<commit_message>
Add Dockerfile and update docker-compose.yml for Spring Boot backend
</commit_message>
<xml_diff>
--- a/docs/design_notes.docx
+++ b/docs/design_notes.docx
@@ -1330,15 +1330,15 @@
         </w:tblCellMar>
       </w:tblPr>
       <w:tblGrid>
-        <w:gridCol w:w="2405"/>
-        <w:gridCol w:w="2412"/>
+        <w:gridCol w:w="2404"/>
+        <w:gridCol w:w="2413"/>
         <w:gridCol w:w="4821"/>
       </w:tblGrid>
       <w:tr>
         <w:trPr/>
         <w:tc>
           <w:tcPr>
-            <w:tcW w:w="2405" w:type="dxa"/>
+            <w:tcW w:w="2404" w:type="dxa"/>
             <w:tcBorders>
               <w:top w:val="single" w:sz="4" w:space="0" w:color="000000"/>
               <w:start w:val="single" w:sz="4" w:space="0" w:color="000000"/>
@@ -1364,7 +1364,7 @@
         </w:tc>
         <w:tc>
           <w:tcPr>
-            <w:tcW w:w="2412" w:type="dxa"/>
+            <w:tcW w:w="2413" w:type="dxa"/>
             <w:tcBorders>
               <w:top w:val="single" w:sz="4" w:space="0" w:color="000000"/>
               <w:start w:val="single" w:sz="4" w:space="0" w:color="000000"/>
@@ -1420,7 +1420,7 @@
         <w:trPr/>
         <w:tc>
           <w:tcPr>
-            <w:tcW w:w="2405" w:type="dxa"/>
+            <w:tcW w:w="2404" w:type="dxa"/>
             <w:tcBorders>
               <w:start w:val="single" w:sz="4" w:space="0" w:color="000000"/>
               <w:bottom w:val="single" w:sz="4" w:space="0" w:color="000000"/>
@@ -1445,7 +1445,7 @@
         </w:tc>
         <w:tc>
           <w:tcPr>
-            <w:tcW w:w="2412" w:type="dxa"/>
+            <w:tcW w:w="2413" w:type="dxa"/>
             <w:tcBorders>
               <w:start w:val="single" w:sz="4" w:space="0" w:color="000000"/>
               <w:bottom w:val="single" w:sz="4" w:space="0" w:color="000000"/>
@@ -1499,7 +1499,7 @@
         <w:trPr/>
         <w:tc>
           <w:tcPr>
-            <w:tcW w:w="2405" w:type="dxa"/>
+            <w:tcW w:w="2404" w:type="dxa"/>
             <w:tcBorders>
               <w:start w:val="single" w:sz="4" w:space="0" w:color="000000"/>
               <w:bottom w:val="single" w:sz="4" w:space="0" w:color="000000"/>
@@ -1524,7 +1524,7 @@
         </w:tc>
         <w:tc>
           <w:tcPr>
-            <w:tcW w:w="2412" w:type="dxa"/>
+            <w:tcW w:w="2413" w:type="dxa"/>
             <w:tcBorders>
               <w:start w:val="single" w:sz="4" w:space="0" w:color="000000"/>
               <w:bottom w:val="single" w:sz="4" w:space="0" w:color="000000"/>
@@ -1578,7 +1578,7 @@
         <w:trPr/>
         <w:tc>
           <w:tcPr>
-            <w:tcW w:w="2405" w:type="dxa"/>
+            <w:tcW w:w="2404" w:type="dxa"/>
             <w:tcBorders>
               <w:start w:val="single" w:sz="4" w:space="0" w:color="000000"/>
               <w:bottom w:val="single" w:sz="4" w:space="0" w:color="000000"/>
@@ -1603,7 +1603,7 @@
         </w:tc>
         <w:tc>
           <w:tcPr>
-            <w:tcW w:w="2412" w:type="dxa"/>
+            <w:tcW w:w="2413" w:type="dxa"/>
             <w:tcBorders>
               <w:start w:val="single" w:sz="4" w:space="0" w:color="000000"/>
               <w:bottom w:val="single" w:sz="4" w:space="0" w:color="000000"/>
@@ -1657,7 +1657,7 @@
         <w:trPr/>
         <w:tc>
           <w:tcPr>
-            <w:tcW w:w="2405" w:type="dxa"/>
+            <w:tcW w:w="2404" w:type="dxa"/>
             <w:tcBorders>
               <w:start w:val="single" w:sz="4" w:space="0" w:color="000000"/>
               <w:bottom w:val="single" w:sz="4" w:space="0" w:color="000000"/>
@@ -1682,7 +1682,7 @@
         </w:tc>
         <w:tc>
           <w:tcPr>
-            <w:tcW w:w="2412" w:type="dxa"/>
+            <w:tcW w:w="2413" w:type="dxa"/>
             <w:tcBorders>
               <w:start w:val="single" w:sz="4" w:space="0" w:color="000000"/>
               <w:bottom w:val="single" w:sz="4" w:space="0" w:color="000000"/>
@@ -1736,7 +1736,7 @@
         <w:trPr/>
         <w:tc>
           <w:tcPr>
-            <w:tcW w:w="2405" w:type="dxa"/>
+            <w:tcW w:w="2404" w:type="dxa"/>
             <w:tcBorders>
               <w:start w:val="single" w:sz="4" w:space="0" w:color="000000"/>
               <w:bottom w:val="single" w:sz="4" w:space="0" w:color="000000"/>
@@ -1761,7 +1761,7 @@
         </w:tc>
         <w:tc>
           <w:tcPr>
-            <w:tcW w:w="2412" w:type="dxa"/>
+            <w:tcW w:w="2413" w:type="dxa"/>
             <w:tcBorders>
               <w:start w:val="single" w:sz="4" w:space="0" w:color="000000"/>
               <w:bottom w:val="single" w:sz="4" w:space="0" w:color="000000"/>
@@ -1815,7 +1815,7 @@
         <w:trPr/>
         <w:tc>
           <w:tcPr>
-            <w:tcW w:w="2405" w:type="dxa"/>
+            <w:tcW w:w="2404" w:type="dxa"/>
             <w:tcBorders>
               <w:start w:val="single" w:sz="4" w:space="0" w:color="000000"/>
               <w:bottom w:val="single" w:sz="4" w:space="0" w:color="000000"/>
@@ -1840,7 +1840,7 @@
         </w:tc>
         <w:tc>
           <w:tcPr>
-            <w:tcW w:w="2412" w:type="dxa"/>
+            <w:tcW w:w="2413" w:type="dxa"/>
             <w:tcBorders>
               <w:start w:val="single" w:sz="4" w:space="0" w:color="000000"/>
               <w:bottom w:val="single" w:sz="4" w:space="0" w:color="000000"/>
@@ -1894,7 +1894,7 @@
         <w:trPr/>
         <w:tc>
           <w:tcPr>
-            <w:tcW w:w="2405" w:type="dxa"/>
+            <w:tcW w:w="2404" w:type="dxa"/>
             <w:tcBorders>
               <w:start w:val="single" w:sz="4" w:space="0" w:color="000000"/>
               <w:bottom w:val="single" w:sz="4" w:space="0" w:color="000000"/>
@@ -1919,7 +1919,7 @@
         </w:tc>
         <w:tc>
           <w:tcPr>
-            <w:tcW w:w="2412" w:type="dxa"/>
+            <w:tcW w:w="2413" w:type="dxa"/>
             <w:tcBorders>
               <w:start w:val="single" w:sz="4" w:space="0" w:color="000000"/>
               <w:bottom w:val="single" w:sz="4" w:space="0" w:color="000000"/>
@@ -4114,37 +4114,367 @@
         <w:rPr>
           <w:rFonts w:ascii="SF Pro Text" w:hAnsi="SF Pro Text"/>
         </w:rPr>
-        <w:t>What is an Event?</w:t>
-      </w:r>
-    </w:p>
-    <w:p>
-      <w:pPr>
-        <w:pStyle w:val="Normal"/>
-        <w:bidi w:val="0"/>
-        <w:jc w:val="both"/>
-        <w:rPr>
-          <w:rFonts w:ascii="SF Pro Text" w:hAnsi="SF Pro Text"/>
-        </w:rPr>
-      </w:pPr>
-      <w:r>
-        <w:rPr>
-          <w:rFonts w:ascii="SF Pro Text" w:hAnsi="SF Pro Text"/>
-        </w:rPr>
-        <w:t xml:space="preserve">Something like a </w:t>
-      </w:r>
-      <w:r>
-        <w:rPr>
-          <w:rFonts w:ascii="SF Pro Text" w:hAnsi="SF Pro Text"/>
-          <w:b/>
-          <w:bCs/>
-        </w:rPr>
-        <w:t>phone call</w:t>
-      </w:r>
-      <w:r>
-        <w:rPr>
-          <w:rFonts w:ascii="SF Pro Text" w:hAnsi="SF Pro Text"/>
-        </w:rPr>
-        <w:t>. One person calls (emits event), another answers (listens event).</w:t>
+        <w:t>Architecture (Single Container)</w:t>
+      </w:r>
+    </w:p>
+    <w:p>
+      <w:pPr>
+        <w:pStyle w:val="Normal"/>
+        <w:bidi w:val="0"/>
+        <w:jc w:val="both"/>
+        <w:rPr>
+          <w:rFonts w:ascii="SF Pro Text" w:hAnsi="SF Pro Text"/>
+        </w:rPr>
+      </w:pPr>
+      <w:r>
+        <w:rPr>
+          <w:rFonts w:ascii="SF Pro Text" w:hAnsi="SF Pro Text"/>
+        </w:rPr>
+        <w:drawing>
+          <wp:anchor behindDoc="0" distT="0" distB="0" distL="0" distR="0" simplePos="0" locked="0" layoutInCell="0" allowOverlap="1" relativeHeight="4">
+            <wp:simplePos x="0" y="0"/>
+            <wp:positionH relativeFrom="column">
+              <wp:posOffset>115570</wp:posOffset>
+            </wp:positionH>
+            <wp:positionV relativeFrom="paragraph">
+              <wp:posOffset>155575</wp:posOffset>
+            </wp:positionV>
+            <wp:extent cx="2395855" cy="3992880"/>
+            <wp:effectExtent l="0" t="0" r="0" b="0"/>
+            <wp:wrapSquare wrapText="largest"/>
+            <wp:docPr id="3" name="Image3" descr="" title=""/>
+            <wp:cNvGraphicFramePr>
+              <a:graphicFrameLocks xmlns:a="http://schemas.openxmlformats.org/drawingml/2006/main" noChangeAspect="1"/>
+            </wp:cNvGraphicFramePr>
+            <a:graphic xmlns:a="http://schemas.openxmlformats.org/drawingml/2006/main">
+              <a:graphicData uri="http://schemas.openxmlformats.org/drawingml/2006/picture">
+                <pic:pic xmlns:pic="http://schemas.openxmlformats.org/drawingml/2006/picture">
+                  <pic:nvPicPr>
+                    <pic:cNvPr id="3" name="Image3" descr="" title=""/>
+                    <pic:cNvPicPr>
+                      <a:picLocks noChangeAspect="1" noChangeArrowheads="1"/>
+                    </pic:cNvPicPr>
+                  </pic:nvPicPr>
+                  <pic:blipFill>
+                    <a:blip r:embed="rId4"/>
+                    <a:stretch>
+                      <a:fillRect/>
+                    </a:stretch>
+                  </pic:blipFill>
+                  <pic:spPr bwMode="auto">
+                    <a:xfrm>
+                      <a:off x="0" y="0"/>
+                      <a:ext cx="2395855" cy="3992880"/>
+                    </a:xfrm>
+                    <a:prstGeom prst="rect">
+                      <a:avLst/>
+                    </a:prstGeom>
+                  </pic:spPr>
+                </pic:pic>
+              </a:graphicData>
+            </a:graphic>
+          </wp:anchor>
+        </w:drawing>
+      </w:r>
+    </w:p>
+    <w:p>
+      <w:pPr>
+        <w:pStyle w:val="Normal"/>
+        <w:bidi w:val="0"/>
+        <w:jc w:val="both"/>
+        <w:rPr>
+          <w:rFonts w:ascii="SF Pro Text" w:hAnsi="SF Pro Text"/>
+        </w:rPr>
+      </w:pPr>
+      <w:r>
+        <w:rPr>
+          <w:rFonts w:ascii="SF Pro Text" w:hAnsi="SF Pro Text"/>
+        </w:rPr>
+      </w:r>
+    </w:p>
+    <w:p>
+      <w:pPr>
+        <w:pStyle w:val="Normal"/>
+        <w:bidi w:val="0"/>
+        <w:jc w:val="both"/>
+        <w:rPr>
+          <w:rFonts w:ascii="SF Pro Text" w:hAnsi="SF Pro Text"/>
+        </w:rPr>
+      </w:pPr>
+      <w:r>
+        <w:rPr>
+          <w:rFonts w:ascii="SF Pro Text" w:hAnsi="SF Pro Text"/>
+        </w:rPr>
+      </w:r>
+    </w:p>
+    <w:p>
+      <w:pPr>
+        <w:pStyle w:val="Normal"/>
+        <w:bidi w:val="0"/>
+        <w:jc w:val="both"/>
+        <w:rPr>
+          <w:rFonts w:ascii="SF Pro Text" w:hAnsi="SF Pro Text"/>
+        </w:rPr>
+      </w:pPr>
+      <w:r>
+        <w:rPr>
+          <w:rFonts w:ascii="SF Pro Text" w:hAnsi="SF Pro Text"/>
+        </w:rPr>
+      </w:r>
+    </w:p>
+    <w:p>
+      <w:pPr>
+        <w:pStyle w:val="Normal"/>
+        <w:bidi w:val="0"/>
+        <w:jc w:val="both"/>
+        <w:rPr>
+          <w:rFonts w:ascii="SF Pro Text" w:hAnsi="SF Pro Text"/>
+        </w:rPr>
+      </w:pPr>
+      <w:r>
+        <w:rPr>
+          <w:rFonts w:ascii="SF Pro Text" w:hAnsi="SF Pro Text"/>
+        </w:rPr>
+      </w:r>
+    </w:p>
+    <w:p>
+      <w:pPr>
+        <w:pStyle w:val="Normal"/>
+        <w:bidi w:val="0"/>
+        <w:jc w:val="both"/>
+        <w:rPr>
+          <w:rFonts w:ascii="SF Pro Text" w:hAnsi="SF Pro Text"/>
+        </w:rPr>
+      </w:pPr>
+      <w:r>
+        <w:rPr>
+          <w:rFonts w:ascii="SF Pro Text" w:hAnsi="SF Pro Text"/>
+        </w:rPr>
+      </w:r>
+    </w:p>
+    <w:p>
+      <w:pPr>
+        <w:pStyle w:val="Normal"/>
+        <w:bidi w:val="0"/>
+        <w:jc w:val="both"/>
+        <w:rPr>
+          <w:rFonts w:ascii="SF Pro Text" w:hAnsi="SF Pro Text"/>
+        </w:rPr>
+      </w:pPr>
+      <w:r>
+        <w:rPr>
+          <w:rFonts w:ascii="SF Pro Text" w:hAnsi="SF Pro Text"/>
+        </w:rPr>
+      </w:r>
+    </w:p>
+    <w:p>
+      <w:pPr>
+        <w:pStyle w:val="Normal"/>
+        <w:bidi w:val="0"/>
+        <w:jc w:val="both"/>
+        <w:rPr>
+          <w:rFonts w:ascii="SF Pro Text" w:hAnsi="SF Pro Text"/>
+        </w:rPr>
+      </w:pPr>
+      <w:r>
+        <w:rPr>
+          <w:rFonts w:ascii="SF Pro Text" w:hAnsi="SF Pro Text"/>
+        </w:rPr>
+      </w:r>
+    </w:p>
+    <w:p>
+      <w:pPr>
+        <w:pStyle w:val="Normal"/>
+        <w:bidi w:val="0"/>
+        <w:jc w:val="both"/>
+        <w:rPr>
+          <w:rFonts w:ascii="SF Pro Text" w:hAnsi="SF Pro Text"/>
+        </w:rPr>
+      </w:pPr>
+      <w:r>
+        <w:rPr>
+          <w:rFonts w:ascii="SF Pro Text" w:hAnsi="SF Pro Text"/>
+        </w:rPr>
+      </w:r>
+    </w:p>
+    <w:p>
+      <w:pPr>
+        <w:pStyle w:val="Normal"/>
+        <w:bidi w:val="0"/>
+        <w:jc w:val="both"/>
+        <w:rPr>
+          <w:rFonts w:ascii="SF Pro Text" w:hAnsi="SF Pro Text"/>
+        </w:rPr>
+      </w:pPr>
+      <w:r>
+        <w:rPr>
+          <w:rFonts w:ascii="SF Pro Text" w:hAnsi="SF Pro Text"/>
+        </w:rPr>
+      </w:r>
+    </w:p>
+    <w:p>
+      <w:pPr>
+        <w:pStyle w:val="Normal"/>
+        <w:bidi w:val="0"/>
+        <w:jc w:val="both"/>
+        <w:rPr>
+          <w:rFonts w:ascii="SF Pro Text" w:hAnsi="SF Pro Text"/>
+        </w:rPr>
+      </w:pPr>
+      <w:r>
+        <w:rPr>
+          <w:rFonts w:ascii="SF Pro Text" w:hAnsi="SF Pro Text"/>
+        </w:rPr>
+      </w:r>
+    </w:p>
+    <w:p>
+      <w:pPr>
+        <w:pStyle w:val="Normal"/>
+        <w:bidi w:val="0"/>
+        <w:jc w:val="both"/>
+        <w:rPr>
+          <w:rFonts w:ascii="SF Pro Text" w:hAnsi="SF Pro Text"/>
+        </w:rPr>
+      </w:pPr>
+      <w:r>
+        <w:rPr>
+          <w:rFonts w:ascii="SF Pro Text" w:hAnsi="SF Pro Text"/>
+        </w:rPr>
+      </w:r>
+    </w:p>
+    <w:p>
+      <w:pPr>
+        <w:pStyle w:val="Normal"/>
+        <w:bidi w:val="0"/>
+        <w:jc w:val="both"/>
+        <w:rPr>
+          <w:rFonts w:ascii="SF Pro Text" w:hAnsi="SF Pro Text"/>
+        </w:rPr>
+      </w:pPr>
+      <w:r>
+        <w:rPr>
+          <w:rFonts w:ascii="SF Pro Text" w:hAnsi="SF Pro Text"/>
+        </w:rPr>
+      </w:r>
+    </w:p>
+    <w:p>
+      <w:pPr>
+        <w:pStyle w:val="Normal"/>
+        <w:bidi w:val="0"/>
+        <w:jc w:val="both"/>
+        <w:rPr>
+          <w:rFonts w:ascii="SF Pro Text" w:hAnsi="SF Pro Text"/>
+        </w:rPr>
+      </w:pPr>
+      <w:r>
+        <w:rPr>
+          <w:rFonts w:ascii="SF Pro Text" w:hAnsi="SF Pro Text"/>
+        </w:rPr>
+      </w:r>
+    </w:p>
+    <w:p>
+      <w:pPr>
+        <w:pStyle w:val="Normal"/>
+        <w:bidi w:val="0"/>
+        <w:jc w:val="both"/>
+        <w:rPr>
+          <w:rFonts w:ascii="SF Pro Text" w:hAnsi="SF Pro Text"/>
+        </w:rPr>
+      </w:pPr>
+      <w:r>
+        <w:rPr>
+          <w:rFonts w:ascii="SF Pro Text" w:hAnsi="SF Pro Text"/>
+        </w:rPr>
+      </w:r>
+    </w:p>
+    <w:p>
+      <w:pPr>
+        <w:pStyle w:val="Normal"/>
+        <w:bidi w:val="0"/>
+        <w:jc w:val="both"/>
+        <w:rPr>
+          <w:rFonts w:ascii="SF Pro Text" w:hAnsi="SF Pro Text"/>
+        </w:rPr>
+      </w:pPr>
+      <w:r>
+        <w:rPr>
+          <w:rFonts w:ascii="SF Pro Text" w:hAnsi="SF Pro Text"/>
+        </w:rPr>
+      </w:r>
+    </w:p>
+    <w:p>
+      <w:pPr>
+        <w:pStyle w:val="Normal"/>
+        <w:bidi w:val="0"/>
+        <w:jc w:val="both"/>
+        <w:rPr>
+          <w:rFonts w:ascii="SF Pro Text" w:hAnsi="SF Pro Text"/>
+        </w:rPr>
+      </w:pPr>
+      <w:r>
+        <w:rPr>
+          <w:rFonts w:ascii="SF Pro Text" w:hAnsi="SF Pro Text"/>
+        </w:rPr>
+      </w:r>
+    </w:p>
+    <w:p>
+      <w:pPr>
+        <w:pStyle w:val="Normal"/>
+        <w:bidi w:val="0"/>
+        <w:jc w:val="both"/>
+        <w:rPr>
+          <w:rFonts w:ascii="SF Pro Text" w:hAnsi="SF Pro Text"/>
+        </w:rPr>
+      </w:pPr>
+      <w:r>
+        <w:rPr>
+          <w:rFonts w:ascii="SF Pro Text" w:hAnsi="SF Pro Text"/>
+        </w:rPr>
+      </w:r>
+    </w:p>
+    <w:p>
+      <w:pPr>
+        <w:pStyle w:val="Normal"/>
+        <w:bidi w:val="0"/>
+        <w:jc w:val="both"/>
+        <w:rPr>
+          <w:rFonts w:ascii="SF Pro Text" w:hAnsi="SF Pro Text"/>
+        </w:rPr>
+      </w:pPr>
+      <w:r>
+        <w:rPr>
+          <w:rFonts w:ascii="SF Pro Text" w:hAnsi="SF Pro Text"/>
+        </w:rPr>
+      </w:r>
+    </w:p>
+    <w:p>
+      <w:pPr>
+        <w:pStyle w:val="Normal"/>
+        <w:bidi w:val="0"/>
+        <w:jc w:val="both"/>
+        <w:rPr>
+          <w:rFonts w:ascii="SF Pro Text" w:hAnsi="SF Pro Text"/>
+        </w:rPr>
+      </w:pPr>
+      <w:r>
+        <w:rPr>
+          <w:rFonts w:ascii="SF Pro Text" w:hAnsi="SF Pro Text"/>
+        </w:rPr>
+      </w:r>
+    </w:p>
+    <w:p>
+      <w:pPr>
+        <w:pStyle w:val="Normal"/>
+        <w:bidi w:val="0"/>
+        <w:jc w:val="both"/>
+        <w:rPr>
+          <w:rFonts w:ascii="SF Pro Text" w:hAnsi="SF Pro Text"/>
+        </w:rPr>
+      </w:pPr>
+      <w:r>
+        <w:rPr>
+          <w:rFonts w:ascii="SF Pro Text" w:hAnsi="SF Pro Text"/>
+        </w:rPr>
       </w:r>
     </w:p>
     <w:p>

</xml_diff>

<commit_message>
fix: QR code scan not redirecting to receiver page, and add camera to interface
</commit_message>
<xml_diff>
--- a/docs/design_notes.docx
+++ b/docs/design_notes.docx
@@ -37,50 +37,26 @@
         <w:jc w:val="both"/>
         <w:rPr>
           <w:rFonts w:ascii="SF Pro Text" w:hAnsi="SF Pro Text"/>
-        </w:rPr>
-      </w:pPr>
-      <w:r>
-        <w:rPr>
-          <w:rFonts w:ascii="SF Pro Text" w:hAnsi="SF Pro Text"/>
+          <w:i/>
+          <w:i/>
+          <w:iCs/>
+        </w:rPr>
+      </w:pPr>
+      <w:r>
+        <w:rPr>
+          <w:rFonts w:ascii="SF Pro Text" w:hAnsi="SF Pro Text"/>
+          <w:i/>
+          <w:iCs/>
         </w:rPr>
         <w:t>“</w:t>
       </w:r>
       <w:r>
         <w:rPr>
           <w:rFonts w:ascii="SF Pro Text" w:hAnsi="SF Pro Text"/>
-        </w:rPr>
-        <w:t>A secure, peer-to-peer file sharing web app that works instantly between any two devices-without uploading files to any server”</w:t>
-      </w:r>
-    </w:p>
-    <w:p>
-      <w:pPr>
-        <w:pStyle w:val="Normal"/>
-        <w:bidi w:val="0"/>
-        <w:jc w:val="both"/>
-        <w:rPr>
-          <w:rFonts w:ascii="SF Pro Text" w:hAnsi="SF Pro Text"/>
-        </w:rPr>
-      </w:pPr>
-      <w:r>
-        <w:rPr>
-          <w:rFonts w:ascii="SF Pro Text" w:hAnsi="SF Pro Text"/>
-        </w:rPr>
-      </w:r>
-    </w:p>
-    <w:p>
-      <w:pPr>
-        <w:pStyle w:val="Normal"/>
-        <w:bidi w:val="0"/>
-        <w:jc w:val="both"/>
-        <w:rPr>
-          <w:rFonts w:ascii="SF Pro Text" w:hAnsi="SF Pro Text"/>
-        </w:rPr>
-      </w:pPr>
-      <w:r>
-        <w:rPr>
-          <w:rFonts w:ascii="SF Pro Text" w:hAnsi="SF Pro Text"/>
-        </w:rPr>
-        <w:t>Let users share files via link or QR, directly browser-to-browser using WebRTC, with a spring boot backend acting only as the signaling server (for peer discovery)</w:t>
+          <w:i/>
+          <w:iCs/>
+        </w:rPr>
+        <w:t>LocalShare is a peer-to-peer file sharing web app that allows users to transfer files directly between browsers using WebRTC. The Spring Boot backend acts solely as a signaling server, managing session creation and discovery. All file transfers occur over encrypted P2P data channels, ensuring privacy and minimal server load.”</w:t>
       </w:r>
     </w:p>
     <w:p>
@@ -103,7 +79,7 @@
         <w:pStyle w:val="Heading1"/>
         <w:numPr>
           <w:ilvl w:val="0"/>
-          <w:numId w:val="1"/>
+          <w:numId w:val="2"/>
         </w:numPr>
         <w:ind w:hanging="0" w:start="0"/>
         <w:rPr/>
@@ -128,7 +104,7 @@
       </w:tblPr>
       <w:tblGrid>
         <w:gridCol w:w="3212"/>
-        <w:gridCol w:w="6425"/>
+        <w:gridCol w:w="6426"/>
       </w:tblGrid>
       <w:tr>
         <w:trPr/>
@@ -154,7 +130,7 @@
         </w:tc>
         <w:tc>
           <w:tcPr>
-            <w:tcW w:w="6425" w:type="dxa"/>
+            <w:tcW w:w="6426" w:type="dxa"/>
             <w:tcBorders>
               <w:top w:val="single" w:sz="4" w:space="0" w:color="000000"/>
               <w:start w:val="single" w:sz="4" w:space="0" w:color="000000"/>
@@ -197,7 +173,7 @@
         </w:tc>
         <w:tc>
           <w:tcPr>
-            <w:tcW w:w="6425" w:type="dxa"/>
+            <w:tcW w:w="6426" w:type="dxa"/>
             <w:tcBorders>
               <w:start w:val="single" w:sz="4" w:space="0" w:color="000000"/>
               <w:bottom w:val="single" w:sz="4" w:space="0" w:color="000000"/>
@@ -239,7 +215,7 @@
         </w:tc>
         <w:tc>
           <w:tcPr>
-            <w:tcW w:w="6425" w:type="dxa"/>
+            <w:tcW w:w="6426" w:type="dxa"/>
             <w:tcBorders>
               <w:start w:val="single" w:sz="4" w:space="0" w:color="000000"/>
               <w:bottom w:val="single" w:sz="4" w:space="0" w:color="000000"/>
@@ -281,7 +257,7 @@
         </w:tc>
         <w:tc>
           <w:tcPr>
-            <w:tcW w:w="6425" w:type="dxa"/>
+            <w:tcW w:w="6426" w:type="dxa"/>
             <w:tcBorders>
               <w:start w:val="single" w:sz="4" w:space="0" w:color="000000"/>
               <w:bottom w:val="single" w:sz="4" w:space="0" w:color="000000"/>
@@ -323,7 +299,7 @@
         </w:tc>
         <w:tc>
           <w:tcPr>
-            <w:tcW w:w="6425" w:type="dxa"/>
+            <w:tcW w:w="6426" w:type="dxa"/>
             <w:tcBorders>
               <w:start w:val="single" w:sz="4" w:space="0" w:color="000000"/>
               <w:bottom w:val="single" w:sz="4" w:space="0" w:color="000000"/>
@@ -365,7 +341,7 @@
         </w:tc>
         <w:tc>
           <w:tcPr>
-            <w:tcW w:w="6425" w:type="dxa"/>
+            <w:tcW w:w="6426" w:type="dxa"/>
             <w:tcBorders>
               <w:start w:val="single" w:sz="4" w:space="0" w:color="000000"/>
               <w:bottom w:val="single" w:sz="4" w:space="0" w:color="000000"/>
@@ -407,7 +383,7 @@
         </w:tc>
         <w:tc>
           <w:tcPr>
-            <w:tcW w:w="6425" w:type="dxa"/>
+            <w:tcW w:w="6426" w:type="dxa"/>
             <w:tcBorders>
               <w:start w:val="single" w:sz="4" w:space="0" w:color="000000"/>
               <w:bottom w:val="single" w:sz="4" w:space="0" w:color="000000"/>
@@ -449,7 +425,7 @@
         </w:tc>
         <w:tc>
           <w:tcPr>
-            <w:tcW w:w="6425" w:type="dxa"/>
+            <w:tcW w:w="6426" w:type="dxa"/>
             <w:tcBorders>
               <w:start w:val="single" w:sz="4" w:space="0" w:color="000000"/>
               <w:bottom w:val="single" w:sz="4" w:space="0" w:color="000000"/>
@@ -491,7 +467,7 @@
         </w:tc>
         <w:tc>
           <w:tcPr>
-            <w:tcW w:w="6425" w:type="dxa"/>
+            <w:tcW w:w="6426" w:type="dxa"/>
             <w:tcBorders>
               <w:start w:val="single" w:sz="4" w:space="0" w:color="000000"/>
               <w:bottom w:val="single" w:sz="4" w:space="0" w:color="000000"/>
@@ -533,7 +509,7 @@
         </w:tc>
         <w:tc>
           <w:tcPr>
-            <w:tcW w:w="6425" w:type="dxa"/>
+            <w:tcW w:w="6426" w:type="dxa"/>
             <w:tcBorders>
               <w:start w:val="single" w:sz="4" w:space="0" w:color="000000"/>
               <w:bottom w:val="single" w:sz="4" w:space="0" w:color="000000"/>
@@ -575,7 +551,7 @@
         </w:tc>
         <w:tc>
           <w:tcPr>
-            <w:tcW w:w="6425" w:type="dxa"/>
+            <w:tcW w:w="6426" w:type="dxa"/>
             <w:tcBorders>
               <w:start w:val="single" w:sz="4" w:space="0" w:color="000000"/>
               <w:bottom w:val="single" w:sz="4" w:space="0" w:color="000000"/>
@@ -617,7 +593,7 @@
         </w:tc>
         <w:tc>
           <w:tcPr>
-            <w:tcW w:w="6425" w:type="dxa"/>
+            <w:tcW w:w="6426" w:type="dxa"/>
             <w:tcBorders>
               <w:start w:val="single" w:sz="4" w:space="0" w:color="000000"/>
               <w:bottom w:val="single" w:sz="4" w:space="0" w:color="000000"/>
@@ -659,7 +635,7 @@
         </w:tc>
         <w:tc>
           <w:tcPr>
-            <w:tcW w:w="6425" w:type="dxa"/>
+            <w:tcW w:w="6426" w:type="dxa"/>
             <w:tcBorders>
               <w:start w:val="single" w:sz="4" w:space="0" w:color="000000"/>
               <w:bottom w:val="single" w:sz="4" w:space="0" w:color="000000"/>
@@ -701,7 +677,7 @@
         </w:tc>
         <w:tc>
           <w:tcPr>
-            <w:tcW w:w="6425" w:type="dxa"/>
+            <w:tcW w:w="6426" w:type="dxa"/>
             <w:tcBorders>
               <w:start w:val="single" w:sz="4" w:space="0" w:color="000000"/>
               <w:bottom w:val="single" w:sz="4" w:space="0" w:color="000000"/>
@@ -743,7 +719,7 @@
         </w:tc>
         <w:tc>
           <w:tcPr>
-            <w:tcW w:w="6425" w:type="dxa"/>
+            <w:tcW w:w="6426" w:type="dxa"/>
             <w:tcBorders>
               <w:start w:val="single" w:sz="4" w:space="0" w:color="000000"/>
               <w:bottom w:val="single" w:sz="4" w:space="0" w:color="000000"/>
@@ -785,7 +761,7 @@
         </w:tc>
         <w:tc>
           <w:tcPr>
-            <w:tcW w:w="6425" w:type="dxa"/>
+            <w:tcW w:w="6426" w:type="dxa"/>
             <w:tcBorders>
               <w:start w:val="single" w:sz="4" w:space="0" w:color="000000"/>
               <w:bottom w:val="single" w:sz="4" w:space="0" w:color="000000"/>
@@ -827,7 +803,7 @@
         </w:tc>
         <w:tc>
           <w:tcPr>
-            <w:tcW w:w="6425" w:type="dxa"/>
+            <w:tcW w:w="6426" w:type="dxa"/>
             <w:tcBorders>
               <w:start w:val="single" w:sz="4" w:space="0" w:color="000000"/>
               <w:bottom w:val="single" w:sz="4" w:space="0" w:color="000000"/>
@@ -874,43 +850,96 @@
     <w:p>
       <w:pPr>
         <w:pStyle w:val="Heading1"/>
-        <w:numPr>
-          <w:ilvl w:val="0"/>
-          <w:numId w:val="1"/>
-        </w:numPr>
-        <w:bidi w:val="0"/>
-        <w:ind w:hanging="0" w:start="0"/>
-        <w:jc w:val="both"/>
-        <w:rPr/>
-      </w:pPr>
-      <w:r>
-        <w:rPr/>
-        <w:t>Functional requirements</w:t>
-      </w:r>
-    </w:p>
-    <w:p>
-      <w:pPr>
-        <w:pStyle w:val="Normal"/>
-        <w:bidi w:val="0"/>
-        <w:jc w:val="both"/>
-        <w:rPr>
-          <w:rFonts w:ascii="SF Pro Text" w:hAnsi="SF Pro Text"/>
-        </w:rPr>
-      </w:pPr>
-      <w:r>
-        <w:rPr>
-          <w:rFonts w:ascii="SF Pro Text" w:hAnsi="SF Pro Text"/>
-        </w:rPr>
-      </w:r>
-    </w:p>
-    <w:p>
-      <w:pPr>
-        <w:pStyle w:val="Normal"/>
         <w:numPr>
           <w:ilvl w:val="0"/>
           <w:numId w:val="2"/>
         </w:numPr>
         <w:bidi w:val="0"/>
+        <w:ind w:hanging="0" w:start="0"/>
+        <w:jc w:val="both"/>
+        <w:rPr/>
+      </w:pPr>
+      <w:r>
+        <w:rPr/>
+        <w:t>Functional requirements</w:t>
+      </w:r>
+    </w:p>
+    <w:p>
+      <w:pPr>
+        <w:pStyle w:val="Normal"/>
+        <w:bidi w:val="0"/>
+        <w:jc w:val="both"/>
+        <w:rPr>
+          <w:rFonts w:ascii="SF Pro Text" w:hAnsi="SF Pro Text"/>
+        </w:rPr>
+      </w:pPr>
+      <w:r>
+        <w:rPr>
+          <w:rFonts w:ascii="SF Pro Text" w:hAnsi="SF Pro Text"/>
+        </w:rPr>
+      </w:r>
+    </w:p>
+    <w:p>
+      <w:pPr>
+        <w:pStyle w:val="BodyText"/>
+        <w:numPr>
+          <w:ilvl w:val="0"/>
+          <w:numId w:val="15"/>
+        </w:numPr>
+        <w:bidi w:val="0"/>
+        <w:jc w:val="both"/>
+        <w:rPr>
+          <w:rFonts w:ascii="SF Pro Text" w:hAnsi="SF Pro Text"/>
+        </w:rPr>
+      </w:pPr>
+      <w:r>
+        <w:rPr>
+          <w:rStyle w:val="Strong"/>
+          <w:rFonts w:ascii="SF Pro Text" w:hAnsi="SF Pro Text"/>
+        </w:rPr>
+        <w:t>Signaling Flow (handled by Spring Boot + Socket.IO)</w:t>
+      </w:r>
+    </w:p>
+    <w:p>
+      <w:pPr>
+        <w:pStyle w:val="BodyText"/>
+        <w:numPr>
+          <w:ilvl w:val="0"/>
+          <w:numId w:val="15"/>
+        </w:numPr>
+        <w:rPr/>
+      </w:pPr>
+      <w:r>
+        <w:rPr>
+          <w:rStyle w:val="Strong"/>
+          <w:rFonts w:ascii="SF Pro Text" w:hAnsi="SF Pro Text"/>
+        </w:rPr>
+        <w:t>Data Flow (handled by WebRTC peer connection)</w:t>
+      </w:r>
+    </w:p>
+    <w:p>
+      <w:pPr>
+        <w:pStyle w:val="Normal"/>
+        <w:bidi w:val="0"/>
+        <w:jc w:val="both"/>
+        <w:rPr>
+          <w:rFonts w:ascii="SF Pro Text" w:hAnsi="SF Pro Text"/>
+        </w:rPr>
+      </w:pPr>
+      <w:r>
+        <w:rPr>
+          <w:rFonts w:ascii="SF Pro Text" w:hAnsi="SF Pro Text"/>
+        </w:rPr>
+      </w:r>
+    </w:p>
+    <w:p>
+      <w:pPr>
+        <w:pStyle w:val="Normal"/>
+        <w:numPr>
+          <w:ilvl w:val="0"/>
+          <w:numId w:val="3"/>
+        </w:numPr>
+        <w:bidi w:val="0"/>
         <w:jc w:val="both"/>
         <w:rPr>
           <w:rFonts w:ascii="SF Pro Text" w:hAnsi="SF Pro Text"/>
@@ -926,21 +955,229 @@
     <w:p>
       <w:pPr>
         <w:pStyle w:val="Normal"/>
+        <w:numPr>
+          <w:ilvl w:val="0"/>
+          <w:numId w:val="3"/>
+        </w:numPr>
+        <w:bidi w:val="0"/>
+        <w:jc w:val="both"/>
+        <w:rPr>
+          <w:rFonts w:ascii="SF Pro Text" w:hAnsi="SF Pro Text"/>
+        </w:rPr>
+      </w:pPr>
+      <w:r>
+        <w:rPr>
+          <w:rFonts w:ascii="SF Pro Text" w:hAnsi="SF Pro Text"/>
+        </w:rPr>
+        <w:t>Join session – Receiver enters the code or scans QR to connect to the sender</w:t>
+      </w:r>
+    </w:p>
+    <w:p>
+      <w:pPr>
+        <w:pStyle w:val="Normal"/>
+        <w:numPr>
+          <w:ilvl w:val="0"/>
+          <w:numId w:val="3"/>
+        </w:numPr>
+        <w:bidi w:val="0"/>
+        <w:jc w:val="both"/>
+        <w:rPr>
+          <w:rFonts w:ascii="SF Pro Text" w:hAnsi="SF Pro Text"/>
+        </w:rPr>
+      </w:pPr>
+      <w:r>
+        <w:rPr>
+          <w:rFonts w:ascii="SF Pro Text" w:hAnsi="SF Pro Text"/>
+        </w:rPr>
+        <w:t>Peer connection – Once both are in session, a WebRTC data channel is established via socket.IO signaling.</w:t>
+      </w:r>
+    </w:p>
+    <w:p>
+      <w:pPr>
+        <w:pStyle w:val="Normal"/>
+        <w:numPr>
+          <w:ilvl w:val="0"/>
+          <w:numId w:val="3"/>
+        </w:numPr>
+        <w:bidi w:val="0"/>
+        <w:jc w:val="both"/>
+        <w:rPr>
+          <w:rFonts w:ascii="SF Pro Text" w:hAnsi="SF Pro Text"/>
+        </w:rPr>
+      </w:pPr>
+      <w:r>
+        <w:rPr>
+          <w:rFonts w:ascii="SF Pro Text" w:hAnsi="SF Pro Text"/>
+        </w:rPr>
+        <w:t>File transfer – Sender selects file → gets streamed via WebRTC data channel to receiver</w:t>
+      </w:r>
+    </w:p>
+    <w:p>
+      <w:pPr>
+        <w:pStyle w:val="Normal"/>
+        <w:numPr>
+          <w:ilvl w:val="0"/>
+          <w:numId w:val="3"/>
+        </w:numPr>
+        <w:bidi w:val="0"/>
+        <w:jc w:val="both"/>
+        <w:rPr>
+          <w:rFonts w:ascii="SF Pro Text" w:hAnsi="SF Pro Text"/>
+        </w:rPr>
+      </w:pPr>
+      <w:r>
+        <w:rPr>
+          <w:rFonts w:ascii="SF Pro Text" w:hAnsi="SF Pro Text"/>
+        </w:rPr>
+        <w:t>File encryption – Before sending, file is AES-encrypted in the browser. Receiver decrypts it</w:t>
+      </w:r>
+    </w:p>
+    <w:p>
+      <w:pPr>
+        <w:pStyle w:val="Normal"/>
+        <w:numPr>
+          <w:ilvl w:val="0"/>
+          <w:numId w:val="3"/>
+        </w:numPr>
+        <w:bidi w:val="0"/>
+        <w:jc w:val="both"/>
+        <w:rPr>
+          <w:rFonts w:ascii="SF Pro Text" w:hAnsi="SF Pro Text"/>
+        </w:rPr>
+      </w:pPr>
+      <w:r>
+        <w:rPr>
+          <w:rFonts w:ascii="SF Pro Text" w:hAnsi="SF Pro Text"/>
+        </w:rPr>
+        <w:t>Progress UI – show upload an download progress for each file</w:t>
+      </w:r>
+    </w:p>
+    <w:p>
+      <w:pPr>
+        <w:pStyle w:val="Normal"/>
+        <w:numPr>
+          <w:ilvl w:val="0"/>
+          <w:numId w:val="3"/>
+        </w:numPr>
+        <w:bidi w:val="0"/>
+        <w:jc w:val="both"/>
+        <w:rPr>
+          <w:rFonts w:ascii="SF Pro Text" w:hAnsi="SF Pro Text"/>
+        </w:rPr>
+      </w:pPr>
+      <w:r>
+        <w:rPr>
+          <w:rFonts w:ascii="SF Pro Text" w:hAnsi="SF Pro Text"/>
+        </w:rPr>
+        <w:t>Device QR link – show QR code for easier connect on mobile</w:t>
+      </w:r>
+    </w:p>
+    <w:p>
+      <w:pPr>
+        <w:pStyle w:val="Normal"/>
+        <w:numPr>
+          <w:ilvl w:val="0"/>
+          <w:numId w:val="3"/>
+        </w:numPr>
+        <w:bidi w:val="0"/>
+        <w:jc w:val="both"/>
+        <w:rPr>
+          <w:rFonts w:ascii="SF Pro Text" w:hAnsi="SF Pro Text"/>
+        </w:rPr>
+      </w:pPr>
+      <w:r>
+        <w:rPr>
+          <w:rFonts w:ascii="SF Pro Text" w:hAnsi="SF Pro Text"/>
+        </w:rPr>
+        <w:t>Connection fallback – if peer to peer fails (e.g., behind NAT/ firewall) , use Springboot relay proxy.</w:t>
+      </w:r>
+    </w:p>
+    <w:p>
+      <w:pPr>
+        <w:pStyle w:val="Normal"/>
+        <w:numPr>
+          <w:ilvl w:val="0"/>
+          <w:numId w:val="3"/>
+        </w:numPr>
+        <w:bidi w:val="0"/>
+        <w:jc w:val="both"/>
+        <w:rPr>
+          <w:rFonts w:ascii="SF Pro Text" w:hAnsi="SF Pro Text"/>
+        </w:rPr>
+      </w:pPr>
+      <w:r>
+        <w:rPr>
+          <w:rFonts w:ascii="SF Pro Text" w:hAnsi="SF Pro Text"/>
+        </w:rPr>
+        <w:t>Local history – share previous share sessions in browser using indexedDB</w:t>
+      </w:r>
+    </w:p>
+    <w:p>
+      <w:pPr>
+        <w:pStyle w:val="Normal"/>
+        <w:numPr>
+          <w:ilvl w:val="0"/>
+          <w:numId w:val="3"/>
+        </w:numPr>
+        <w:bidi w:val="0"/>
+        <w:jc w:val="both"/>
+        <w:rPr>
+          <w:rFonts w:ascii="SF Pro Text" w:hAnsi="SF Pro Text"/>
+        </w:rPr>
+      </w:pPr>
+      <w:r>
+        <w:rPr>
+          <w:rFonts w:ascii="SF Pro Text" w:hAnsi="SF Pro Text"/>
+        </w:rPr>
+        <w:t>Auto cleanup – sessions expire after inactivity (server + client)</w:t>
+      </w:r>
+    </w:p>
+    <w:p>
+      <w:pPr>
+        <w:pStyle w:val="Normal"/>
+        <w:bidi w:val="0"/>
+        <w:jc w:val="both"/>
+        <w:rPr>
+          <w:rFonts w:ascii="SF Pro Text" w:hAnsi="SF Pro Text"/>
+        </w:rPr>
+      </w:pPr>
+      <w:r>
+        <w:rPr>
+          <w:rFonts w:ascii="SF Pro Text" w:hAnsi="SF Pro Text"/>
+        </w:rPr>
+      </w:r>
+    </w:p>
+    <w:p>
+      <w:pPr>
+        <w:pStyle w:val="Heading1"/>
         <w:numPr>
           <w:ilvl w:val="0"/>
           <w:numId w:val="2"/>
         </w:numPr>
         <w:bidi w:val="0"/>
-        <w:jc w:val="both"/>
-        <w:rPr>
-          <w:rFonts w:ascii="SF Pro Text" w:hAnsi="SF Pro Text"/>
-        </w:rPr>
-      </w:pPr>
-      <w:r>
-        <w:rPr>
-          <w:rFonts w:ascii="SF Pro Text" w:hAnsi="SF Pro Text"/>
-        </w:rPr>
-        <w:t>Join session – Receiver enters the code or scans QR to connect to the sender</w:t>
+        <w:ind w:hanging="0" w:start="0"/>
+        <w:jc w:val="both"/>
+        <w:rPr/>
+      </w:pPr>
+      <w:r>
+        <w:rPr/>
+        <w:t>Non-Functional requirements</w:t>
+      </w:r>
+    </w:p>
+    <w:p>
+      <w:pPr>
+        <w:pStyle w:val="Normal"/>
+        <w:bidi w:val="0"/>
+        <w:jc w:val="both"/>
+        <w:rPr>
+          <w:rFonts w:ascii="SF Pro Text" w:hAnsi="SF Pro Text"/>
+        </w:rPr>
+      </w:pPr>
+      <w:r>
+        <w:rPr>
+          <w:rFonts w:ascii="SF Pro Text" w:hAnsi="SF Pro Text"/>
+        </w:rPr>
+        <w:t xml:space="preserve"> </w:t>
       </w:r>
     </w:p>
     <w:p>
@@ -948,7 +1185,7 @@
         <w:pStyle w:val="Normal"/>
         <w:numPr>
           <w:ilvl w:val="0"/>
-          <w:numId w:val="2"/>
+          <w:numId w:val="4"/>
         </w:numPr>
         <w:bidi w:val="0"/>
         <w:jc w:val="both"/>
@@ -960,7 +1197,7 @@
         <w:rPr>
           <w:rFonts w:ascii="SF Pro Text" w:hAnsi="SF Pro Text"/>
         </w:rPr>
-        <w:t>Peer connection – Once both are in session, a WebRTC data channel is established via socket.IO signaling.</w:t>
+        <w:t>Performance – Must handle 100 concurrent signaling sessions easily. File transfer is P2P. So server load stays low.</w:t>
       </w:r>
     </w:p>
     <w:p>
@@ -968,7 +1205,7 @@
         <w:pStyle w:val="Normal"/>
         <w:numPr>
           <w:ilvl w:val="0"/>
-          <w:numId w:val="2"/>
+          <w:numId w:val="4"/>
         </w:numPr>
         <w:bidi w:val="0"/>
         <w:jc w:val="both"/>
@@ -980,7 +1217,7 @@
         <w:rPr>
           <w:rFonts w:ascii="SF Pro Text" w:hAnsi="SF Pro Text"/>
         </w:rPr>
-        <w:t>File transfer – Sender selects file → gets streamed via WebRTC data channel to receiver</w:t>
+        <w:t>Scalability – Redis for many signaling clients.</w:t>
       </w:r>
     </w:p>
     <w:p>
@@ -988,7 +1225,7 @@
         <w:pStyle w:val="Normal"/>
         <w:numPr>
           <w:ilvl w:val="0"/>
-          <w:numId w:val="2"/>
+          <w:numId w:val="4"/>
         </w:numPr>
         <w:bidi w:val="0"/>
         <w:jc w:val="both"/>
@@ -1000,7 +1237,7 @@
         <w:rPr>
           <w:rFonts w:ascii="SF Pro Text" w:hAnsi="SF Pro Text"/>
         </w:rPr>
-        <w:t>File encryption – Before sending, file is AES-encrypted in the browser. Receiver decrypts it</w:t>
+        <w:t>Security – HTTPS/WSS for all signaling. WebRTC data is encrypted (DTLS).</w:t>
       </w:r>
     </w:p>
     <w:p>
@@ -1008,7 +1245,7 @@
         <w:pStyle w:val="Normal"/>
         <w:numPr>
           <w:ilvl w:val="0"/>
-          <w:numId w:val="2"/>
+          <w:numId w:val="4"/>
         </w:numPr>
         <w:bidi w:val="0"/>
         <w:jc w:val="both"/>
@@ -1020,7 +1257,7 @@
         <w:rPr>
           <w:rFonts w:ascii="SF Pro Text" w:hAnsi="SF Pro Text"/>
         </w:rPr>
-        <w:t>Progress UI – show upload an download progress for each file</w:t>
+        <w:t>Cross-Platform – Works on desktop and mobile browsers</w:t>
       </w:r>
     </w:p>
     <w:p>
@@ -1028,7 +1265,7 @@
         <w:pStyle w:val="Normal"/>
         <w:numPr>
           <w:ilvl w:val="0"/>
-          <w:numId w:val="2"/>
+          <w:numId w:val="4"/>
         </w:numPr>
         <w:bidi w:val="0"/>
         <w:jc w:val="both"/>
@@ -1040,212 +1277,6 @@
         <w:rPr>
           <w:rFonts w:ascii="SF Pro Text" w:hAnsi="SF Pro Text"/>
         </w:rPr>
-        <w:t>Device QR link – show QR code for easier connect on mobile</w:t>
-      </w:r>
-    </w:p>
-    <w:p>
-      <w:pPr>
-        <w:pStyle w:val="Normal"/>
-        <w:numPr>
-          <w:ilvl w:val="0"/>
-          <w:numId w:val="2"/>
-        </w:numPr>
-        <w:bidi w:val="0"/>
-        <w:jc w:val="both"/>
-        <w:rPr>
-          <w:rFonts w:ascii="SF Pro Text" w:hAnsi="SF Pro Text"/>
-        </w:rPr>
-      </w:pPr>
-      <w:r>
-        <w:rPr>
-          <w:rFonts w:ascii="SF Pro Text" w:hAnsi="SF Pro Text"/>
-        </w:rPr>
-        <w:t>Connection fallback – if peer to peer fails (e.g., behind NAT/ firewall) , use Springboot relay proxy.</w:t>
-      </w:r>
-    </w:p>
-    <w:p>
-      <w:pPr>
-        <w:pStyle w:val="Normal"/>
-        <w:numPr>
-          <w:ilvl w:val="0"/>
-          <w:numId w:val="2"/>
-        </w:numPr>
-        <w:bidi w:val="0"/>
-        <w:jc w:val="both"/>
-        <w:rPr>
-          <w:rFonts w:ascii="SF Pro Text" w:hAnsi="SF Pro Text"/>
-        </w:rPr>
-      </w:pPr>
-      <w:r>
-        <w:rPr>
-          <w:rFonts w:ascii="SF Pro Text" w:hAnsi="SF Pro Text"/>
-        </w:rPr>
-        <w:t>Local history – share previous share sessions in browser using indexedDB</w:t>
-      </w:r>
-    </w:p>
-    <w:p>
-      <w:pPr>
-        <w:pStyle w:val="Normal"/>
-        <w:numPr>
-          <w:ilvl w:val="0"/>
-          <w:numId w:val="2"/>
-        </w:numPr>
-        <w:bidi w:val="0"/>
-        <w:jc w:val="both"/>
-        <w:rPr>
-          <w:rFonts w:ascii="SF Pro Text" w:hAnsi="SF Pro Text"/>
-        </w:rPr>
-      </w:pPr>
-      <w:r>
-        <w:rPr>
-          <w:rFonts w:ascii="SF Pro Text" w:hAnsi="SF Pro Text"/>
-        </w:rPr>
-        <w:t>Auto cleanup – sessions expire after inactivity (server + client)</w:t>
-      </w:r>
-    </w:p>
-    <w:p>
-      <w:pPr>
-        <w:pStyle w:val="Normal"/>
-        <w:bidi w:val="0"/>
-        <w:jc w:val="both"/>
-        <w:rPr>
-          <w:rFonts w:ascii="SF Pro Text" w:hAnsi="SF Pro Text"/>
-        </w:rPr>
-      </w:pPr>
-      <w:r>
-        <w:rPr>
-          <w:rFonts w:ascii="SF Pro Text" w:hAnsi="SF Pro Text"/>
-        </w:rPr>
-      </w:r>
-    </w:p>
-    <w:p>
-      <w:pPr>
-        <w:pStyle w:val="Heading1"/>
-        <w:numPr>
-          <w:ilvl w:val="0"/>
-          <w:numId w:val="1"/>
-        </w:numPr>
-        <w:bidi w:val="0"/>
-        <w:ind w:hanging="0" w:start="0"/>
-        <w:jc w:val="both"/>
-        <w:rPr/>
-      </w:pPr>
-      <w:r>
-        <w:rPr/>
-        <w:t>Non-Functional requirements</w:t>
-      </w:r>
-    </w:p>
-    <w:p>
-      <w:pPr>
-        <w:pStyle w:val="Normal"/>
-        <w:bidi w:val="0"/>
-        <w:jc w:val="both"/>
-        <w:rPr>
-          <w:rFonts w:ascii="SF Pro Text" w:hAnsi="SF Pro Text"/>
-        </w:rPr>
-      </w:pPr>
-      <w:r>
-        <w:rPr>
-          <w:rFonts w:ascii="SF Pro Text" w:hAnsi="SF Pro Text"/>
-        </w:rPr>
-        <w:t xml:space="preserve"> </w:t>
-      </w:r>
-    </w:p>
-    <w:p>
-      <w:pPr>
-        <w:pStyle w:val="Normal"/>
-        <w:numPr>
-          <w:ilvl w:val="0"/>
-          <w:numId w:val="3"/>
-        </w:numPr>
-        <w:bidi w:val="0"/>
-        <w:jc w:val="both"/>
-        <w:rPr>
-          <w:rFonts w:ascii="SF Pro Text" w:hAnsi="SF Pro Text"/>
-        </w:rPr>
-      </w:pPr>
-      <w:r>
-        <w:rPr>
-          <w:rFonts w:ascii="SF Pro Text" w:hAnsi="SF Pro Text"/>
-        </w:rPr>
-        <w:t>Performance – Must handle 100 concurrent signaling sessions easily. File transfer is P2P. So server load stays low.</w:t>
-      </w:r>
-    </w:p>
-    <w:p>
-      <w:pPr>
-        <w:pStyle w:val="Normal"/>
-        <w:numPr>
-          <w:ilvl w:val="0"/>
-          <w:numId w:val="3"/>
-        </w:numPr>
-        <w:bidi w:val="0"/>
-        <w:jc w:val="both"/>
-        <w:rPr>
-          <w:rFonts w:ascii="SF Pro Text" w:hAnsi="SF Pro Text"/>
-        </w:rPr>
-      </w:pPr>
-      <w:r>
-        <w:rPr>
-          <w:rFonts w:ascii="SF Pro Text" w:hAnsi="SF Pro Text"/>
-        </w:rPr>
-        <w:t>Scalability – Redis for many signaling clients.</w:t>
-      </w:r>
-    </w:p>
-    <w:p>
-      <w:pPr>
-        <w:pStyle w:val="Normal"/>
-        <w:numPr>
-          <w:ilvl w:val="0"/>
-          <w:numId w:val="3"/>
-        </w:numPr>
-        <w:bidi w:val="0"/>
-        <w:jc w:val="both"/>
-        <w:rPr>
-          <w:rFonts w:ascii="SF Pro Text" w:hAnsi="SF Pro Text"/>
-        </w:rPr>
-      </w:pPr>
-      <w:r>
-        <w:rPr>
-          <w:rFonts w:ascii="SF Pro Text" w:hAnsi="SF Pro Text"/>
-        </w:rPr>
-        <w:t>Security – HTTPS/WSS for all signaling. WebRTC data is encrypted (DTLS).</w:t>
-      </w:r>
-    </w:p>
-    <w:p>
-      <w:pPr>
-        <w:pStyle w:val="Normal"/>
-        <w:numPr>
-          <w:ilvl w:val="0"/>
-          <w:numId w:val="3"/>
-        </w:numPr>
-        <w:bidi w:val="0"/>
-        <w:jc w:val="both"/>
-        <w:rPr>
-          <w:rFonts w:ascii="SF Pro Text" w:hAnsi="SF Pro Text"/>
-        </w:rPr>
-      </w:pPr>
-      <w:r>
-        <w:rPr>
-          <w:rFonts w:ascii="SF Pro Text" w:hAnsi="SF Pro Text"/>
-        </w:rPr>
-        <w:t>Cross-Platform – Works on desktop and mobile browsers</w:t>
-      </w:r>
-    </w:p>
-    <w:p>
-      <w:pPr>
-        <w:pStyle w:val="Normal"/>
-        <w:numPr>
-          <w:ilvl w:val="0"/>
-          <w:numId w:val="3"/>
-        </w:numPr>
-        <w:bidi w:val="0"/>
-        <w:jc w:val="both"/>
-        <w:rPr/>
-      </w:pPr>
-      <w:r>
-        <w:rPr>
-          <w:rFonts w:ascii="SF Pro Text" w:hAnsi="SF Pro Text"/>
-        </w:rPr>
         <w:t>Offline support – Service worker for PWA install and local cache of UI.</w:t>
       </w:r>
     </w:p>
@@ -1267,10 +1298,6 @@
     <w:p>
       <w:pPr>
         <w:pStyle w:val="Normal"/>
-        <w:numPr>
-          <w:ilvl w:val="0"/>
-          <w:numId w:val="0"/>
-        </w:numPr>
         <w:bidi w:val="0"/>
         <w:ind w:hanging="0" w:start="720"/>
         <w:jc w:val="both"/>
@@ -2004,7 +2031,7 @@
         <w:pStyle w:val="Heading1"/>
         <w:numPr>
           <w:ilvl w:val="0"/>
-          <w:numId w:val="1"/>
+          <w:numId w:val="2"/>
         </w:numPr>
         <w:bidi w:val="0"/>
         <w:ind w:hanging="0" w:start="0"/>
@@ -2236,7 +2263,7 @@
         <w:pStyle w:val="Normal"/>
         <w:numPr>
           <w:ilvl w:val="0"/>
-          <w:numId w:val="4"/>
+          <w:numId w:val="5"/>
         </w:numPr>
         <w:bidi w:val="0"/>
         <w:jc w:val="both"/>
@@ -2257,92 +2284,6 @@
           <w:rFonts w:ascii="SF Pro Text" w:hAnsi="SF Pro Text"/>
         </w:rPr>
         <w:t xml:space="preserve"> – how data is stored</w:t>
-      </w:r>
-    </w:p>
-    <w:p>
-      <w:pPr>
-        <w:pStyle w:val="Normal"/>
-        <w:numPr>
-          <w:ilvl w:val="0"/>
-          <w:numId w:val="4"/>
-        </w:numPr>
-        <w:bidi w:val="0"/>
-        <w:jc w:val="both"/>
-        <w:rPr>
-          <w:rFonts w:ascii="SF Pro Text" w:hAnsi="SF Pro Text"/>
-        </w:rPr>
-      </w:pPr>
-      <w:r>
-        <w:rPr>
-          <w:rFonts w:ascii="SF Pro Text" w:hAnsi="SF Pro Text"/>
-        </w:rPr>
-        <w:t>contains redis- specific fields</w:t>
-      </w:r>
-    </w:p>
-    <w:p>
-      <w:pPr>
-        <w:pStyle w:val="Normal"/>
-        <w:numPr>
-          <w:ilvl w:val="0"/>
-          <w:numId w:val="4"/>
-        </w:numPr>
-        <w:bidi w:val="0"/>
-        <w:jc w:val="both"/>
-        <w:rPr>
-          <w:rFonts w:ascii="SF Pro Text" w:hAnsi="SF Pro Text"/>
-        </w:rPr>
-      </w:pPr>
-      <w:r>
-        <w:rPr>
-          <w:rFonts w:ascii="SF Pro Text" w:hAnsi="SF Pro Text"/>
-        </w:rPr>
-        <w:t>never exposed directly to API</w:t>
-      </w:r>
-    </w:p>
-    <w:p>
-      <w:pPr>
-        <w:pStyle w:val="Normal"/>
-        <w:bidi w:val="0"/>
-        <w:jc w:val="both"/>
-        <w:rPr>
-          <w:rFonts w:ascii="SF Pro Text" w:hAnsi="SF Pro Text"/>
-        </w:rPr>
-      </w:pPr>
-      <w:r>
-        <w:rPr>
-          <w:rFonts w:ascii="SF Pro Text" w:hAnsi="SF Pro Text"/>
-        </w:rPr>
-      </w:r>
-    </w:p>
-    <w:p>
-      <w:pPr>
-        <w:pStyle w:val="Normal"/>
-        <w:bidi w:val="0"/>
-        <w:jc w:val="both"/>
-        <w:rPr>
-          <w:rFonts w:ascii="SF Pro Text" w:hAnsi="SF Pro Text"/>
-        </w:rPr>
-      </w:pPr>
-      <w:r>
-        <w:rPr>
-          <w:rFonts w:ascii="SF Pro Text" w:hAnsi="SF Pro Text"/>
-        </w:rPr>
-        <w:t>DTO(SessionResponse.java)</w:t>
-      </w:r>
-    </w:p>
-    <w:p>
-      <w:pPr>
-        <w:pStyle w:val="Normal"/>
-        <w:bidi w:val="0"/>
-        <w:jc w:val="both"/>
-        <w:rPr>
-          <w:rFonts w:ascii="SF Pro Text" w:hAnsi="SF Pro Text"/>
-        </w:rPr>
-      </w:pPr>
-      <w:r>
-        <w:rPr>
-          <w:rFonts w:ascii="SF Pro Text" w:hAnsi="SF Pro Text"/>
-        </w:rPr>
       </w:r>
     </w:p>
     <w:p>
@@ -2361,16 +2302,8 @@
       <w:r>
         <w:rPr>
           <w:rFonts w:ascii="SF Pro Text" w:hAnsi="SF Pro Text"/>
-          <w:b/>
-          <w:bCs/>
-        </w:rPr>
-        <w:t>External representation</w:t>
-      </w:r>
-      <w:r>
-        <w:rPr>
-          <w:rFonts w:ascii="SF Pro Text" w:hAnsi="SF Pro Text"/>
-        </w:rPr>
-        <w:t xml:space="preserve"> – what API returns</w:t>
+        </w:rPr>
+        <w:t>contains redis- specific fields</w:t>
       </w:r>
     </w:p>
     <w:p>
@@ -2390,83 +2323,38 @@
         <w:rPr>
           <w:rFonts w:ascii="SF Pro Text" w:hAnsi="SF Pro Text"/>
         </w:rPr>
-        <w:t>only contains fields client need</w:t>
-      </w:r>
-    </w:p>
-    <w:p>
-      <w:pPr>
-        <w:pStyle w:val="Normal"/>
-        <w:bidi w:val="0"/>
-        <w:jc w:val="both"/>
-        <w:rPr>
-          <w:rFonts w:ascii="SF Pro Text" w:hAnsi="SF Pro Text"/>
-        </w:rPr>
-      </w:pPr>
-      <w:r>
-        <w:rPr>
-          <w:rFonts w:ascii="SF Pro Text" w:hAnsi="SF Pro Text"/>
-        </w:rPr>
-      </w:r>
-    </w:p>
-    <w:p>
-      <w:pPr>
-        <w:pStyle w:val="Normal"/>
-        <w:bidi w:val="0"/>
-        <w:jc w:val="both"/>
-        <w:rPr>
-          <w:rFonts w:ascii="SF Pro Text" w:hAnsi="SF Pro Text"/>
-        </w:rPr>
-      </w:pPr>
-      <w:r>
-        <w:rPr>
-          <w:rFonts w:ascii="SF Pro Text" w:hAnsi="SF Pro Text"/>
-        </w:rPr>
-      </w:r>
-    </w:p>
-    <w:p>
-      <w:pPr>
-        <w:pStyle w:val="Normal"/>
-        <w:bidi w:val="0"/>
-        <w:jc w:val="both"/>
-        <w:rPr>
-          <w:rFonts w:ascii="SF Pro Text" w:hAnsi="SF Pro Text"/>
-        </w:rPr>
-      </w:pPr>
-      <w:r>
-        <w:rPr>
-          <w:rFonts w:ascii="SF Pro Text" w:hAnsi="SF Pro Text"/>
-        </w:rPr>
-      </w:r>
-    </w:p>
-    <w:p>
-      <w:pPr>
-        <w:pStyle w:val="Normal"/>
-        <w:bidi w:val="0"/>
-        <w:jc w:val="both"/>
-        <w:rPr>
-          <w:rFonts w:ascii="SF Pro Text" w:hAnsi="SF Pro Text"/>
-        </w:rPr>
-      </w:pPr>
-      <w:r>
-        <w:rPr>
-          <w:rFonts w:ascii="SF Pro Text" w:hAnsi="SF Pro Text"/>
-        </w:rPr>
-      </w:r>
-    </w:p>
-    <w:p>
-      <w:pPr>
-        <w:pStyle w:val="Normal"/>
-        <w:bidi w:val="0"/>
-        <w:jc w:val="both"/>
-        <w:rPr>
-          <w:rFonts w:ascii="SF Pro Text" w:hAnsi="SF Pro Text"/>
-        </w:rPr>
-      </w:pPr>
-      <w:r>
-        <w:rPr>
-          <w:rFonts w:ascii="SF Pro Text" w:hAnsi="SF Pro Text"/>
-        </w:rPr>
-        <w:t xml:space="preserve">What is Redis template? </w:t>
+        <w:t>never exposed directly to API</w:t>
+      </w:r>
+    </w:p>
+    <w:p>
+      <w:pPr>
+        <w:pStyle w:val="Normal"/>
+        <w:bidi w:val="0"/>
+        <w:jc w:val="both"/>
+        <w:rPr>
+          <w:rFonts w:ascii="SF Pro Text" w:hAnsi="SF Pro Text"/>
+        </w:rPr>
+      </w:pPr>
+      <w:r>
+        <w:rPr>
+          <w:rFonts w:ascii="SF Pro Text" w:hAnsi="SF Pro Text"/>
+        </w:rPr>
+      </w:r>
+    </w:p>
+    <w:p>
+      <w:pPr>
+        <w:pStyle w:val="Normal"/>
+        <w:bidi w:val="0"/>
+        <w:jc w:val="both"/>
+        <w:rPr>
+          <w:rFonts w:ascii="SF Pro Text" w:hAnsi="SF Pro Text"/>
+        </w:rPr>
+      </w:pPr>
+      <w:r>
+        <w:rPr>
+          <w:rFonts w:ascii="SF Pro Text" w:hAnsi="SF Pro Text"/>
+        </w:rPr>
+        <w:t>DTO(SessionResponse.java)</w:t>
       </w:r>
     </w:p>
     <w:p>
@@ -2493,13 +2381,23 @@
         </w:numPr>
         <w:bidi w:val="0"/>
         <w:jc w:val="both"/>
-        <w:rPr/>
-      </w:pPr>
-      <w:r>
-        <w:rPr>
-          <w:rFonts w:ascii="SF Pro Text" w:hAnsi="SF Pro Text"/>
-        </w:rPr>
-        <w:t>Its like a toolbox for redis operations:</w:t>
+        <w:rPr>
+          <w:rFonts w:ascii="SF Pro Text" w:hAnsi="SF Pro Text"/>
+        </w:rPr>
+      </w:pPr>
+      <w:r>
+        <w:rPr>
+          <w:rFonts w:ascii="SF Pro Text" w:hAnsi="SF Pro Text"/>
+          <w:b/>
+          <w:bCs/>
+        </w:rPr>
+        <w:t>External representation</w:t>
+      </w:r>
+      <w:r>
+        <w:rPr>
+          <w:rFonts w:ascii="SF Pro Text" w:hAnsi="SF Pro Text"/>
+        </w:rPr>
+        <w:t xml:space="preserve"> – what API returns</w:t>
       </w:r>
     </w:p>
     <w:p>
@@ -2511,13 +2409,106 @@
         </w:numPr>
         <w:bidi w:val="0"/>
         <w:jc w:val="both"/>
-        <w:rPr/>
-      </w:pPr>
-      <w:r>
-        <w:rPr>
-          <w:rFonts w:ascii="SF Pro Text" w:hAnsi="SF Pro Text"/>
-        </w:rPr>
-        <w:t>set(key,value) – store data</w:t>
+        <w:rPr>
+          <w:rFonts w:ascii="SF Pro Text" w:hAnsi="SF Pro Text"/>
+        </w:rPr>
+      </w:pPr>
+      <w:r>
+        <w:rPr>
+          <w:rFonts w:ascii="SF Pro Text" w:hAnsi="SF Pro Text"/>
+        </w:rPr>
+        <w:t>only contains fields client need</w:t>
+      </w:r>
+    </w:p>
+    <w:p>
+      <w:pPr>
+        <w:pStyle w:val="Normal"/>
+        <w:bidi w:val="0"/>
+        <w:jc w:val="both"/>
+        <w:rPr>
+          <w:rFonts w:ascii="SF Pro Text" w:hAnsi="SF Pro Text"/>
+        </w:rPr>
+      </w:pPr>
+      <w:r>
+        <w:rPr>
+          <w:rFonts w:ascii="SF Pro Text" w:hAnsi="SF Pro Text"/>
+        </w:rPr>
+      </w:r>
+    </w:p>
+    <w:p>
+      <w:pPr>
+        <w:pStyle w:val="Normal"/>
+        <w:bidi w:val="0"/>
+        <w:jc w:val="both"/>
+        <w:rPr>
+          <w:rFonts w:ascii="SF Pro Text" w:hAnsi="SF Pro Text"/>
+        </w:rPr>
+      </w:pPr>
+      <w:r>
+        <w:rPr>
+          <w:rFonts w:ascii="SF Pro Text" w:hAnsi="SF Pro Text"/>
+        </w:rPr>
+      </w:r>
+    </w:p>
+    <w:p>
+      <w:pPr>
+        <w:pStyle w:val="Normal"/>
+        <w:bidi w:val="0"/>
+        <w:jc w:val="both"/>
+        <w:rPr>
+          <w:rFonts w:ascii="SF Pro Text" w:hAnsi="SF Pro Text"/>
+        </w:rPr>
+      </w:pPr>
+      <w:r>
+        <w:rPr>
+          <w:rFonts w:ascii="SF Pro Text" w:hAnsi="SF Pro Text"/>
+        </w:rPr>
+      </w:r>
+    </w:p>
+    <w:p>
+      <w:pPr>
+        <w:pStyle w:val="Normal"/>
+        <w:bidi w:val="0"/>
+        <w:jc w:val="both"/>
+        <w:rPr>
+          <w:rFonts w:ascii="SF Pro Text" w:hAnsi="SF Pro Text"/>
+        </w:rPr>
+      </w:pPr>
+      <w:r>
+        <w:rPr>
+          <w:rFonts w:ascii="SF Pro Text" w:hAnsi="SF Pro Text"/>
+        </w:rPr>
+      </w:r>
+    </w:p>
+    <w:p>
+      <w:pPr>
+        <w:pStyle w:val="Normal"/>
+        <w:bidi w:val="0"/>
+        <w:jc w:val="both"/>
+        <w:rPr>
+          <w:rFonts w:ascii="SF Pro Text" w:hAnsi="SF Pro Text"/>
+        </w:rPr>
+      </w:pPr>
+      <w:r>
+        <w:rPr>
+          <w:rFonts w:ascii="SF Pro Text" w:hAnsi="SF Pro Text"/>
+        </w:rPr>
+        <w:t xml:space="preserve">What is Redis template? </w:t>
+      </w:r>
+    </w:p>
+    <w:p>
+      <w:pPr>
+        <w:pStyle w:val="Normal"/>
+        <w:bidi w:val="0"/>
+        <w:jc w:val="both"/>
+        <w:rPr>
+          <w:rFonts w:ascii="SF Pro Text" w:hAnsi="SF Pro Text"/>
+        </w:rPr>
+      </w:pPr>
+      <w:r>
+        <w:rPr>
+          <w:rFonts w:ascii="SF Pro Text" w:hAnsi="SF Pro Text"/>
+        </w:rPr>
       </w:r>
     </w:p>
     <w:p>
@@ -2525,17 +2516,19 @@
         <w:pStyle w:val="Normal"/>
         <w:numPr>
           <w:ilvl w:val="0"/>
-          <w:numId w:val="6"/>
+          <w:numId w:val="7"/>
         </w:numPr>
         <w:bidi w:val="0"/>
         <w:jc w:val="both"/>
-        <w:rPr/>
-      </w:pPr>
-      <w:r>
-        <w:rPr>
-          <w:rFonts w:ascii="SF Pro Text" w:hAnsi="SF Pro Text"/>
-        </w:rPr>
-        <w:t>get(key) – retrieve data</w:t>
+        <w:rPr>
+          <w:rFonts w:ascii="SF Pro Text" w:hAnsi="SF Pro Text"/>
+        </w:rPr>
+      </w:pPr>
+      <w:r>
+        <w:rPr>
+          <w:rFonts w:ascii="SF Pro Text" w:hAnsi="SF Pro Text"/>
+        </w:rPr>
+        <w:t>Its like a toolbox for redis operations:</w:t>
       </w:r>
     </w:p>
     <w:p>
@@ -2543,17 +2536,19 @@
         <w:pStyle w:val="Normal"/>
         <w:numPr>
           <w:ilvl w:val="0"/>
-          <w:numId w:val="6"/>
+          <w:numId w:val="7"/>
         </w:numPr>
         <w:bidi w:val="0"/>
         <w:jc w:val="both"/>
-        <w:rPr/>
-      </w:pPr>
-      <w:r>
-        <w:rPr>
-          <w:rFonts w:ascii="SF Pro Text" w:hAnsi="SF Pro Text"/>
-        </w:rPr>
-        <w:t>delete(key) – remove data</w:t>
+        <w:rPr>
+          <w:rFonts w:ascii="SF Pro Text" w:hAnsi="SF Pro Text"/>
+        </w:rPr>
+      </w:pPr>
+      <w:r>
+        <w:rPr>
+          <w:rFonts w:ascii="SF Pro Text" w:hAnsi="SF Pro Text"/>
+        </w:rPr>
+        <w:t>set(key,value) – store data</w:t>
       </w:r>
     </w:p>
     <w:p>
@@ -2561,7 +2556,47 @@
         <w:pStyle w:val="Normal"/>
         <w:numPr>
           <w:ilvl w:val="0"/>
-          <w:numId w:val="6"/>
+          <w:numId w:val="7"/>
+        </w:numPr>
+        <w:bidi w:val="0"/>
+        <w:jc w:val="both"/>
+        <w:rPr>
+          <w:rFonts w:ascii="SF Pro Text" w:hAnsi="SF Pro Text"/>
+        </w:rPr>
+      </w:pPr>
+      <w:r>
+        <w:rPr>
+          <w:rFonts w:ascii="SF Pro Text" w:hAnsi="SF Pro Text"/>
+        </w:rPr>
+        <w:t>get(key) – retrieve data</w:t>
+      </w:r>
+    </w:p>
+    <w:p>
+      <w:pPr>
+        <w:pStyle w:val="Normal"/>
+        <w:numPr>
+          <w:ilvl w:val="0"/>
+          <w:numId w:val="7"/>
+        </w:numPr>
+        <w:bidi w:val="0"/>
+        <w:jc w:val="both"/>
+        <w:rPr>
+          <w:rFonts w:ascii="SF Pro Text" w:hAnsi="SF Pro Text"/>
+        </w:rPr>
+      </w:pPr>
+      <w:r>
+        <w:rPr>
+          <w:rFonts w:ascii="SF Pro Text" w:hAnsi="SF Pro Text"/>
+        </w:rPr>
+        <w:t>delete(key) – remove data</w:t>
+      </w:r>
+    </w:p>
+    <w:p>
+      <w:pPr>
+        <w:pStyle w:val="Normal"/>
+        <w:numPr>
+          <w:ilvl w:val="0"/>
+          <w:numId w:val="7"/>
         </w:numPr>
         <w:bidi w:val="0"/>
         <w:jc w:val="both"/>
@@ -3000,7 +3035,7 @@
         <w:pStyle w:val="Normal"/>
         <w:numPr>
           <w:ilvl w:val="0"/>
-          <w:numId w:val="7"/>
+          <w:numId w:val="8"/>
         </w:numPr>
         <w:bidi w:val="0"/>
         <w:jc w:val="both"/>
@@ -3020,7 +3055,7 @@
         <w:pStyle w:val="Normal"/>
         <w:numPr>
           <w:ilvl w:val="0"/>
-          <w:numId w:val="7"/>
+          <w:numId w:val="8"/>
         </w:numPr>
         <w:bidi w:val="0"/>
         <w:jc w:val="both"/>
@@ -3040,7 +3075,7 @@
         <w:pStyle w:val="Normal"/>
         <w:numPr>
           <w:ilvl w:val="0"/>
-          <w:numId w:val="7"/>
+          <w:numId w:val="8"/>
         </w:numPr>
         <w:bidi w:val="0"/>
         <w:jc w:val="both"/>
@@ -3116,7 +3151,7 @@
       </w:tblPr>
       <w:tblGrid>
         <w:gridCol w:w="3212"/>
-        <w:gridCol w:w="6425"/>
+        <w:gridCol w:w="6426"/>
       </w:tblGrid>
       <w:tr>
         <w:trPr/>
@@ -3142,7 +3177,7 @@
         </w:tc>
         <w:tc>
           <w:tcPr>
-            <w:tcW w:w="6425" w:type="dxa"/>
+            <w:tcW w:w="6426" w:type="dxa"/>
             <w:tcBorders>
               <w:top w:val="single" w:sz="4" w:space="0" w:color="000000"/>
               <w:start w:val="single" w:sz="4" w:space="0" w:color="000000"/>
@@ -3185,7 +3220,67 @@
         </w:tc>
         <w:tc>
           <w:tcPr>
-            <w:tcW w:w="6425" w:type="dxa"/>
+            <w:tcW w:w="6426" w:type="dxa"/>
+            <w:tcBorders>
+              <w:start w:val="single" w:sz="4" w:space="0" w:color="000000"/>
+              <w:bottom w:val="single" w:sz="4" w:space="0" w:color="000000"/>
+              <w:end w:val="single" w:sz="4" w:space="0" w:color="000000"/>
+            </w:tcBorders>
+          </w:tcPr>
+          <w:p>
+            <w:pPr>
+              <w:pStyle w:val="TableContents"/>
+              <w:numPr>
+                <w:ilvl w:val="0"/>
+                <w:numId w:val="10"/>
+              </w:numPr>
+              <w:rPr/>
+            </w:pPr>
+            <w:r>
+              <w:rPr/>
+              <w:t>Type of signaling message.</w:t>
+            </w:r>
+          </w:p>
+          <w:p>
+            <w:pPr>
+              <w:pStyle w:val="TableContents"/>
+              <w:numPr>
+                <w:ilvl w:val="0"/>
+                <w:numId w:val="10"/>
+              </w:numPr>
+              <w:rPr/>
+            </w:pPr>
+            <w:r>
+              <w:rPr/>
+              <w:t>Value: offer, answer, ice_candidate</w:t>
+            </w:r>
+          </w:p>
+        </w:tc>
+      </w:tr>
+      <w:tr>
+        <w:trPr/>
+        <w:tc>
+          <w:tcPr>
+            <w:tcW w:w="3212" w:type="dxa"/>
+            <w:tcBorders>
+              <w:start w:val="single" w:sz="4" w:space="0" w:color="000000"/>
+              <w:bottom w:val="single" w:sz="4" w:space="0" w:color="000000"/>
+            </w:tcBorders>
+          </w:tcPr>
+          <w:p>
+            <w:pPr>
+              <w:pStyle w:val="TableContents"/>
+              <w:rPr/>
+            </w:pPr>
+            <w:r>
+              <w:rPr/>
+              <w:t>SessionId</w:t>
+            </w:r>
+          </w:p>
+        </w:tc>
+        <w:tc>
+          <w:tcPr>
+            <w:tcW w:w="6426" w:type="dxa"/>
             <w:tcBorders>
               <w:start w:val="single" w:sz="4" w:space="0" w:color="000000"/>
               <w:bottom w:val="single" w:sz="4" w:space="0" w:color="000000"/>
@@ -3203,9 +3298,41 @@
             </w:pPr>
             <w:r>
               <w:rPr/>
-              <w:t>Type of signaling message.</w:t>
-            </w:r>
-          </w:p>
+              <w:t>Session ID this message belongs</w:t>
+            </w:r>
+          </w:p>
+        </w:tc>
+      </w:tr>
+      <w:tr>
+        <w:trPr/>
+        <w:tc>
+          <w:tcPr>
+            <w:tcW w:w="3212" w:type="dxa"/>
+            <w:tcBorders>
+              <w:start w:val="single" w:sz="4" w:space="0" w:color="000000"/>
+              <w:bottom w:val="single" w:sz="4" w:space="0" w:color="000000"/>
+            </w:tcBorders>
+          </w:tcPr>
+          <w:p>
+            <w:pPr>
+              <w:pStyle w:val="TableContents"/>
+              <w:rPr/>
+            </w:pPr>
+            <w:r>
+              <w:rPr/>
+              <w:t>Sdp</w:t>
+            </w:r>
+          </w:p>
+        </w:tc>
+        <w:tc>
+          <w:tcPr>
+            <w:tcW w:w="6426" w:type="dxa"/>
+            <w:tcBorders>
+              <w:start w:val="single" w:sz="4" w:space="0" w:color="000000"/>
+              <w:bottom w:val="single" w:sz="4" w:space="0" w:color="000000"/>
+              <w:end w:val="single" w:sz="4" w:space="0" w:color="000000"/>
+            </w:tcBorders>
+          </w:tcPr>
           <w:p>
             <w:pPr>
               <w:pStyle w:val="TableContents"/>
@@ -3217,7 +3344,35 @@
             </w:pPr>
             <w:r>
               <w:rPr/>
-              <w:t>Value: offer, answer, ice_candidate</w:t>
+              <w:t>SDP data</w:t>
+            </w:r>
+          </w:p>
+          <w:p>
+            <w:pPr>
+              <w:pStyle w:val="TableContents"/>
+              <w:numPr>
+                <w:ilvl w:val="0"/>
+                <w:numId w:val="9"/>
+              </w:numPr>
+              <w:rPr/>
+            </w:pPr>
+            <w:r>
+              <w:rPr/>
+              <w:t>Contains connection parameters (e.g., codecs, formats, etc.)</w:t>
+            </w:r>
+          </w:p>
+          <w:p>
+            <w:pPr>
+              <w:pStyle w:val="TableContents"/>
+              <w:numPr>
+                <w:ilvl w:val="0"/>
+                <w:numId w:val="9"/>
+              </w:numPr>
+              <w:rPr/>
+            </w:pPr>
+            <w:r>
+              <w:rPr/>
+              <w:t>Used for OFFER and ANSWER messages</w:t>
             </w:r>
           </w:p>
         </w:tc>
@@ -3239,253 +3394,13 @@
             </w:pPr>
             <w:r>
               <w:rPr/>
-              <w:t>SessionId</w:t>
-            </w:r>
-          </w:p>
-        </w:tc>
-        <w:tc>
-          <w:tcPr>
-            <w:tcW w:w="6425" w:type="dxa"/>
-            <w:tcBorders>
-              <w:start w:val="single" w:sz="4" w:space="0" w:color="000000"/>
-              <w:bottom w:val="single" w:sz="4" w:space="0" w:color="000000"/>
-              <w:end w:val="single" w:sz="4" w:space="0" w:color="000000"/>
-            </w:tcBorders>
-          </w:tcPr>
-          <w:p>
-            <w:pPr>
-              <w:pStyle w:val="TableContents"/>
-              <w:numPr>
-                <w:ilvl w:val="0"/>
-                <w:numId w:val="8"/>
-              </w:numPr>
-              <w:rPr/>
-            </w:pPr>
-            <w:r>
-              <w:rPr/>
-              <w:t>Session ID this message belongs</w:t>
-            </w:r>
-          </w:p>
-        </w:tc>
-      </w:tr>
-      <w:tr>
-        <w:trPr/>
-        <w:tc>
-          <w:tcPr>
-            <w:tcW w:w="3212" w:type="dxa"/>
-            <w:tcBorders>
-              <w:start w:val="single" w:sz="4" w:space="0" w:color="000000"/>
-              <w:bottom w:val="single" w:sz="4" w:space="0" w:color="000000"/>
-            </w:tcBorders>
-          </w:tcPr>
-          <w:p>
-            <w:pPr>
-              <w:pStyle w:val="TableContents"/>
-              <w:rPr/>
-            </w:pPr>
-            <w:r>
-              <w:rPr/>
-              <w:t>Sdp</w:t>
-            </w:r>
-          </w:p>
-        </w:tc>
-        <w:tc>
-          <w:tcPr>
-            <w:tcW w:w="6425" w:type="dxa"/>
-            <w:tcBorders>
-              <w:start w:val="single" w:sz="4" w:space="0" w:color="000000"/>
-              <w:bottom w:val="single" w:sz="4" w:space="0" w:color="000000"/>
-              <w:end w:val="single" w:sz="4" w:space="0" w:color="000000"/>
-            </w:tcBorders>
-          </w:tcPr>
-          <w:p>
-            <w:pPr>
-              <w:pStyle w:val="TableContents"/>
-              <w:numPr>
-                <w:ilvl w:val="0"/>
-                <w:numId w:val="8"/>
-              </w:numPr>
-              <w:rPr/>
-            </w:pPr>
-            <w:r>
-              <w:rPr/>
-              <w:t>SDP data</w:t>
-            </w:r>
-          </w:p>
-          <w:p>
-            <w:pPr>
-              <w:pStyle w:val="TableContents"/>
-              <w:numPr>
-                <w:ilvl w:val="0"/>
-                <w:numId w:val="8"/>
-              </w:numPr>
-              <w:rPr/>
-            </w:pPr>
-            <w:r>
-              <w:rPr/>
-              <w:t>Contains connection parameters (e.g., codecs, formats, etc.)</w:t>
-            </w:r>
-          </w:p>
-          <w:p>
-            <w:pPr>
-              <w:pStyle w:val="TableContents"/>
-              <w:numPr>
-                <w:ilvl w:val="0"/>
-                <w:numId w:val="8"/>
-              </w:numPr>
-              <w:rPr/>
-            </w:pPr>
-            <w:r>
-              <w:rPr/>
-              <w:t>Used for OFFER and ANSWER messages</w:t>
-            </w:r>
-          </w:p>
-        </w:tc>
-      </w:tr>
-      <w:tr>
-        <w:trPr/>
-        <w:tc>
-          <w:tcPr>
-            <w:tcW w:w="3212" w:type="dxa"/>
-            <w:tcBorders>
-              <w:start w:val="single" w:sz="4" w:space="0" w:color="000000"/>
-              <w:bottom w:val="single" w:sz="4" w:space="0" w:color="000000"/>
-            </w:tcBorders>
-          </w:tcPr>
-          <w:p>
-            <w:pPr>
-              <w:pStyle w:val="TableContents"/>
-              <w:rPr/>
-            </w:pPr>
-            <w:r>
-              <w:rPr/>
               <w:t>Candidate</w:t>
             </w:r>
           </w:p>
         </w:tc>
         <w:tc>
           <w:tcPr>
-            <w:tcW w:w="6425" w:type="dxa"/>
-            <w:tcBorders>
-              <w:start w:val="single" w:sz="4" w:space="0" w:color="000000"/>
-              <w:bottom w:val="single" w:sz="4" w:space="0" w:color="000000"/>
-              <w:end w:val="single" w:sz="4" w:space="0" w:color="000000"/>
-            </w:tcBorders>
-          </w:tcPr>
-          <w:p>
-            <w:pPr>
-              <w:pStyle w:val="TableContents"/>
-              <w:numPr>
-                <w:ilvl w:val="0"/>
-                <w:numId w:val="10"/>
-              </w:numPr>
-              <w:rPr/>
-            </w:pPr>
-            <w:r>
-              <w:rPr/>
-              <w:t>ICE candidate data</w:t>
-            </w:r>
-          </w:p>
-          <w:p>
-            <w:pPr>
-              <w:pStyle w:val="TableContents"/>
-              <w:numPr>
-                <w:ilvl w:val="0"/>
-                <w:numId w:val="10"/>
-              </w:numPr>
-              <w:rPr/>
-            </w:pPr>
-            <w:r>
-              <w:rPr/>
-              <w:t>Contains network route information (IP,port,protocol)</w:t>
-            </w:r>
-          </w:p>
-          <w:p>
-            <w:pPr>
-              <w:pStyle w:val="TableContents"/>
-              <w:numPr>
-                <w:ilvl w:val="0"/>
-                <w:numId w:val="10"/>
-              </w:numPr>
-              <w:rPr/>
-            </w:pPr>
-            <w:r>
-              <w:rPr/>
-              <w:t>Used for ICE_CANDIDATE messages</w:t>
-            </w:r>
-          </w:p>
-        </w:tc>
-      </w:tr>
-      <w:tr>
-        <w:trPr/>
-        <w:tc>
-          <w:tcPr>
-            <w:tcW w:w="3212" w:type="dxa"/>
-            <w:tcBorders>
-              <w:start w:val="single" w:sz="4" w:space="0" w:color="000000"/>
-              <w:bottom w:val="single" w:sz="4" w:space="0" w:color="000000"/>
-            </w:tcBorders>
-          </w:tcPr>
-          <w:p>
-            <w:pPr>
-              <w:pStyle w:val="TableContents"/>
-              <w:rPr/>
-            </w:pPr>
-            <w:r>
-              <w:rPr/>
-              <w:t>From</w:t>
-            </w:r>
-          </w:p>
-        </w:tc>
-        <w:tc>
-          <w:tcPr>
-            <w:tcW w:w="6425" w:type="dxa"/>
-            <w:tcBorders>
-              <w:start w:val="single" w:sz="4" w:space="0" w:color="000000"/>
-              <w:bottom w:val="single" w:sz="4" w:space="0" w:color="000000"/>
-              <w:end w:val="single" w:sz="4" w:space="0" w:color="000000"/>
-            </w:tcBorders>
-          </w:tcPr>
-          <w:p>
-            <w:pPr>
-              <w:pStyle w:val="TableContents"/>
-              <w:numPr>
-                <w:ilvl w:val="0"/>
-                <w:numId w:val="8"/>
-              </w:numPr>
-              <w:rPr/>
-            </w:pPr>
-            <w:r>
-              <w:rPr/>
-              <w:t>Senders socket ID (for routing)</w:t>
-            </w:r>
-          </w:p>
-        </w:tc>
-      </w:tr>
-      <w:tr>
-        <w:trPr/>
-        <w:tc>
-          <w:tcPr>
-            <w:tcW w:w="3212" w:type="dxa"/>
-            <w:tcBorders>
-              <w:start w:val="single" w:sz="4" w:space="0" w:color="000000"/>
-              <w:bottom w:val="single" w:sz="4" w:space="0" w:color="000000"/>
-            </w:tcBorders>
-          </w:tcPr>
-          <w:p>
-            <w:pPr>
-              <w:pStyle w:val="TableContents"/>
-              <w:rPr/>
-            </w:pPr>
-            <w:r>
-              <w:rPr/>
-              <w:t>To</w:t>
-            </w:r>
-          </w:p>
-        </w:tc>
-        <w:tc>
-          <w:tcPr>
-            <w:tcW w:w="6425" w:type="dxa"/>
+            <w:tcW w:w="6426" w:type="dxa"/>
             <w:tcBorders>
               <w:start w:val="single" w:sz="4" w:space="0" w:color="000000"/>
               <w:bottom w:val="single" w:sz="4" w:space="0" w:color="000000"/>
@@ -3503,7 +3418,35 @@
             </w:pPr>
             <w:r>
               <w:rPr/>
-              <w:t>Receiver’s socket ID (for routing)</w:t>
+              <w:t>ICE candidate data</w:t>
+            </w:r>
+          </w:p>
+          <w:p>
+            <w:pPr>
+              <w:pStyle w:val="TableContents"/>
+              <w:numPr>
+                <w:ilvl w:val="0"/>
+                <w:numId w:val="11"/>
+              </w:numPr>
+              <w:rPr/>
+            </w:pPr>
+            <w:r>
+              <w:rPr/>
+              <w:t>Contains network route information (IP,port,protocol)</w:t>
+            </w:r>
+          </w:p>
+          <w:p>
+            <w:pPr>
+              <w:pStyle w:val="TableContents"/>
+              <w:numPr>
+                <w:ilvl w:val="0"/>
+                <w:numId w:val="11"/>
+              </w:numPr>
+              <w:rPr/>
+            </w:pPr>
+            <w:r>
+              <w:rPr/>
+              <w:t>Used for ICE_CANDIDATE messages</w:t>
             </w:r>
           </w:p>
         </w:tc>
@@ -3525,13 +3468,59 @@
             </w:pPr>
             <w:r>
               <w:rPr/>
-              <w:t>Message</w:t>
-            </w:r>
-          </w:p>
-        </w:tc>
-        <w:tc>
-          <w:tcPr>
-            <w:tcW w:w="6425" w:type="dxa"/>
+              <w:t>From</w:t>
+            </w:r>
+          </w:p>
+        </w:tc>
+        <w:tc>
+          <w:tcPr>
+            <w:tcW w:w="6426" w:type="dxa"/>
+            <w:tcBorders>
+              <w:start w:val="single" w:sz="4" w:space="0" w:color="000000"/>
+              <w:bottom w:val="single" w:sz="4" w:space="0" w:color="000000"/>
+              <w:end w:val="single" w:sz="4" w:space="0" w:color="000000"/>
+            </w:tcBorders>
+          </w:tcPr>
+          <w:p>
+            <w:pPr>
+              <w:pStyle w:val="TableContents"/>
+              <w:numPr>
+                <w:ilvl w:val="0"/>
+                <w:numId w:val="9"/>
+              </w:numPr>
+              <w:rPr/>
+            </w:pPr>
+            <w:r>
+              <w:rPr/>
+              <w:t>Senders socket ID (for routing)</w:t>
+            </w:r>
+          </w:p>
+        </w:tc>
+      </w:tr>
+      <w:tr>
+        <w:trPr/>
+        <w:tc>
+          <w:tcPr>
+            <w:tcW w:w="3212" w:type="dxa"/>
+            <w:tcBorders>
+              <w:start w:val="single" w:sz="4" w:space="0" w:color="000000"/>
+              <w:bottom w:val="single" w:sz="4" w:space="0" w:color="000000"/>
+            </w:tcBorders>
+          </w:tcPr>
+          <w:p>
+            <w:pPr>
+              <w:pStyle w:val="TableContents"/>
+              <w:rPr/>
+            </w:pPr>
+            <w:r>
+              <w:rPr/>
+              <w:t>To</w:t>
+            </w:r>
+          </w:p>
+        </w:tc>
+        <w:tc>
+          <w:tcPr>
+            <w:tcW w:w="6426" w:type="dxa"/>
             <w:tcBorders>
               <w:start w:val="single" w:sz="4" w:space="0" w:color="000000"/>
               <w:bottom w:val="single" w:sz="4" w:space="0" w:color="000000"/>
@@ -3549,7 +3538,7 @@
             </w:pPr>
             <w:r>
               <w:rPr/>
-              <w:t>Additional metadata and error messages</w:t>
+              <w:t>Receiver’s socket ID (for routing)</w:t>
             </w:r>
           </w:p>
         </w:tc>
@@ -3571,13 +3560,13 @@
             </w:pPr>
             <w:r>
               <w:rPr/>
-              <w:t>Timestamp</w:t>
-            </w:r>
-          </w:p>
-        </w:tc>
-        <w:tc>
-          <w:tcPr>
-            <w:tcW w:w="6425" w:type="dxa"/>
+              <w:t>Message</w:t>
+            </w:r>
+          </w:p>
+        </w:tc>
+        <w:tc>
+          <w:tcPr>
+            <w:tcW w:w="6426" w:type="dxa"/>
             <w:tcBorders>
               <w:start w:val="single" w:sz="4" w:space="0" w:color="000000"/>
               <w:bottom w:val="single" w:sz="4" w:space="0" w:color="000000"/>
@@ -3590,6 +3579,52 @@
               <w:numPr>
                 <w:ilvl w:val="0"/>
                 <w:numId w:val="13"/>
+              </w:numPr>
+              <w:rPr/>
+            </w:pPr>
+            <w:r>
+              <w:rPr/>
+              <w:t>Additional metadata and error messages</w:t>
+            </w:r>
+          </w:p>
+        </w:tc>
+      </w:tr>
+      <w:tr>
+        <w:trPr/>
+        <w:tc>
+          <w:tcPr>
+            <w:tcW w:w="3212" w:type="dxa"/>
+            <w:tcBorders>
+              <w:start w:val="single" w:sz="4" w:space="0" w:color="000000"/>
+              <w:bottom w:val="single" w:sz="4" w:space="0" w:color="000000"/>
+            </w:tcBorders>
+          </w:tcPr>
+          <w:p>
+            <w:pPr>
+              <w:pStyle w:val="TableContents"/>
+              <w:rPr/>
+            </w:pPr>
+            <w:r>
+              <w:rPr/>
+              <w:t>Timestamp</w:t>
+            </w:r>
+          </w:p>
+        </w:tc>
+        <w:tc>
+          <w:tcPr>
+            <w:tcW w:w="6426" w:type="dxa"/>
+            <w:tcBorders>
+              <w:start w:val="single" w:sz="4" w:space="0" w:color="000000"/>
+              <w:bottom w:val="single" w:sz="4" w:space="0" w:color="000000"/>
+              <w:end w:val="single" w:sz="4" w:space="0" w:color="000000"/>
+            </w:tcBorders>
+          </w:tcPr>
+          <w:p>
+            <w:pPr>
+              <w:pStyle w:val="TableContents"/>
+              <w:numPr>
+                <w:ilvl w:val="0"/>
+                <w:numId w:val="14"/>
               </w:numPr>
               <w:rPr/>
             </w:pPr>
@@ -4527,7 +4562,7 @@
       <w:start w:val="1"/>
       <w:numFmt w:val="none"/>
       <w:suff w:val="nothing"/>
-      <w:lvlText w:val=""/>
+      <w:lvlText w:val="%1"/>
       <w:lvlJc w:val="start"/>
       <w:pPr>
         <w:tabs>
@@ -4535,13 +4570,12 @@
         </w:tabs>
         <w:ind w:start="0" w:hanging="0"/>
       </w:pPr>
-      <w:rPr/>
     </w:lvl>
     <w:lvl w:ilvl="1">
       <w:start w:val="1"/>
       <w:numFmt w:val="none"/>
       <w:suff w:val="nothing"/>
-      <w:lvlText w:val=""/>
+      <w:lvlText w:val="%2"/>
       <w:lvlJc w:val="start"/>
       <w:pPr>
         <w:tabs>
@@ -4549,13 +4583,12 @@
         </w:tabs>
         <w:ind w:start="0" w:hanging="0"/>
       </w:pPr>
-      <w:rPr/>
     </w:lvl>
     <w:lvl w:ilvl="2">
       <w:start w:val="1"/>
       <w:numFmt w:val="none"/>
       <w:suff w:val="nothing"/>
-      <w:lvlText w:val=""/>
+      <w:lvlText w:val="%3"/>
       <w:lvlJc w:val="start"/>
       <w:pPr>
         <w:tabs>
@@ -4563,13 +4596,12 @@
         </w:tabs>
         <w:ind w:start="0" w:hanging="0"/>
       </w:pPr>
-      <w:rPr/>
     </w:lvl>
     <w:lvl w:ilvl="3">
       <w:start w:val="1"/>
       <w:numFmt w:val="none"/>
       <w:suff w:val="nothing"/>
-      <w:lvlText w:val=""/>
+      <w:lvlText w:val="%4"/>
       <w:lvlJc w:val="start"/>
       <w:pPr>
         <w:tabs>
@@ -4577,13 +4609,12 @@
         </w:tabs>
         <w:ind w:start="0" w:hanging="0"/>
       </w:pPr>
-      <w:rPr/>
     </w:lvl>
     <w:lvl w:ilvl="4">
       <w:start w:val="1"/>
       <w:numFmt w:val="none"/>
       <w:suff w:val="nothing"/>
-      <w:lvlText w:val=""/>
+      <w:lvlText w:val="%5"/>
       <w:lvlJc w:val="start"/>
       <w:pPr>
         <w:tabs>
@@ -4591,13 +4622,12 @@
         </w:tabs>
         <w:ind w:start="0" w:hanging="0"/>
       </w:pPr>
-      <w:rPr/>
     </w:lvl>
     <w:lvl w:ilvl="5">
       <w:start w:val="1"/>
       <w:numFmt w:val="none"/>
       <w:suff w:val="nothing"/>
-      <w:lvlText w:val=""/>
+      <w:lvlText w:val="%6"/>
       <w:lvlJc w:val="start"/>
       <w:pPr>
         <w:tabs>
@@ -4605,13 +4635,12 @@
         </w:tabs>
         <w:ind w:start="0" w:hanging="0"/>
       </w:pPr>
-      <w:rPr/>
     </w:lvl>
     <w:lvl w:ilvl="6">
       <w:start w:val="1"/>
       <w:numFmt w:val="none"/>
       <w:suff w:val="nothing"/>
-      <w:lvlText w:val=""/>
+      <w:lvlText w:val="%7"/>
       <w:lvlJc w:val="start"/>
       <w:pPr>
         <w:tabs>
@@ -4619,13 +4648,12 @@
         </w:tabs>
         <w:ind w:start="0" w:hanging="0"/>
       </w:pPr>
-      <w:rPr/>
     </w:lvl>
     <w:lvl w:ilvl="7">
       <w:start w:val="1"/>
       <w:numFmt w:val="none"/>
       <w:suff w:val="nothing"/>
-      <w:lvlText w:val=""/>
+      <w:lvlText w:val="%8"/>
       <w:lvlJc w:val="start"/>
       <w:pPr>
         <w:tabs>
@@ -4633,13 +4661,12 @@
         </w:tabs>
         <w:ind w:start="0" w:hanging="0"/>
       </w:pPr>
-      <w:rPr/>
     </w:lvl>
     <w:lvl w:ilvl="8">
       <w:start w:val="1"/>
       <w:numFmt w:val="none"/>
       <w:suff w:val="nothing"/>
-      <w:lvlText w:val=""/>
+      <w:lvlText w:val="%9"/>
       <w:lvlJc w:val="start"/>
       <w:pPr>
         <w:tabs>
@@ -4647,124 +4674,132 @@
         </w:tabs>
         <w:ind w:start="0" w:hanging="0"/>
       </w:pPr>
-      <w:rPr/>
     </w:lvl>
   </w:abstractNum>
   <w:abstractNum w:abstractNumId="2">
     <w:lvl w:ilvl="0">
       <w:start w:val="1"/>
-      <w:numFmt w:val="decimal"/>
-      <w:lvlText w:val="%1."/>
-      <w:lvlJc w:val="start"/>
-      <w:pPr>
-        <w:tabs>
-          <w:tab w:val="num" w:pos="720"/>
-        </w:tabs>
-        <w:ind w:start="720" w:hanging="360"/>
+      <w:numFmt w:val="none"/>
+      <w:suff w:val="nothing"/>
+      <w:lvlText w:val="%1"/>
+      <w:lvlJc w:val="start"/>
+      <w:pPr>
+        <w:tabs>
+          <w:tab w:val="num" w:pos="0"/>
+        </w:tabs>
+        <w:ind w:start="0" w:hanging="0"/>
       </w:pPr>
       <w:rPr/>
     </w:lvl>
     <w:lvl w:ilvl="1">
       <w:start w:val="1"/>
-      <w:numFmt w:val="decimal"/>
-      <w:lvlText w:val="%2."/>
-      <w:lvlJc w:val="start"/>
-      <w:pPr>
-        <w:tabs>
-          <w:tab w:val="num" w:pos="1080"/>
-        </w:tabs>
-        <w:ind w:start="1080" w:hanging="360"/>
+      <w:numFmt w:val="none"/>
+      <w:suff w:val="nothing"/>
+      <w:lvlText w:val="%2"/>
+      <w:lvlJc w:val="start"/>
+      <w:pPr>
+        <w:tabs>
+          <w:tab w:val="num" w:pos="0"/>
+        </w:tabs>
+        <w:ind w:start="0" w:hanging="0"/>
       </w:pPr>
       <w:rPr/>
     </w:lvl>
     <w:lvl w:ilvl="2">
       <w:start w:val="1"/>
-      <w:numFmt w:val="decimal"/>
-      <w:lvlText w:val="%3."/>
-      <w:lvlJc w:val="start"/>
-      <w:pPr>
-        <w:tabs>
-          <w:tab w:val="num" w:pos="1440"/>
-        </w:tabs>
-        <w:ind w:start="1440" w:hanging="360"/>
+      <w:numFmt w:val="none"/>
+      <w:suff w:val="nothing"/>
+      <w:lvlText w:val="%3"/>
+      <w:lvlJc w:val="start"/>
+      <w:pPr>
+        <w:tabs>
+          <w:tab w:val="num" w:pos="0"/>
+        </w:tabs>
+        <w:ind w:start="0" w:hanging="0"/>
       </w:pPr>
       <w:rPr/>
     </w:lvl>
     <w:lvl w:ilvl="3">
       <w:start w:val="1"/>
-      <w:numFmt w:val="decimal"/>
-      <w:lvlText w:val="%4."/>
-      <w:lvlJc w:val="start"/>
-      <w:pPr>
-        <w:tabs>
-          <w:tab w:val="num" w:pos="1800"/>
-        </w:tabs>
-        <w:ind w:start="1800" w:hanging="360"/>
+      <w:numFmt w:val="none"/>
+      <w:suff w:val="nothing"/>
+      <w:lvlText w:val="%4"/>
+      <w:lvlJc w:val="start"/>
+      <w:pPr>
+        <w:tabs>
+          <w:tab w:val="num" w:pos="0"/>
+        </w:tabs>
+        <w:ind w:start="0" w:hanging="0"/>
       </w:pPr>
       <w:rPr/>
     </w:lvl>
     <w:lvl w:ilvl="4">
       <w:start w:val="1"/>
-      <w:numFmt w:val="decimal"/>
-      <w:lvlText w:val="%5."/>
-      <w:lvlJc w:val="start"/>
-      <w:pPr>
-        <w:tabs>
-          <w:tab w:val="num" w:pos="2160"/>
-        </w:tabs>
-        <w:ind w:start="2160" w:hanging="360"/>
+      <w:numFmt w:val="none"/>
+      <w:suff w:val="nothing"/>
+      <w:lvlText w:val="%5"/>
+      <w:lvlJc w:val="start"/>
+      <w:pPr>
+        <w:tabs>
+          <w:tab w:val="num" w:pos="0"/>
+        </w:tabs>
+        <w:ind w:start="0" w:hanging="0"/>
       </w:pPr>
       <w:rPr/>
     </w:lvl>
     <w:lvl w:ilvl="5">
       <w:start w:val="1"/>
-      <w:numFmt w:val="decimal"/>
-      <w:lvlText w:val="%6."/>
-      <w:lvlJc w:val="start"/>
-      <w:pPr>
-        <w:tabs>
-          <w:tab w:val="num" w:pos="2520"/>
-        </w:tabs>
-        <w:ind w:start="2520" w:hanging="360"/>
+      <w:numFmt w:val="none"/>
+      <w:suff w:val="nothing"/>
+      <w:lvlText w:val="%6"/>
+      <w:lvlJc w:val="start"/>
+      <w:pPr>
+        <w:tabs>
+          <w:tab w:val="num" w:pos="0"/>
+        </w:tabs>
+        <w:ind w:start="0" w:hanging="0"/>
       </w:pPr>
       <w:rPr/>
     </w:lvl>
     <w:lvl w:ilvl="6">
       <w:start w:val="1"/>
-      <w:numFmt w:val="decimal"/>
-      <w:lvlText w:val="%7."/>
-      <w:lvlJc w:val="start"/>
-      <w:pPr>
-        <w:tabs>
-          <w:tab w:val="num" w:pos="2880"/>
-        </w:tabs>
-        <w:ind w:start="2880" w:hanging="360"/>
+      <w:numFmt w:val="none"/>
+      <w:suff w:val="nothing"/>
+      <w:lvlText w:val="%7"/>
+      <w:lvlJc w:val="start"/>
+      <w:pPr>
+        <w:tabs>
+          <w:tab w:val="num" w:pos="0"/>
+        </w:tabs>
+        <w:ind w:start="0" w:hanging="0"/>
       </w:pPr>
       <w:rPr/>
     </w:lvl>
     <w:lvl w:ilvl="7">
       <w:start w:val="1"/>
-      <w:numFmt w:val="decimal"/>
-      <w:lvlText w:val="%8."/>
-      <w:lvlJc w:val="start"/>
-      <w:pPr>
-        <w:tabs>
-          <w:tab w:val="num" w:pos="3240"/>
-        </w:tabs>
-        <w:ind w:start="3240" w:hanging="360"/>
+      <w:numFmt w:val="none"/>
+      <w:suff w:val="nothing"/>
+      <w:lvlText w:val="%8"/>
+      <w:lvlJc w:val="start"/>
+      <w:pPr>
+        <w:tabs>
+          <w:tab w:val="num" w:pos="0"/>
+        </w:tabs>
+        <w:ind w:start="0" w:hanging="0"/>
       </w:pPr>
       <w:rPr/>
     </w:lvl>
     <w:lvl w:ilvl="8">
       <w:start w:val="1"/>
-      <w:numFmt w:val="decimal"/>
-      <w:lvlText w:val="%9."/>
-      <w:lvlJc w:val="start"/>
-      <w:pPr>
-        <w:tabs>
-          <w:tab w:val="num" w:pos="3600"/>
-        </w:tabs>
-        <w:ind w:start="3600" w:hanging="360"/>
+      <w:numFmt w:val="none"/>
+      <w:suff w:val="nothing"/>
+      <w:lvlText w:val="%9"/>
+      <w:lvlJc w:val="start"/>
+      <w:pPr>
+        <w:tabs>
+          <w:tab w:val="num" w:pos="0"/>
+        </w:tabs>
+        <w:ind w:start="0" w:hanging="0"/>
       </w:pPr>
       <w:rPr/>
     </w:lvl>
@@ -4891,8 +4926,8 @@
   <w:abstractNum w:abstractNumId="4">
     <w:lvl w:ilvl="0">
       <w:start w:val="1"/>
-      <w:numFmt w:val="bullet"/>
-      <w:lvlText w:val=""/>
+      <w:numFmt w:val="decimal"/>
+      <w:lvlText w:val="%1."/>
       <w:lvlJc w:val="start"/>
       <w:pPr>
         <w:tabs>
@@ -4900,14 +4935,12 @@
         </w:tabs>
         <w:ind w:start="720" w:hanging="360"/>
       </w:pPr>
-      <w:rPr>
-        <w:rFonts w:ascii="Symbol" w:hAnsi="Symbol" w:cs="Symbol" w:hint="default"/>
-      </w:rPr>
+      <w:rPr/>
     </w:lvl>
     <w:lvl w:ilvl="1">
       <w:start w:val="1"/>
-      <w:numFmt w:val="bullet"/>
-      <w:lvlText w:val="◦"/>
+      <w:numFmt w:val="decimal"/>
+      <w:lvlText w:val="%2."/>
       <w:lvlJc w:val="start"/>
       <w:pPr>
         <w:tabs>
@@ -4915,14 +4948,12 @@
         </w:tabs>
         <w:ind w:start="1080" w:hanging="360"/>
       </w:pPr>
-      <w:rPr>
-        <w:rFonts w:ascii="OpenSymbol" w:hAnsi="OpenSymbol" w:cs="OpenSymbol" w:hint="default"/>
-      </w:rPr>
+      <w:rPr/>
     </w:lvl>
     <w:lvl w:ilvl="2">
       <w:start w:val="1"/>
-      <w:numFmt w:val="bullet"/>
-      <w:lvlText w:val="▪"/>
+      <w:numFmt w:val="decimal"/>
+      <w:lvlText w:val="%3."/>
       <w:lvlJc w:val="start"/>
       <w:pPr>
         <w:tabs>
@@ -4930,14 +4961,12 @@
         </w:tabs>
         <w:ind w:start="1440" w:hanging="360"/>
       </w:pPr>
-      <w:rPr>
-        <w:rFonts w:ascii="OpenSymbol" w:hAnsi="OpenSymbol" w:cs="OpenSymbol" w:hint="default"/>
-      </w:rPr>
+      <w:rPr/>
     </w:lvl>
     <w:lvl w:ilvl="3">
       <w:start w:val="1"/>
-      <w:numFmt w:val="bullet"/>
-      <w:lvlText w:val=""/>
+      <w:numFmt w:val="decimal"/>
+      <w:lvlText w:val="%4."/>
       <w:lvlJc w:val="start"/>
       <w:pPr>
         <w:tabs>
@@ -4945,14 +4974,12 @@
         </w:tabs>
         <w:ind w:start="1800" w:hanging="360"/>
       </w:pPr>
-      <w:rPr>
-        <w:rFonts w:ascii="Symbol" w:hAnsi="Symbol" w:cs="Symbol" w:hint="default"/>
-      </w:rPr>
+      <w:rPr/>
     </w:lvl>
     <w:lvl w:ilvl="4">
       <w:start w:val="1"/>
-      <w:numFmt w:val="bullet"/>
-      <w:lvlText w:val="◦"/>
+      <w:numFmt w:val="decimal"/>
+      <w:lvlText w:val="%5."/>
       <w:lvlJc w:val="start"/>
       <w:pPr>
         <w:tabs>
@@ -4960,14 +4987,12 @@
         </w:tabs>
         <w:ind w:start="2160" w:hanging="360"/>
       </w:pPr>
-      <w:rPr>
-        <w:rFonts w:ascii="OpenSymbol" w:hAnsi="OpenSymbol" w:cs="OpenSymbol" w:hint="default"/>
-      </w:rPr>
+      <w:rPr/>
     </w:lvl>
     <w:lvl w:ilvl="5">
       <w:start w:val="1"/>
-      <w:numFmt w:val="bullet"/>
-      <w:lvlText w:val="▪"/>
+      <w:numFmt w:val="decimal"/>
+      <w:lvlText w:val="%6."/>
       <w:lvlJc w:val="start"/>
       <w:pPr>
         <w:tabs>
@@ -4975,14 +5000,12 @@
         </w:tabs>
         <w:ind w:start="2520" w:hanging="360"/>
       </w:pPr>
-      <w:rPr>
-        <w:rFonts w:ascii="OpenSymbol" w:hAnsi="OpenSymbol" w:cs="OpenSymbol" w:hint="default"/>
-      </w:rPr>
+      <w:rPr/>
     </w:lvl>
     <w:lvl w:ilvl="6">
       <w:start w:val="1"/>
-      <w:numFmt w:val="bullet"/>
-      <w:lvlText w:val=""/>
+      <w:numFmt w:val="decimal"/>
+      <w:lvlText w:val="%7."/>
       <w:lvlJc w:val="start"/>
       <w:pPr>
         <w:tabs>
@@ -4990,14 +5013,12 @@
         </w:tabs>
         <w:ind w:start="2880" w:hanging="360"/>
       </w:pPr>
-      <w:rPr>
-        <w:rFonts w:ascii="Symbol" w:hAnsi="Symbol" w:cs="Symbol" w:hint="default"/>
-      </w:rPr>
+      <w:rPr/>
     </w:lvl>
     <w:lvl w:ilvl="7">
       <w:start w:val="1"/>
-      <w:numFmt w:val="bullet"/>
-      <w:lvlText w:val="◦"/>
+      <w:numFmt w:val="decimal"/>
+      <w:lvlText w:val="%8."/>
       <w:lvlJc w:val="start"/>
       <w:pPr>
         <w:tabs>
@@ -5005,14 +5026,12 @@
         </w:tabs>
         <w:ind w:start="3240" w:hanging="360"/>
       </w:pPr>
-      <w:rPr>
-        <w:rFonts w:ascii="OpenSymbol" w:hAnsi="OpenSymbol" w:cs="OpenSymbol" w:hint="default"/>
-      </w:rPr>
+      <w:rPr/>
     </w:lvl>
     <w:lvl w:ilvl="8">
       <w:start w:val="1"/>
-      <w:numFmt w:val="bullet"/>
-      <w:lvlText w:val="▪"/>
+      <w:numFmt w:val="decimal"/>
+      <w:lvlText w:val="%9."/>
       <w:lvlJc w:val="start"/>
       <w:pPr>
         <w:tabs>
@@ -5020,9 +5039,7 @@
         </w:tabs>
         <w:ind w:start="3600" w:hanging="360"/>
       </w:pPr>
-      <w:rPr>
-        <w:rFonts w:ascii="OpenSymbol" w:hAnsi="OpenSymbol" w:cs="OpenSymbol" w:hint="default"/>
-      </w:rPr>
+      <w:rPr/>
     </w:lvl>
   </w:abstractNum>
   <w:abstractNum w:abstractNumId="5">
@@ -5302,8 +5319,8 @@
   <w:abstractNum w:abstractNumId="7">
     <w:lvl w:ilvl="0">
       <w:start w:val="1"/>
-      <w:numFmt w:val="decimal"/>
-      <w:lvlText w:val="%1."/>
+      <w:numFmt w:val="bullet"/>
+      <w:lvlText w:val=""/>
       <w:lvlJc w:val="start"/>
       <w:pPr>
         <w:tabs>
@@ -5311,12 +5328,14 @@
         </w:tabs>
         <w:ind w:start="720" w:hanging="360"/>
       </w:pPr>
-      <w:rPr/>
+      <w:rPr>
+        <w:rFonts w:ascii="Symbol" w:hAnsi="Symbol" w:cs="Symbol" w:hint="default"/>
+      </w:rPr>
     </w:lvl>
     <w:lvl w:ilvl="1">
       <w:start w:val="1"/>
-      <w:numFmt w:val="decimal"/>
-      <w:lvlText w:val="%2."/>
+      <w:numFmt w:val="bullet"/>
+      <w:lvlText w:val="◦"/>
       <w:lvlJc w:val="start"/>
       <w:pPr>
         <w:tabs>
@@ -5324,12 +5343,14 @@
         </w:tabs>
         <w:ind w:start="1080" w:hanging="360"/>
       </w:pPr>
-      <w:rPr/>
+      <w:rPr>
+        <w:rFonts w:ascii="OpenSymbol" w:hAnsi="OpenSymbol" w:cs="OpenSymbol" w:hint="default"/>
+      </w:rPr>
     </w:lvl>
     <w:lvl w:ilvl="2">
       <w:start w:val="1"/>
-      <w:numFmt w:val="decimal"/>
-      <w:lvlText w:val="%3."/>
+      <w:numFmt w:val="bullet"/>
+      <w:lvlText w:val="▪"/>
       <w:lvlJc w:val="start"/>
       <w:pPr>
         <w:tabs>
@@ -5337,12 +5358,14 @@
         </w:tabs>
         <w:ind w:start="1440" w:hanging="360"/>
       </w:pPr>
-      <w:rPr/>
+      <w:rPr>
+        <w:rFonts w:ascii="OpenSymbol" w:hAnsi="OpenSymbol" w:cs="OpenSymbol" w:hint="default"/>
+      </w:rPr>
     </w:lvl>
     <w:lvl w:ilvl="3">
       <w:start w:val="1"/>
-      <w:numFmt w:val="decimal"/>
-      <w:lvlText w:val="%4."/>
+      <w:numFmt w:val="bullet"/>
+      <w:lvlText w:val=""/>
       <w:lvlJc w:val="start"/>
       <w:pPr>
         <w:tabs>
@@ -5350,12 +5373,14 @@
         </w:tabs>
         <w:ind w:start="1800" w:hanging="360"/>
       </w:pPr>
-      <w:rPr/>
+      <w:rPr>
+        <w:rFonts w:ascii="Symbol" w:hAnsi="Symbol" w:cs="Symbol" w:hint="default"/>
+      </w:rPr>
     </w:lvl>
     <w:lvl w:ilvl="4">
       <w:start w:val="1"/>
-      <w:numFmt w:val="decimal"/>
-      <w:lvlText w:val="%5."/>
+      <w:numFmt w:val="bullet"/>
+      <w:lvlText w:val="◦"/>
       <w:lvlJc w:val="start"/>
       <w:pPr>
         <w:tabs>
@@ -5363,12 +5388,14 @@
         </w:tabs>
         <w:ind w:start="2160" w:hanging="360"/>
       </w:pPr>
-      <w:rPr/>
+      <w:rPr>
+        <w:rFonts w:ascii="OpenSymbol" w:hAnsi="OpenSymbol" w:cs="OpenSymbol" w:hint="default"/>
+      </w:rPr>
     </w:lvl>
     <w:lvl w:ilvl="5">
       <w:start w:val="1"/>
-      <w:numFmt w:val="decimal"/>
-      <w:lvlText w:val="%6."/>
+      <w:numFmt w:val="bullet"/>
+      <w:lvlText w:val="▪"/>
       <w:lvlJc w:val="start"/>
       <w:pPr>
         <w:tabs>
@@ -5376,12 +5403,14 @@
         </w:tabs>
         <w:ind w:start="2520" w:hanging="360"/>
       </w:pPr>
-      <w:rPr/>
+      <w:rPr>
+        <w:rFonts w:ascii="OpenSymbol" w:hAnsi="OpenSymbol" w:cs="OpenSymbol" w:hint="default"/>
+      </w:rPr>
     </w:lvl>
     <w:lvl w:ilvl="6">
       <w:start w:val="1"/>
-      <w:numFmt w:val="decimal"/>
-      <w:lvlText w:val="%7."/>
+      <w:numFmt w:val="bullet"/>
+      <w:lvlText w:val=""/>
       <w:lvlJc w:val="start"/>
       <w:pPr>
         <w:tabs>
@@ -5389,12 +5418,14 @@
         </w:tabs>
         <w:ind w:start="2880" w:hanging="360"/>
       </w:pPr>
-      <w:rPr/>
+      <w:rPr>
+        <w:rFonts w:ascii="Symbol" w:hAnsi="Symbol" w:cs="Symbol" w:hint="default"/>
+      </w:rPr>
     </w:lvl>
     <w:lvl w:ilvl="7">
       <w:start w:val="1"/>
-      <w:numFmt w:val="decimal"/>
-      <w:lvlText w:val="%8."/>
+      <w:numFmt w:val="bullet"/>
+      <w:lvlText w:val="◦"/>
       <w:lvlJc w:val="start"/>
       <w:pPr>
         <w:tabs>
@@ -5402,12 +5433,14 @@
         </w:tabs>
         <w:ind w:start="3240" w:hanging="360"/>
       </w:pPr>
-      <w:rPr/>
+      <w:rPr>
+        <w:rFonts w:ascii="OpenSymbol" w:hAnsi="OpenSymbol" w:cs="OpenSymbol" w:hint="default"/>
+      </w:rPr>
     </w:lvl>
     <w:lvl w:ilvl="8">
       <w:start w:val="1"/>
-      <w:numFmt w:val="decimal"/>
-      <w:lvlText w:val="%9."/>
+      <w:numFmt w:val="bullet"/>
+      <w:lvlText w:val="▪"/>
       <w:lvlJc w:val="start"/>
       <w:pPr>
         <w:tabs>
@@ -5415,14 +5448,16 @@
         </w:tabs>
         <w:ind w:start="3600" w:hanging="360"/>
       </w:pPr>
-      <w:rPr/>
+      <w:rPr>
+        <w:rFonts w:ascii="OpenSymbol" w:hAnsi="OpenSymbol" w:cs="OpenSymbol" w:hint="default"/>
+      </w:rPr>
     </w:lvl>
   </w:abstractNum>
   <w:abstractNum w:abstractNumId="8">
     <w:lvl w:ilvl="0">
       <w:start w:val="1"/>
-      <w:numFmt w:val="bullet"/>
-      <w:lvlText w:val=""/>
+      <w:numFmt w:val="decimal"/>
+      <w:lvlText w:val="%1."/>
       <w:lvlJc w:val="start"/>
       <w:pPr>
         <w:tabs>
@@ -5430,14 +5465,12 @@
         </w:tabs>
         <w:ind w:start="720" w:hanging="360"/>
       </w:pPr>
-      <w:rPr>
-        <w:rFonts w:ascii="Wingdings" w:hAnsi="Wingdings" w:cs="Wingdings" w:hint="default"/>
-      </w:rPr>
+      <w:rPr/>
     </w:lvl>
     <w:lvl w:ilvl="1">
       <w:start w:val="1"/>
-      <w:numFmt w:val="bullet"/>
-      <w:lvlText w:val=""/>
+      <w:numFmt w:val="decimal"/>
+      <w:lvlText w:val="%2."/>
       <w:lvlJc w:val="start"/>
       <w:pPr>
         <w:tabs>
@@ -5445,14 +5478,12 @@
         </w:tabs>
         <w:ind w:start="1080" w:hanging="360"/>
       </w:pPr>
-      <w:rPr>
-        <w:rFonts w:ascii="Wingdings" w:hAnsi="Wingdings" w:cs="Wingdings" w:hint="default"/>
-      </w:rPr>
+      <w:rPr/>
     </w:lvl>
     <w:lvl w:ilvl="2">
       <w:start w:val="1"/>
-      <w:numFmt w:val="bullet"/>
-      <w:lvlText w:val=""/>
+      <w:numFmt w:val="decimal"/>
+      <w:lvlText w:val="%3."/>
       <w:lvlJc w:val="start"/>
       <w:pPr>
         <w:tabs>
@@ -5460,14 +5491,12 @@
         </w:tabs>
         <w:ind w:start="1440" w:hanging="360"/>
       </w:pPr>
-      <w:rPr>
-        <w:rFonts w:ascii="Wingdings" w:hAnsi="Wingdings" w:cs="Wingdings" w:hint="default"/>
-      </w:rPr>
+      <w:rPr/>
     </w:lvl>
     <w:lvl w:ilvl="3">
       <w:start w:val="1"/>
-      <w:numFmt w:val="bullet"/>
-      <w:lvlText w:val=""/>
+      <w:numFmt w:val="decimal"/>
+      <w:lvlText w:val="%4."/>
       <w:lvlJc w:val="start"/>
       <w:pPr>
         <w:tabs>
@@ -5475,14 +5504,12 @@
         </w:tabs>
         <w:ind w:start="1800" w:hanging="360"/>
       </w:pPr>
-      <w:rPr>
-        <w:rFonts w:ascii="Wingdings" w:hAnsi="Wingdings" w:cs="Wingdings" w:hint="default"/>
-      </w:rPr>
+      <w:rPr/>
     </w:lvl>
     <w:lvl w:ilvl="4">
       <w:start w:val="1"/>
-      <w:numFmt w:val="bullet"/>
-      <w:lvlText w:val=""/>
+      <w:numFmt w:val="decimal"/>
+      <w:lvlText w:val="%5."/>
       <w:lvlJc w:val="start"/>
       <w:pPr>
         <w:tabs>
@@ -5490,14 +5517,12 @@
         </w:tabs>
         <w:ind w:start="2160" w:hanging="360"/>
       </w:pPr>
-      <w:rPr>
-        <w:rFonts w:ascii="Wingdings" w:hAnsi="Wingdings" w:cs="Wingdings" w:hint="default"/>
-      </w:rPr>
+      <w:rPr/>
     </w:lvl>
     <w:lvl w:ilvl="5">
       <w:start w:val="1"/>
-      <w:numFmt w:val="bullet"/>
-      <w:lvlText w:val=""/>
+      <w:numFmt w:val="decimal"/>
+      <w:lvlText w:val="%6."/>
       <w:lvlJc w:val="start"/>
       <w:pPr>
         <w:tabs>
@@ -5505,14 +5530,12 @@
         </w:tabs>
         <w:ind w:start="2520" w:hanging="360"/>
       </w:pPr>
-      <w:rPr>
-        <w:rFonts w:ascii="Wingdings" w:hAnsi="Wingdings" w:cs="Wingdings" w:hint="default"/>
-      </w:rPr>
+      <w:rPr/>
     </w:lvl>
     <w:lvl w:ilvl="6">
       <w:start w:val="1"/>
-      <w:numFmt w:val="bullet"/>
-      <w:lvlText w:val=""/>
+      <w:numFmt w:val="decimal"/>
+      <w:lvlText w:val="%7."/>
       <w:lvlJc w:val="start"/>
       <w:pPr>
         <w:tabs>
@@ -5520,14 +5543,12 @@
         </w:tabs>
         <w:ind w:start="2880" w:hanging="360"/>
       </w:pPr>
-      <w:rPr>
-        <w:rFonts w:ascii="Wingdings" w:hAnsi="Wingdings" w:cs="Wingdings" w:hint="default"/>
-      </w:rPr>
+      <w:rPr/>
     </w:lvl>
     <w:lvl w:ilvl="7">
       <w:start w:val="1"/>
-      <w:numFmt w:val="bullet"/>
-      <w:lvlText w:val=""/>
+      <w:numFmt w:val="decimal"/>
+      <w:lvlText w:val="%8."/>
       <w:lvlJc w:val="start"/>
       <w:pPr>
         <w:tabs>
@@ -5535,14 +5556,12 @@
         </w:tabs>
         <w:ind w:start="3240" w:hanging="360"/>
       </w:pPr>
-      <w:rPr>
-        <w:rFonts w:ascii="Wingdings" w:hAnsi="Wingdings" w:cs="Wingdings" w:hint="default"/>
-      </w:rPr>
+      <w:rPr/>
     </w:lvl>
     <w:lvl w:ilvl="8">
       <w:start w:val="1"/>
-      <w:numFmt w:val="bullet"/>
-      <w:lvlText w:val=""/>
+      <w:numFmt w:val="decimal"/>
+      <w:lvlText w:val="%9."/>
       <w:lvlJc w:val="start"/>
       <w:pPr>
         <w:tabs>
@@ -5550,9 +5569,7 @@
         </w:tabs>
         <w:ind w:start="3600" w:hanging="360"/>
       </w:pPr>
-      <w:rPr>
-        <w:rFonts w:ascii="Wingdings" w:hAnsi="Wingdings" w:cs="Wingdings" w:hint="default"/>
-      </w:rPr>
+      <w:rPr/>
     </w:lvl>
   </w:abstractNum>
   <w:abstractNum w:abstractNumId="9">
@@ -5574,7 +5591,7 @@
     <w:lvl w:ilvl="1">
       <w:start w:val="1"/>
       <w:numFmt w:val="bullet"/>
-      <w:lvlText w:val="◦"/>
+      <w:lvlText w:val=""/>
       <w:lvlJc w:val="start"/>
       <w:pPr>
         <w:tabs>
@@ -5583,13 +5600,13 @@
         <w:ind w:start="1080" w:hanging="360"/>
       </w:pPr>
       <w:rPr>
-        <w:rFonts w:ascii="OpenSymbol" w:hAnsi="OpenSymbol" w:cs="OpenSymbol" w:hint="default"/>
+        <w:rFonts w:ascii="Wingdings" w:hAnsi="Wingdings" w:cs="Wingdings" w:hint="default"/>
       </w:rPr>
     </w:lvl>
     <w:lvl w:ilvl="2">
       <w:start w:val="1"/>
       <w:numFmt w:val="bullet"/>
-      <w:lvlText w:val="▪"/>
+      <w:lvlText w:val=""/>
       <w:lvlJc w:val="start"/>
       <w:pPr>
         <w:tabs>
@@ -5598,13 +5615,13 @@
         <w:ind w:start="1440" w:hanging="360"/>
       </w:pPr>
       <w:rPr>
-        <w:rFonts w:ascii="OpenSymbol" w:hAnsi="OpenSymbol" w:cs="OpenSymbol" w:hint="default"/>
+        <w:rFonts w:ascii="Wingdings" w:hAnsi="Wingdings" w:cs="Wingdings" w:hint="default"/>
       </w:rPr>
     </w:lvl>
     <w:lvl w:ilvl="3">
       <w:start w:val="1"/>
       <w:numFmt w:val="bullet"/>
-      <w:lvlText w:val=""/>
+      <w:lvlText w:val=""/>
       <w:lvlJc w:val="start"/>
       <w:pPr>
         <w:tabs>
@@ -5613,13 +5630,13 @@
         <w:ind w:start="1800" w:hanging="360"/>
       </w:pPr>
       <w:rPr>
-        <w:rFonts w:ascii="Symbol" w:hAnsi="Symbol" w:cs="Symbol" w:hint="default"/>
+        <w:rFonts w:ascii="Wingdings" w:hAnsi="Wingdings" w:cs="Wingdings" w:hint="default"/>
       </w:rPr>
     </w:lvl>
     <w:lvl w:ilvl="4">
       <w:start w:val="1"/>
       <w:numFmt w:val="bullet"/>
-      <w:lvlText w:val="◦"/>
+      <w:lvlText w:val=""/>
       <w:lvlJc w:val="start"/>
       <w:pPr>
         <w:tabs>
@@ -5628,13 +5645,13 @@
         <w:ind w:start="2160" w:hanging="360"/>
       </w:pPr>
       <w:rPr>
-        <w:rFonts w:ascii="OpenSymbol" w:hAnsi="OpenSymbol" w:cs="OpenSymbol" w:hint="default"/>
+        <w:rFonts w:ascii="Wingdings" w:hAnsi="Wingdings" w:cs="Wingdings" w:hint="default"/>
       </w:rPr>
     </w:lvl>
     <w:lvl w:ilvl="5">
       <w:start w:val="1"/>
       <w:numFmt w:val="bullet"/>
-      <w:lvlText w:val="▪"/>
+      <w:lvlText w:val=""/>
       <w:lvlJc w:val="start"/>
       <w:pPr>
         <w:tabs>
@@ -5643,13 +5660,13 @@
         <w:ind w:start="2520" w:hanging="360"/>
       </w:pPr>
       <w:rPr>
-        <w:rFonts w:ascii="OpenSymbol" w:hAnsi="OpenSymbol" w:cs="OpenSymbol" w:hint="default"/>
+        <w:rFonts w:ascii="Wingdings" w:hAnsi="Wingdings" w:cs="Wingdings" w:hint="default"/>
       </w:rPr>
     </w:lvl>
     <w:lvl w:ilvl="6">
       <w:start w:val="1"/>
       <w:numFmt w:val="bullet"/>
-      <w:lvlText w:val=""/>
+      <w:lvlText w:val=""/>
       <w:lvlJc w:val="start"/>
       <w:pPr>
         <w:tabs>
@@ -5658,13 +5675,13 @@
         <w:ind w:start="2880" w:hanging="360"/>
       </w:pPr>
       <w:rPr>
-        <w:rFonts w:ascii="Symbol" w:hAnsi="Symbol" w:cs="Symbol" w:hint="default"/>
+        <w:rFonts w:ascii="Wingdings" w:hAnsi="Wingdings" w:cs="Wingdings" w:hint="default"/>
       </w:rPr>
     </w:lvl>
     <w:lvl w:ilvl="7">
       <w:start w:val="1"/>
       <w:numFmt w:val="bullet"/>
-      <w:lvlText w:val="◦"/>
+      <w:lvlText w:val=""/>
       <w:lvlJc w:val="start"/>
       <w:pPr>
         <w:tabs>
@@ -5673,13 +5690,13 @@
         <w:ind w:start="3240" w:hanging="360"/>
       </w:pPr>
       <w:rPr>
-        <w:rFonts w:ascii="OpenSymbol" w:hAnsi="OpenSymbol" w:cs="OpenSymbol" w:hint="default"/>
+        <w:rFonts w:ascii="Wingdings" w:hAnsi="Wingdings" w:cs="Wingdings" w:hint="default"/>
       </w:rPr>
     </w:lvl>
     <w:lvl w:ilvl="8">
       <w:start w:val="1"/>
       <w:numFmt w:val="bullet"/>
-      <w:lvlText w:val="▪"/>
+      <w:lvlText w:val=""/>
       <w:lvlJc w:val="start"/>
       <w:pPr>
         <w:tabs>
@@ -5688,7 +5705,7 @@
         <w:ind w:start="3600" w:hanging="360"/>
       </w:pPr>
       <w:rPr>
-        <w:rFonts w:ascii="OpenSymbol" w:hAnsi="OpenSymbol" w:cs="OpenSymbol" w:hint="default"/>
+        <w:rFonts w:ascii="Wingdings" w:hAnsi="Wingdings" w:cs="Wingdings" w:hint="default"/>
       </w:rPr>
     </w:lvl>
   </w:abstractNum>
@@ -5848,7 +5865,7 @@
     <w:lvl w:ilvl="1">
       <w:start w:val="1"/>
       <w:numFmt w:val="bullet"/>
-      <w:lvlText w:val=""/>
+      <w:lvlText w:val="◦"/>
       <w:lvlJc w:val="start"/>
       <w:pPr>
         <w:tabs>
@@ -5857,13 +5874,13 @@
         <w:ind w:start="1080" w:hanging="360"/>
       </w:pPr>
       <w:rPr>
-        <w:rFonts w:ascii="Wingdings" w:hAnsi="Wingdings" w:cs="Wingdings" w:hint="default"/>
+        <w:rFonts w:ascii="OpenSymbol" w:hAnsi="OpenSymbol" w:cs="OpenSymbol" w:hint="default"/>
       </w:rPr>
     </w:lvl>
     <w:lvl w:ilvl="2">
       <w:start w:val="1"/>
       <w:numFmt w:val="bullet"/>
-      <w:lvlText w:val=""/>
+      <w:lvlText w:val="▪"/>
       <w:lvlJc w:val="start"/>
       <w:pPr>
         <w:tabs>
@@ -5872,13 +5889,13 @@
         <w:ind w:start="1440" w:hanging="360"/>
       </w:pPr>
       <w:rPr>
-        <w:rFonts w:ascii="Wingdings" w:hAnsi="Wingdings" w:cs="Wingdings" w:hint="default"/>
+        <w:rFonts w:ascii="OpenSymbol" w:hAnsi="OpenSymbol" w:cs="OpenSymbol" w:hint="default"/>
       </w:rPr>
     </w:lvl>
     <w:lvl w:ilvl="3">
       <w:start w:val="1"/>
       <w:numFmt w:val="bullet"/>
-      <w:lvlText w:val=""/>
+      <w:lvlText w:val=""/>
       <w:lvlJc w:val="start"/>
       <w:pPr>
         <w:tabs>
@@ -5887,13 +5904,13 @@
         <w:ind w:start="1800" w:hanging="360"/>
       </w:pPr>
       <w:rPr>
-        <w:rFonts w:ascii="Wingdings" w:hAnsi="Wingdings" w:cs="Wingdings" w:hint="default"/>
+        <w:rFonts w:ascii="Symbol" w:hAnsi="Symbol" w:cs="Symbol" w:hint="default"/>
       </w:rPr>
     </w:lvl>
     <w:lvl w:ilvl="4">
       <w:start w:val="1"/>
       <w:numFmt w:val="bullet"/>
-      <w:lvlText w:val=""/>
+      <w:lvlText w:val="◦"/>
       <w:lvlJc w:val="start"/>
       <w:pPr>
         <w:tabs>
@@ -5902,13 +5919,13 @@
         <w:ind w:start="2160" w:hanging="360"/>
       </w:pPr>
       <w:rPr>
-        <w:rFonts w:ascii="Wingdings" w:hAnsi="Wingdings" w:cs="Wingdings" w:hint="default"/>
+        <w:rFonts w:ascii="OpenSymbol" w:hAnsi="OpenSymbol" w:cs="OpenSymbol" w:hint="default"/>
       </w:rPr>
     </w:lvl>
     <w:lvl w:ilvl="5">
       <w:start w:val="1"/>
       <w:numFmt w:val="bullet"/>
-      <w:lvlText w:val=""/>
+      <w:lvlText w:val="▪"/>
       <w:lvlJc w:val="start"/>
       <w:pPr>
         <w:tabs>
@@ -5917,13 +5934,13 @@
         <w:ind w:start="2520" w:hanging="360"/>
       </w:pPr>
       <w:rPr>
-        <w:rFonts w:ascii="Wingdings" w:hAnsi="Wingdings" w:cs="Wingdings" w:hint="default"/>
+        <w:rFonts w:ascii="OpenSymbol" w:hAnsi="OpenSymbol" w:cs="OpenSymbol" w:hint="default"/>
       </w:rPr>
     </w:lvl>
     <w:lvl w:ilvl="6">
       <w:start w:val="1"/>
       <w:numFmt w:val="bullet"/>
-      <w:lvlText w:val=""/>
+      <w:lvlText w:val=""/>
       <w:lvlJc w:val="start"/>
       <w:pPr>
         <w:tabs>
@@ -5932,13 +5949,13 @@
         <w:ind w:start="2880" w:hanging="360"/>
       </w:pPr>
       <w:rPr>
-        <w:rFonts w:ascii="Wingdings" w:hAnsi="Wingdings" w:cs="Wingdings" w:hint="default"/>
+        <w:rFonts w:ascii="Symbol" w:hAnsi="Symbol" w:cs="Symbol" w:hint="default"/>
       </w:rPr>
     </w:lvl>
     <w:lvl w:ilvl="7">
       <w:start w:val="1"/>
       <w:numFmt w:val="bullet"/>
-      <w:lvlText w:val=""/>
+      <w:lvlText w:val="◦"/>
       <w:lvlJc w:val="start"/>
       <w:pPr>
         <w:tabs>
@@ -5947,13 +5964,13 @@
         <w:ind w:start="3240" w:hanging="360"/>
       </w:pPr>
       <w:rPr>
-        <w:rFonts w:ascii="Wingdings" w:hAnsi="Wingdings" w:cs="Wingdings" w:hint="default"/>
+        <w:rFonts w:ascii="OpenSymbol" w:hAnsi="OpenSymbol" w:cs="OpenSymbol" w:hint="default"/>
       </w:rPr>
     </w:lvl>
     <w:lvl w:ilvl="8">
       <w:start w:val="1"/>
       <w:numFmt w:val="bullet"/>
-      <w:lvlText w:val=""/>
+      <w:lvlText w:val="▪"/>
       <w:lvlJc w:val="start"/>
       <w:pPr>
         <w:tabs>
@@ -5962,7 +5979,7 @@
         <w:ind w:start="3600" w:hanging="360"/>
       </w:pPr>
       <w:rPr>
-        <w:rFonts w:ascii="Wingdings" w:hAnsi="Wingdings" w:cs="Wingdings" w:hint="default"/>
+        <w:rFonts w:ascii="OpenSymbol" w:hAnsi="OpenSymbol" w:cs="OpenSymbol" w:hint="default"/>
       </w:rPr>
     </w:lvl>
   </w:abstractNum>
@@ -6243,120 +6260,275 @@
   <w:abstractNum w:abstractNumId="14">
     <w:lvl w:ilvl="0">
       <w:start w:val="1"/>
-      <w:numFmt w:val="none"/>
-      <w:suff w:val="nothing"/>
-      <w:lvlText w:val=""/>
-      <w:lvlJc w:val="start"/>
-      <w:pPr>
-        <w:tabs>
-          <w:tab w:val="num" w:pos="0"/>
-        </w:tabs>
-        <w:ind w:start="0" w:hanging="0"/>
-      </w:pPr>
+      <w:numFmt w:val="bullet"/>
+      <w:lvlText w:val=""/>
+      <w:lvlJc w:val="start"/>
+      <w:pPr>
+        <w:tabs>
+          <w:tab w:val="num" w:pos="720"/>
+        </w:tabs>
+        <w:ind w:start="720" w:hanging="360"/>
+      </w:pPr>
+      <w:rPr>
+        <w:rFonts w:ascii="Wingdings" w:hAnsi="Wingdings" w:cs="Wingdings" w:hint="default"/>
+      </w:rPr>
     </w:lvl>
     <w:lvl w:ilvl="1">
       <w:start w:val="1"/>
-      <w:numFmt w:val="none"/>
-      <w:suff w:val="nothing"/>
-      <w:lvlText w:val=""/>
-      <w:lvlJc w:val="start"/>
-      <w:pPr>
-        <w:tabs>
-          <w:tab w:val="num" w:pos="0"/>
-        </w:tabs>
-        <w:ind w:start="0" w:hanging="0"/>
-      </w:pPr>
+      <w:numFmt w:val="bullet"/>
+      <w:lvlText w:val=""/>
+      <w:lvlJc w:val="start"/>
+      <w:pPr>
+        <w:tabs>
+          <w:tab w:val="num" w:pos="1080"/>
+        </w:tabs>
+        <w:ind w:start="1080" w:hanging="360"/>
+      </w:pPr>
+      <w:rPr>
+        <w:rFonts w:ascii="Wingdings" w:hAnsi="Wingdings" w:cs="Wingdings" w:hint="default"/>
+      </w:rPr>
     </w:lvl>
     <w:lvl w:ilvl="2">
       <w:start w:val="1"/>
-      <w:numFmt w:val="none"/>
-      <w:suff w:val="nothing"/>
-      <w:lvlText w:val=""/>
-      <w:lvlJc w:val="start"/>
-      <w:pPr>
-        <w:tabs>
-          <w:tab w:val="num" w:pos="0"/>
-        </w:tabs>
-        <w:ind w:start="0" w:hanging="0"/>
-      </w:pPr>
+      <w:numFmt w:val="bullet"/>
+      <w:lvlText w:val=""/>
+      <w:lvlJc w:val="start"/>
+      <w:pPr>
+        <w:tabs>
+          <w:tab w:val="num" w:pos="1440"/>
+        </w:tabs>
+        <w:ind w:start="1440" w:hanging="360"/>
+      </w:pPr>
+      <w:rPr>
+        <w:rFonts w:ascii="Wingdings" w:hAnsi="Wingdings" w:cs="Wingdings" w:hint="default"/>
+      </w:rPr>
     </w:lvl>
     <w:lvl w:ilvl="3">
       <w:start w:val="1"/>
-      <w:numFmt w:val="none"/>
-      <w:suff w:val="nothing"/>
-      <w:lvlText w:val=""/>
-      <w:lvlJc w:val="start"/>
-      <w:pPr>
-        <w:tabs>
-          <w:tab w:val="num" w:pos="0"/>
-        </w:tabs>
-        <w:ind w:start="0" w:hanging="0"/>
-      </w:pPr>
+      <w:numFmt w:val="bullet"/>
+      <w:lvlText w:val=""/>
+      <w:lvlJc w:val="start"/>
+      <w:pPr>
+        <w:tabs>
+          <w:tab w:val="num" w:pos="1800"/>
+        </w:tabs>
+        <w:ind w:start="1800" w:hanging="360"/>
+      </w:pPr>
+      <w:rPr>
+        <w:rFonts w:ascii="Wingdings" w:hAnsi="Wingdings" w:cs="Wingdings" w:hint="default"/>
+      </w:rPr>
     </w:lvl>
     <w:lvl w:ilvl="4">
       <w:start w:val="1"/>
-      <w:numFmt w:val="none"/>
-      <w:suff w:val="nothing"/>
-      <w:lvlText w:val=""/>
-      <w:lvlJc w:val="start"/>
-      <w:pPr>
-        <w:tabs>
-          <w:tab w:val="num" w:pos="0"/>
-        </w:tabs>
-        <w:ind w:start="0" w:hanging="0"/>
-      </w:pPr>
+      <w:numFmt w:val="bullet"/>
+      <w:lvlText w:val=""/>
+      <w:lvlJc w:val="start"/>
+      <w:pPr>
+        <w:tabs>
+          <w:tab w:val="num" w:pos="2160"/>
+        </w:tabs>
+        <w:ind w:start="2160" w:hanging="360"/>
+      </w:pPr>
+      <w:rPr>
+        <w:rFonts w:ascii="Wingdings" w:hAnsi="Wingdings" w:cs="Wingdings" w:hint="default"/>
+      </w:rPr>
     </w:lvl>
     <w:lvl w:ilvl="5">
       <w:start w:val="1"/>
-      <w:numFmt w:val="none"/>
-      <w:suff w:val="nothing"/>
-      <w:lvlText w:val=""/>
-      <w:lvlJc w:val="start"/>
-      <w:pPr>
-        <w:tabs>
-          <w:tab w:val="num" w:pos="0"/>
-        </w:tabs>
-        <w:ind w:start="0" w:hanging="0"/>
-      </w:pPr>
+      <w:numFmt w:val="bullet"/>
+      <w:lvlText w:val=""/>
+      <w:lvlJc w:val="start"/>
+      <w:pPr>
+        <w:tabs>
+          <w:tab w:val="num" w:pos="2520"/>
+        </w:tabs>
+        <w:ind w:start="2520" w:hanging="360"/>
+      </w:pPr>
+      <w:rPr>
+        <w:rFonts w:ascii="Wingdings" w:hAnsi="Wingdings" w:cs="Wingdings" w:hint="default"/>
+      </w:rPr>
     </w:lvl>
     <w:lvl w:ilvl="6">
       <w:start w:val="1"/>
-      <w:numFmt w:val="none"/>
-      <w:suff w:val="nothing"/>
-      <w:lvlText w:val=""/>
-      <w:lvlJc w:val="start"/>
-      <w:pPr>
-        <w:tabs>
-          <w:tab w:val="num" w:pos="0"/>
-        </w:tabs>
-        <w:ind w:start="0" w:hanging="0"/>
-      </w:pPr>
+      <w:numFmt w:val="bullet"/>
+      <w:lvlText w:val=""/>
+      <w:lvlJc w:val="start"/>
+      <w:pPr>
+        <w:tabs>
+          <w:tab w:val="num" w:pos="2880"/>
+        </w:tabs>
+        <w:ind w:start="2880" w:hanging="360"/>
+      </w:pPr>
+      <w:rPr>
+        <w:rFonts w:ascii="Wingdings" w:hAnsi="Wingdings" w:cs="Wingdings" w:hint="default"/>
+      </w:rPr>
     </w:lvl>
     <w:lvl w:ilvl="7">
       <w:start w:val="1"/>
-      <w:numFmt w:val="none"/>
-      <w:suff w:val="nothing"/>
-      <w:lvlText w:val=""/>
-      <w:lvlJc w:val="start"/>
-      <w:pPr>
-        <w:tabs>
-          <w:tab w:val="num" w:pos="0"/>
-        </w:tabs>
-        <w:ind w:start="0" w:hanging="0"/>
-      </w:pPr>
+      <w:numFmt w:val="bullet"/>
+      <w:lvlText w:val=""/>
+      <w:lvlJc w:val="start"/>
+      <w:pPr>
+        <w:tabs>
+          <w:tab w:val="num" w:pos="3240"/>
+        </w:tabs>
+        <w:ind w:start="3240" w:hanging="360"/>
+      </w:pPr>
+      <w:rPr>
+        <w:rFonts w:ascii="Wingdings" w:hAnsi="Wingdings" w:cs="Wingdings" w:hint="default"/>
+      </w:rPr>
     </w:lvl>
     <w:lvl w:ilvl="8">
       <w:start w:val="1"/>
-      <w:numFmt w:val="none"/>
-      <w:suff w:val="nothing"/>
-      <w:lvlText w:val=""/>
-      <w:lvlJc w:val="start"/>
-      <w:pPr>
-        <w:tabs>
-          <w:tab w:val="num" w:pos="0"/>
-        </w:tabs>
-        <w:ind w:start="0" w:hanging="0"/>
-      </w:pPr>
+      <w:numFmt w:val="bullet"/>
+      <w:lvlText w:val=""/>
+      <w:lvlJc w:val="start"/>
+      <w:pPr>
+        <w:tabs>
+          <w:tab w:val="num" w:pos="3600"/>
+        </w:tabs>
+        <w:ind w:start="3600" w:hanging="360"/>
+      </w:pPr>
+      <w:rPr>
+        <w:rFonts w:ascii="Wingdings" w:hAnsi="Wingdings" w:cs="Wingdings" w:hint="default"/>
+      </w:rPr>
+    </w:lvl>
+  </w:abstractNum>
+  <w:abstractNum w:abstractNumId="15">
+    <w:lvl w:ilvl="0">
+      <w:start w:val="1"/>
+      <w:numFmt w:val="bullet"/>
+      <w:lvlText w:val=""/>
+      <w:lvlJc w:val="start"/>
+      <w:pPr>
+        <w:tabs>
+          <w:tab w:val="num" w:pos="720"/>
+        </w:tabs>
+        <w:ind w:start="720" w:hanging="360"/>
+      </w:pPr>
+      <w:rPr>
+        <w:rFonts w:ascii="Symbol" w:hAnsi="Symbol" w:cs="Symbol" w:hint="default"/>
+      </w:rPr>
+    </w:lvl>
+    <w:lvl w:ilvl="1">
+      <w:start w:val="1"/>
+      <w:numFmt w:val="bullet"/>
+      <w:lvlText w:val="◦"/>
+      <w:lvlJc w:val="start"/>
+      <w:pPr>
+        <w:tabs>
+          <w:tab w:val="num" w:pos="1080"/>
+        </w:tabs>
+        <w:ind w:start="1080" w:hanging="360"/>
+      </w:pPr>
+      <w:rPr>
+        <w:rFonts w:ascii="OpenSymbol" w:hAnsi="OpenSymbol" w:cs="OpenSymbol" w:hint="default"/>
+      </w:rPr>
+    </w:lvl>
+    <w:lvl w:ilvl="2">
+      <w:start w:val="1"/>
+      <w:numFmt w:val="bullet"/>
+      <w:lvlText w:val="▪"/>
+      <w:lvlJc w:val="start"/>
+      <w:pPr>
+        <w:tabs>
+          <w:tab w:val="num" w:pos="1440"/>
+        </w:tabs>
+        <w:ind w:start="1440" w:hanging="360"/>
+      </w:pPr>
+      <w:rPr>
+        <w:rFonts w:ascii="OpenSymbol" w:hAnsi="OpenSymbol" w:cs="OpenSymbol" w:hint="default"/>
+      </w:rPr>
+    </w:lvl>
+    <w:lvl w:ilvl="3">
+      <w:start w:val="1"/>
+      <w:numFmt w:val="bullet"/>
+      <w:lvlText w:val=""/>
+      <w:lvlJc w:val="start"/>
+      <w:pPr>
+        <w:tabs>
+          <w:tab w:val="num" w:pos="1800"/>
+        </w:tabs>
+        <w:ind w:start="1800" w:hanging="360"/>
+      </w:pPr>
+      <w:rPr>
+        <w:rFonts w:ascii="Symbol" w:hAnsi="Symbol" w:cs="Symbol" w:hint="default"/>
+      </w:rPr>
+    </w:lvl>
+    <w:lvl w:ilvl="4">
+      <w:start w:val="1"/>
+      <w:numFmt w:val="bullet"/>
+      <w:lvlText w:val="◦"/>
+      <w:lvlJc w:val="start"/>
+      <w:pPr>
+        <w:tabs>
+          <w:tab w:val="num" w:pos="2160"/>
+        </w:tabs>
+        <w:ind w:start="2160" w:hanging="360"/>
+      </w:pPr>
+      <w:rPr>
+        <w:rFonts w:ascii="OpenSymbol" w:hAnsi="OpenSymbol" w:cs="OpenSymbol" w:hint="default"/>
+      </w:rPr>
+    </w:lvl>
+    <w:lvl w:ilvl="5">
+      <w:start w:val="1"/>
+      <w:numFmt w:val="bullet"/>
+      <w:lvlText w:val="▪"/>
+      <w:lvlJc w:val="start"/>
+      <w:pPr>
+        <w:tabs>
+          <w:tab w:val="num" w:pos="2520"/>
+        </w:tabs>
+        <w:ind w:start="2520" w:hanging="360"/>
+      </w:pPr>
+      <w:rPr>
+        <w:rFonts w:ascii="OpenSymbol" w:hAnsi="OpenSymbol" w:cs="OpenSymbol" w:hint="default"/>
+      </w:rPr>
+    </w:lvl>
+    <w:lvl w:ilvl="6">
+      <w:start w:val="1"/>
+      <w:numFmt w:val="bullet"/>
+      <w:lvlText w:val=""/>
+      <w:lvlJc w:val="start"/>
+      <w:pPr>
+        <w:tabs>
+          <w:tab w:val="num" w:pos="2880"/>
+        </w:tabs>
+        <w:ind w:start="2880" w:hanging="360"/>
+      </w:pPr>
+      <w:rPr>
+        <w:rFonts w:ascii="Symbol" w:hAnsi="Symbol" w:cs="Symbol" w:hint="default"/>
+      </w:rPr>
+    </w:lvl>
+    <w:lvl w:ilvl="7">
+      <w:start w:val="1"/>
+      <w:numFmt w:val="bullet"/>
+      <w:lvlText w:val="◦"/>
+      <w:lvlJc w:val="start"/>
+      <w:pPr>
+        <w:tabs>
+          <w:tab w:val="num" w:pos="3240"/>
+        </w:tabs>
+        <w:ind w:start="3240" w:hanging="360"/>
+      </w:pPr>
+      <w:rPr>
+        <w:rFonts w:ascii="OpenSymbol" w:hAnsi="OpenSymbol" w:cs="OpenSymbol" w:hint="default"/>
+      </w:rPr>
+    </w:lvl>
+    <w:lvl w:ilvl="8">
+      <w:start w:val="1"/>
+      <w:numFmt w:val="bullet"/>
+      <w:lvlText w:val="▪"/>
+      <w:lvlJc w:val="start"/>
+      <w:pPr>
+        <w:tabs>
+          <w:tab w:val="num" w:pos="3600"/>
+        </w:tabs>
+        <w:ind w:start="3600" w:hanging="360"/>
+      </w:pPr>
+      <w:rPr>
+        <w:rFonts w:ascii="OpenSymbol" w:hAnsi="OpenSymbol" w:cs="OpenSymbol" w:hint="default"/>
+      </w:rPr>
     </w:lvl>
   </w:abstractNum>
   <w:num w:numId="1">
@@ -6401,6 +6573,9 @@
   <w:num w:numId="14">
     <w:abstractNumId w:val="14"/>
   </w:num>
+  <w:num w:numId="15">
+    <w:abstractNumId w:val="15"/>
+  </w:num>
 </w:numbering>
 </file>
 
@@ -6428,6 +6603,9 @@
     <w:pPr>
       <w:widowControl/>
       <w:suppressAutoHyphens w:val="true"/>
+      <w:kinsoku w:val="true"/>
+      <w:overflowPunct w:val="true"/>
+      <w:autoSpaceDE w:val="true"/>
       <w:bidi w:val="0"/>
       <w:spacing w:before="0" w:after="0"/>
       <w:jc w:val="start"/>
@@ -6449,7 +6627,7 @@
     <w:pPr>
       <w:numPr>
         <w:ilvl w:val="0"/>
-        <w:numId w:val="1"/>
+        <w:numId w:val="2"/>
       </w:numPr>
       <w:spacing w:before="240" w:after="120"/>
       <w:outlineLvl w:val="0"/>
@@ -6471,6 +6649,14 @@
     <w:qFormat/>
     <w:rPr>
       <w:rFonts w:ascii="OpenSymbol" w:hAnsi="OpenSymbol" w:eastAsia="OpenSymbol" w:cs="OpenSymbol"/>
+    </w:rPr>
+  </w:style>
+  <w:style w:type="character" w:styleId="Strong">
+    <w:name w:val="Strong"/>
+    <w:qFormat/>
+    <w:rPr>
+      <w:b/>
+      <w:bCs/>
     </w:rPr>
   </w:style>
   <w:style w:type="paragraph" w:styleId="Heading">

</xml_diff>

<commit_message>
feat: add multi-recipient broadcast session support
</commit_message>
<xml_diff>
--- a/docs/design_notes.docx
+++ b/docs/design_notes.docx
@@ -79,7 +79,7 @@
         <w:pStyle w:val="Heading1"/>
         <w:numPr>
           <w:ilvl w:val="0"/>
-          <w:numId w:val="2"/>
+          <w:numId w:val="1"/>
         </w:numPr>
         <w:ind w:hanging="0" w:start="0"/>
         <w:rPr/>
@@ -104,7 +104,7 @@
       </w:tblPr>
       <w:tblGrid>
         <w:gridCol w:w="3212"/>
-        <w:gridCol w:w="6426"/>
+        <w:gridCol w:w="6425"/>
       </w:tblGrid>
       <w:tr>
         <w:trPr/>
@@ -130,7 +130,7 @@
         </w:tc>
         <w:tc>
           <w:tcPr>
-            <w:tcW w:w="6426" w:type="dxa"/>
+            <w:tcW w:w="6425" w:type="dxa"/>
             <w:tcBorders>
               <w:top w:val="single" w:sz="4" w:space="0" w:color="000000"/>
               <w:start w:val="single" w:sz="4" w:space="0" w:color="000000"/>
@@ -173,7 +173,7 @@
         </w:tc>
         <w:tc>
           <w:tcPr>
-            <w:tcW w:w="6426" w:type="dxa"/>
+            <w:tcW w:w="6425" w:type="dxa"/>
             <w:tcBorders>
               <w:start w:val="single" w:sz="4" w:space="0" w:color="000000"/>
               <w:bottom w:val="single" w:sz="4" w:space="0" w:color="000000"/>
@@ -215,7 +215,7 @@
         </w:tc>
         <w:tc>
           <w:tcPr>
-            <w:tcW w:w="6426" w:type="dxa"/>
+            <w:tcW w:w="6425" w:type="dxa"/>
             <w:tcBorders>
               <w:start w:val="single" w:sz="4" w:space="0" w:color="000000"/>
               <w:bottom w:val="single" w:sz="4" w:space="0" w:color="000000"/>
@@ -257,7 +257,7 @@
         </w:tc>
         <w:tc>
           <w:tcPr>
-            <w:tcW w:w="6426" w:type="dxa"/>
+            <w:tcW w:w="6425" w:type="dxa"/>
             <w:tcBorders>
               <w:start w:val="single" w:sz="4" w:space="0" w:color="000000"/>
               <w:bottom w:val="single" w:sz="4" w:space="0" w:color="000000"/>
@@ -299,7 +299,7 @@
         </w:tc>
         <w:tc>
           <w:tcPr>
-            <w:tcW w:w="6426" w:type="dxa"/>
+            <w:tcW w:w="6425" w:type="dxa"/>
             <w:tcBorders>
               <w:start w:val="single" w:sz="4" w:space="0" w:color="000000"/>
               <w:bottom w:val="single" w:sz="4" w:space="0" w:color="000000"/>
@@ -341,7 +341,7 @@
         </w:tc>
         <w:tc>
           <w:tcPr>
-            <w:tcW w:w="6426" w:type="dxa"/>
+            <w:tcW w:w="6425" w:type="dxa"/>
             <w:tcBorders>
               <w:start w:val="single" w:sz="4" w:space="0" w:color="000000"/>
               <w:bottom w:val="single" w:sz="4" w:space="0" w:color="000000"/>
@@ -383,7 +383,7 @@
         </w:tc>
         <w:tc>
           <w:tcPr>
-            <w:tcW w:w="6426" w:type="dxa"/>
+            <w:tcW w:w="6425" w:type="dxa"/>
             <w:tcBorders>
               <w:start w:val="single" w:sz="4" w:space="0" w:color="000000"/>
               <w:bottom w:val="single" w:sz="4" w:space="0" w:color="000000"/>
@@ -425,7 +425,7 @@
         </w:tc>
         <w:tc>
           <w:tcPr>
-            <w:tcW w:w="6426" w:type="dxa"/>
+            <w:tcW w:w="6425" w:type="dxa"/>
             <w:tcBorders>
               <w:start w:val="single" w:sz="4" w:space="0" w:color="000000"/>
               <w:bottom w:val="single" w:sz="4" w:space="0" w:color="000000"/>
@@ -467,7 +467,7 @@
         </w:tc>
         <w:tc>
           <w:tcPr>
-            <w:tcW w:w="6426" w:type="dxa"/>
+            <w:tcW w:w="6425" w:type="dxa"/>
             <w:tcBorders>
               <w:start w:val="single" w:sz="4" w:space="0" w:color="000000"/>
               <w:bottom w:val="single" w:sz="4" w:space="0" w:color="000000"/>
@@ -509,7 +509,7 @@
         </w:tc>
         <w:tc>
           <w:tcPr>
-            <w:tcW w:w="6426" w:type="dxa"/>
+            <w:tcW w:w="6425" w:type="dxa"/>
             <w:tcBorders>
               <w:start w:val="single" w:sz="4" w:space="0" w:color="000000"/>
               <w:bottom w:val="single" w:sz="4" w:space="0" w:color="000000"/>
@@ -551,7 +551,7 @@
         </w:tc>
         <w:tc>
           <w:tcPr>
-            <w:tcW w:w="6426" w:type="dxa"/>
+            <w:tcW w:w="6425" w:type="dxa"/>
             <w:tcBorders>
               <w:start w:val="single" w:sz="4" w:space="0" w:color="000000"/>
               <w:bottom w:val="single" w:sz="4" w:space="0" w:color="000000"/>
@@ -593,7 +593,7 @@
         </w:tc>
         <w:tc>
           <w:tcPr>
-            <w:tcW w:w="6426" w:type="dxa"/>
+            <w:tcW w:w="6425" w:type="dxa"/>
             <w:tcBorders>
               <w:start w:val="single" w:sz="4" w:space="0" w:color="000000"/>
               <w:bottom w:val="single" w:sz="4" w:space="0" w:color="000000"/>
@@ -635,7 +635,7 @@
         </w:tc>
         <w:tc>
           <w:tcPr>
-            <w:tcW w:w="6426" w:type="dxa"/>
+            <w:tcW w:w="6425" w:type="dxa"/>
             <w:tcBorders>
               <w:start w:val="single" w:sz="4" w:space="0" w:color="000000"/>
               <w:bottom w:val="single" w:sz="4" w:space="0" w:color="000000"/>
@@ -677,7 +677,7 @@
         </w:tc>
         <w:tc>
           <w:tcPr>
-            <w:tcW w:w="6426" w:type="dxa"/>
+            <w:tcW w:w="6425" w:type="dxa"/>
             <w:tcBorders>
               <w:start w:val="single" w:sz="4" w:space="0" w:color="000000"/>
               <w:bottom w:val="single" w:sz="4" w:space="0" w:color="000000"/>
@@ -719,7 +719,7 @@
         </w:tc>
         <w:tc>
           <w:tcPr>
-            <w:tcW w:w="6426" w:type="dxa"/>
+            <w:tcW w:w="6425" w:type="dxa"/>
             <w:tcBorders>
               <w:start w:val="single" w:sz="4" w:space="0" w:color="000000"/>
               <w:bottom w:val="single" w:sz="4" w:space="0" w:color="000000"/>
@@ -761,7 +761,7 @@
         </w:tc>
         <w:tc>
           <w:tcPr>
-            <w:tcW w:w="6426" w:type="dxa"/>
+            <w:tcW w:w="6425" w:type="dxa"/>
             <w:tcBorders>
               <w:start w:val="single" w:sz="4" w:space="0" w:color="000000"/>
               <w:bottom w:val="single" w:sz="4" w:space="0" w:color="000000"/>
@@ -803,7 +803,7 @@
         </w:tc>
         <w:tc>
           <w:tcPr>
-            <w:tcW w:w="6426" w:type="dxa"/>
+            <w:tcW w:w="6425" w:type="dxa"/>
             <w:tcBorders>
               <w:start w:val="single" w:sz="4" w:space="0" w:color="000000"/>
               <w:bottom w:val="single" w:sz="4" w:space="0" w:color="000000"/>
@@ -850,41 +850,114 @@
     <w:p>
       <w:pPr>
         <w:pStyle w:val="Heading1"/>
+        <w:numPr>
+          <w:ilvl w:val="0"/>
+          <w:numId w:val="1"/>
+        </w:numPr>
+        <w:bidi w:val="0"/>
+        <w:ind w:hanging="0" w:start="0"/>
+        <w:jc w:val="both"/>
+        <w:rPr/>
+      </w:pPr>
+      <w:r>
+        <w:rPr/>
+        <w:t>Functional requirements</w:t>
+      </w:r>
+    </w:p>
+    <w:p>
+      <w:pPr>
+        <w:pStyle w:val="Normal"/>
+        <w:bidi w:val="0"/>
+        <w:jc w:val="both"/>
+        <w:rPr>
+          <w:rFonts w:ascii="SF Pro Text" w:hAnsi="SF Pro Text"/>
+        </w:rPr>
+      </w:pPr>
+      <w:r>
+        <w:rPr>
+          <w:rFonts w:ascii="SF Pro Text" w:hAnsi="SF Pro Text"/>
+        </w:rPr>
+      </w:r>
+    </w:p>
+    <w:p>
+      <w:pPr>
+        <w:pStyle w:val="BodyText"/>
+        <w:numPr>
+          <w:ilvl w:val="0"/>
+          <w:numId w:val="14"/>
+        </w:numPr>
+        <w:bidi w:val="0"/>
+        <w:jc w:val="both"/>
+        <w:rPr>
+          <w:rFonts w:ascii="SF Pro Text" w:hAnsi="SF Pro Text"/>
+        </w:rPr>
+      </w:pPr>
+      <w:r>
+        <w:rPr>
+          <w:rStyle w:val="Strong"/>
+          <w:rFonts w:ascii="SF Pro Text" w:hAnsi="SF Pro Text"/>
+        </w:rPr>
+        <w:t>Signaling Flow (handled by Spring Boot + Socket.IO)</w:t>
+      </w:r>
+    </w:p>
+    <w:p>
+      <w:pPr>
+        <w:pStyle w:val="BodyText"/>
+        <w:numPr>
+          <w:ilvl w:val="0"/>
+          <w:numId w:val="14"/>
+        </w:numPr>
+        <w:rPr/>
+      </w:pPr>
+      <w:r>
+        <w:rPr>
+          <w:rStyle w:val="Strong"/>
+          <w:rFonts w:ascii="SF Pro Text" w:hAnsi="SF Pro Text"/>
+        </w:rPr>
+        <w:t>Data Flow (handled by WebRTC peer connection)</w:t>
+      </w:r>
+    </w:p>
+    <w:p>
+      <w:pPr>
+        <w:pStyle w:val="Normal"/>
+        <w:bidi w:val="0"/>
+        <w:jc w:val="both"/>
+        <w:rPr>
+          <w:rFonts w:ascii="SF Pro Text" w:hAnsi="SF Pro Text"/>
+        </w:rPr>
+      </w:pPr>
+      <w:r>
+        <w:rPr>
+          <w:rFonts w:ascii="SF Pro Text" w:hAnsi="SF Pro Text"/>
+        </w:rPr>
+      </w:r>
+    </w:p>
+    <w:p>
+      <w:pPr>
+        <w:pStyle w:val="Normal"/>
         <w:numPr>
           <w:ilvl w:val="0"/>
           <w:numId w:val="2"/>
         </w:numPr>
         <w:bidi w:val="0"/>
-        <w:ind w:hanging="0" w:start="0"/>
-        <w:jc w:val="both"/>
-        <w:rPr/>
-      </w:pPr>
-      <w:r>
-        <w:rPr/>
-        <w:t>Functional requirements</w:t>
-      </w:r>
-    </w:p>
-    <w:p>
-      <w:pPr>
-        <w:pStyle w:val="Normal"/>
-        <w:bidi w:val="0"/>
-        <w:jc w:val="both"/>
-        <w:rPr>
-          <w:rFonts w:ascii="SF Pro Text" w:hAnsi="SF Pro Text"/>
-        </w:rPr>
-      </w:pPr>
-      <w:r>
-        <w:rPr>
-          <w:rFonts w:ascii="SF Pro Text" w:hAnsi="SF Pro Text"/>
-        </w:rPr>
-      </w:r>
-    </w:p>
-    <w:p>
-      <w:pPr>
-        <w:pStyle w:val="BodyText"/>
+        <w:jc w:val="both"/>
+        <w:rPr>
+          <w:rFonts w:ascii="SF Pro Text" w:hAnsi="SF Pro Text"/>
+        </w:rPr>
+      </w:pPr>
+      <w:r>
+        <w:rPr>
+          <w:rFonts w:ascii="SF Pro Text" w:hAnsi="SF Pro Text"/>
+        </w:rPr>
+        <w:t>Create share session – Sender clicks “create session”- backend generates a unique session id</w:t>
+      </w:r>
+    </w:p>
+    <w:p>
+      <w:pPr>
+        <w:pStyle w:val="Normal"/>
         <w:numPr>
           <w:ilvl w:val="0"/>
-          <w:numId w:val="15"/>
+          <w:numId w:val="2"/>
         </w:numPr>
         <w:bidi w:val="0"/>
         <w:jc w:val="both"/>
@@ -894,42 +967,217 @@
       </w:pPr>
       <w:r>
         <w:rPr>
-          <w:rStyle w:val="Strong"/>
-          <w:rFonts w:ascii="SF Pro Text" w:hAnsi="SF Pro Text"/>
-        </w:rPr>
-        <w:t>Signaling Flow (handled by Spring Boot + Socket.IO)</w:t>
-      </w:r>
-    </w:p>
-    <w:p>
-      <w:pPr>
-        <w:pStyle w:val="BodyText"/>
+          <w:rFonts w:ascii="SF Pro Text" w:hAnsi="SF Pro Text"/>
+        </w:rPr>
+        <w:t>Join session – Receiver enters the code or scans QR to connect to the sender</w:t>
+      </w:r>
+    </w:p>
+    <w:p>
+      <w:pPr>
+        <w:pStyle w:val="Normal"/>
         <w:numPr>
           <w:ilvl w:val="0"/>
-          <w:numId w:val="15"/>
+          <w:numId w:val="2"/>
         </w:numPr>
+        <w:bidi w:val="0"/>
+        <w:jc w:val="both"/>
+        <w:rPr>
+          <w:rFonts w:ascii="SF Pro Text" w:hAnsi="SF Pro Text"/>
+        </w:rPr>
+      </w:pPr>
+      <w:r>
+        <w:rPr>
+          <w:rFonts w:ascii="SF Pro Text" w:hAnsi="SF Pro Text"/>
+        </w:rPr>
+        <w:t>Peer connection – Once both are in session, a WebRTC data channel is established via socket.IO signaling.</w:t>
+      </w:r>
+    </w:p>
+    <w:p>
+      <w:pPr>
+        <w:pStyle w:val="Normal"/>
+        <w:numPr>
+          <w:ilvl w:val="0"/>
+          <w:numId w:val="2"/>
+        </w:numPr>
+        <w:bidi w:val="0"/>
+        <w:jc w:val="both"/>
+        <w:rPr>
+          <w:rFonts w:ascii="SF Pro Text" w:hAnsi="SF Pro Text"/>
+        </w:rPr>
+      </w:pPr>
+      <w:r>
+        <w:rPr>
+          <w:rFonts w:ascii="SF Pro Text" w:hAnsi="SF Pro Text"/>
+        </w:rPr>
+        <w:t>File transfer – Sender selects file → gets streamed via WebRTC data channel to receiver</w:t>
+      </w:r>
+    </w:p>
+    <w:p>
+      <w:pPr>
+        <w:pStyle w:val="Normal"/>
+        <w:numPr>
+          <w:ilvl w:val="0"/>
+          <w:numId w:val="2"/>
+        </w:numPr>
+        <w:bidi w:val="0"/>
+        <w:jc w:val="both"/>
+        <w:rPr>
+          <w:rFonts w:ascii="SF Pro Text" w:hAnsi="SF Pro Text"/>
+        </w:rPr>
+      </w:pPr>
+      <w:r>
+        <w:rPr>
+          <w:rFonts w:ascii="SF Pro Text" w:hAnsi="SF Pro Text"/>
+        </w:rPr>
+        <w:t>File encryption – Before sending, file is AES-encrypted in the browser. Receiver decrypts it</w:t>
+      </w:r>
+    </w:p>
+    <w:p>
+      <w:pPr>
+        <w:pStyle w:val="Normal"/>
+        <w:numPr>
+          <w:ilvl w:val="0"/>
+          <w:numId w:val="2"/>
+        </w:numPr>
+        <w:bidi w:val="0"/>
+        <w:jc w:val="both"/>
+        <w:rPr>
+          <w:rFonts w:ascii="SF Pro Text" w:hAnsi="SF Pro Text"/>
+        </w:rPr>
+      </w:pPr>
+      <w:r>
+        <w:rPr>
+          <w:rFonts w:ascii="SF Pro Text" w:hAnsi="SF Pro Text"/>
+        </w:rPr>
+        <w:t>Progress UI – show upload an download progress for each file</w:t>
+      </w:r>
+    </w:p>
+    <w:p>
+      <w:pPr>
+        <w:pStyle w:val="Normal"/>
+        <w:numPr>
+          <w:ilvl w:val="0"/>
+          <w:numId w:val="2"/>
+        </w:numPr>
+        <w:bidi w:val="0"/>
+        <w:jc w:val="both"/>
+        <w:rPr>
+          <w:rFonts w:ascii="SF Pro Text" w:hAnsi="SF Pro Text"/>
+        </w:rPr>
+      </w:pPr>
+      <w:r>
+        <w:rPr>
+          <w:rFonts w:ascii="SF Pro Text" w:hAnsi="SF Pro Text"/>
+        </w:rPr>
+        <w:t>Device QR link – show QR code for easier connect on mobile</w:t>
+      </w:r>
+    </w:p>
+    <w:p>
+      <w:pPr>
+        <w:pStyle w:val="Normal"/>
+        <w:numPr>
+          <w:ilvl w:val="0"/>
+          <w:numId w:val="2"/>
+        </w:numPr>
+        <w:bidi w:val="0"/>
+        <w:jc w:val="both"/>
+        <w:rPr>
+          <w:rFonts w:ascii="SF Pro Text" w:hAnsi="SF Pro Text"/>
+        </w:rPr>
+      </w:pPr>
+      <w:r>
+        <w:rPr>
+          <w:rFonts w:ascii="SF Pro Text" w:hAnsi="SF Pro Text"/>
+        </w:rPr>
+        <w:t>Connection fallback – if peer to peer fails (e.g., behind NAT/ firewall) , use Springboot relay proxy.</w:t>
+      </w:r>
+    </w:p>
+    <w:p>
+      <w:pPr>
+        <w:pStyle w:val="Normal"/>
+        <w:numPr>
+          <w:ilvl w:val="0"/>
+          <w:numId w:val="2"/>
+        </w:numPr>
+        <w:bidi w:val="0"/>
+        <w:jc w:val="both"/>
+        <w:rPr>
+          <w:rFonts w:ascii="SF Pro Text" w:hAnsi="SF Pro Text"/>
+        </w:rPr>
+      </w:pPr>
+      <w:r>
+        <w:rPr>
+          <w:rFonts w:ascii="SF Pro Text" w:hAnsi="SF Pro Text"/>
+        </w:rPr>
+        <w:t>Local history – share previous share sessions in browser using indexedDB</w:t>
+      </w:r>
+    </w:p>
+    <w:p>
+      <w:pPr>
+        <w:pStyle w:val="Normal"/>
+        <w:numPr>
+          <w:ilvl w:val="0"/>
+          <w:numId w:val="2"/>
+        </w:numPr>
+        <w:bidi w:val="0"/>
+        <w:jc w:val="both"/>
+        <w:rPr>
+          <w:rFonts w:ascii="SF Pro Text" w:hAnsi="SF Pro Text"/>
+        </w:rPr>
+      </w:pPr>
+      <w:r>
+        <w:rPr>
+          <w:rFonts w:ascii="SF Pro Text" w:hAnsi="SF Pro Text"/>
+        </w:rPr>
+        <w:t>Auto cleanup – sessions expire after inactivity (server + client)</w:t>
+      </w:r>
+    </w:p>
+    <w:p>
+      <w:pPr>
+        <w:pStyle w:val="Normal"/>
+        <w:bidi w:val="0"/>
+        <w:jc w:val="both"/>
+        <w:rPr>
+          <w:rFonts w:ascii="SF Pro Text" w:hAnsi="SF Pro Text"/>
+        </w:rPr>
+      </w:pPr>
+      <w:r>
+        <w:rPr>
+          <w:rFonts w:ascii="SF Pro Text" w:hAnsi="SF Pro Text"/>
+        </w:rPr>
+      </w:r>
+    </w:p>
+    <w:p>
+      <w:pPr>
+        <w:pStyle w:val="Heading1"/>
+        <w:numPr>
+          <w:ilvl w:val="0"/>
+          <w:numId w:val="1"/>
+        </w:numPr>
+        <w:bidi w:val="0"/>
+        <w:ind w:hanging="0" w:start="0"/>
+        <w:jc w:val="both"/>
         <w:rPr/>
       </w:pPr>
       <w:r>
-        <w:rPr>
-          <w:rStyle w:val="Strong"/>
-          <w:rFonts w:ascii="SF Pro Text" w:hAnsi="SF Pro Text"/>
-        </w:rPr>
-        <w:t>Data Flow (handled by WebRTC peer connection)</w:t>
-      </w:r>
-    </w:p>
-    <w:p>
-      <w:pPr>
-        <w:pStyle w:val="Normal"/>
-        <w:bidi w:val="0"/>
-        <w:jc w:val="both"/>
-        <w:rPr>
-          <w:rFonts w:ascii="SF Pro Text" w:hAnsi="SF Pro Text"/>
-        </w:rPr>
-      </w:pPr>
-      <w:r>
-        <w:rPr>
-          <w:rFonts w:ascii="SF Pro Text" w:hAnsi="SF Pro Text"/>
-        </w:rPr>
+        <w:rPr/>
+        <w:t>Non-Functional requirements</w:t>
+      </w:r>
+    </w:p>
+    <w:p>
+      <w:pPr>
+        <w:pStyle w:val="Normal"/>
+        <w:bidi w:val="0"/>
+        <w:jc w:val="both"/>
+        <w:rPr>
+          <w:rFonts w:ascii="SF Pro Text" w:hAnsi="SF Pro Text"/>
+        </w:rPr>
+      </w:pPr>
+      <w:r>
+        <w:rPr>
+          <w:rFonts w:ascii="SF Pro Text" w:hAnsi="SF Pro Text"/>
+        </w:rPr>
+        <w:t xml:space="preserve"> </w:t>
       </w:r>
     </w:p>
     <w:p>
@@ -949,7 +1197,7 @@
         <w:rPr>
           <w:rFonts w:ascii="SF Pro Text" w:hAnsi="SF Pro Text"/>
         </w:rPr>
-        <w:t>Create share session – Sender clicks “create session”- backend generates a unique session id</w:t>
+        <w:t>Performance – Must handle 100 concurrent signaling sessions easily. File transfer is P2P. So server load stays low.</w:t>
       </w:r>
     </w:p>
     <w:p>
@@ -969,7 +1217,7 @@
         <w:rPr>
           <w:rFonts w:ascii="SF Pro Text" w:hAnsi="SF Pro Text"/>
         </w:rPr>
-        <w:t>Join session – Receiver enters the code or scans QR to connect to the sender</w:t>
+        <w:t>Scalability – Redis for many signaling clients.</w:t>
       </w:r>
     </w:p>
     <w:p>
@@ -989,7 +1237,7 @@
         <w:rPr>
           <w:rFonts w:ascii="SF Pro Text" w:hAnsi="SF Pro Text"/>
         </w:rPr>
-        <w:t>Peer connection – Once both are in session, a WebRTC data channel is established via socket.IO signaling.</w:t>
+        <w:t>Security – HTTPS/WSS for all signaling. WebRTC data is encrypted (DTLS).</w:t>
       </w:r>
     </w:p>
     <w:p>
@@ -1009,7 +1257,7 @@
         <w:rPr>
           <w:rFonts w:ascii="SF Pro Text" w:hAnsi="SF Pro Text"/>
         </w:rPr>
-        <w:t>File transfer – Sender selects file → gets streamed via WebRTC data channel to receiver</w:t>
+        <w:t>Cross-Platform – Works on desktop and mobile browsers</w:t>
       </w:r>
     </w:p>
     <w:p>
@@ -1018,254 +1266,6 @@
         <w:numPr>
           <w:ilvl w:val="0"/>
           <w:numId w:val="3"/>
-        </w:numPr>
-        <w:bidi w:val="0"/>
-        <w:jc w:val="both"/>
-        <w:rPr>
-          <w:rFonts w:ascii="SF Pro Text" w:hAnsi="SF Pro Text"/>
-        </w:rPr>
-      </w:pPr>
-      <w:r>
-        <w:rPr>
-          <w:rFonts w:ascii="SF Pro Text" w:hAnsi="SF Pro Text"/>
-        </w:rPr>
-        <w:t>File encryption – Before sending, file is AES-encrypted in the browser. Receiver decrypts it</w:t>
-      </w:r>
-    </w:p>
-    <w:p>
-      <w:pPr>
-        <w:pStyle w:val="Normal"/>
-        <w:numPr>
-          <w:ilvl w:val="0"/>
-          <w:numId w:val="3"/>
-        </w:numPr>
-        <w:bidi w:val="0"/>
-        <w:jc w:val="both"/>
-        <w:rPr>
-          <w:rFonts w:ascii="SF Pro Text" w:hAnsi="SF Pro Text"/>
-        </w:rPr>
-      </w:pPr>
-      <w:r>
-        <w:rPr>
-          <w:rFonts w:ascii="SF Pro Text" w:hAnsi="SF Pro Text"/>
-        </w:rPr>
-        <w:t>Progress UI – show upload an download progress for each file</w:t>
-      </w:r>
-    </w:p>
-    <w:p>
-      <w:pPr>
-        <w:pStyle w:val="Normal"/>
-        <w:numPr>
-          <w:ilvl w:val="0"/>
-          <w:numId w:val="3"/>
-        </w:numPr>
-        <w:bidi w:val="0"/>
-        <w:jc w:val="both"/>
-        <w:rPr>
-          <w:rFonts w:ascii="SF Pro Text" w:hAnsi="SF Pro Text"/>
-        </w:rPr>
-      </w:pPr>
-      <w:r>
-        <w:rPr>
-          <w:rFonts w:ascii="SF Pro Text" w:hAnsi="SF Pro Text"/>
-        </w:rPr>
-        <w:t>Device QR link – show QR code for easier connect on mobile</w:t>
-      </w:r>
-    </w:p>
-    <w:p>
-      <w:pPr>
-        <w:pStyle w:val="Normal"/>
-        <w:numPr>
-          <w:ilvl w:val="0"/>
-          <w:numId w:val="3"/>
-        </w:numPr>
-        <w:bidi w:val="0"/>
-        <w:jc w:val="both"/>
-        <w:rPr>
-          <w:rFonts w:ascii="SF Pro Text" w:hAnsi="SF Pro Text"/>
-        </w:rPr>
-      </w:pPr>
-      <w:r>
-        <w:rPr>
-          <w:rFonts w:ascii="SF Pro Text" w:hAnsi="SF Pro Text"/>
-        </w:rPr>
-        <w:t>Connection fallback – if peer to peer fails (e.g., behind NAT/ firewall) , use Springboot relay proxy.</w:t>
-      </w:r>
-    </w:p>
-    <w:p>
-      <w:pPr>
-        <w:pStyle w:val="Normal"/>
-        <w:numPr>
-          <w:ilvl w:val="0"/>
-          <w:numId w:val="3"/>
-        </w:numPr>
-        <w:bidi w:val="0"/>
-        <w:jc w:val="both"/>
-        <w:rPr>
-          <w:rFonts w:ascii="SF Pro Text" w:hAnsi="SF Pro Text"/>
-        </w:rPr>
-      </w:pPr>
-      <w:r>
-        <w:rPr>
-          <w:rFonts w:ascii="SF Pro Text" w:hAnsi="SF Pro Text"/>
-        </w:rPr>
-        <w:t>Local history – share previous share sessions in browser using indexedDB</w:t>
-      </w:r>
-    </w:p>
-    <w:p>
-      <w:pPr>
-        <w:pStyle w:val="Normal"/>
-        <w:numPr>
-          <w:ilvl w:val="0"/>
-          <w:numId w:val="3"/>
-        </w:numPr>
-        <w:bidi w:val="0"/>
-        <w:jc w:val="both"/>
-        <w:rPr>
-          <w:rFonts w:ascii="SF Pro Text" w:hAnsi="SF Pro Text"/>
-        </w:rPr>
-      </w:pPr>
-      <w:r>
-        <w:rPr>
-          <w:rFonts w:ascii="SF Pro Text" w:hAnsi="SF Pro Text"/>
-        </w:rPr>
-        <w:t>Auto cleanup – sessions expire after inactivity (server + client)</w:t>
-      </w:r>
-    </w:p>
-    <w:p>
-      <w:pPr>
-        <w:pStyle w:val="Normal"/>
-        <w:bidi w:val="0"/>
-        <w:jc w:val="both"/>
-        <w:rPr>
-          <w:rFonts w:ascii="SF Pro Text" w:hAnsi="SF Pro Text"/>
-        </w:rPr>
-      </w:pPr>
-      <w:r>
-        <w:rPr>
-          <w:rFonts w:ascii="SF Pro Text" w:hAnsi="SF Pro Text"/>
-        </w:rPr>
-      </w:r>
-    </w:p>
-    <w:p>
-      <w:pPr>
-        <w:pStyle w:val="Heading1"/>
-        <w:numPr>
-          <w:ilvl w:val="0"/>
-          <w:numId w:val="2"/>
-        </w:numPr>
-        <w:bidi w:val="0"/>
-        <w:ind w:hanging="0" w:start="0"/>
-        <w:jc w:val="both"/>
-        <w:rPr/>
-      </w:pPr>
-      <w:r>
-        <w:rPr/>
-        <w:t>Non-Functional requirements</w:t>
-      </w:r>
-    </w:p>
-    <w:p>
-      <w:pPr>
-        <w:pStyle w:val="Normal"/>
-        <w:bidi w:val="0"/>
-        <w:jc w:val="both"/>
-        <w:rPr>
-          <w:rFonts w:ascii="SF Pro Text" w:hAnsi="SF Pro Text"/>
-        </w:rPr>
-      </w:pPr>
-      <w:r>
-        <w:rPr>
-          <w:rFonts w:ascii="SF Pro Text" w:hAnsi="SF Pro Text"/>
-        </w:rPr>
-        <w:t xml:space="preserve"> </w:t>
-      </w:r>
-    </w:p>
-    <w:p>
-      <w:pPr>
-        <w:pStyle w:val="Normal"/>
-        <w:numPr>
-          <w:ilvl w:val="0"/>
-          <w:numId w:val="4"/>
-        </w:numPr>
-        <w:bidi w:val="0"/>
-        <w:jc w:val="both"/>
-        <w:rPr>
-          <w:rFonts w:ascii="SF Pro Text" w:hAnsi="SF Pro Text"/>
-        </w:rPr>
-      </w:pPr>
-      <w:r>
-        <w:rPr>
-          <w:rFonts w:ascii="SF Pro Text" w:hAnsi="SF Pro Text"/>
-        </w:rPr>
-        <w:t>Performance – Must handle 100 concurrent signaling sessions easily. File transfer is P2P. So server load stays low.</w:t>
-      </w:r>
-    </w:p>
-    <w:p>
-      <w:pPr>
-        <w:pStyle w:val="Normal"/>
-        <w:numPr>
-          <w:ilvl w:val="0"/>
-          <w:numId w:val="4"/>
-        </w:numPr>
-        <w:bidi w:val="0"/>
-        <w:jc w:val="both"/>
-        <w:rPr>
-          <w:rFonts w:ascii="SF Pro Text" w:hAnsi="SF Pro Text"/>
-        </w:rPr>
-      </w:pPr>
-      <w:r>
-        <w:rPr>
-          <w:rFonts w:ascii="SF Pro Text" w:hAnsi="SF Pro Text"/>
-        </w:rPr>
-        <w:t>Scalability – Redis for many signaling clients.</w:t>
-      </w:r>
-    </w:p>
-    <w:p>
-      <w:pPr>
-        <w:pStyle w:val="Normal"/>
-        <w:numPr>
-          <w:ilvl w:val="0"/>
-          <w:numId w:val="4"/>
-        </w:numPr>
-        <w:bidi w:val="0"/>
-        <w:jc w:val="both"/>
-        <w:rPr>
-          <w:rFonts w:ascii="SF Pro Text" w:hAnsi="SF Pro Text"/>
-        </w:rPr>
-      </w:pPr>
-      <w:r>
-        <w:rPr>
-          <w:rFonts w:ascii="SF Pro Text" w:hAnsi="SF Pro Text"/>
-        </w:rPr>
-        <w:t>Security – HTTPS/WSS for all signaling. WebRTC data is encrypted (DTLS).</w:t>
-      </w:r>
-    </w:p>
-    <w:p>
-      <w:pPr>
-        <w:pStyle w:val="Normal"/>
-        <w:numPr>
-          <w:ilvl w:val="0"/>
-          <w:numId w:val="4"/>
-        </w:numPr>
-        <w:bidi w:val="0"/>
-        <w:jc w:val="both"/>
-        <w:rPr>
-          <w:rFonts w:ascii="SF Pro Text" w:hAnsi="SF Pro Text"/>
-        </w:rPr>
-      </w:pPr>
-      <w:r>
-        <w:rPr>
-          <w:rFonts w:ascii="SF Pro Text" w:hAnsi="SF Pro Text"/>
-        </w:rPr>
-        <w:t>Cross-Platform – Works on desktop and mobile browsers</w:t>
-      </w:r>
-    </w:p>
-    <w:p>
-      <w:pPr>
-        <w:pStyle w:val="Normal"/>
-        <w:numPr>
-          <w:ilvl w:val="0"/>
-          <w:numId w:val="4"/>
         </w:numPr>
         <w:bidi w:val="0"/>
         <w:jc w:val="both"/>
@@ -1357,15 +1357,15 @@
         </w:tblCellMar>
       </w:tblPr>
       <w:tblGrid>
-        <w:gridCol w:w="2404"/>
-        <w:gridCol w:w="2413"/>
+        <w:gridCol w:w="2403"/>
+        <w:gridCol w:w="2414"/>
         <w:gridCol w:w="4821"/>
       </w:tblGrid>
       <w:tr>
         <w:trPr/>
         <w:tc>
           <w:tcPr>
-            <w:tcW w:w="2404" w:type="dxa"/>
+            <w:tcW w:w="2403" w:type="dxa"/>
             <w:tcBorders>
               <w:top w:val="single" w:sz="4" w:space="0" w:color="000000"/>
               <w:start w:val="single" w:sz="4" w:space="0" w:color="000000"/>
@@ -1391,7 +1391,7 @@
         </w:tc>
         <w:tc>
           <w:tcPr>
-            <w:tcW w:w="2413" w:type="dxa"/>
+            <w:tcW w:w="2414" w:type="dxa"/>
             <w:tcBorders>
               <w:top w:val="single" w:sz="4" w:space="0" w:color="000000"/>
               <w:start w:val="single" w:sz="4" w:space="0" w:color="000000"/>
@@ -1447,7 +1447,7 @@
         <w:trPr/>
         <w:tc>
           <w:tcPr>
-            <w:tcW w:w="2404" w:type="dxa"/>
+            <w:tcW w:w="2403" w:type="dxa"/>
             <w:tcBorders>
               <w:start w:val="single" w:sz="4" w:space="0" w:color="000000"/>
               <w:bottom w:val="single" w:sz="4" w:space="0" w:color="000000"/>
@@ -1472,7 +1472,7 @@
         </w:tc>
         <w:tc>
           <w:tcPr>
-            <w:tcW w:w="2413" w:type="dxa"/>
+            <w:tcW w:w="2414" w:type="dxa"/>
             <w:tcBorders>
               <w:start w:val="single" w:sz="4" w:space="0" w:color="000000"/>
               <w:bottom w:val="single" w:sz="4" w:space="0" w:color="000000"/>
@@ -1526,7 +1526,7 @@
         <w:trPr/>
         <w:tc>
           <w:tcPr>
-            <w:tcW w:w="2404" w:type="dxa"/>
+            <w:tcW w:w="2403" w:type="dxa"/>
             <w:tcBorders>
               <w:start w:val="single" w:sz="4" w:space="0" w:color="000000"/>
               <w:bottom w:val="single" w:sz="4" w:space="0" w:color="000000"/>
@@ -1551,7 +1551,7 @@
         </w:tc>
         <w:tc>
           <w:tcPr>
-            <w:tcW w:w="2413" w:type="dxa"/>
+            <w:tcW w:w="2414" w:type="dxa"/>
             <w:tcBorders>
               <w:start w:val="single" w:sz="4" w:space="0" w:color="000000"/>
               <w:bottom w:val="single" w:sz="4" w:space="0" w:color="000000"/>
@@ -1605,7 +1605,7 @@
         <w:trPr/>
         <w:tc>
           <w:tcPr>
-            <w:tcW w:w="2404" w:type="dxa"/>
+            <w:tcW w:w="2403" w:type="dxa"/>
             <w:tcBorders>
               <w:start w:val="single" w:sz="4" w:space="0" w:color="000000"/>
               <w:bottom w:val="single" w:sz="4" w:space="0" w:color="000000"/>
@@ -1630,7 +1630,7 @@
         </w:tc>
         <w:tc>
           <w:tcPr>
-            <w:tcW w:w="2413" w:type="dxa"/>
+            <w:tcW w:w="2414" w:type="dxa"/>
             <w:tcBorders>
               <w:start w:val="single" w:sz="4" w:space="0" w:color="000000"/>
               <w:bottom w:val="single" w:sz="4" w:space="0" w:color="000000"/>
@@ -1684,7 +1684,7 @@
         <w:trPr/>
         <w:tc>
           <w:tcPr>
-            <w:tcW w:w="2404" w:type="dxa"/>
+            <w:tcW w:w="2403" w:type="dxa"/>
             <w:tcBorders>
               <w:start w:val="single" w:sz="4" w:space="0" w:color="000000"/>
               <w:bottom w:val="single" w:sz="4" w:space="0" w:color="000000"/>
@@ -1709,7 +1709,7 @@
         </w:tc>
         <w:tc>
           <w:tcPr>
-            <w:tcW w:w="2413" w:type="dxa"/>
+            <w:tcW w:w="2414" w:type="dxa"/>
             <w:tcBorders>
               <w:start w:val="single" w:sz="4" w:space="0" w:color="000000"/>
               <w:bottom w:val="single" w:sz="4" w:space="0" w:color="000000"/>
@@ -1763,7 +1763,7 @@
         <w:trPr/>
         <w:tc>
           <w:tcPr>
-            <w:tcW w:w="2404" w:type="dxa"/>
+            <w:tcW w:w="2403" w:type="dxa"/>
             <w:tcBorders>
               <w:start w:val="single" w:sz="4" w:space="0" w:color="000000"/>
               <w:bottom w:val="single" w:sz="4" w:space="0" w:color="000000"/>
@@ -1788,7 +1788,7 @@
         </w:tc>
         <w:tc>
           <w:tcPr>
-            <w:tcW w:w="2413" w:type="dxa"/>
+            <w:tcW w:w="2414" w:type="dxa"/>
             <w:tcBorders>
               <w:start w:val="single" w:sz="4" w:space="0" w:color="000000"/>
               <w:bottom w:val="single" w:sz="4" w:space="0" w:color="000000"/>
@@ -1842,7 +1842,7 @@
         <w:trPr/>
         <w:tc>
           <w:tcPr>
-            <w:tcW w:w="2404" w:type="dxa"/>
+            <w:tcW w:w="2403" w:type="dxa"/>
             <w:tcBorders>
               <w:start w:val="single" w:sz="4" w:space="0" w:color="000000"/>
               <w:bottom w:val="single" w:sz="4" w:space="0" w:color="000000"/>
@@ -1867,7 +1867,7 @@
         </w:tc>
         <w:tc>
           <w:tcPr>
-            <w:tcW w:w="2413" w:type="dxa"/>
+            <w:tcW w:w="2414" w:type="dxa"/>
             <w:tcBorders>
               <w:start w:val="single" w:sz="4" w:space="0" w:color="000000"/>
               <w:bottom w:val="single" w:sz="4" w:space="0" w:color="000000"/>
@@ -1921,7 +1921,7 @@
         <w:trPr/>
         <w:tc>
           <w:tcPr>
-            <w:tcW w:w="2404" w:type="dxa"/>
+            <w:tcW w:w="2403" w:type="dxa"/>
             <w:tcBorders>
               <w:start w:val="single" w:sz="4" w:space="0" w:color="000000"/>
               <w:bottom w:val="single" w:sz="4" w:space="0" w:color="000000"/>
@@ -1946,7 +1946,7 @@
         </w:tc>
         <w:tc>
           <w:tcPr>
-            <w:tcW w:w="2413" w:type="dxa"/>
+            <w:tcW w:w="2414" w:type="dxa"/>
             <w:tcBorders>
               <w:start w:val="single" w:sz="4" w:space="0" w:color="000000"/>
               <w:bottom w:val="single" w:sz="4" w:space="0" w:color="000000"/>
@@ -2031,7 +2031,7 @@
         <w:pStyle w:val="Heading1"/>
         <w:numPr>
           <w:ilvl w:val="0"/>
-          <w:numId w:val="2"/>
+          <w:numId w:val="1"/>
         </w:numPr>
         <w:bidi w:val="0"/>
         <w:ind w:hanging="0" w:start="0"/>
@@ -2263,7 +2263,7 @@
         <w:pStyle w:val="Normal"/>
         <w:numPr>
           <w:ilvl w:val="0"/>
-          <w:numId w:val="5"/>
+          <w:numId w:val="4"/>
         </w:numPr>
         <w:bidi w:val="0"/>
         <w:jc w:val="both"/>
@@ -2284,6 +2284,92 @@
           <w:rFonts w:ascii="SF Pro Text" w:hAnsi="SF Pro Text"/>
         </w:rPr>
         <w:t xml:space="preserve"> – how data is stored</w:t>
+      </w:r>
+    </w:p>
+    <w:p>
+      <w:pPr>
+        <w:pStyle w:val="Normal"/>
+        <w:numPr>
+          <w:ilvl w:val="0"/>
+          <w:numId w:val="4"/>
+        </w:numPr>
+        <w:bidi w:val="0"/>
+        <w:jc w:val="both"/>
+        <w:rPr>
+          <w:rFonts w:ascii="SF Pro Text" w:hAnsi="SF Pro Text"/>
+        </w:rPr>
+      </w:pPr>
+      <w:r>
+        <w:rPr>
+          <w:rFonts w:ascii="SF Pro Text" w:hAnsi="SF Pro Text"/>
+        </w:rPr>
+        <w:t>contains redis- specific fields</w:t>
+      </w:r>
+    </w:p>
+    <w:p>
+      <w:pPr>
+        <w:pStyle w:val="Normal"/>
+        <w:numPr>
+          <w:ilvl w:val="0"/>
+          <w:numId w:val="4"/>
+        </w:numPr>
+        <w:bidi w:val="0"/>
+        <w:jc w:val="both"/>
+        <w:rPr>
+          <w:rFonts w:ascii="SF Pro Text" w:hAnsi="SF Pro Text"/>
+        </w:rPr>
+      </w:pPr>
+      <w:r>
+        <w:rPr>
+          <w:rFonts w:ascii="SF Pro Text" w:hAnsi="SF Pro Text"/>
+        </w:rPr>
+        <w:t>never exposed directly to API</w:t>
+      </w:r>
+    </w:p>
+    <w:p>
+      <w:pPr>
+        <w:pStyle w:val="Normal"/>
+        <w:bidi w:val="0"/>
+        <w:jc w:val="both"/>
+        <w:rPr>
+          <w:rFonts w:ascii="SF Pro Text" w:hAnsi="SF Pro Text"/>
+        </w:rPr>
+      </w:pPr>
+      <w:r>
+        <w:rPr>
+          <w:rFonts w:ascii="SF Pro Text" w:hAnsi="SF Pro Text"/>
+        </w:rPr>
+      </w:r>
+    </w:p>
+    <w:p>
+      <w:pPr>
+        <w:pStyle w:val="Normal"/>
+        <w:bidi w:val="0"/>
+        <w:jc w:val="both"/>
+        <w:rPr>
+          <w:rFonts w:ascii="SF Pro Text" w:hAnsi="SF Pro Text"/>
+        </w:rPr>
+      </w:pPr>
+      <w:r>
+        <w:rPr>
+          <w:rFonts w:ascii="SF Pro Text" w:hAnsi="SF Pro Text"/>
+        </w:rPr>
+        <w:t>DTO(SessionResponse.java)</w:t>
+      </w:r>
+    </w:p>
+    <w:p>
+      <w:pPr>
+        <w:pStyle w:val="Normal"/>
+        <w:bidi w:val="0"/>
+        <w:jc w:val="both"/>
+        <w:rPr>
+          <w:rFonts w:ascii="SF Pro Text" w:hAnsi="SF Pro Text"/>
+        </w:rPr>
+      </w:pPr>
+      <w:r>
+        <w:rPr>
+          <w:rFonts w:ascii="SF Pro Text" w:hAnsi="SF Pro Text"/>
+        </w:rPr>
       </w:r>
     </w:p>
     <w:p>
@@ -2302,8 +2388,16 @@
       <w:r>
         <w:rPr>
           <w:rFonts w:ascii="SF Pro Text" w:hAnsi="SF Pro Text"/>
-        </w:rPr>
-        <w:t>contains redis- specific fields</w:t>
+          <w:b/>
+          <w:bCs/>
+        </w:rPr>
+        <w:t>External representation</w:t>
+      </w:r>
+      <w:r>
+        <w:rPr>
+          <w:rFonts w:ascii="SF Pro Text" w:hAnsi="SF Pro Text"/>
+        </w:rPr>
+        <w:t xml:space="preserve"> – what API returns</w:t>
       </w:r>
     </w:p>
     <w:p>
@@ -2323,38 +2417,83 @@
         <w:rPr>
           <w:rFonts w:ascii="SF Pro Text" w:hAnsi="SF Pro Text"/>
         </w:rPr>
-        <w:t>never exposed directly to API</w:t>
-      </w:r>
-    </w:p>
-    <w:p>
-      <w:pPr>
-        <w:pStyle w:val="Normal"/>
-        <w:bidi w:val="0"/>
-        <w:jc w:val="both"/>
-        <w:rPr>
-          <w:rFonts w:ascii="SF Pro Text" w:hAnsi="SF Pro Text"/>
-        </w:rPr>
-      </w:pPr>
-      <w:r>
-        <w:rPr>
-          <w:rFonts w:ascii="SF Pro Text" w:hAnsi="SF Pro Text"/>
-        </w:rPr>
-      </w:r>
-    </w:p>
-    <w:p>
-      <w:pPr>
-        <w:pStyle w:val="Normal"/>
-        <w:bidi w:val="0"/>
-        <w:jc w:val="both"/>
-        <w:rPr>
-          <w:rFonts w:ascii="SF Pro Text" w:hAnsi="SF Pro Text"/>
-        </w:rPr>
-      </w:pPr>
-      <w:r>
-        <w:rPr>
-          <w:rFonts w:ascii="SF Pro Text" w:hAnsi="SF Pro Text"/>
-        </w:rPr>
-        <w:t>DTO(SessionResponse.java)</w:t>
+        <w:t>only contains fields client need</w:t>
+      </w:r>
+    </w:p>
+    <w:p>
+      <w:pPr>
+        <w:pStyle w:val="Normal"/>
+        <w:bidi w:val="0"/>
+        <w:jc w:val="both"/>
+        <w:rPr>
+          <w:rFonts w:ascii="SF Pro Text" w:hAnsi="SF Pro Text"/>
+        </w:rPr>
+      </w:pPr>
+      <w:r>
+        <w:rPr>
+          <w:rFonts w:ascii="SF Pro Text" w:hAnsi="SF Pro Text"/>
+        </w:rPr>
+      </w:r>
+    </w:p>
+    <w:p>
+      <w:pPr>
+        <w:pStyle w:val="Normal"/>
+        <w:bidi w:val="0"/>
+        <w:jc w:val="both"/>
+        <w:rPr>
+          <w:rFonts w:ascii="SF Pro Text" w:hAnsi="SF Pro Text"/>
+        </w:rPr>
+      </w:pPr>
+      <w:r>
+        <w:rPr>
+          <w:rFonts w:ascii="SF Pro Text" w:hAnsi="SF Pro Text"/>
+        </w:rPr>
+      </w:r>
+    </w:p>
+    <w:p>
+      <w:pPr>
+        <w:pStyle w:val="Normal"/>
+        <w:bidi w:val="0"/>
+        <w:jc w:val="both"/>
+        <w:rPr>
+          <w:rFonts w:ascii="SF Pro Text" w:hAnsi="SF Pro Text"/>
+        </w:rPr>
+      </w:pPr>
+      <w:r>
+        <w:rPr>
+          <w:rFonts w:ascii="SF Pro Text" w:hAnsi="SF Pro Text"/>
+        </w:rPr>
+      </w:r>
+    </w:p>
+    <w:p>
+      <w:pPr>
+        <w:pStyle w:val="Normal"/>
+        <w:bidi w:val="0"/>
+        <w:jc w:val="both"/>
+        <w:rPr>
+          <w:rFonts w:ascii="SF Pro Text" w:hAnsi="SF Pro Text"/>
+        </w:rPr>
+      </w:pPr>
+      <w:r>
+        <w:rPr>
+          <w:rFonts w:ascii="SF Pro Text" w:hAnsi="SF Pro Text"/>
+        </w:rPr>
+      </w:r>
+    </w:p>
+    <w:p>
+      <w:pPr>
+        <w:pStyle w:val="Normal"/>
+        <w:bidi w:val="0"/>
+        <w:jc w:val="both"/>
+        <w:rPr>
+          <w:rFonts w:ascii="SF Pro Text" w:hAnsi="SF Pro Text"/>
+        </w:rPr>
+      </w:pPr>
+      <w:r>
+        <w:rPr>
+          <w:rFonts w:ascii="SF Pro Text" w:hAnsi="SF Pro Text"/>
+        </w:rPr>
+        <w:t xml:space="preserve">What is Redis template? </w:t>
       </w:r>
     </w:p>
     <w:p>
@@ -2388,16 +2527,8 @@
       <w:r>
         <w:rPr>
           <w:rFonts w:ascii="SF Pro Text" w:hAnsi="SF Pro Text"/>
-          <w:b/>
-          <w:bCs/>
-        </w:rPr>
-        <w:t>External representation</w:t>
-      </w:r>
-      <w:r>
-        <w:rPr>
-          <w:rFonts w:ascii="SF Pro Text" w:hAnsi="SF Pro Text"/>
-        </w:rPr>
-        <w:t xml:space="preserve"> – what API returns</w:t>
+        </w:rPr>
+        <w:t>Its like a toolbox for redis operations:</w:t>
       </w:r>
     </w:p>
     <w:p>
@@ -2417,98 +2548,7 @@
         <w:rPr>
           <w:rFonts w:ascii="SF Pro Text" w:hAnsi="SF Pro Text"/>
         </w:rPr>
-        <w:t>only contains fields client need</w:t>
-      </w:r>
-    </w:p>
-    <w:p>
-      <w:pPr>
-        <w:pStyle w:val="Normal"/>
-        <w:bidi w:val="0"/>
-        <w:jc w:val="both"/>
-        <w:rPr>
-          <w:rFonts w:ascii="SF Pro Text" w:hAnsi="SF Pro Text"/>
-        </w:rPr>
-      </w:pPr>
-      <w:r>
-        <w:rPr>
-          <w:rFonts w:ascii="SF Pro Text" w:hAnsi="SF Pro Text"/>
-        </w:rPr>
-      </w:r>
-    </w:p>
-    <w:p>
-      <w:pPr>
-        <w:pStyle w:val="Normal"/>
-        <w:bidi w:val="0"/>
-        <w:jc w:val="both"/>
-        <w:rPr>
-          <w:rFonts w:ascii="SF Pro Text" w:hAnsi="SF Pro Text"/>
-        </w:rPr>
-      </w:pPr>
-      <w:r>
-        <w:rPr>
-          <w:rFonts w:ascii="SF Pro Text" w:hAnsi="SF Pro Text"/>
-        </w:rPr>
-      </w:r>
-    </w:p>
-    <w:p>
-      <w:pPr>
-        <w:pStyle w:val="Normal"/>
-        <w:bidi w:val="0"/>
-        <w:jc w:val="both"/>
-        <w:rPr>
-          <w:rFonts w:ascii="SF Pro Text" w:hAnsi="SF Pro Text"/>
-        </w:rPr>
-      </w:pPr>
-      <w:r>
-        <w:rPr>
-          <w:rFonts w:ascii="SF Pro Text" w:hAnsi="SF Pro Text"/>
-        </w:rPr>
-      </w:r>
-    </w:p>
-    <w:p>
-      <w:pPr>
-        <w:pStyle w:val="Normal"/>
-        <w:bidi w:val="0"/>
-        <w:jc w:val="both"/>
-        <w:rPr>
-          <w:rFonts w:ascii="SF Pro Text" w:hAnsi="SF Pro Text"/>
-        </w:rPr>
-      </w:pPr>
-      <w:r>
-        <w:rPr>
-          <w:rFonts w:ascii="SF Pro Text" w:hAnsi="SF Pro Text"/>
-        </w:rPr>
-      </w:r>
-    </w:p>
-    <w:p>
-      <w:pPr>
-        <w:pStyle w:val="Normal"/>
-        <w:bidi w:val="0"/>
-        <w:jc w:val="both"/>
-        <w:rPr>
-          <w:rFonts w:ascii="SF Pro Text" w:hAnsi="SF Pro Text"/>
-        </w:rPr>
-      </w:pPr>
-      <w:r>
-        <w:rPr>
-          <w:rFonts w:ascii="SF Pro Text" w:hAnsi="SF Pro Text"/>
-        </w:rPr>
-        <w:t xml:space="preserve">What is Redis template? </w:t>
-      </w:r>
-    </w:p>
-    <w:p>
-      <w:pPr>
-        <w:pStyle w:val="Normal"/>
-        <w:bidi w:val="0"/>
-        <w:jc w:val="both"/>
-        <w:rPr>
-          <w:rFonts w:ascii="SF Pro Text" w:hAnsi="SF Pro Text"/>
-        </w:rPr>
-      </w:pPr>
-      <w:r>
-        <w:rPr>
-          <w:rFonts w:ascii="SF Pro Text" w:hAnsi="SF Pro Text"/>
-        </w:rPr>
+        <w:t>set(key,value) – store data</w:t>
       </w:r>
     </w:p>
     <w:p>
@@ -2516,7 +2556,7 @@
         <w:pStyle w:val="Normal"/>
         <w:numPr>
           <w:ilvl w:val="0"/>
-          <w:numId w:val="7"/>
+          <w:numId w:val="6"/>
         </w:numPr>
         <w:bidi w:val="0"/>
         <w:jc w:val="both"/>
@@ -2528,7 +2568,7 @@
         <w:rPr>
           <w:rFonts w:ascii="SF Pro Text" w:hAnsi="SF Pro Text"/>
         </w:rPr>
-        <w:t>Its like a toolbox for redis operations:</w:t>
+        <w:t>get(key) – retrieve data</w:t>
       </w:r>
     </w:p>
     <w:p>
@@ -2536,7 +2576,7 @@
         <w:pStyle w:val="Normal"/>
         <w:numPr>
           <w:ilvl w:val="0"/>
-          <w:numId w:val="7"/>
+          <w:numId w:val="6"/>
         </w:numPr>
         <w:bidi w:val="0"/>
         <w:jc w:val="both"/>
@@ -2548,7 +2588,7 @@
         <w:rPr>
           <w:rFonts w:ascii="SF Pro Text" w:hAnsi="SF Pro Text"/>
         </w:rPr>
-        <w:t>set(key,value) – store data</w:t>
+        <w:t>delete(key) – remove data</w:t>
       </w:r>
     </w:p>
     <w:p>
@@ -2556,47 +2596,7 @@
         <w:pStyle w:val="Normal"/>
         <w:numPr>
           <w:ilvl w:val="0"/>
-          <w:numId w:val="7"/>
-        </w:numPr>
-        <w:bidi w:val="0"/>
-        <w:jc w:val="both"/>
-        <w:rPr>
-          <w:rFonts w:ascii="SF Pro Text" w:hAnsi="SF Pro Text"/>
-        </w:rPr>
-      </w:pPr>
-      <w:r>
-        <w:rPr>
-          <w:rFonts w:ascii="SF Pro Text" w:hAnsi="SF Pro Text"/>
-        </w:rPr>
-        <w:t>get(key) – retrieve data</w:t>
-      </w:r>
-    </w:p>
-    <w:p>
-      <w:pPr>
-        <w:pStyle w:val="Normal"/>
-        <w:numPr>
-          <w:ilvl w:val="0"/>
-          <w:numId w:val="7"/>
-        </w:numPr>
-        <w:bidi w:val="0"/>
-        <w:jc w:val="both"/>
-        <w:rPr>
-          <w:rFonts w:ascii="SF Pro Text" w:hAnsi="SF Pro Text"/>
-        </w:rPr>
-      </w:pPr>
-      <w:r>
-        <w:rPr>
-          <w:rFonts w:ascii="SF Pro Text" w:hAnsi="SF Pro Text"/>
-        </w:rPr>
-        <w:t>delete(key) – remove data</w:t>
-      </w:r>
-    </w:p>
-    <w:p>
-      <w:pPr>
-        <w:pStyle w:val="Normal"/>
-        <w:numPr>
-          <w:ilvl w:val="0"/>
-          <w:numId w:val="7"/>
+          <w:numId w:val="6"/>
         </w:numPr>
         <w:bidi w:val="0"/>
         <w:jc w:val="both"/>
@@ -3035,7 +3035,7 @@
         <w:pStyle w:val="Normal"/>
         <w:numPr>
           <w:ilvl w:val="0"/>
-          <w:numId w:val="8"/>
+          <w:numId w:val="7"/>
         </w:numPr>
         <w:bidi w:val="0"/>
         <w:jc w:val="both"/>
@@ -3055,7 +3055,7 @@
         <w:pStyle w:val="Normal"/>
         <w:numPr>
           <w:ilvl w:val="0"/>
-          <w:numId w:val="8"/>
+          <w:numId w:val="7"/>
         </w:numPr>
         <w:bidi w:val="0"/>
         <w:jc w:val="both"/>
@@ -3075,7 +3075,7 @@
         <w:pStyle w:val="Normal"/>
         <w:numPr>
           <w:ilvl w:val="0"/>
-          <w:numId w:val="8"/>
+          <w:numId w:val="7"/>
         </w:numPr>
         <w:bidi w:val="0"/>
         <w:jc w:val="both"/>
@@ -3151,7 +3151,7 @@
       </w:tblPr>
       <w:tblGrid>
         <w:gridCol w:w="3212"/>
-        <w:gridCol w:w="6426"/>
+        <w:gridCol w:w="6425"/>
       </w:tblGrid>
       <w:tr>
         <w:trPr/>
@@ -3177,7 +3177,7 @@
         </w:tc>
         <w:tc>
           <w:tcPr>
-            <w:tcW w:w="6426" w:type="dxa"/>
+            <w:tcW w:w="6425" w:type="dxa"/>
             <w:tcBorders>
               <w:top w:val="single" w:sz="4" w:space="0" w:color="000000"/>
               <w:start w:val="single" w:sz="4" w:space="0" w:color="000000"/>
@@ -3220,7 +3220,187 @@
         </w:tc>
         <w:tc>
           <w:tcPr>
-            <w:tcW w:w="6426" w:type="dxa"/>
+            <w:tcW w:w="6425" w:type="dxa"/>
+            <w:tcBorders>
+              <w:start w:val="single" w:sz="4" w:space="0" w:color="000000"/>
+              <w:bottom w:val="single" w:sz="4" w:space="0" w:color="000000"/>
+              <w:end w:val="single" w:sz="4" w:space="0" w:color="000000"/>
+            </w:tcBorders>
+          </w:tcPr>
+          <w:p>
+            <w:pPr>
+              <w:pStyle w:val="TableContents"/>
+              <w:numPr>
+                <w:ilvl w:val="0"/>
+                <w:numId w:val="9"/>
+              </w:numPr>
+              <w:rPr/>
+            </w:pPr>
+            <w:r>
+              <w:rPr/>
+              <w:t>Type of signaling message.</w:t>
+            </w:r>
+          </w:p>
+          <w:p>
+            <w:pPr>
+              <w:pStyle w:val="TableContents"/>
+              <w:numPr>
+                <w:ilvl w:val="0"/>
+                <w:numId w:val="9"/>
+              </w:numPr>
+              <w:rPr/>
+            </w:pPr>
+            <w:r>
+              <w:rPr/>
+              <w:t>Value: offer, answer, ice_candidate</w:t>
+            </w:r>
+          </w:p>
+        </w:tc>
+      </w:tr>
+      <w:tr>
+        <w:trPr/>
+        <w:tc>
+          <w:tcPr>
+            <w:tcW w:w="3212" w:type="dxa"/>
+            <w:tcBorders>
+              <w:start w:val="single" w:sz="4" w:space="0" w:color="000000"/>
+              <w:bottom w:val="single" w:sz="4" w:space="0" w:color="000000"/>
+            </w:tcBorders>
+          </w:tcPr>
+          <w:p>
+            <w:pPr>
+              <w:pStyle w:val="TableContents"/>
+              <w:rPr/>
+            </w:pPr>
+            <w:r>
+              <w:rPr/>
+              <w:t>SessionId</w:t>
+            </w:r>
+          </w:p>
+        </w:tc>
+        <w:tc>
+          <w:tcPr>
+            <w:tcW w:w="6425" w:type="dxa"/>
+            <w:tcBorders>
+              <w:start w:val="single" w:sz="4" w:space="0" w:color="000000"/>
+              <w:bottom w:val="single" w:sz="4" w:space="0" w:color="000000"/>
+              <w:end w:val="single" w:sz="4" w:space="0" w:color="000000"/>
+            </w:tcBorders>
+          </w:tcPr>
+          <w:p>
+            <w:pPr>
+              <w:pStyle w:val="TableContents"/>
+              <w:numPr>
+                <w:ilvl w:val="0"/>
+                <w:numId w:val="8"/>
+              </w:numPr>
+              <w:rPr/>
+            </w:pPr>
+            <w:r>
+              <w:rPr/>
+              <w:t>Session ID this message belongs</w:t>
+            </w:r>
+          </w:p>
+        </w:tc>
+      </w:tr>
+      <w:tr>
+        <w:trPr/>
+        <w:tc>
+          <w:tcPr>
+            <w:tcW w:w="3212" w:type="dxa"/>
+            <w:tcBorders>
+              <w:start w:val="single" w:sz="4" w:space="0" w:color="000000"/>
+              <w:bottom w:val="single" w:sz="4" w:space="0" w:color="000000"/>
+            </w:tcBorders>
+          </w:tcPr>
+          <w:p>
+            <w:pPr>
+              <w:pStyle w:val="TableContents"/>
+              <w:rPr/>
+            </w:pPr>
+            <w:r>
+              <w:rPr/>
+              <w:t>Sdp</w:t>
+            </w:r>
+          </w:p>
+        </w:tc>
+        <w:tc>
+          <w:tcPr>
+            <w:tcW w:w="6425" w:type="dxa"/>
+            <w:tcBorders>
+              <w:start w:val="single" w:sz="4" w:space="0" w:color="000000"/>
+              <w:bottom w:val="single" w:sz="4" w:space="0" w:color="000000"/>
+              <w:end w:val="single" w:sz="4" w:space="0" w:color="000000"/>
+            </w:tcBorders>
+          </w:tcPr>
+          <w:p>
+            <w:pPr>
+              <w:pStyle w:val="TableContents"/>
+              <w:numPr>
+                <w:ilvl w:val="0"/>
+                <w:numId w:val="8"/>
+              </w:numPr>
+              <w:rPr/>
+            </w:pPr>
+            <w:r>
+              <w:rPr/>
+              <w:t>SDP data</w:t>
+            </w:r>
+          </w:p>
+          <w:p>
+            <w:pPr>
+              <w:pStyle w:val="TableContents"/>
+              <w:numPr>
+                <w:ilvl w:val="0"/>
+                <w:numId w:val="8"/>
+              </w:numPr>
+              <w:rPr/>
+            </w:pPr>
+            <w:r>
+              <w:rPr/>
+              <w:t>Contains connection parameters (e.g., codecs, formats, etc.)</w:t>
+            </w:r>
+          </w:p>
+          <w:p>
+            <w:pPr>
+              <w:pStyle w:val="TableContents"/>
+              <w:numPr>
+                <w:ilvl w:val="0"/>
+                <w:numId w:val="8"/>
+              </w:numPr>
+              <w:rPr/>
+            </w:pPr>
+            <w:r>
+              <w:rPr/>
+              <w:t>Used for OFFER and ANSWER messages</w:t>
+            </w:r>
+          </w:p>
+        </w:tc>
+      </w:tr>
+      <w:tr>
+        <w:trPr/>
+        <w:tc>
+          <w:tcPr>
+            <w:tcW w:w="3212" w:type="dxa"/>
+            <w:tcBorders>
+              <w:start w:val="single" w:sz="4" w:space="0" w:color="000000"/>
+              <w:bottom w:val="single" w:sz="4" w:space="0" w:color="000000"/>
+            </w:tcBorders>
+          </w:tcPr>
+          <w:p>
+            <w:pPr>
+              <w:pStyle w:val="TableContents"/>
+              <w:rPr/>
+            </w:pPr>
+            <w:r>
+              <w:rPr/>
+              <w:t>Candidate</w:t>
+            </w:r>
+          </w:p>
+        </w:tc>
+        <w:tc>
+          <w:tcPr>
+            <w:tcW w:w="6425" w:type="dxa"/>
             <w:tcBorders>
               <w:start w:val="single" w:sz="4" w:space="0" w:color="000000"/>
               <w:bottom w:val="single" w:sz="4" w:space="0" w:color="000000"/>
@@ -3238,7 +3418,7 @@
             </w:pPr>
             <w:r>
               <w:rPr/>
-              <w:t>Type of signaling message.</w:t>
+              <w:t>ICE candidate data</w:t>
             </w:r>
           </w:p>
           <w:p>
@@ -3252,7 +3432,21 @@
             </w:pPr>
             <w:r>
               <w:rPr/>
-              <w:t>Value: offer, answer, ice_candidate</w:t>
+              <w:t>Contains network route information (IP,port,protocol)</w:t>
+            </w:r>
+          </w:p>
+          <w:p>
+            <w:pPr>
+              <w:pStyle w:val="TableContents"/>
+              <w:numPr>
+                <w:ilvl w:val="0"/>
+                <w:numId w:val="10"/>
+              </w:numPr>
+              <w:rPr/>
+            </w:pPr>
+            <w:r>
+              <w:rPr/>
+              <w:t>Used for ICE_CANDIDATE messages</w:t>
             </w:r>
           </w:p>
         </w:tc>
@@ -3274,13 +3468,13 @@
             </w:pPr>
             <w:r>
               <w:rPr/>
-              <w:t>SessionId</w:t>
-            </w:r>
-          </w:p>
-        </w:tc>
-        <w:tc>
-          <w:tcPr>
-            <w:tcW w:w="6426" w:type="dxa"/>
+              <w:t>From</w:t>
+            </w:r>
+          </w:p>
+        </w:tc>
+        <w:tc>
+          <w:tcPr>
+            <w:tcW w:w="6425" w:type="dxa"/>
             <w:tcBorders>
               <w:start w:val="single" w:sz="4" w:space="0" w:color="000000"/>
               <w:bottom w:val="single" w:sz="4" w:space="0" w:color="000000"/>
@@ -3292,13 +3486,13 @@
               <w:pStyle w:val="TableContents"/>
               <w:numPr>
                 <w:ilvl w:val="0"/>
-                <w:numId w:val="9"/>
+                <w:numId w:val="8"/>
               </w:numPr>
               <w:rPr/>
             </w:pPr>
             <w:r>
               <w:rPr/>
-              <w:t>Session ID this message belongs</w:t>
+              <w:t>Senders socket ID (for routing)</w:t>
             </w:r>
           </w:p>
         </w:tc>
@@ -3320,87 +3514,13 @@
             </w:pPr>
             <w:r>
               <w:rPr/>
-              <w:t>Sdp</w:t>
-            </w:r>
-          </w:p>
-        </w:tc>
-        <w:tc>
-          <w:tcPr>
-            <w:tcW w:w="6426" w:type="dxa"/>
-            <w:tcBorders>
-              <w:start w:val="single" w:sz="4" w:space="0" w:color="000000"/>
-              <w:bottom w:val="single" w:sz="4" w:space="0" w:color="000000"/>
-              <w:end w:val="single" w:sz="4" w:space="0" w:color="000000"/>
-            </w:tcBorders>
-          </w:tcPr>
-          <w:p>
-            <w:pPr>
-              <w:pStyle w:val="TableContents"/>
-              <w:numPr>
-                <w:ilvl w:val="0"/>
-                <w:numId w:val="9"/>
-              </w:numPr>
-              <w:rPr/>
-            </w:pPr>
-            <w:r>
-              <w:rPr/>
-              <w:t>SDP data</w:t>
-            </w:r>
-          </w:p>
-          <w:p>
-            <w:pPr>
-              <w:pStyle w:val="TableContents"/>
-              <w:numPr>
-                <w:ilvl w:val="0"/>
-                <w:numId w:val="9"/>
-              </w:numPr>
-              <w:rPr/>
-            </w:pPr>
-            <w:r>
-              <w:rPr/>
-              <w:t>Contains connection parameters (e.g., codecs, formats, etc.)</w:t>
-            </w:r>
-          </w:p>
-          <w:p>
-            <w:pPr>
-              <w:pStyle w:val="TableContents"/>
-              <w:numPr>
-                <w:ilvl w:val="0"/>
-                <w:numId w:val="9"/>
-              </w:numPr>
-              <w:rPr/>
-            </w:pPr>
-            <w:r>
-              <w:rPr/>
-              <w:t>Used for OFFER and ANSWER messages</w:t>
-            </w:r>
-          </w:p>
-        </w:tc>
-      </w:tr>
-      <w:tr>
-        <w:trPr/>
-        <w:tc>
-          <w:tcPr>
-            <w:tcW w:w="3212" w:type="dxa"/>
-            <w:tcBorders>
-              <w:start w:val="single" w:sz="4" w:space="0" w:color="000000"/>
-              <w:bottom w:val="single" w:sz="4" w:space="0" w:color="000000"/>
-            </w:tcBorders>
-          </w:tcPr>
-          <w:p>
-            <w:pPr>
-              <w:pStyle w:val="TableContents"/>
-              <w:rPr/>
-            </w:pPr>
-            <w:r>
-              <w:rPr/>
-              <w:t>Candidate</w:t>
-            </w:r>
-          </w:p>
-        </w:tc>
-        <w:tc>
-          <w:tcPr>
-            <w:tcW w:w="6426" w:type="dxa"/>
+              <w:t>To</w:t>
+            </w:r>
+          </w:p>
+        </w:tc>
+        <w:tc>
+          <w:tcPr>
+            <w:tcW w:w="6425" w:type="dxa"/>
             <w:tcBorders>
               <w:start w:val="single" w:sz="4" w:space="0" w:color="000000"/>
               <w:bottom w:val="single" w:sz="4" w:space="0" w:color="000000"/>
@@ -3418,35 +3538,7 @@
             </w:pPr>
             <w:r>
               <w:rPr/>
-              <w:t>ICE candidate data</w:t>
-            </w:r>
-          </w:p>
-          <w:p>
-            <w:pPr>
-              <w:pStyle w:val="TableContents"/>
-              <w:numPr>
-                <w:ilvl w:val="0"/>
-                <w:numId w:val="11"/>
-              </w:numPr>
-              <w:rPr/>
-            </w:pPr>
-            <w:r>
-              <w:rPr/>
-              <w:t>Contains network route information (IP,port,protocol)</w:t>
-            </w:r>
-          </w:p>
-          <w:p>
-            <w:pPr>
-              <w:pStyle w:val="TableContents"/>
-              <w:numPr>
-                <w:ilvl w:val="0"/>
-                <w:numId w:val="11"/>
-              </w:numPr>
-              <w:rPr/>
-            </w:pPr>
-            <w:r>
-              <w:rPr/>
-              <w:t>Used for ICE_CANDIDATE messages</w:t>
+              <w:t>Receiver’s socket ID (for routing)</w:t>
             </w:r>
           </w:p>
         </w:tc>
@@ -3468,59 +3560,13 @@
             </w:pPr>
             <w:r>
               <w:rPr/>
-              <w:t>From</w:t>
-            </w:r>
-          </w:p>
-        </w:tc>
-        <w:tc>
-          <w:tcPr>
-            <w:tcW w:w="6426" w:type="dxa"/>
-            <w:tcBorders>
-              <w:start w:val="single" w:sz="4" w:space="0" w:color="000000"/>
-              <w:bottom w:val="single" w:sz="4" w:space="0" w:color="000000"/>
-              <w:end w:val="single" w:sz="4" w:space="0" w:color="000000"/>
-            </w:tcBorders>
-          </w:tcPr>
-          <w:p>
-            <w:pPr>
-              <w:pStyle w:val="TableContents"/>
-              <w:numPr>
-                <w:ilvl w:val="0"/>
-                <w:numId w:val="9"/>
-              </w:numPr>
-              <w:rPr/>
-            </w:pPr>
-            <w:r>
-              <w:rPr/>
-              <w:t>Senders socket ID (for routing)</w:t>
-            </w:r>
-          </w:p>
-        </w:tc>
-      </w:tr>
-      <w:tr>
-        <w:trPr/>
-        <w:tc>
-          <w:tcPr>
-            <w:tcW w:w="3212" w:type="dxa"/>
-            <w:tcBorders>
-              <w:start w:val="single" w:sz="4" w:space="0" w:color="000000"/>
-              <w:bottom w:val="single" w:sz="4" w:space="0" w:color="000000"/>
-            </w:tcBorders>
-          </w:tcPr>
-          <w:p>
-            <w:pPr>
-              <w:pStyle w:val="TableContents"/>
-              <w:rPr/>
-            </w:pPr>
-            <w:r>
-              <w:rPr/>
-              <w:t>To</w:t>
-            </w:r>
-          </w:p>
-        </w:tc>
-        <w:tc>
-          <w:tcPr>
-            <w:tcW w:w="6426" w:type="dxa"/>
+              <w:t>Message</w:t>
+            </w:r>
+          </w:p>
+        </w:tc>
+        <w:tc>
+          <w:tcPr>
+            <w:tcW w:w="6425" w:type="dxa"/>
             <w:tcBorders>
               <w:start w:val="single" w:sz="4" w:space="0" w:color="000000"/>
               <w:bottom w:val="single" w:sz="4" w:space="0" w:color="000000"/>
@@ -3538,7 +3584,7 @@
             </w:pPr>
             <w:r>
               <w:rPr/>
-              <w:t>Receiver’s socket ID (for routing)</w:t>
+              <w:t>Additional metadata and error messages</w:t>
             </w:r>
           </w:p>
         </w:tc>
@@ -3560,13 +3606,13 @@
             </w:pPr>
             <w:r>
               <w:rPr/>
-              <w:t>Message</w:t>
-            </w:r>
-          </w:p>
-        </w:tc>
-        <w:tc>
-          <w:tcPr>
-            <w:tcW w:w="6426" w:type="dxa"/>
+              <w:t>Timestamp</w:t>
+            </w:r>
+          </w:p>
+        </w:tc>
+        <w:tc>
+          <w:tcPr>
+            <w:tcW w:w="6425" w:type="dxa"/>
             <w:tcBorders>
               <w:start w:val="single" w:sz="4" w:space="0" w:color="000000"/>
               <w:bottom w:val="single" w:sz="4" w:space="0" w:color="000000"/>
@@ -3579,52 +3625,6 @@
               <w:numPr>
                 <w:ilvl w:val="0"/>
                 <w:numId w:val="13"/>
-              </w:numPr>
-              <w:rPr/>
-            </w:pPr>
-            <w:r>
-              <w:rPr/>
-              <w:t>Additional metadata and error messages</w:t>
-            </w:r>
-          </w:p>
-        </w:tc>
-      </w:tr>
-      <w:tr>
-        <w:trPr/>
-        <w:tc>
-          <w:tcPr>
-            <w:tcW w:w="3212" w:type="dxa"/>
-            <w:tcBorders>
-              <w:start w:val="single" w:sz="4" w:space="0" w:color="000000"/>
-              <w:bottom w:val="single" w:sz="4" w:space="0" w:color="000000"/>
-            </w:tcBorders>
-          </w:tcPr>
-          <w:p>
-            <w:pPr>
-              <w:pStyle w:val="TableContents"/>
-              <w:rPr/>
-            </w:pPr>
-            <w:r>
-              <w:rPr/>
-              <w:t>Timestamp</w:t>
-            </w:r>
-          </w:p>
-        </w:tc>
-        <w:tc>
-          <w:tcPr>
-            <w:tcW w:w="6426" w:type="dxa"/>
-            <w:tcBorders>
-              <w:start w:val="single" w:sz="4" w:space="0" w:color="000000"/>
-              <w:bottom w:val="single" w:sz="4" w:space="0" w:color="000000"/>
-              <w:end w:val="single" w:sz="4" w:space="0" w:color="000000"/>
-            </w:tcBorders>
-          </w:tcPr>
-          <w:p>
-            <w:pPr>
-              <w:pStyle w:val="TableContents"/>
-              <w:numPr>
-                <w:ilvl w:val="0"/>
-                <w:numId w:val="14"/>
               </w:numPr>
               <w:rPr/>
             </w:pPr>
@@ -4540,6 +4540,38 @@
         <w:rPr>
           <w:rFonts w:ascii="SF Pro Text" w:hAnsi="SF Pro Text"/>
         </w:rPr>
+        <w:t>2025-10-12</w:t>
+      </w:r>
+    </w:p>
+    <w:p>
+      <w:pPr>
+        <w:pStyle w:val="Normal"/>
+        <w:bidi w:val="0"/>
+        <w:jc w:val="both"/>
+        <w:rPr>
+          <w:rFonts w:ascii="SF Pro Text" w:hAnsi="SF Pro Text"/>
+        </w:rPr>
+      </w:pPr>
+      <w:r>
+        <w:rPr>
+          <w:rFonts w:ascii="SF Pro Text" w:hAnsi="SF Pro Text"/>
+        </w:rPr>
+      </w:r>
+    </w:p>
+    <w:p>
+      <w:pPr>
+        <w:pStyle w:val="Normal"/>
+        <w:bidi w:val="0"/>
+        <w:jc w:val="both"/>
+        <w:rPr>
+          <w:rFonts w:ascii="SF Pro Text" w:hAnsi="SF Pro Text"/>
+        </w:rPr>
+      </w:pPr>
+      <w:r>
+        <w:rPr>
+          <w:rFonts w:ascii="SF Pro Text" w:hAnsi="SF Pro Text"/>
+        </w:rPr>
+        <w:t>Multi-recipient Broadcasting</w:t>
       </w:r>
     </w:p>
     <w:sectPr>
@@ -4570,6 +4602,7 @@
         </w:tabs>
         <w:ind w:start="0" w:hanging="0"/>
       </w:pPr>
+      <w:rPr/>
     </w:lvl>
     <w:lvl w:ilvl="1">
       <w:start w:val="1"/>
@@ -4583,6 +4616,7 @@
         </w:tabs>
         <w:ind w:start="0" w:hanging="0"/>
       </w:pPr>
+      <w:rPr/>
     </w:lvl>
     <w:lvl w:ilvl="2">
       <w:start w:val="1"/>
@@ -4596,6 +4630,7 @@
         </w:tabs>
         <w:ind w:start="0" w:hanging="0"/>
       </w:pPr>
+      <w:rPr/>
     </w:lvl>
     <w:lvl w:ilvl="3">
       <w:start w:val="1"/>
@@ -4609,6 +4644,7 @@
         </w:tabs>
         <w:ind w:start="0" w:hanging="0"/>
       </w:pPr>
+      <w:rPr/>
     </w:lvl>
     <w:lvl w:ilvl="4">
       <w:start w:val="1"/>
@@ -4622,6 +4658,7 @@
         </w:tabs>
         <w:ind w:start="0" w:hanging="0"/>
       </w:pPr>
+      <w:rPr/>
     </w:lvl>
     <w:lvl w:ilvl="5">
       <w:start w:val="1"/>
@@ -4635,6 +4672,7 @@
         </w:tabs>
         <w:ind w:start="0" w:hanging="0"/>
       </w:pPr>
+      <w:rPr/>
     </w:lvl>
     <w:lvl w:ilvl="6">
       <w:start w:val="1"/>
@@ -4648,6 +4686,7 @@
         </w:tabs>
         <w:ind w:start="0" w:hanging="0"/>
       </w:pPr>
+      <w:rPr/>
     </w:lvl>
     <w:lvl w:ilvl="7">
       <w:start w:val="1"/>
@@ -4661,6 +4700,7 @@
         </w:tabs>
         <w:ind w:start="0" w:hanging="0"/>
       </w:pPr>
+      <w:rPr/>
     </w:lvl>
     <w:lvl w:ilvl="8">
       <w:start w:val="1"/>
@@ -4674,132 +4714,124 @@
         </w:tabs>
         <w:ind w:start="0" w:hanging="0"/>
       </w:pPr>
+      <w:rPr/>
     </w:lvl>
   </w:abstractNum>
   <w:abstractNum w:abstractNumId="2">
     <w:lvl w:ilvl="0">
       <w:start w:val="1"/>
-      <w:numFmt w:val="none"/>
-      <w:suff w:val="nothing"/>
-      <w:lvlText w:val="%1"/>
-      <w:lvlJc w:val="start"/>
-      <w:pPr>
-        <w:tabs>
-          <w:tab w:val="num" w:pos="0"/>
-        </w:tabs>
-        <w:ind w:start="0" w:hanging="0"/>
+      <w:numFmt w:val="decimal"/>
+      <w:lvlText w:val="%1."/>
+      <w:lvlJc w:val="start"/>
+      <w:pPr>
+        <w:tabs>
+          <w:tab w:val="num" w:pos="720"/>
+        </w:tabs>
+        <w:ind w:start="720" w:hanging="360"/>
       </w:pPr>
       <w:rPr/>
     </w:lvl>
     <w:lvl w:ilvl="1">
       <w:start w:val="1"/>
-      <w:numFmt w:val="none"/>
-      <w:suff w:val="nothing"/>
-      <w:lvlText w:val="%2"/>
-      <w:lvlJc w:val="start"/>
-      <w:pPr>
-        <w:tabs>
-          <w:tab w:val="num" w:pos="0"/>
-        </w:tabs>
-        <w:ind w:start="0" w:hanging="0"/>
+      <w:numFmt w:val="decimal"/>
+      <w:lvlText w:val="%2."/>
+      <w:lvlJc w:val="start"/>
+      <w:pPr>
+        <w:tabs>
+          <w:tab w:val="num" w:pos="1080"/>
+        </w:tabs>
+        <w:ind w:start="1080" w:hanging="360"/>
       </w:pPr>
       <w:rPr/>
     </w:lvl>
     <w:lvl w:ilvl="2">
       <w:start w:val="1"/>
-      <w:numFmt w:val="none"/>
-      <w:suff w:val="nothing"/>
-      <w:lvlText w:val="%3"/>
-      <w:lvlJc w:val="start"/>
-      <w:pPr>
-        <w:tabs>
-          <w:tab w:val="num" w:pos="0"/>
-        </w:tabs>
-        <w:ind w:start="0" w:hanging="0"/>
+      <w:numFmt w:val="decimal"/>
+      <w:lvlText w:val="%3."/>
+      <w:lvlJc w:val="start"/>
+      <w:pPr>
+        <w:tabs>
+          <w:tab w:val="num" w:pos="1440"/>
+        </w:tabs>
+        <w:ind w:start="1440" w:hanging="360"/>
       </w:pPr>
       <w:rPr/>
     </w:lvl>
     <w:lvl w:ilvl="3">
       <w:start w:val="1"/>
-      <w:numFmt w:val="none"/>
-      <w:suff w:val="nothing"/>
-      <w:lvlText w:val="%4"/>
-      <w:lvlJc w:val="start"/>
-      <w:pPr>
-        <w:tabs>
-          <w:tab w:val="num" w:pos="0"/>
-        </w:tabs>
-        <w:ind w:start="0" w:hanging="0"/>
+      <w:numFmt w:val="decimal"/>
+      <w:lvlText w:val="%4."/>
+      <w:lvlJc w:val="start"/>
+      <w:pPr>
+        <w:tabs>
+          <w:tab w:val="num" w:pos="1800"/>
+        </w:tabs>
+        <w:ind w:start="1800" w:hanging="360"/>
       </w:pPr>
       <w:rPr/>
     </w:lvl>
     <w:lvl w:ilvl="4">
       <w:start w:val="1"/>
-      <w:numFmt w:val="none"/>
-      <w:suff w:val="nothing"/>
-      <w:lvlText w:val="%5"/>
-      <w:lvlJc w:val="start"/>
-      <w:pPr>
-        <w:tabs>
-          <w:tab w:val="num" w:pos="0"/>
-        </w:tabs>
-        <w:ind w:start="0" w:hanging="0"/>
+      <w:numFmt w:val="decimal"/>
+      <w:lvlText w:val="%5."/>
+      <w:lvlJc w:val="start"/>
+      <w:pPr>
+        <w:tabs>
+          <w:tab w:val="num" w:pos="2160"/>
+        </w:tabs>
+        <w:ind w:start="2160" w:hanging="360"/>
       </w:pPr>
       <w:rPr/>
     </w:lvl>
     <w:lvl w:ilvl="5">
       <w:start w:val="1"/>
-      <w:numFmt w:val="none"/>
-      <w:suff w:val="nothing"/>
-      <w:lvlText w:val="%6"/>
-      <w:lvlJc w:val="start"/>
-      <w:pPr>
-        <w:tabs>
-          <w:tab w:val="num" w:pos="0"/>
-        </w:tabs>
-        <w:ind w:start="0" w:hanging="0"/>
+      <w:numFmt w:val="decimal"/>
+      <w:lvlText w:val="%6."/>
+      <w:lvlJc w:val="start"/>
+      <w:pPr>
+        <w:tabs>
+          <w:tab w:val="num" w:pos="2520"/>
+        </w:tabs>
+        <w:ind w:start="2520" w:hanging="360"/>
       </w:pPr>
       <w:rPr/>
     </w:lvl>
     <w:lvl w:ilvl="6">
       <w:start w:val="1"/>
-      <w:numFmt w:val="none"/>
-      <w:suff w:val="nothing"/>
-      <w:lvlText w:val="%7"/>
-      <w:lvlJc w:val="start"/>
-      <w:pPr>
-        <w:tabs>
-          <w:tab w:val="num" w:pos="0"/>
-        </w:tabs>
-        <w:ind w:start="0" w:hanging="0"/>
+      <w:numFmt w:val="decimal"/>
+      <w:lvlText w:val="%7."/>
+      <w:lvlJc w:val="start"/>
+      <w:pPr>
+        <w:tabs>
+          <w:tab w:val="num" w:pos="2880"/>
+        </w:tabs>
+        <w:ind w:start="2880" w:hanging="360"/>
       </w:pPr>
       <w:rPr/>
     </w:lvl>
     <w:lvl w:ilvl="7">
       <w:start w:val="1"/>
-      <w:numFmt w:val="none"/>
-      <w:suff w:val="nothing"/>
-      <w:lvlText w:val="%8"/>
-      <w:lvlJc w:val="start"/>
-      <w:pPr>
-        <w:tabs>
-          <w:tab w:val="num" w:pos="0"/>
-        </w:tabs>
-        <w:ind w:start="0" w:hanging="0"/>
+      <w:numFmt w:val="decimal"/>
+      <w:lvlText w:val="%8."/>
+      <w:lvlJc w:val="start"/>
+      <w:pPr>
+        <w:tabs>
+          <w:tab w:val="num" w:pos="3240"/>
+        </w:tabs>
+        <w:ind w:start="3240" w:hanging="360"/>
       </w:pPr>
       <w:rPr/>
     </w:lvl>
     <w:lvl w:ilvl="8">
       <w:start w:val="1"/>
-      <w:numFmt w:val="none"/>
-      <w:suff w:val="nothing"/>
-      <w:lvlText w:val="%9"/>
-      <w:lvlJc w:val="start"/>
-      <w:pPr>
-        <w:tabs>
-          <w:tab w:val="num" w:pos="0"/>
-        </w:tabs>
-        <w:ind w:start="0" w:hanging="0"/>
+      <w:numFmt w:val="decimal"/>
+      <w:lvlText w:val="%9."/>
+      <w:lvlJc w:val="start"/>
+      <w:pPr>
+        <w:tabs>
+          <w:tab w:val="num" w:pos="3600"/>
+        </w:tabs>
+        <w:ind w:start="3600" w:hanging="360"/>
       </w:pPr>
       <w:rPr/>
     </w:lvl>
@@ -4926,8 +4958,8 @@
   <w:abstractNum w:abstractNumId="4">
     <w:lvl w:ilvl="0">
       <w:start w:val="1"/>
-      <w:numFmt w:val="decimal"/>
-      <w:lvlText w:val="%1."/>
+      <w:numFmt w:val="bullet"/>
+      <w:lvlText w:val=""/>
       <w:lvlJc w:val="start"/>
       <w:pPr>
         <w:tabs>
@@ -4935,12 +4967,14 @@
         </w:tabs>
         <w:ind w:start="720" w:hanging="360"/>
       </w:pPr>
-      <w:rPr/>
+      <w:rPr>
+        <w:rFonts w:ascii="Symbol" w:hAnsi="Symbol" w:cs="Symbol" w:hint="default"/>
+      </w:rPr>
     </w:lvl>
     <w:lvl w:ilvl="1">
       <w:start w:val="1"/>
-      <w:numFmt w:val="decimal"/>
-      <w:lvlText w:val="%2."/>
+      <w:numFmt w:val="bullet"/>
+      <w:lvlText w:val="◦"/>
       <w:lvlJc w:val="start"/>
       <w:pPr>
         <w:tabs>
@@ -4948,12 +4982,14 @@
         </w:tabs>
         <w:ind w:start="1080" w:hanging="360"/>
       </w:pPr>
-      <w:rPr/>
+      <w:rPr>
+        <w:rFonts w:ascii="OpenSymbol" w:hAnsi="OpenSymbol" w:cs="OpenSymbol" w:hint="default"/>
+      </w:rPr>
     </w:lvl>
     <w:lvl w:ilvl="2">
       <w:start w:val="1"/>
-      <w:numFmt w:val="decimal"/>
-      <w:lvlText w:val="%3."/>
+      <w:numFmt w:val="bullet"/>
+      <w:lvlText w:val="▪"/>
       <w:lvlJc w:val="start"/>
       <w:pPr>
         <w:tabs>
@@ -4961,12 +4997,14 @@
         </w:tabs>
         <w:ind w:start="1440" w:hanging="360"/>
       </w:pPr>
-      <w:rPr/>
+      <w:rPr>
+        <w:rFonts w:ascii="OpenSymbol" w:hAnsi="OpenSymbol" w:cs="OpenSymbol" w:hint="default"/>
+      </w:rPr>
     </w:lvl>
     <w:lvl w:ilvl="3">
       <w:start w:val="1"/>
-      <w:numFmt w:val="decimal"/>
-      <w:lvlText w:val="%4."/>
+      <w:numFmt w:val="bullet"/>
+      <w:lvlText w:val=""/>
       <w:lvlJc w:val="start"/>
       <w:pPr>
         <w:tabs>
@@ -4974,12 +5012,14 @@
         </w:tabs>
         <w:ind w:start="1800" w:hanging="360"/>
       </w:pPr>
-      <w:rPr/>
+      <w:rPr>
+        <w:rFonts w:ascii="Symbol" w:hAnsi="Symbol" w:cs="Symbol" w:hint="default"/>
+      </w:rPr>
     </w:lvl>
     <w:lvl w:ilvl="4">
       <w:start w:val="1"/>
-      <w:numFmt w:val="decimal"/>
-      <w:lvlText w:val="%5."/>
+      <w:numFmt w:val="bullet"/>
+      <w:lvlText w:val="◦"/>
       <w:lvlJc w:val="start"/>
       <w:pPr>
         <w:tabs>
@@ -4987,12 +5027,14 @@
         </w:tabs>
         <w:ind w:start="2160" w:hanging="360"/>
       </w:pPr>
-      <w:rPr/>
+      <w:rPr>
+        <w:rFonts w:ascii="OpenSymbol" w:hAnsi="OpenSymbol" w:cs="OpenSymbol" w:hint="default"/>
+      </w:rPr>
     </w:lvl>
     <w:lvl w:ilvl="5">
       <w:start w:val="1"/>
-      <w:numFmt w:val="decimal"/>
-      <w:lvlText w:val="%6."/>
+      <w:numFmt w:val="bullet"/>
+      <w:lvlText w:val="▪"/>
       <w:lvlJc w:val="start"/>
       <w:pPr>
         <w:tabs>
@@ -5000,12 +5042,14 @@
         </w:tabs>
         <w:ind w:start="2520" w:hanging="360"/>
       </w:pPr>
-      <w:rPr/>
+      <w:rPr>
+        <w:rFonts w:ascii="OpenSymbol" w:hAnsi="OpenSymbol" w:cs="OpenSymbol" w:hint="default"/>
+      </w:rPr>
     </w:lvl>
     <w:lvl w:ilvl="6">
       <w:start w:val="1"/>
-      <w:numFmt w:val="decimal"/>
-      <w:lvlText w:val="%7."/>
+      <w:numFmt w:val="bullet"/>
+      <w:lvlText w:val=""/>
       <w:lvlJc w:val="start"/>
       <w:pPr>
         <w:tabs>
@@ -5013,12 +5057,14 @@
         </w:tabs>
         <w:ind w:start="2880" w:hanging="360"/>
       </w:pPr>
-      <w:rPr/>
+      <w:rPr>
+        <w:rFonts w:ascii="Symbol" w:hAnsi="Symbol" w:cs="Symbol" w:hint="default"/>
+      </w:rPr>
     </w:lvl>
     <w:lvl w:ilvl="7">
       <w:start w:val="1"/>
-      <w:numFmt w:val="decimal"/>
-      <w:lvlText w:val="%8."/>
+      <w:numFmt w:val="bullet"/>
+      <w:lvlText w:val="◦"/>
       <w:lvlJc w:val="start"/>
       <w:pPr>
         <w:tabs>
@@ -5026,12 +5072,14 @@
         </w:tabs>
         <w:ind w:start="3240" w:hanging="360"/>
       </w:pPr>
-      <w:rPr/>
+      <w:rPr>
+        <w:rFonts w:ascii="OpenSymbol" w:hAnsi="OpenSymbol" w:cs="OpenSymbol" w:hint="default"/>
+      </w:rPr>
     </w:lvl>
     <w:lvl w:ilvl="8">
       <w:start w:val="1"/>
-      <w:numFmt w:val="decimal"/>
-      <w:lvlText w:val="%9."/>
+      <w:numFmt w:val="bullet"/>
+      <w:lvlText w:val="▪"/>
       <w:lvlJc w:val="start"/>
       <w:pPr>
         <w:tabs>
@@ -5039,7 +5087,9 @@
         </w:tabs>
         <w:ind w:start="3600" w:hanging="360"/>
       </w:pPr>
-      <w:rPr/>
+      <w:rPr>
+        <w:rFonts w:ascii="OpenSymbol" w:hAnsi="OpenSymbol" w:cs="OpenSymbol" w:hint="default"/>
+      </w:rPr>
     </w:lvl>
   </w:abstractNum>
   <w:abstractNum w:abstractNumId="5">
@@ -5319,8 +5369,8 @@
   <w:abstractNum w:abstractNumId="7">
     <w:lvl w:ilvl="0">
       <w:start w:val="1"/>
-      <w:numFmt w:val="bullet"/>
-      <w:lvlText w:val=""/>
+      <w:numFmt w:val="decimal"/>
+      <w:lvlText w:val="%1."/>
       <w:lvlJc w:val="start"/>
       <w:pPr>
         <w:tabs>
@@ -5328,14 +5378,12 @@
         </w:tabs>
         <w:ind w:start="720" w:hanging="360"/>
       </w:pPr>
-      <w:rPr>
-        <w:rFonts w:ascii="Symbol" w:hAnsi="Symbol" w:cs="Symbol" w:hint="default"/>
-      </w:rPr>
+      <w:rPr/>
     </w:lvl>
     <w:lvl w:ilvl="1">
       <w:start w:val="1"/>
-      <w:numFmt w:val="bullet"/>
-      <w:lvlText w:val="◦"/>
+      <w:numFmt w:val="decimal"/>
+      <w:lvlText w:val="%2."/>
       <w:lvlJc w:val="start"/>
       <w:pPr>
         <w:tabs>
@@ -5343,14 +5391,12 @@
         </w:tabs>
         <w:ind w:start="1080" w:hanging="360"/>
       </w:pPr>
-      <w:rPr>
-        <w:rFonts w:ascii="OpenSymbol" w:hAnsi="OpenSymbol" w:cs="OpenSymbol" w:hint="default"/>
-      </w:rPr>
+      <w:rPr/>
     </w:lvl>
     <w:lvl w:ilvl="2">
       <w:start w:val="1"/>
-      <w:numFmt w:val="bullet"/>
-      <w:lvlText w:val="▪"/>
+      <w:numFmt w:val="decimal"/>
+      <w:lvlText w:val="%3."/>
       <w:lvlJc w:val="start"/>
       <w:pPr>
         <w:tabs>
@@ -5358,14 +5404,12 @@
         </w:tabs>
         <w:ind w:start="1440" w:hanging="360"/>
       </w:pPr>
-      <w:rPr>
-        <w:rFonts w:ascii="OpenSymbol" w:hAnsi="OpenSymbol" w:cs="OpenSymbol" w:hint="default"/>
-      </w:rPr>
+      <w:rPr/>
     </w:lvl>
     <w:lvl w:ilvl="3">
       <w:start w:val="1"/>
-      <w:numFmt w:val="bullet"/>
-      <w:lvlText w:val=""/>
+      <w:numFmt w:val="decimal"/>
+      <w:lvlText w:val="%4."/>
       <w:lvlJc w:val="start"/>
       <w:pPr>
         <w:tabs>
@@ -5373,14 +5417,12 @@
         </w:tabs>
         <w:ind w:start="1800" w:hanging="360"/>
       </w:pPr>
-      <w:rPr>
-        <w:rFonts w:ascii="Symbol" w:hAnsi="Symbol" w:cs="Symbol" w:hint="default"/>
-      </w:rPr>
+      <w:rPr/>
     </w:lvl>
     <w:lvl w:ilvl="4">
       <w:start w:val="1"/>
-      <w:numFmt w:val="bullet"/>
-      <w:lvlText w:val="◦"/>
+      <w:numFmt w:val="decimal"/>
+      <w:lvlText w:val="%5."/>
       <w:lvlJc w:val="start"/>
       <w:pPr>
         <w:tabs>
@@ -5388,14 +5430,12 @@
         </w:tabs>
         <w:ind w:start="2160" w:hanging="360"/>
       </w:pPr>
-      <w:rPr>
-        <w:rFonts w:ascii="OpenSymbol" w:hAnsi="OpenSymbol" w:cs="OpenSymbol" w:hint="default"/>
-      </w:rPr>
+      <w:rPr/>
     </w:lvl>
     <w:lvl w:ilvl="5">
       <w:start w:val="1"/>
-      <w:numFmt w:val="bullet"/>
-      <w:lvlText w:val="▪"/>
+      <w:numFmt w:val="decimal"/>
+      <w:lvlText w:val="%6."/>
       <w:lvlJc w:val="start"/>
       <w:pPr>
         <w:tabs>
@@ -5403,14 +5443,12 @@
         </w:tabs>
         <w:ind w:start="2520" w:hanging="360"/>
       </w:pPr>
-      <w:rPr>
-        <w:rFonts w:ascii="OpenSymbol" w:hAnsi="OpenSymbol" w:cs="OpenSymbol" w:hint="default"/>
-      </w:rPr>
+      <w:rPr/>
     </w:lvl>
     <w:lvl w:ilvl="6">
       <w:start w:val="1"/>
-      <w:numFmt w:val="bullet"/>
-      <w:lvlText w:val=""/>
+      <w:numFmt w:val="decimal"/>
+      <w:lvlText w:val="%7."/>
       <w:lvlJc w:val="start"/>
       <w:pPr>
         <w:tabs>
@@ -5418,14 +5456,12 @@
         </w:tabs>
         <w:ind w:start="2880" w:hanging="360"/>
       </w:pPr>
-      <w:rPr>
-        <w:rFonts w:ascii="Symbol" w:hAnsi="Symbol" w:cs="Symbol" w:hint="default"/>
-      </w:rPr>
+      <w:rPr/>
     </w:lvl>
     <w:lvl w:ilvl="7">
       <w:start w:val="1"/>
-      <w:numFmt w:val="bullet"/>
-      <w:lvlText w:val="◦"/>
+      <w:numFmt w:val="decimal"/>
+      <w:lvlText w:val="%8."/>
       <w:lvlJc w:val="start"/>
       <w:pPr>
         <w:tabs>
@@ -5433,14 +5469,12 @@
         </w:tabs>
         <w:ind w:start="3240" w:hanging="360"/>
       </w:pPr>
-      <w:rPr>
-        <w:rFonts w:ascii="OpenSymbol" w:hAnsi="OpenSymbol" w:cs="OpenSymbol" w:hint="default"/>
-      </w:rPr>
+      <w:rPr/>
     </w:lvl>
     <w:lvl w:ilvl="8">
       <w:start w:val="1"/>
-      <w:numFmt w:val="bullet"/>
-      <w:lvlText w:val="▪"/>
+      <w:numFmt w:val="decimal"/>
+      <w:lvlText w:val="%9."/>
       <w:lvlJc w:val="start"/>
       <w:pPr>
         <w:tabs>
@@ -5448,16 +5482,14 @@
         </w:tabs>
         <w:ind w:start="3600" w:hanging="360"/>
       </w:pPr>
-      <w:rPr>
-        <w:rFonts w:ascii="OpenSymbol" w:hAnsi="OpenSymbol" w:cs="OpenSymbol" w:hint="default"/>
-      </w:rPr>
+      <w:rPr/>
     </w:lvl>
   </w:abstractNum>
   <w:abstractNum w:abstractNumId="8">
     <w:lvl w:ilvl="0">
       <w:start w:val="1"/>
-      <w:numFmt w:val="decimal"/>
-      <w:lvlText w:val="%1."/>
+      <w:numFmt w:val="bullet"/>
+      <w:lvlText w:val=""/>
       <w:lvlJc w:val="start"/>
       <w:pPr>
         <w:tabs>
@@ -5465,12 +5497,14 @@
         </w:tabs>
         <w:ind w:start="720" w:hanging="360"/>
       </w:pPr>
-      <w:rPr/>
+      <w:rPr>
+        <w:rFonts w:ascii="Wingdings" w:hAnsi="Wingdings" w:cs="Wingdings" w:hint="default"/>
+      </w:rPr>
     </w:lvl>
     <w:lvl w:ilvl="1">
       <w:start w:val="1"/>
-      <w:numFmt w:val="decimal"/>
-      <w:lvlText w:val="%2."/>
+      <w:numFmt w:val="bullet"/>
+      <w:lvlText w:val=""/>
       <w:lvlJc w:val="start"/>
       <w:pPr>
         <w:tabs>
@@ -5478,12 +5512,14 @@
         </w:tabs>
         <w:ind w:start="1080" w:hanging="360"/>
       </w:pPr>
-      <w:rPr/>
+      <w:rPr>
+        <w:rFonts w:ascii="Wingdings" w:hAnsi="Wingdings" w:cs="Wingdings" w:hint="default"/>
+      </w:rPr>
     </w:lvl>
     <w:lvl w:ilvl="2">
       <w:start w:val="1"/>
-      <w:numFmt w:val="decimal"/>
-      <w:lvlText w:val="%3."/>
+      <w:numFmt w:val="bullet"/>
+      <w:lvlText w:val=""/>
       <w:lvlJc w:val="start"/>
       <w:pPr>
         <w:tabs>
@@ -5491,12 +5527,14 @@
         </w:tabs>
         <w:ind w:start="1440" w:hanging="360"/>
       </w:pPr>
-      <w:rPr/>
+      <w:rPr>
+        <w:rFonts w:ascii="Wingdings" w:hAnsi="Wingdings" w:cs="Wingdings" w:hint="default"/>
+      </w:rPr>
     </w:lvl>
     <w:lvl w:ilvl="3">
       <w:start w:val="1"/>
-      <w:numFmt w:val="decimal"/>
-      <w:lvlText w:val="%4."/>
+      <w:numFmt w:val="bullet"/>
+      <w:lvlText w:val=""/>
       <w:lvlJc w:val="start"/>
       <w:pPr>
         <w:tabs>
@@ -5504,12 +5542,14 @@
         </w:tabs>
         <w:ind w:start="1800" w:hanging="360"/>
       </w:pPr>
-      <w:rPr/>
+      <w:rPr>
+        <w:rFonts w:ascii="Wingdings" w:hAnsi="Wingdings" w:cs="Wingdings" w:hint="default"/>
+      </w:rPr>
     </w:lvl>
     <w:lvl w:ilvl="4">
       <w:start w:val="1"/>
-      <w:numFmt w:val="decimal"/>
-      <w:lvlText w:val="%5."/>
+      <w:numFmt w:val="bullet"/>
+      <w:lvlText w:val=""/>
       <w:lvlJc w:val="start"/>
       <w:pPr>
         <w:tabs>
@@ -5517,12 +5557,14 @@
         </w:tabs>
         <w:ind w:start="2160" w:hanging="360"/>
       </w:pPr>
-      <w:rPr/>
+      <w:rPr>
+        <w:rFonts w:ascii="Wingdings" w:hAnsi="Wingdings" w:cs="Wingdings" w:hint="default"/>
+      </w:rPr>
     </w:lvl>
     <w:lvl w:ilvl="5">
       <w:start w:val="1"/>
-      <w:numFmt w:val="decimal"/>
-      <w:lvlText w:val="%6."/>
+      <w:numFmt w:val="bullet"/>
+      <w:lvlText w:val=""/>
       <w:lvlJc w:val="start"/>
       <w:pPr>
         <w:tabs>
@@ -5530,12 +5572,14 @@
         </w:tabs>
         <w:ind w:start="2520" w:hanging="360"/>
       </w:pPr>
-      <w:rPr/>
+      <w:rPr>
+        <w:rFonts w:ascii="Wingdings" w:hAnsi="Wingdings" w:cs="Wingdings" w:hint="default"/>
+      </w:rPr>
     </w:lvl>
     <w:lvl w:ilvl="6">
       <w:start w:val="1"/>
-      <w:numFmt w:val="decimal"/>
-      <w:lvlText w:val="%7."/>
+      <w:numFmt w:val="bullet"/>
+      <w:lvlText w:val=""/>
       <w:lvlJc w:val="start"/>
       <w:pPr>
         <w:tabs>
@@ -5543,12 +5587,14 @@
         </w:tabs>
         <w:ind w:start="2880" w:hanging="360"/>
       </w:pPr>
-      <w:rPr/>
+      <w:rPr>
+        <w:rFonts w:ascii="Wingdings" w:hAnsi="Wingdings" w:cs="Wingdings" w:hint="default"/>
+      </w:rPr>
     </w:lvl>
     <w:lvl w:ilvl="7">
       <w:start w:val="1"/>
-      <w:numFmt w:val="decimal"/>
-      <w:lvlText w:val="%8."/>
+      <w:numFmt w:val="bullet"/>
+      <w:lvlText w:val=""/>
       <w:lvlJc w:val="start"/>
       <w:pPr>
         <w:tabs>
@@ -5556,12 +5602,14 @@
         </w:tabs>
         <w:ind w:start="3240" w:hanging="360"/>
       </w:pPr>
-      <w:rPr/>
+      <w:rPr>
+        <w:rFonts w:ascii="Wingdings" w:hAnsi="Wingdings" w:cs="Wingdings" w:hint="default"/>
+      </w:rPr>
     </w:lvl>
     <w:lvl w:ilvl="8">
       <w:start w:val="1"/>
-      <w:numFmt w:val="decimal"/>
-      <w:lvlText w:val="%9."/>
+      <w:numFmt w:val="bullet"/>
+      <w:lvlText w:val=""/>
       <w:lvlJc w:val="start"/>
       <w:pPr>
         <w:tabs>
@@ -5569,7 +5617,9 @@
         </w:tabs>
         <w:ind w:start="3600" w:hanging="360"/>
       </w:pPr>
-      <w:rPr/>
+      <w:rPr>
+        <w:rFonts w:ascii="Wingdings" w:hAnsi="Wingdings" w:cs="Wingdings" w:hint="default"/>
+      </w:rPr>
     </w:lvl>
   </w:abstractNum>
   <w:abstractNum w:abstractNumId="9">
@@ -5591,7 +5641,7 @@
     <w:lvl w:ilvl="1">
       <w:start w:val="1"/>
       <w:numFmt w:val="bullet"/>
-      <w:lvlText w:val=""/>
+      <w:lvlText w:val="◦"/>
       <w:lvlJc w:val="start"/>
       <w:pPr>
         <w:tabs>
@@ -5600,13 +5650,13 @@
         <w:ind w:start="1080" w:hanging="360"/>
       </w:pPr>
       <w:rPr>
-        <w:rFonts w:ascii="Wingdings" w:hAnsi="Wingdings" w:cs="Wingdings" w:hint="default"/>
+        <w:rFonts w:ascii="OpenSymbol" w:hAnsi="OpenSymbol" w:cs="OpenSymbol" w:hint="default"/>
       </w:rPr>
     </w:lvl>
     <w:lvl w:ilvl="2">
       <w:start w:val="1"/>
       <w:numFmt w:val="bullet"/>
-      <w:lvlText w:val=""/>
+      <w:lvlText w:val="▪"/>
       <w:lvlJc w:val="start"/>
       <w:pPr>
         <w:tabs>
@@ -5615,13 +5665,13 @@
         <w:ind w:start="1440" w:hanging="360"/>
       </w:pPr>
       <w:rPr>
-        <w:rFonts w:ascii="Wingdings" w:hAnsi="Wingdings" w:cs="Wingdings" w:hint="default"/>
+        <w:rFonts w:ascii="OpenSymbol" w:hAnsi="OpenSymbol" w:cs="OpenSymbol" w:hint="default"/>
       </w:rPr>
     </w:lvl>
     <w:lvl w:ilvl="3">
       <w:start w:val="1"/>
       <w:numFmt w:val="bullet"/>
-      <w:lvlText w:val=""/>
+      <w:lvlText w:val=""/>
       <w:lvlJc w:val="start"/>
       <w:pPr>
         <w:tabs>
@@ -5630,13 +5680,13 @@
         <w:ind w:start="1800" w:hanging="360"/>
       </w:pPr>
       <w:rPr>
-        <w:rFonts w:ascii="Wingdings" w:hAnsi="Wingdings" w:cs="Wingdings" w:hint="default"/>
+        <w:rFonts w:ascii="Symbol" w:hAnsi="Symbol" w:cs="Symbol" w:hint="default"/>
       </w:rPr>
     </w:lvl>
     <w:lvl w:ilvl="4">
       <w:start w:val="1"/>
       <w:numFmt w:val="bullet"/>
-      <w:lvlText w:val=""/>
+      <w:lvlText w:val="◦"/>
       <w:lvlJc w:val="start"/>
       <w:pPr>
         <w:tabs>
@@ -5645,13 +5695,13 @@
         <w:ind w:start="2160" w:hanging="360"/>
       </w:pPr>
       <w:rPr>
-        <w:rFonts w:ascii="Wingdings" w:hAnsi="Wingdings" w:cs="Wingdings" w:hint="default"/>
+        <w:rFonts w:ascii="OpenSymbol" w:hAnsi="OpenSymbol" w:cs="OpenSymbol" w:hint="default"/>
       </w:rPr>
     </w:lvl>
     <w:lvl w:ilvl="5">
       <w:start w:val="1"/>
       <w:numFmt w:val="bullet"/>
-      <w:lvlText w:val=""/>
+      <w:lvlText w:val="▪"/>
       <w:lvlJc w:val="start"/>
       <w:pPr>
         <w:tabs>
@@ -5660,13 +5710,13 @@
         <w:ind w:start="2520" w:hanging="360"/>
       </w:pPr>
       <w:rPr>
-        <w:rFonts w:ascii="Wingdings" w:hAnsi="Wingdings" w:cs="Wingdings" w:hint="default"/>
+        <w:rFonts w:ascii="OpenSymbol" w:hAnsi="OpenSymbol" w:cs="OpenSymbol" w:hint="default"/>
       </w:rPr>
     </w:lvl>
     <w:lvl w:ilvl="6">
       <w:start w:val="1"/>
       <w:numFmt w:val="bullet"/>
-      <w:lvlText w:val=""/>
+      <w:lvlText w:val=""/>
       <w:lvlJc w:val="start"/>
       <w:pPr>
         <w:tabs>
@@ -5675,13 +5725,13 @@
         <w:ind w:start="2880" w:hanging="360"/>
       </w:pPr>
       <w:rPr>
-        <w:rFonts w:ascii="Wingdings" w:hAnsi="Wingdings" w:cs="Wingdings" w:hint="default"/>
+        <w:rFonts w:ascii="Symbol" w:hAnsi="Symbol" w:cs="Symbol" w:hint="default"/>
       </w:rPr>
     </w:lvl>
     <w:lvl w:ilvl="7">
       <w:start w:val="1"/>
       <w:numFmt w:val="bullet"/>
-      <w:lvlText w:val=""/>
+      <w:lvlText w:val="◦"/>
       <w:lvlJc w:val="start"/>
       <w:pPr>
         <w:tabs>
@@ -5690,13 +5740,13 @@
         <w:ind w:start="3240" w:hanging="360"/>
       </w:pPr>
       <w:rPr>
-        <w:rFonts w:ascii="Wingdings" w:hAnsi="Wingdings" w:cs="Wingdings" w:hint="default"/>
+        <w:rFonts w:ascii="OpenSymbol" w:hAnsi="OpenSymbol" w:cs="OpenSymbol" w:hint="default"/>
       </w:rPr>
     </w:lvl>
     <w:lvl w:ilvl="8">
       <w:start w:val="1"/>
       <w:numFmt w:val="bullet"/>
-      <w:lvlText w:val=""/>
+      <w:lvlText w:val="▪"/>
       <w:lvlJc w:val="start"/>
       <w:pPr>
         <w:tabs>
@@ -5705,7 +5755,7 @@
         <w:ind w:start="3600" w:hanging="360"/>
       </w:pPr>
       <w:rPr>
-        <w:rFonts w:ascii="Wingdings" w:hAnsi="Wingdings" w:cs="Wingdings" w:hint="default"/>
+        <w:rFonts w:ascii="OpenSymbol" w:hAnsi="OpenSymbol" w:cs="OpenSymbol" w:hint="default"/>
       </w:rPr>
     </w:lvl>
   </w:abstractNum>
@@ -5865,7 +5915,7 @@
     <w:lvl w:ilvl="1">
       <w:start w:val="1"/>
       <w:numFmt w:val="bullet"/>
-      <w:lvlText w:val="◦"/>
+      <w:lvlText w:val=""/>
       <w:lvlJc w:val="start"/>
       <w:pPr>
         <w:tabs>
@@ -5874,13 +5924,13 @@
         <w:ind w:start="1080" w:hanging="360"/>
       </w:pPr>
       <w:rPr>
-        <w:rFonts w:ascii="OpenSymbol" w:hAnsi="OpenSymbol" w:cs="OpenSymbol" w:hint="default"/>
+        <w:rFonts w:ascii="Wingdings" w:hAnsi="Wingdings" w:cs="Wingdings" w:hint="default"/>
       </w:rPr>
     </w:lvl>
     <w:lvl w:ilvl="2">
       <w:start w:val="1"/>
       <w:numFmt w:val="bullet"/>
-      <w:lvlText w:val="▪"/>
+      <w:lvlText w:val=""/>
       <w:lvlJc w:val="start"/>
       <w:pPr>
         <w:tabs>
@@ -5889,13 +5939,13 @@
         <w:ind w:start="1440" w:hanging="360"/>
       </w:pPr>
       <w:rPr>
-        <w:rFonts w:ascii="OpenSymbol" w:hAnsi="OpenSymbol" w:cs="OpenSymbol" w:hint="default"/>
+        <w:rFonts w:ascii="Wingdings" w:hAnsi="Wingdings" w:cs="Wingdings" w:hint="default"/>
       </w:rPr>
     </w:lvl>
     <w:lvl w:ilvl="3">
       <w:start w:val="1"/>
       <w:numFmt w:val="bullet"/>
-      <w:lvlText w:val=""/>
+      <w:lvlText w:val=""/>
       <w:lvlJc w:val="start"/>
       <w:pPr>
         <w:tabs>
@@ -5904,13 +5954,13 @@
         <w:ind w:start="1800" w:hanging="360"/>
       </w:pPr>
       <w:rPr>
-        <w:rFonts w:ascii="Symbol" w:hAnsi="Symbol" w:cs="Symbol" w:hint="default"/>
+        <w:rFonts w:ascii="Wingdings" w:hAnsi="Wingdings" w:cs="Wingdings" w:hint="default"/>
       </w:rPr>
     </w:lvl>
     <w:lvl w:ilvl="4">
       <w:start w:val="1"/>
       <w:numFmt w:val="bullet"/>
-      <w:lvlText w:val="◦"/>
+      <w:lvlText w:val=""/>
       <w:lvlJc w:val="start"/>
       <w:pPr>
         <w:tabs>
@@ -5919,13 +5969,13 @@
         <w:ind w:start="2160" w:hanging="360"/>
       </w:pPr>
       <w:rPr>
-        <w:rFonts w:ascii="OpenSymbol" w:hAnsi="OpenSymbol" w:cs="OpenSymbol" w:hint="default"/>
+        <w:rFonts w:ascii="Wingdings" w:hAnsi="Wingdings" w:cs="Wingdings" w:hint="default"/>
       </w:rPr>
     </w:lvl>
     <w:lvl w:ilvl="5">
       <w:start w:val="1"/>
       <w:numFmt w:val="bullet"/>
-      <w:lvlText w:val="▪"/>
+      <w:lvlText w:val=""/>
       <w:lvlJc w:val="start"/>
       <w:pPr>
         <w:tabs>
@@ -5934,13 +5984,13 @@
         <w:ind w:start="2520" w:hanging="360"/>
       </w:pPr>
       <w:rPr>
-        <w:rFonts w:ascii="OpenSymbol" w:hAnsi="OpenSymbol" w:cs="OpenSymbol" w:hint="default"/>
+        <w:rFonts w:ascii="Wingdings" w:hAnsi="Wingdings" w:cs="Wingdings" w:hint="default"/>
       </w:rPr>
     </w:lvl>
     <w:lvl w:ilvl="6">
       <w:start w:val="1"/>
       <w:numFmt w:val="bullet"/>
-      <w:lvlText w:val=""/>
+      <w:lvlText w:val=""/>
       <w:lvlJc w:val="start"/>
       <w:pPr>
         <w:tabs>
@@ -5949,13 +5999,13 @@
         <w:ind w:start="2880" w:hanging="360"/>
       </w:pPr>
       <w:rPr>
-        <w:rFonts w:ascii="Symbol" w:hAnsi="Symbol" w:cs="Symbol" w:hint="default"/>
+        <w:rFonts w:ascii="Wingdings" w:hAnsi="Wingdings" w:cs="Wingdings" w:hint="default"/>
       </w:rPr>
     </w:lvl>
     <w:lvl w:ilvl="7">
       <w:start w:val="1"/>
       <w:numFmt w:val="bullet"/>
-      <w:lvlText w:val="◦"/>
+      <w:lvlText w:val=""/>
       <w:lvlJc w:val="start"/>
       <w:pPr>
         <w:tabs>
@@ -5964,13 +6014,13 @@
         <w:ind w:start="3240" w:hanging="360"/>
       </w:pPr>
       <w:rPr>
-        <w:rFonts w:ascii="OpenSymbol" w:hAnsi="OpenSymbol" w:cs="OpenSymbol" w:hint="default"/>
+        <w:rFonts w:ascii="Wingdings" w:hAnsi="Wingdings" w:cs="Wingdings" w:hint="default"/>
       </w:rPr>
     </w:lvl>
     <w:lvl w:ilvl="8">
       <w:start w:val="1"/>
       <w:numFmt w:val="bullet"/>
-      <w:lvlText w:val="▪"/>
+      <w:lvlText w:val=""/>
       <w:lvlJc w:val="start"/>
       <w:pPr>
         <w:tabs>
@@ -5979,7 +6029,7 @@
         <w:ind w:start="3600" w:hanging="360"/>
       </w:pPr>
       <w:rPr>
-        <w:rFonts w:ascii="OpenSymbol" w:hAnsi="OpenSymbol" w:cs="OpenSymbol" w:hint="default"/>
+        <w:rFonts w:ascii="Wingdings" w:hAnsi="Wingdings" w:cs="Wingdings" w:hint="default"/>
       </w:rPr>
     </w:lvl>
   </w:abstractNum>
@@ -6261,7 +6311,7 @@
     <w:lvl w:ilvl="0">
       <w:start w:val="1"/>
       <w:numFmt w:val="bullet"/>
-      <w:lvlText w:val=""/>
+      <w:lvlText w:val=""/>
       <w:lvlJc w:val="start"/>
       <w:pPr>
         <w:tabs>
@@ -6270,13 +6320,13 @@
         <w:ind w:start="720" w:hanging="360"/>
       </w:pPr>
       <w:rPr>
-        <w:rFonts w:ascii="Wingdings" w:hAnsi="Wingdings" w:cs="Wingdings" w:hint="default"/>
+        <w:rFonts w:ascii="Symbol" w:hAnsi="Symbol" w:cs="Symbol" w:hint="default"/>
       </w:rPr>
     </w:lvl>
     <w:lvl w:ilvl="1">
       <w:start w:val="1"/>
       <w:numFmt w:val="bullet"/>
-      <w:lvlText w:val=""/>
+      <w:lvlText w:val="◦"/>
       <w:lvlJc w:val="start"/>
       <w:pPr>
         <w:tabs>
@@ -6285,13 +6335,13 @@
         <w:ind w:start="1080" w:hanging="360"/>
       </w:pPr>
       <w:rPr>
-        <w:rFonts w:ascii="Wingdings" w:hAnsi="Wingdings" w:cs="Wingdings" w:hint="default"/>
+        <w:rFonts w:ascii="OpenSymbol" w:hAnsi="OpenSymbol" w:cs="OpenSymbol" w:hint="default"/>
       </w:rPr>
     </w:lvl>
     <w:lvl w:ilvl="2">
       <w:start w:val="1"/>
       <w:numFmt w:val="bullet"/>
-      <w:lvlText w:val=""/>
+      <w:lvlText w:val="▪"/>
       <w:lvlJc w:val="start"/>
       <w:pPr>
         <w:tabs>
@@ -6300,13 +6350,13 @@
         <w:ind w:start="1440" w:hanging="360"/>
       </w:pPr>
       <w:rPr>
-        <w:rFonts w:ascii="Wingdings" w:hAnsi="Wingdings" w:cs="Wingdings" w:hint="default"/>
+        <w:rFonts w:ascii="OpenSymbol" w:hAnsi="OpenSymbol" w:cs="OpenSymbol" w:hint="default"/>
       </w:rPr>
     </w:lvl>
     <w:lvl w:ilvl="3">
       <w:start w:val="1"/>
       <w:numFmt w:val="bullet"/>
-      <w:lvlText w:val=""/>
+      <w:lvlText w:val=""/>
       <w:lvlJc w:val="start"/>
       <w:pPr>
         <w:tabs>
@@ -6315,13 +6365,13 @@
         <w:ind w:start="1800" w:hanging="360"/>
       </w:pPr>
       <w:rPr>
-        <w:rFonts w:ascii="Wingdings" w:hAnsi="Wingdings" w:cs="Wingdings" w:hint="default"/>
+        <w:rFonts w:ascii="Symbol" w:hAnsi="Symbol" w:cs="Symbol" w:hint="default"/>
       </w:rPr>
     </w:lvl>
     <w:lvl w:ilvl="4">
       <w:start w:val="1"/>
       <w:numFmt w:val="bullet"/>
-      <w:lvlText w:val=""/>
+      <w:lvlText w:val="◦"/>
       <w:lvlJc w:val="start"/>
       <w:pPr>
         <w:tabs>
@@ -6330,13 +6380,13 @@
         <w:ind w:start="2160" w:hanging="360"/>
       </w:pPr>
       <w:rPr>
-        <w:rFonts w:ascii="Wingdings" w:hAnsi="Wingdings" w:cs="Wingdings" w:hint="default"/>
+        <w:rFonts w:ascii="OpenSymbol" w:hAnsi="OpenSymbol" w:cs="OpenSymbol" w:hint="default"/>
       </w:rPr>
     </w:lvl>
     <w:lvl w:ilvl="5">
       <w:start w:val="1"/>
       <w:numFmt w:val="bullet"/>
-      <w:lvlText w:val=""/>
+      <w:lvlText w:val="▪"/>
       <w:lvlJc w:val="start"/>
       <w:pPr>
         <w:tabs>
@@ -6345,13 +6395,13 @@
         <w:ind w:start="2520" w:hanging="360"/>
       </w:pPr>
       <w:rPr>
-        <w:rFonts w:ascii="Wingdings" w:hAnsi="Wingdings" w:cs="Wingdings" w:hint="default"/>
+        <w:rFonts w:ascii="OpenSymbol" w:hAnsi="OpenSymbol" w:cs="OpenSymbol" w:hint="default"/>
       </w:rPr>
     </w:lvl>
     <w:lvl w:ilvl="6">
       <w:start w:val="1"/>
       <w:numFmt w:val="bullet"/>
-      <w:lvlText w:val=""/>
+      <w:lvlText w:val=""/>
       <w:lvlJc w:val="start"/>
       <w:pPr>
         <w:tabs>
@@ -6360,13 +6410,13 @@
         <w:ind w:start="2880" w:hanging="360"/>
       </w:pPr>
       <w:rPr>
-        <w:rFonts w:ascii="Wingdings" w:hAnsi="Wingdings" w:cs="Wingdings" w:hint="default"/>
+        <w:rFonts w:ascii="Symbol" w:hAnsi="Symbol" w:cs="Symbol" w:hint="default"/>
       </w:rPr>
     </w:lvl>
     <w:lvl w:ilvl="7">
       <w:start w:val="1"/>
       <w:numFmt w:val="bullet"/>
-      <w:lvlText w:val=""/>
+      <w:lvlText w:val="◦"/>
       <w:lvlJc w:val="start"/>
       <w:pPr>
         <w:tabs>
@@ -6375,13 +6425,13 @@
         <w:ind w:start="3240" w:hanging="360"/>
       </w:pPr>
       <w:rPr>
-        <w:rFonts w:ascii="Wingdings" w:hAnsi="Wingdings" w:cs="Wingdings" w:hint="default"/>
+        <w:rFonts w:ascii="OpenSymbol" w:hAnsi="OpenSymbol" w:cs="OpenSymbol" w:hint="default"/>
       </w:rPr>
     </w:lvl>
     <w:lvl w:ilvl="8">
       <w:start w:val="1"/>
       <w:numFmt w:val="bullet"/>
-      <w:lvlText w:val=""/>
+      <w:lvlText w:val="▪"/>
       <w:lvlJc w:val="start"/>
       <w:pPr>
         <w:tabs>
@@ -6390,145 +6440,127 @@
         <w:ind w:start="3600" w:hanging="360"/>
       </w:pPr>
       <w:rPr>
-        <w:rFonts w:ascii="Wingdings" w:hAnsi="Wingdings" w:cs="Wingdings" w:hint="default"/>
+        <w:rFonts w:ascii="OpenSymbol" w:hAnsi="OpenSymbol" w:cs="OpenSymbol" w:hint="default"/>
       </w:rPr>
     </w:lvl>
   </w:abstractNum>
   <w:abstractNum w:abstractNumId="15">
     <w:lvl w:ilvl="0">
       <w:start w:val="1"/>
-      <w:numFmt w:val="bullet"/>
-      <w:lvlText w:val=""/>
-      <w:lvlJc w:val="start"/>
-      <w:pPr>
-        <w:tabs>
-          <w:tab w:val="num" w:pos="720"/>
-        </w:tabs>
-        <w:ind w:start="720" w:hanging="360"/>
-      </w:pPr>
-      <w:rPr>
-        <w:rFonts w:ascii="Symbol" w:hAnsi="Symbol" w:cs="Symbol" w:hint="default"/>
-      </w:rPr>
+      <w:numFmt w:val="none"/>
+      <w:suff w:val="nothing"/>
+      <w:lvlText w:val=""/>
+      <w:lvlJc w:val="start"/>
+      <w:pPr>
+        <w:tabs>
+          <w:tab w:val="num" w:pos="0"/>
+        </w:tabs>
+        <w:ind w:start="0" w:hanging="0"/>
+      </w:pPr>
     </w:lvl>
     <w:lvl w:ilvl="1">
       <w:start w:val="1"/>
-      <w:numFmt w:val="bullet"/>
-      <w:lvlText w:val="◦"/>
-      <w:lvlJc w:val="start"/>
-      <w:pPr>
-        <w:tabs>
-          <w:tab w:val="num" w:pos="1080"/>
-        </w:tabs>
-        <w:ind w:start="1080" w:hanging="360"/>
-      </w:pPr>
-      <w:rPr>
-        <w:rFonts w:ascii="OpenSymbol" w:hAnsi="OpenSymbol" w:cs="OpenSymbol" w:hint="default"/>
-      </w:rPr>
+      <w:numFmt w:val="none"/>
+      <w:suff w:val="nothing"/>
+      <w:lvlText w:val=""/>
+      <w:lvlJc w:val="start"/>
+      <w:pPr>
+        <w:tabs>
+          <w:tab w:val="num" w:pos="0"/>
+        </w:tabs>
+        <w:ind w:start="0" w:hanging="0"/>
+      </w:pPr>
     </w:lvl>
     <w:lvl w:ilvl="2">
       <w:start w:val="1"/>
-      <w:numFmt w:val="bullet"/>
-      <w:lvlText w:val="▪"/>
-      <w:lvlJc w:val="start"/>
-      <w:pPr>
-        <w:tabs>
-          <w:tab w:val="num" w:pos="1440"/>
-        </w:tabs>
-        <w:ind w:start="1440" w:hanging="360"/>
-      </w:pPr>
-      <w:rPr>
-        <w:rFonts w:ascii="OpenSymbol" w:hAnsi="OpenSymbol" w:cs="OpenSymbol" w:hint="default"/>
-      </w:rPr>
+      <w:numFmt w:val="none"/>
+      <w:suff w:val="nothing"/>
+      <w:lvlText w:val=""/>
+      <w:lvlJc w:val="start"/>
+      <w:pPr>
+        <w:tabs>
+          <w:tab w:val="num" w:pos="0"/>
+        </w:tabs>
+        <w:ind w:start="0" w:hanging="0"/>
+      </w:pPr>
     </w:lvl>
     <w:lvl w:ilvl="3">
       <w:start w:val="1"/>
-      <w:numFmt w:val="bullet"/>
-      <w:lvlText w:val=""/>
-      <w:lvlJc w:val="start"/>
-      <w:pPr>
-        <w:tabs>
-          <w:tab w:val="num" w:pos="1800"/>
-        </w:tabs>
-        <w:ind w:start="1800" w:hanging="360"/>
-      </w:pPr>
-      <w:rPr>
-        <w:rFonts w:ascii="Symbol" w:hAnsi="Symbol" w:cs="Symbol" w:hint="default"/>
-      </w:rPr>
+      <w:numFmt w:val="none"/>
+      <w:suff w:val="nothing"/>
+      <w:lvlText w:val=""/>
+      <w:lvlJc w:val="start"/>
+      <w:pPr>
+        <w:tabs>
+          <w:tab w:val="num" w:pos="0"/>
+        </w:tabs>
+        <w:ind w:start="0" w:hanging="0"/>
+      </w:pPr>
     </w:lvl>
     <w:lvl w:ilvl="4">
       <w:start w:val="1"/>
-      <w:numFmt w:val="bullet"/>
-      <w:lvlText w:val="◦"/>
-      <w:lvlJc w:val="start"/>
-      <w:pPr>
-        <w:tabs>
-          <w:tab w:val="num" w:pos="2160"/>
-        </w:tabs>
-        <w:ind w:start="2160" w:hanging="360"/>
-      </w:pPr>
-      <w:rPr>
-        <w:rFonts w:ascii="OpenSymbol" w:hAnsi="OpenSymbol" w:cs="OpenSymbol" w:hint="default"/>
-      </w:rPr>
+      <w:numFmt w:val="none"/>
+      <w:suff w:val="nothing"/>
+      <w:lvlText w:val=""/>
+      <w:lvlJc w:val="start"/>
+      <w:pPr>
+        <w:tabs>
+          <w:tab w:val="num" w:pos="0"/>
+        </w:tabs>
+        <w:ind w:start="0" w:hanging="0"/>
+      </w:pPr>
     </w:lvl>
     <w:lvl w:ilvl="5">
       <w:start w:val="1"/>
-      <w:numFmt w:val="bullet"/>
-      <w:lvlText w:val="▪"/>
-      <w:lvlJc w:val="start"/>
-      <w:pPr>
-        <w:tabs>
-          <w:tab w:val="num" w:pos="2520"/>
-        </w:tabs>
-        <w:ind w:start="2520" w:hanging="360"/>
-      </w:pPr>
-      <w:rPr>
-        <w:rFonts w:ascii="OpenSymbol" w:hAnsi="OpenSymbol" w:cs="OpenSymbol" w:hint="default"/>
-      </w:rPr>
+      <w:numFmt w:val="none"/>
+      <w:suff w:val="nothing"/>
+      <w:lvlText w:val=""/>
+      <w:lvlJc w:val="start"/>
+      <w:pPr>
+        <w:tabs>
+          <w:tab w:val="num" w:pos="0"/>
+        </w:tabs>
+        <w:ind w:start="0" w:hanging="0"/>
+      </w:pPr>
     </w:lvl>
     <w:lvl w:ilvl="6">
       <w:start w:val="1"/>
-      <w:numFmt w:val="bullet"/>
-      <w:lvlText w:val=""/>
-      <w:lvlJc w:val="start"/>
-      <w:pPr>
-        <w:tabs>
-          <w:tab w:val="num" w:pos="2880"/>
-        </w:tabs>
-        <w:ind w:start="2880" w:hanging="360"/>
-      </w:pPr>
-      <w:rPr>
-        <w:rFonts w:ascii="Symbol" w:hAnsi="Symbol" w:cs="Symbol" w:hint="default"/>
-      </w:rPr>
+      <w:numFmt w:val="none"/>
+      <w:suff w:val="nothing"/>
+      <w:lvlText w:val=""/>
+      <w:lvlJc w:val="start"/>
+      <w:pPr>
+        <w:tabs>
+          <w:tab w:val="num" w:pos="0"/>
+        </w:tabs>
+        <w:ind w:start="0" w:hanging="0"/>
+      </w:pPr>
     </w:lvl>
     <w:lvl w:ilvl="7">
       <w:start w:val="1"/>
-      <w:numFmt w:val="bullet"/>
-      <w:lvlText w:val="◦"/>
-      <w:lvlJc w:val="start"/>
-      <w:pPr>
-        <w:tabs>
-          <w:tab w:val="num" w:pos="3240"/>
-        </w:tabs>
-        <w:ind w:start="3240" w:hanging="360"/>
-      </w:pPr>
-      <w:rPr>
-        <w:rFonts w:ascii="OpenSymbol" w:hAnsi="OpenSymbol" w:cs="OpenSymbol" w:hint="default"/>
-      </w:rPr>
+      <w:numFmt w:val="none"/>
+      <w:suff w:val="nothing"/>
+      <w:lvlText w:val=""/>
+      <w:lvlJc w:val="start"/>
+      <w:pPr>
+        <w:tabs>
+          <w:tab w:val="num" w:pos="0"/>
+        </w:tabs>
+        <w:ind w:start="0" w:hanging="0"/>
+      </w:pPr>
     </w:lvl>
     <w:lvl w:ilvl="8">
       <w:start w:val="1"/>
-      <w:numFmt w:val="bullet"/>
-      <w:lvlText w:val="▪"/>
-      <w:lvlJc w:val="start"/>
-      <w:pPr>
-        <w:tabs>
-          <w:tab w:val="num" w:pos="3600"/>
-        </w:tabs>
-        <w:ind w:start="3600" w:hanging="360"/>
-      </w:pPr>
-      <w:rPr>
-        <w:rFonts w:ascii="OpenSymbol" w:hAnsi="OpenSymbol" w:cs="OpenSymbol" w:hint="default"/>
-      </w:rPr>
+      <w:numFmt w:val="none"/>
+      <w:suff w:val="nothing"/>
+      <w:lvlText w:val=""/>
+      <w:lvlJc w:val="start"/>
+      <w:pPr>
+        <w:tabs>
+          <w:tab w:val="num" w:pos="0"/>
+        </w:tabs>
+        <w:ind w:start="0" w:hanging="0"/>
+      </w:pPr>
     </w:lvl>
   </w:abstractNum>
   <w:num w:numId="1">
@@ -6603,9 +6635,7 @@
     <w:pPr>
       <w:widowControl/>
       <w:suppressAutoHyphens w:val="true"/>
-      <w:kinsoku w:val="true"/>
-      <w:overflowPunct w:val="true"/>
-      <w:autoSpaceDE w:val="true"/>
+      <w:overflowPunct w:val="false"/>
       <w:bidi w:val="0"/>
       <w:spacing w:before="0" w:after="0"/>
       <w:jc w:val="start"/>
@@ -6627,7 +6657,7 @@
     <w:pPr>
       <w:numPr>
         <w:ilvl w:val="0"/>
-        <w:numId w:val="2"/>
+        <w:numId w:val="1"/>
       </w:numPr>
       <w:spacing w:before="240" w:after="120"/>
       <w:outlineLvl w:val="0"/>

</xml_diff>

<commit_message>
feat: implement file upload system with enhanced authorization
- Add file upload modal and file card components
- Refactor room modal for better file management
- Create useFileUpload hook for upload API calls
- Update backend to use userId instead of socketId for authorization
- cache evict functions for file upload service logics
</commit_message>
<xml_diff>
--- a/docs/design_notes.docx
+++ b/docs/design_notes.docx
@@ -16,13 +16,7 @@
         <w:rPr>
           <w:rFonts w:ascii="SF Pro Text" w:hAnsi="SF Pro Text"/>
         </w:rPr>
-        <w:t>Quick</w:t>
-      </w:r>
-      <w:r>
-        <w:rPr>
-          <w:rFonts w:ascii="SF Pro Text" w:hAnsi="SF Pro Text"/>
-        </w:rPr>
-        <w:t>Share</w:t>
+        <w:t>QuickShare</w:t>
       </w:r>
     </w:p>
     <w:p>
@@ -63,15 +57,7 @@
           <w:i/>
           <w:iCs/>
         </w:rPr>
-        <w:t>Quick</w:t>
-      </w:r>
-      <w:r>
-        <w:rPr>
-          <w:rFonts w:ascii="SF Pro Text" w:hAnsi="SF Pro Text"/>
-          <w:i/>
-          <w:iCs/>
-        </w:rPr>
-        <w:t>Share is a peer-to-peer file sharing web app that allows users to transfer files directly between browsers using WebRTC. The Spring Boot backend acts solely as a signaling server, managing session creation and discovery. All file transfers occur over encrypted P2P data channels, ensuring privacy and minimal server load.”</w:t>
+        <w:t>QuickShare is a peer-to-peer file sharing web app that allows users to transfer files directly between browsers using WebRTC. The Spring Boot backend acts solely as a signaling server, managing session creation and discovery. All file transfers occur over encrypted P2P data channels, ensuring privacy and minimal server load.”</w:t>
       </w:r>
     </w:p>
     <w:p>
@@ -1526,15 +1512,15 @@
         </w:tblCellMar>
       </w:tblPr>
       <w:tblGrid>
-        <w:gridCol w:w="2398"/>
-        <w:gridCol w:w="2419"/>
+        <w:gridCol w:w="2397"/>
+        <w:gridCol w:w="2420"/>
         <w:gridCol w:w="4821"/>
       </w:tblGrid>
       <w:tr>
         <w:trPr/>
         <w:tc>
           <w:tcPr>
-            <w:tcW w:w="2398" w:type="dxa"/>
+            <w:tcW w:w="2397" w:type="dxa"/>
             <w:tcBorders>
               <w:top w:val="single" w:sz="4" w:space="0" w:color="000000"/>
               <w:start w:val="single" w:sz="4" w:space="0" w:color="000000"/>
@@ -1560,7 +1546,7 @@
         </w:tc>
         <w:tc>
           <w:tcPr>
-            <w:tcW w:w="2419" w:type="dxa"/>
+            <w:tcW w:w="2420" w:type="dxa"/>
             <w:tcBorders>
               <w:top w:val="single" w:sz="4" w:space="0" w:color="000000"/>
               <w:start w:val="single" w:sz="4" w:space="0" w:color="000000"/>
@@ -1616,7 +1602,7 @@
         <w:trPr/>
         <w:tc>
           <w:tcPr>
-            <w:tcW w:w="2398" w:type="dxa"/>
+            <w:tcW w:w="2397" w:type="dxa"/>
             <w:tcBorders>
               <w:start w:val="single" w:sz="4" w:space="0" w:color="000000"/>
               <w:bottom w:val="single" w:sz="4" w:space="0" w:color="000000"/>
@@ -1641,7 +1627,7 @@
         </w:tc>
         <w:tc>
           <w:tcPr>
-            <w:tcW w:w="2419" w:type="dxa"/>
+            <w:tcW w:w="2420" w:type="dxa"/>
             <w:tcBorders>
               <w:start w:val="single" w:sz="4" w:space="0" w:color="000000"/>
               <w:bottom w:val="single" w:sz="4" w:space="0" w:color="000000"/>
@@ -1695,7 +1681,7 @@
         <w:trPr/>
         <w:tc>
           <w:tcPr>
-            <w:tcW w:w="2398" w:type="dxa"/>
+            <w:tcW w:w="2397" w:type="dxa"/>
             <w:tcBorders>
               <w:start w:val="single" w:sz="4" w:space="0" w:color="000000"/>
               <w:bottom w:val="single" w:sz="4" w:space="0" w:color="000000"/>
@@ -1720,7 +1706,7 @@
         </w:tc>
         <w:tc>
           <w:tcPr>
-            <w:tcW w:w="2419" w:type="dxa"/>
+            <w:tcW w:w="2420" w:type="dxa"/>
             <w:tcBorders>
               <w:start w:val="single" w:sz="4" w:space="0" w:color="000000"/>
               <w:bottom w:val="single" w:sz="4" w:space="0" w:color="000000"/>
@@ -1774,7 +1760,7 @@
         <w:trPr/>
         <w:tc>
           <w:tcPr>
-            <w:tcW w:w="2398" w:type="dxa"/>
+            <w:tcW w:w="2397" w:type="dxa"/>
             <w:tcBorders>
               <w:start w:val="single" w:sz="4" w:space="0" w:color="000000"/>
               <w:bottom w:val="single" w:sz="4" w:space="0" w:color="000000"/>
@@ -1799,7 +1785,7 @@
         </w:tc>
         <w:tc>
           <w:tcPr>
-            <w:tcW w:w="2419" w:type="dxa"/>
+            <w:tcW w:w="2420" w:type="dxa"/>
             <w:tcBorders>
               <w:start w:val="single" w:sz="4" w:space="0" w:color="000000"/>
               <w:bottom w:val="single" w:sz="4" w:space="0" w:color="000000"/>
@@ -1853,7 +1839,7 @@
         <w:trPr/>
         <w:tc>
           <w:tcPr>
-            <w:tcW w:w="2398" w:type="dxa"/>
+            <w:tcW w:w="2397" w:type="dxa"/>
             <w:tcBorders>
               <w:start w:val="single" w:sz="4" w:space="0" w:color="000000"/>
               <w:bottom w:val="single" w:sz="4" w:space="0" w:color="000000"/>
@@ -1878,7 +1864,7 @@
         </w:tc>
         <w:tc>
           <w:tcPr>
-            <w:tcW w:w="2419" w:type="dxa"/>
+            <w:tcW w:w="2420" w:type="dxa"/>
             <w:tcBorders>
               <w:start w:val="single" w:sz="4" w:space="0" w:color="000000"/>
               <w:bottom w:val="single" w:sz="4" w:space="0" w:color="000000"/>
@@ -1932,7 +1918,7 @@
         <w:trPr/>
         <w:tc>
           <w:tcPr>
-            <w:tcW w:w="2398" w:type="dxa"/>
+            <w:tcW w:w="2397" w:type="dxa"/>
             <w:tcBorders>
               <w:start w:val="single" w:sz="4" w:space="0" w:color="000000"/>
               <w:bottom w:val="single" w:sz="4" w:space="0" w:color="000000"/>
@@ -1957,7 +1943,7 @@
         </w:tc>
         <w:tc>
           <w:tcPr>
-            <w:tcW w:w="2419" w:type="dxa"/>
+            <w:tcW w:w="2420" w:type="dxa"/>
             <w:tcBorders>
               <w:start w:val="single" w:sz="4" w:space="0" w:color="000000"/>
               <w:bottom w:val="single" w:sz="4" w:space="0" w:color="000000"/>
@@ -2011,7 +1997,7 @@
         <w:trPr/>
         <w:tc>
           <w:tcPr>
-            <w:tcW w:w="2398" w:type="dxa"/>
+            <w:tcW w:w="2397" w:type="dxa"/>
             <w:tcBorders>
               <w:start w:val="single" w:sz="4" w:space="0" w:color="000000"/>
               <w:bottom w:val="single" w:sz="4" w:space="0" w:color="000000"/>
@@ -2036,7 +2022,7 @@
         </w:tc>
         <w:tc>
           <w:tcPr>
-            <w:tcW w:w="2419" w:type="dxa"/>
+            <w:tcW w:w="2420" w:type="dxa"/>
             <w:tcBorders>
               <w:start w:val="single" w:sz="4" w:space="0" w:color="000000"/>
               <w:bottom w:val="single" w:sz="4" w:space="0" w:color="000000"/>
@@ -2090,7 +2076,7 @@
         <w:trPr/>
         <w:tc>
           <w:tcPr>
-            <w:tcW w:w="2398" w:type="dxa"/>
+            <w:tcW w:w="2397" w:type="dxa"/>
             <w:tcBorders>
               <w:start w:val="single" w:sz="4" w:space="0" w:color="000000"/>
               <w:bottom w:val="single" w:sz="4" w:space="0" w:color="000000"/>
@@ -2115,7 +2101,7 @@
         </w:tc>
         <w:tc>
           <w:tcPr>
-            <w:tcW w:w="2419" w:type="dxa"/>
+            <w:tcW w:w="2420" w:type="dxa"/>
             <w:tcBorders>
               <w:start w:val="single" w:sz="4" w:space="0" w:color="000000"/>
               <w:bottom w:val="single" w:sz="4" w:space="0" w:color="000000"/>
@@ -8871,8 +8857,8 @@
         <w:gridCol w:w="1255"/>
         <w:gridCol w:w="1272"/>
         <w:gridCol w:w="1255"/>
-        <w:gridCol w:w="1260"/>
-        <w:gridCol w:w="1534"/>
+        <w:gridCol w:w="1261"/>
+        <w:gridCol w:w="1533"/>
       </w:tblGrid>
       <w:tr>
         <w:trPr/>
@@ -8998,7 +8984,7 @@
         </w:tc>
         <w:tc>
           <w:tcPr>
-            <w:tcW w:w="1260" w:type="dxa"/>
+            <w:tcW w:w="1261" w:type="dxa"/>
             <w:tcBorders>
               <w:top w:val="single" w:sz="4" w:space="0" w:color="000000"/>
               <w:start w:val="single" w:sz="4" w:space="0" w:color="000000"/>
@@ -9022,7 +9008,7 @@
         </w:tc>
         <w:tc>
           <w:tcPr>
-            <w:tcW w:w="1534" w:type="dxa"/>
+            <w:tcW w:w="1533" w:type="dxa"/>
             <w:tcBorders>
               <w:top w:val="single" w:sz="4" w:space="0" w:color="000000"/>
               <w:start w:val="single" w:sz="4" w:space="0" w:color="000000"/>
@@ -9167,7 +9153,7 @@
         </w:tc>
         <w:tc>
           <w:tcPr>
-            <w:tcW w:w="1260" w:type="dxa"/>
+            <w:tcW w:w="1261" w:type="dxa"/>
             <w:tcBorders>
               <w:start w:val="single" w:sz="4" w:space="0" w:color="000000"/>
               <w:bottom w:val="single" w:sz="4" w:space="0" w:color="000000"/>
@@ -9190,7 +9176,7 @@
         </w:tc>
         <w:tc>
           <w:tcPr>
-            <w:tcW w:w="1534" w:type="dxa"/>
+            <w:tcW w:w="1533" w:type="dxa"/>
             <w:tcBorders>
               <w:start w:val="single" w:sz="4" w:space="0" w:color="000000"/>
               <w:bottom w:val="single" w:sz="4" w:space="0" w:color="000000"/>
@@ -9334,7 +9320,7 @@
         </w:tc>
         <w:tc>
           <w:tcPr>
-            <w:tcW w:w="1260" w:type="dxa"/>
+            <w:tcW w:w="1261" w:type="dxa"/>
             <w:tcBorders>
               <w:start w:val="single" w:sz="4" w:space="0" w:color="000000"/>
               <w:bottom w:val="single" w:sz="4" w:space="0" w:color="000000"/>
@@ -9357,7 +9343,7 @@
         </w:tc>
         <w:tc>
           <w:tcPr>
-            <w:tcW w:w="1534" w:type="dxa"/>
+            <w:tcW w:w="1533" w:type="dxa"/>
             <w:tcBorders>
               <w:start w:val="single" w:sz="4" w:space="0" w:color="000000"/>
               <w:bottom w:val="single" w:sz="4" w:space="0" w:color="000000"/>
@@ -9501,7 +9487,7 @@
         </w:tc>
         <w:tc>
           <w:tcPr>
-            <w:tcW w:w="1260" w:type="dxa"/>
+            <w:tcW w:w="1261" w:type="dxa"/>
             <w:tcBorders>
               <w:start w:val="single" w:sz="4" w:space="0" w:color="000000"/>
               <w:bottom w:val="single" w:sz="4" w:space="0" w:color="000000"/>
@@ -9524,7 +9510,7 @@
         </w:tc>
         <w:tc>
           <w:tcPr>
-            <w:tcW w:w="1534" w:type="dxa"/>
+            <w:tcW w:w="1533" w:type="dxa"/>
             <w:tcBorders>
               <w:start w:val="single" w:sz="4" w:space="0" w:color="000000"/>
               <w:bottom w:val="single" w:sz="4" w:space="0" w:color="000000"/>
@@ -9668,7 +9654,7 @@
         </w:tc>
         <w:tc>
           <w:tcPr>
-            <w:tcW w:w="1260" w:type="dxa"/>
+            <w:tcW w:w="1261" w:type="dxa"/>
             <w:tcBorders>
               <w:start w:val="single" w:sz="4" w:space="0" w:color="000000"/>
               <w:bottom w:val="single" w:sz="4" w:space="0" w:color="000000"/>
@@ -9691,7 +9677,7 @@
         </w:tc>
         <w:tc>
           <w:tcPr>
-            <w:tcW w:w="1534" w:type="dxa"/>
+            <w:tcW w:w="1533" w:type="dxa"/>
             <w:tcBorders>
               <w:start w:val="single" w:sz="4" w:space="0" w:color="000000"/>
               <w:bottom w:val="single" w:sz="4" w:space="0" w:color="000000"/>
@@ -9900,10 +9886,15 @@
     <w:p>
       <w:pPr>
         <w:pStyle w:val="Heading3"/>
-        <w:rPr/>
-      </w:pPr>
-      <w:r>
-        <w:rPr/>
+        <w:ind w:hanging="0" w:start="0"/>
+        <w:rPr>
+          <w:rFonts w:ascii="SF Pro Text" w:hAnsi="SF Pro Text"/>
+        </w:rPr>
+      </w:pPr>
+      <w:r>
+        <w:rPr>
+          <w:rFonts w:ascii="SF Pro Text" w:hAnsi="SF Pro Text"/>
+        </w:rPr>
         <w:t>How different user sessions are handled</w:t>
       </w:r>
     </w:p>
@@ -10179,6 +10170,7 @@
     <w:p>
       <w:pPr>
         <w:pStyle w:val="Heading2"/>
+        <w:spacing w:before="0" w:after="120"/>
         <w:ind w:hanging="0" w:start="0"/>
         <w:rPr>
           <w:rFonts w:ascii="SF Pro Text" w:hAnsi="SF Pro Text"/>
@@ -10262,12 +10254,15 @@
                           <w:p>
                             <w:pPr>
                               <w:pStyle w:val="FrameContents"/>
-                              <w:overflowPunct w:val="false"/>
-                              <w:rPr/>
+                              <w:overflowPunct w:val="true"/>
+                              <w:rPr>
+                                <w:color w:val="000000"/>
+                              </w:rPr>
                             </w:pPr>
                             <w:r>
                               <w:rPr>
                                 <w:rFonts w:ascii="Monospace" w:hAnsi="Monospace"/>
+                                <w:color w:val="000000"/>
                                 <w:sz w:val="20"/>
                                 <w:szCs w:val="20"/>
                               </w:rPr>
@@ -10277,12 +10272,15 @@
                           <w:p>
                             <w:pPr>
                               <w:pStyle w:val="FrameContents"/>
-                              <w:overflowPunct w:val="false"/>
-                              <w:rPr/>
+                              <w:overflowPunct w:val="true"/>
+                              <w:rPr>
+                                <w:color w:val="000000"/>
+                              </w:rPr>
                             </w:pPr>
                             <w:r>
                               <w:rPr>
                                 <w:rFonts w:ascii="Monospace" w:hAnsi="Monospace"/>
+                                <w:color w:val="000000"/>
                                 <w:sz w:val="20"/>
                                 <w:szCs w:val="20"/>
                               </w:rPr>
@@ -10291,6 +10289,7 @@
                             <w:r>
                               <w:rPr>
                                 <w:rFonts w:ascii="Monospace" w:hAnsi="Monospace"/>
+                                <w:color w:val="000000"/>
                                 <w:sz w:val="20"/>
                                 <w:szCs w:val="20"/>
                               </w:rPr>
@@ -10300,12 +10299,15 @@
                           <w:p>
                             <w:pPr>
                               <w:pStyle w:val="FrameContents"/>
-                              <w:overflowPunct w:val="false"/>
-                              <w:rPr/>
+                              <w:overflowPunct w:val="true"/>
+                              <w:rPr>
+                                <w:color w:val="000000"/>
+                              </w:rPr>
                             </w:pPr>
                             <w:r>
                               <w:rPr>
                                 <w:rFonts w:ascii="Monospace" w:hAnsi="Monospace"/>
+                                <w:color w:val="000000"/>
                                 <w:sz w:val="20"/>
                                 <w:szCs w:val="20"/>
                               </w:rPr>
@@ -10314,6 +10316,7 @@
                             <w:r>
                               <w:rPr>
                                 <w:rFonts w:ascii="Monospace" w:hAnsi="Monospace"/>
+                                <w:color w:val="000000"/>
                                 <w:sz w:val="20"/>
                                 <w:szCs w:val="20"/>
                               </w:rPr>
@@ -10323,12 +10326,15 @@
                           <w:p>
                             <w:pPr>
                               <w:pStyle w:val="FrameContents"/>
-                              <w:overflowPunct w:val="false"/>
-                              <w:rPr/>
+                              <w:overflowPunct w:val="true"/>
+                              <w:rPr>
+                                <w:color w:val="000000"/>
+                              </w:rPr>
                             </w:pPr>
                             <w:r>
                               <w:rPr>
                                 <w:rFonts w:ascii="Monospace" w:hAnsi="Monospace"/>
+                                <w:color w:val="000000"/>
                                 <w:sz w:val="20"/>
                                 <w:szCs w:val="20"/>
                               </w:rPr>
@@ -10337,6 +10343,7 @@
                             <w:r>
                               <w:rPr>
                                 <w:rFonts w:ascii="Monospace" w:hAnsi="Monospace"/>
+                                <w:color w:val="000000"/>
                                 <w:sz w:val="20"/>
                                 <w:szCs w:val="20"/>
                               </w:rPr>
@@ -10346,12 +10353,15 @@
                           <w:p>
                             <w:pPr>
                               <w:pStyle w:val="FrameContents"/>
-                              <w:overflowPunct w:val="false"/>
-                              <w:rPr/>
+                              <w:overflowPunct w:val="true"/>
+                              <w:rPr>
+                                <w:color w:val="000000"/>
+                              </w:rPr>
                             </w:pPr>
                             <w:r>
                               <w:rPr>
                                 <w:rFonts w:ascii="Monospace" w:hAnsi="Monospace"/>
+                                <w:color w:val="000000"/>
                                 <w:sz w:val="20"/>
                                 <w:szCs w:val="20"/>
                               </w:rPr>
@@ -10360,6 +10370,7 @@
                             <w:r>
                               <w:rPr>
                                 <w:rFonts w:ascii="Monospace" w:hAnsi="Monospace"/>
+                                <w:color w:val="000000"/>
                                 <w:sz w:val="20"/>
                                 <w:szCs w:val="20"/>
                               </w:rPr>
@@ -10369,12 +10380,15 @@
                           <w:p>
                             <w:pPr>
                               <w:pStyle w:val="FrameContents"/>
-                              <w:overflowPunct w:val="false"/>
-                              <w:rPr/>
+                              <w:overflowPunct w:val="true"/>
+                              <w:rPr>
+                                <w:color w:val="000000"/>
+                              </w:rPr>
                             </w:pPr>
                             <w:r>
                               <w:rPr>
                                 <w:rFonts w:ascii="Monospace" w:hAnsi="Monospace"/>
+                                <w:color w:val="000000"/>
                                 <w:sz w:val="20"/>
                                 <w:szCs w:val="20"/>
                               </w:rPr>
@@ -10383,6 +10397,7 @@
                             <w:r>
                               <w:rPr>
                                 <w:rFonts w:ascii="Monospace" w:hAnsi="Monospace"/>
+                                <w:color w:val="000000"/>
                                 <w:sz w:val="20"/>
                                 <w:szCs w:val="20"/>
                               </w:rPr>
@@ -10392,12 +10407,15 @@
                           <w:p>
                             <w:pPr>
                               <w:pStyle w:val="FrameContents"/>
-                              <w:overflowPunct w:val="false"/>
-                              <w:rPr/>
+                              <w:overflowPunct w:val="true"/>
+                              <w:rPr>
+                                <w:color w:val="000000"/>
+                              </w:rPr>
                             </w:pPr>
                             <w:r>
                               <w:rPr>
                                 <w:rFonts w:ascii="Monospace" w:hAnsi="Monospace"/>
+                                <w:color w:val="000000"/>
                                 <w:sz w:val="20"/>
                                 <w:szCs w:val="20"/>
                               </w:rPr>
@@ -10406,6 +10424,7 @@
                             <w:r>
                               <w:rPr>
                                 <w:rFonts w:ascii="Monospace" w:hAnsi="Monospace"/>
+                                <w:color w:val="000000"/>
                                 <w:sz w:val="20"/>
                                 <w:szCs w:val="20"/>
                               </w:rPr>
@@ -10415,12 +10434,15 @@
                           <w:p>
                             <w:pPr>
                               <w:pStyle w:val="FrameContents"/>
-                              <w:overflowPunct w:val="false"/>
-                              <w:rPr/>
+                              <w:overflowPunct w:val="true"/>
+                              <w:rPr>
+                                <w:color w:val="000000"/>
+                              </w:rPr>
                             </w:pPr>
                             <w:r>
                               <w:rPr>
                                 <w:rFonts w:ascii="Monospace" w:hAnsi="Monospace"/>
+                                <w:color w:val="000000"/>
                                 <w:sz w:val="20"/>
                                 <w:szCs w:val="20"/>
                               </w:rPr>
@@ -10429,6 +10451,7 @@
                             <w:r>
                               <w:rPr>
                                 <w:rFonts w:ascii="Monospace" w:hAnsi="Monospace"/>
+                                <w:color w:val="000000"/>
                                 <w:sz w:val="20"/>
                                 <w:szCs w:val="20"/>
                               </w:rPr>
@@ -10438,11 +10461,15 @@
                           <w:p>
                             <w:pPr>
                               <w:pStyle w:val="FrameContents"/>
-                              <w:overflowPunct w:val="false"/>
-                              <w:rPr/>
+                              <w:overflowPunct w:val="true"/>
+                              <w:rPr>
+                                <w:color w:val="000000"/>
+                              </w:rPr>
                             </w:pPr>
                             <w:r>
-                              <w:rPr/>
+                              <w:rPr>
+                                <w:color w:val="000000"/>
+                              </w:rPr>
                             </w:r>
                           </w:p>
                         </w:txbxContent>
@@ -10466,12 +10493,15 @@
                     <w:p>
                       <w:pPr>
                         <w:pStyle w:val="FrameContents"/>
-                        <w:overflowPunct w:val="false"/>
-                        <w:rPr/>
+                        <w:overflowPunct w:val="true"/>
+                        <w:rPr>
+                          <w:color w:val="000000"/>
+                        </w:rPr>
                       </w:pPr>
                       <w:r>
                         <w:rPr>
                           <w:rFonts w:ascii="Monospace" w:hAnsi="Monospace"/>
+                          <w:color w:val="000000"/>
                           <w:sz w:val="20"/>
                           <w:szCs w:val="20"/>
                         </w:rPr>
@@ -10481,12 +10511,15 @@
                     <w:p>
                       <w:pPr>
                         <w:pStyle w:val="FrameContents"/>
-                        <w:overflowPunct w:val="false"/>
-                        <w:rPr/>
+                        <w:overflowPunct w:val="true"/>
+                        <w:rPr>
+                          <w:color w:val="000000"/>
+                        </w:rPr>
                       </w:pPr>
                       <w:r>
                         <w:rPr>
                           <w:rFonts w:ascii="Monospace" w:hAnsi="Monospace"/>
+                          <w:color w:val="000000"/>
                           <w:sz w:val="20"/>
                           <w:szCs w:val="20"/>
                         </w:rPr>
@@ -10495,6 +10528,7 @@
                       <w:r>
                         <w:rPr>
                           <w:rFonts w:ascii="Monospace" w:hAnsi="Monospace"/>
+                          <w:color w:val="000000"/>
                           <w:sz w:val="20"/>
                           <w:szCs w:val="20"/>
                         </w:rPr>
@@ -10504,12 +10538,15 @@
                     <w:p>
                       <w:pPr>
                         <w:pStyle w:val="FrameContents"/>
-                        <w:overflowPunct w:val="false"/>
-                        <w:rPr/>
+                        <w:overflowPunct w:val="true"/>
+                        <w:rPr>
+                          <w:color w:val="000000"/>
+                        </w:rPr>
                       </w:pPr>
                       <w:r>
                         <w:rPr>
                           <w:rFonts w:ascii="Monospace" w:hAnsi="Monospace"/>
+                          <w:color w:val="000000"/>
                           <w:sz w:val="20"/>
                           <w:szCs w:val="20"/>
                         </w:rPr>
@@ -10518,6 +10555,7 @@
                       <w:r>
                         <w:rPr>
                           <w:rFonts w:ascii="Monospace" w:hAnsi="Monospace"/>
+                          <w:color w:val="000000"/>
                           <w:sz w:val="20"/>
                           <w:szCs w:val="20"/>
                         </w:rPr>
@@ -10527,12 +10565,15 @@
                     <w:p>
                       <w:pPr>
                         <w:pStyle w:val="FrameContents"/>
-                        <w:overflowPunct w:val="false"/>
-                        <w:rPr/>
+                        <w:overflowPunct w:val="true"/>
+                        <w:rPr>
+                          <w:color w:val="000000"/>
+                        </w:rPr>
                       </w:pPr>
                       <w:r>
                         <w:rPr>
                           <w:rFonts w:ascii="Monospace" w:hAnsi="Monospace"/>
+                          <w:color w:val="000000"/>
                           <w:sz w:val="20"/>
                           <w:szCs w:val="20"/>
                         </w:rPr>
@@ -10541,6 +10582,7 @@
                       <w:r>
                         <w:rPr>
                           <w:rFonts w:ascii="Monospace" w:hAnsi="Monospace"/>
+                          <w:color w:val="000000"/>
                           <w:sz w:val="20"/>
                           <w:szCs w:val="20"/>
                         </w:rPr>
@@ -10550,12 +10592,15 @@
                     <w:p>
                       <w:pPr>
                         <w:pStyle w:val="FrameContents"/>
-                        <w:overflowPunct w:val="false"/>
-                        <w:rPr/>
+                        <w:overflowPunct w:val="true"/>
+                        <w:rPr>
+                          <w:color w:val="000000"/>
+                        </w:rPr>
                       </w:pPr>
                       <w:r>
                         <w:rPr>
                           <w:rFonts w:ascii="Monospace" w:hAnsi="Monospace"/>
+                          <w:color w:val="000000"/>
                           <w:sz w:val="20"/>
                           <w:szCs w:val="20"/>
                         </w:rPr>
@@ -10564,6 +10609,7 @@
                       <w:r>
                         <w:rPr>
                           <w:rFonts w:ascii="Monospace" w:hAnsi="Monospace"/>
+                          <w:color w:val="000000"/>
                           <w:sz w:val="20"/>
                           <w:szCs w:val="20"/>
                         </w:rPr>
@@ -10573,12 +10619,15 @@
                     <w:p>
                       <w:pPr>
                         <w:pStyle w:val="FrameContents"/>
-                        <w:overflowPunct w:val="false"/>
-                        <w:rPr/>
+                        <w:overflowPunct w:val="true"/>
+                        <w:rPr>
+                          <w:color w:val="000000"/>
+                        </w:rPr>
                       </w:pPr>
                       <w:r>
                         <w:rPr>
                           <w:rFonts w:ascii="Monospace" w:hAnsi="Monospace"/>
+                          <w:color w:val="000000"/>
                           <w:sz w:val="20"/>
                           <w:szCs w:val="20"/>
                         </w:rPr>
@@ -10587,6 +10636,7 @@
                       <w:r>
                         <w:rPr>
                           <w:rFonts w:ascii="Monospace" w:hAnsi="Monospace"/>
+                          <w:color w:val="000000"/>
                           <w:sz w:val="20"/>
                           <w:szCs w:val="20"/>
                         </w:rPr>
@@ -10596,12 +10646,15 @@
                     <w:p>
                       <w:pPr>
                         <w:pStyle w:val="FrameContents"/>
-                        <w:overflowPunct w:val="false"/>
-                        <w:rPr/>
+                        <w:overflowPunct w:val="true"/>
+                        <w:rPr>
+                          <w:color w:val="000000"/>
+                        </w:rPr>
                       </w:pPr>
                       <w:r>
                         <w:rPr>
                           <w:rFonts w:ascii="Monospace" w:hAnsi="Monospace"/>
+                          <w:color w:val="000000"/>
                           <w:sz w:val="20"/>
                           <w:szCs w:val="20"/>
                         </w:rPr>
@@ -10610,6 +10663,7 @@
                       <w:r>
                         <w:rPr>
                           <w:rFonts w:ascii="Monospace" w:hAnsi="Monospace"/>
+                          <w:color w:val="000000"/>
                           <w:sz w:val="20"/>
                           <w:szCs w:val="20"/>
                         </w:rPr>
@@ -10619,12 +10673,15 @@
                     <w:p>
                       <w:pPr>
                         <w:pStyle w:val="FrameContents"/>
-                        <w:overflowPunct w:val="false"/>
-                        <w:rPr/>
+                        <w:overflowPunct w:val="true"/>
+                        <w:rPr>
+                          <w:color w:val="000000"/>
+                        </w:rPr>
                       </w:pPr>
                       <w:r>
                         <w:rPr>
                           <w:rFonts w:ascii="Monospace" w:hAnsi="Monospace"/>
+                          <w:color w:val="000000"/>
                           <w:sz w:val="20"/>
                           <w:szCs w:val="20"/>
                         </w:rPr>
@@ -10633,6 +10690,7 @@
                       <w:r>
                         <w:rPr>
                           <w:rFonts w:ascii="Monospace" w:hAnsi="Monospace"/>
+                          <w:color w:val="000000"/>
                           <w:sz w:val="20"/>
                           <w:szCs w:val="20"/>
                         </w:rPr>
@@ -10642,11 +10700,15 @@
                     <w:p>
                       <w:pPr>
                         <w:pStyle w:val="FrameContents"/>
-                        <w:overflowPunct w:val="false"/>
-                        <w:rPr/>
+                        <w:overflowPunct w:val="true"/>
+                        <w:rPr>
+                          <w:color w:val="000000"/>
+                        </w:rPr>
                       </w:pPr>
                       <w:r>
-                        <w:rPr/>
+                        <w:rPr>
+                          <w:color w:val="000000"/>
+                        </w:rPr>
                       </w:r>
                     </w:p>
                   </w:txbxContent>
@@ -10794,12 +10856,15 @@
                           <w:p>
                             <w:pPr>
                               <w:pStyle w:val="FrameContents"/>
-                              <w:overflowPunct w:val="false"/>
-                              <w:rPr/>
+                              <w:overflowPunct w:val="true"/>
+                              <w:rPr>
+                                <w:color w:val="000000"/>
+                              </w:rPr>
                             </w:pPr>
                             <w:r>
                               <w:rPr>
                                 <w:rFonts w:ascii="Monospace" w:hAnsi="Monospace"/>
+                                <w:color w:val="000000"/>
                                 <w:sz w:val="20"/>
                                 <w:szCs w:val="20"/>
                               </w:rPr>
@@ -10809,12 +10874,15 @@
                           <w:p>
                             <w:pPr>
                               <w:pStyle w:val="FrameContents"/>
-                              <w:overflowPunct w:val="false"/>
-                              <w:rPr/>
+                              <w:overflowPunct w:val="true"/>
+                              <w:rPr>
+                                <w:color w:val="000000"/>
+                              </w:rPr>
                             </w:pPr>
                             <w:r>
                               <w:rPr>
                                 <w:rFonts w:ascii="Monospace" w:hAnsi="Monospace"/>
+                                <w:color w:val="000000"/>
                                 <w:sz w:val="20"/>
                                 <w:szCs w:val="20"/>
                               </w:rPr>
@@ -10823,6 +10891,7 @@
                             <w:r>
                               <w:rPr>
                                 <w:rFonts w:ascii="Monospace" w:hAnsi="Monospace"/>
+                                <w:color w:val="000000"/>
                                 <w:sz w:val="20"/>
                                 <w:szCs w:val="20"/>
                               </w:rPr>
@@ -10832,12 +10901,15 @@
                           <w:p>
                             <w:pPr>
                               <w:pStyle w:val="FrameContents"/>
-                              <w:overflowPunct w:val="false"/>
-                              <w:rPr/>
+                              <w:overflowPunct w:val="true"/>
+                              <w:rPr>
+                                <w:color w:val="000000"/>
+                              </w:rPr>
                             </w:pPr>
                             <w:r>
                               <w:rPr>
                                 <w:rFonts w:ascii="Monospace" w:hAnsi="Monospace"/>
+                                <w:color w:val="000000"/>
                                 <w:sz w:val="20"/>
                                 <w:szCs w:val="20"/>
                               </w:rPr>
@@ -10846,6 +10918,7 @@
                             <w:r>
                               <w:rPr>
                                 <w:rFonts w:ascii="Monospace" w:hAnsi="Monospace"/>
+                                <w:color w:val="000000"/>
                                 <w:sz w:val="20"/>
                                 <w:szCs w:val="20"/>
                               </w:rPr>
@@ -10855,12 +10928,15 @@
                           <w:p>
                             <w:pPr>
                               <w:pStyle w:val="FrameContents"/>
-                              <w:overflowPunct w:val="false"/>
-                              <w:rPr/>
+                              <w:overflowPunct w:val="true"/>
+                              <w:rPr>
+                                <w:color w:val="000000"/>
+                              </w:rPr>
                             </w:pPr>
                             <w:r>
                               <w:rPr>
                                 <w:rFonts w:ascii="Monospace" w:hAnsi="Monospace"/>
+                                <w:color w:val="000000"/>
                                 <w:sz w:val="20"/>
                                 <w:szCs w:val="20"/>
                               </w:rPr>
@@ -10869,6 +10945,7 @@
                             <w:r>
                               <w:rPr>
                                 <w:rFonts w:ascii="Monospace" w:hAnsi="Monospace"/>
+                                <w:color w:val="000000"/>
                                 <w:sz w:val="20"/>
                                 <w:szCs w:val="20"/>
                               </w:rPr>
@@ -10878,12 +10955,15 @@
                           <w:p>
                             <w:pPr>
                               <w:pStyle w:val="FrameContents"/>
-                              <w:overflowPunct w:val="false"/>
-                              <w:rPr/>
+                              <w:overflowPunct w:val="true"/>
+                              <w:rPr>
+                                <w:color w:val="000000"/>
+                              </w:rPr>
                             </w:pPr>
                             <w:r>
                               <w:rPr>
                                 <w:rFonts w:ascii="Monospace" w:hAnsi="Monospace"/>
+                                <w:color w:val="000000"/>
                                 <w:sz w:val="20"/>
                                 <w:szCs w:val="20"/>
                               </w:rPr>
@@ -10892,6 +10972,7 @@
                             <w:r>
                               <w:rPr>
                                 <w:rFonts w:ascii="Monospace" w:hAnsi="Monospace"/>
+                                <w:color w:val="000000"/>
                                 <w:sz w:val="20"/>
                                 <w:szCs w:val="20"/>
                               </w:rPr>
@@ -10901,12 +10982,15 @@
                           <w:p>
                             <w:pPr>
                               <w:pStyle w:val="FrameContents"/>
-                              <w:overflowPunct w:val="false"/>
-                              <w:rPr/>
+                              <w:overflowPunct w:val="true"/>
+                              <w:rPr>
+                                <w:color w:val="000000"/>
+                              </w:rPr>
                             </w:pPr>
                             <w:r>
                               <w:rPr>
                                 <w:rFonts w:ascii="Monospace" w:hAnsi="Monospace"/>
+                                <w:color w:val="000000"/>
                                 <w:sz w:val="20"/>
                                 <w:szCs w:val="20"/>
                               </w:rPr>
@@ -10915,6 +10999,7 @@
                             <w:r>
                               <w:rPr>
                                 <w:rFonts w:ascii="Monospace" w:hAnsi="Monospace"/>
+                                <w:color w:val="000000"/>
                                 <w:sz w:val="20"/>
                                 <w:szCs w:val="20"/>
                               </w:rPr>
@@ -10942,12 +11027,15 @@
                     <w:p>
                       <w:pPr>
                         <w:pStyle w:val="FrameContents"/>
-                        <w:overflowPunct w:val="false"/>
-                        <w:rPr/>
+                        <w:overflowPunct w:val="true"/>
+                        <w:rPr>
+                          <w:color w:val="000000"/>
+                        </w:rPr>
                       </w:pPr>
                       <w:r>
                         <w:rPr>
                           <w:rFonts w:ascii="Monospace" w:hAnsi="Monospace"/>
+                          <w:color w:val="000000"/>
                           <w:sz w:val="20"/>
                           <w:szCs w:val="20"/>
                         </w:rPr>
@@ -10957,12 +11045,15 @@
                     <w:p>
                       <w:pPr>
                         <w:pStyle w:val="FrameContents"/>
-                        <w:overflowPunct w:val="false"/>
-                        <w:rPr/>
+                        <w:overflowPunct w:val="true"/>
+                        <w:rPr>
+                          <w:color w:val="000000"/>
+                        </w:rPr>
                       </w:pPr>
                       <w:r>
                         <w:rPr>
                           <w:rFonts w:ascii="Monospace" w:hAnsi="Monospace"/>
+                          <w:color w:val="000000"/>
                           <w:sz w:val="20"/>
                           <w:szCs w:val="20"/>
                         </w:rPr>
@@ -10971,6 +11062,7 @@
                       <w:r>
                         <w:rPr>
                           <w:rFonts w:ascii="Monospace" w:hAnsi="Monospace"/>
+                          <w:color w:val="000000"/>
                           <w:sz w:val="20"/>
                           <w:szCs w:val="20"/>
                         </w:rPr>
@@ -10980,12 +11072,15 @@
                     <w:p>
                       <w:pPr>
                         <w:pStyle w:val="FrameContents"/>
-                        <w:overflowPunct w:val="false"/>
-                        <w:rPr/>
+                        <w:overflowPunct w:val="true"/>
+                        <w:rPr>
+                          <w:color w:val="000000"/>
+                        </w:rPr>
                       </w:pPr>
                       <w:r>
                         <w:rPr>
                           <w:rFonts w:ascii="Monospace" w:hAnsi="Monospace"/>
+                          <w:color w:val="000000"/>
                           <w:sz w:val="20"/>
                           <w:szCs w:val="20"/>
                         </w:rPr>
@@ -10994,6 +11089,7 @@
                       <w:r>
                         <w:rPr>
                           <w:rFonts w:ascii="Monospace" w:hAnsi="Monospace"/>
+                          <w:color w:val="000000"/>
                           <w:sz w:val="20"/>
                           <w:szCs w:val="20"/>
                         </w:rPr>
@@ -11003,12 +11099,15 @@
                     <w:p>
                       <w:pPr>
                         <w:pStyle w:val="FrameContents"/>
-                        <w:overflowPunct w:val="false"/>
-                        <w:rPr/>
+                        <w:overflowPunct w:val="true"/>
+                        <w:rPr>
+                          <w:color w:val="000000"/>
+                        </w:rPr>
                       </w:pPr>
                       <w:r>
                         <w:rPr>
                           <w:rFonts w:ascii="Monospace" w:hAnsi="Monospace"/>
+                          <w:color w:val="000000"/>
                           <w:sz w:val="20"/>
                           <w:szCs w:val="20"/>
                         </w:rPr>
@@ -11017,6 +11116,7 @@
                       <w:r>
                         <w:rPr>
                           <w:rFonts w:ascii="Monospace" w:hAnsi="Monospace"/>
+                          <w:color w:val="000000"/>
                           <w:sz w:val="20"/>
                           <w:szCs w:val="20"/>
                         </w:rPr>
@@ -11026,12 +11126,15 @@
                     <w:p>
                       <w:pPr>
                         <w:pStyle w:val="FrameContents"/>
-                        <w:overflowPunct w:val="false"/>
-                        <w:rPr/>
+                        <w:overflowPunct w:val="true"/>
+                        <w:rPr>
+                          <w:color w:val="000000"/>
+                        </w:rPr>
                       </w:pPr>
                       <w:r>
                         <w:rPr>
                           <w:rFonts w:ascii="Monospace" w:hAnsi="Monospace"/>
+                          <w:color w:val="000000"/>
                           <w:sz w:val="20"/>
                           <w:szCs w:val="20"/>
                         </w:rPr>
@@ -11040,6 +11143,7 @@
                       <w:r>
                         <w:rPr>
                           <w:rFonts w:ascii="Monospace" w:hAnsi="Monospace"/>
+                          <w:color w:val="000000"/>
                           <w:sz w:val="20"/>
                           <w:szCs w:val="20"/>
                         </w:rPr>
@@ -11049,12 +11153,15 @@
                     <w:p>
                       <w:pPr>
                         <w:pStyle w:val="FrameContents"/>
-                        <w:overflowPunct w:val="false"/>
-                        <w:rPr/>
+                        <w:overflowPunct w:val="true"/>
+                        <w:rPr>
+                          <w:color w:val="000000"/>
+                        </w:rPr>
                       </w:pPr>
                       <w:r>
                         <w:rPr>
                           <w:rFonts w:ascii="Monospace" w:hAnsi="Monospace"/>
+                          <w:color w:val="000000"/>
                           <w:sz w:val="20"/>
                           <w:szCs w:val="20"/>
                         </w:rPr>
@@ -11063,6 +11170,7 @@
                       <w:r>
                         <w:rPr>
                           <w:rFonts w:ascii="Monospace" w:hAnsi="Monospace"/>
+                          <w:color w:val="000000"/>
                           <w:sz w:val="20"/>
                           <w:szCs w:val="20"/>
                         </w:rPr>
@@ -11201,22 +11309,29 @@
                           <w:p>
                             <w:pPr>
                               <w:pStyle w:val="FrameContents"/>
-                              <w:overflowPunct w:val="false"/>
-                              <w:rPr/>
+                              <w:overflowPunct w:val="true"/>
+                              <w:rPr>
+                                <w:color w:val="000000"/>
+                              </w:rPr>
                             </w:pPr>
                             <w:r>
-                              <w:rPr/>
+                              <w:rPr>
+                                <w:color w:val="000000"/>
+                              </w:rPr>
                             </w:r>
                           </w:p>
                           <w:p>
                             <w:pPr>
                               <w:pStyle w:val="FrameContents"/>
-                              <w:overflowPunct w:val="false"/>
-                              <w:rPr/>
+                              <w:overflowPunct w:val="true"/>
+                              <w:rPr>
+                                <w:color w:val="000000"/>
+                              </w:rPr>
                             </w:pPr>
                             <w:r>
                               <w:rPr>
                                 <w:rFonts w:ascii="Monospace" w:hAnsi="Monospace"/>
+                                <w:color w:val="000000"/>
                                 <w:sz w:val="20"/>
                                 <w:szCs w:val="20"/>
                               </w:rPr>
@@ -11226,11 +11341,15 @@
                           <w:p>
                             <w:pPr>
                               <w:pStyle w:val="FrameContents"/>
-                              <w:overflowPunct w:val="false"/>
-                              <w:rPr/>
+                              <w:overflowPunct w:val="true"/>
+                              <w:rPr>
+                                <w:color w:val="000000"/>
+                              </w:rPr>
                             </w:pPr>
                             <w:r>
-                              <w:rPr/>
+                              <w:rPr>
+                                <w:color w:val="000000"/>
+                              </w:rPr>
                             </w:r>
                           </w:p>
                         </w:txbxContent>
@@ -11254,22 +11373,29 @@
                     <w:p>
                       <w:pPr>
                         <w:pStyle w:val="FrameContents"/>
-                        <w:overflowPunct w:val="false"/>
-                        <w:rPr/>
+                        <w:overflowPunct w:val="true"/>
+                        <w:rPr>
+                          <w:color w:val="000000"/>
+                        </w:rPr>
                       </w:pPr>
                       <w:r>
-                        <w:rPr/>
+                        <w:rPr>
+                          <w:color w:val="000000"/>
+                        </w:rPr>
                       </w:r>
                     </w:p>
                     <w:p>
                       <w:pPr>
                         <w:pStyle w:val="FrameContents"/>
-                        <w:overflowPunct w:val="false"/>
-                        <w:rPr/>
+                        <w:overflowPunct w:val="true"/>
+                        <w:rPr>
+                          <w:color w:val="000000"/>
+                        </w:rPr>
                       </w:pPr>
                       <w:r>
                         <w:rPr>
                           <w:rFonts w:ascii="Monospace" w:hAnsi="Monospace"/>
+                          <w:color w:val="000000"/>
                           <w:sz w:val="20"/>
                           <w:szCs w:val="20"/>
                         </w:rPr>
@@ -11279,11 +11405,15 @@
                     <w:p>
                       <w:pPr>
                         <w:pStyle w:val="FrameContents"/>
-                        <w:overflowPunct w:val="false"/>
-                        <w:rPr/>
+                        <w:overflowPunct w:val="true"/>
+                        <w:rPr>
+                          <w:color w:val="000000"/>
+                        </w:rPr>
                       </w:pPr>
                       <w:r>
-                        <w:rPr/>
+                        <w:rPr>
+                          <w:color w:val="000000"/>
+                        </w:rPr>
                       </w:r>
                     </w:p>
                   </w:txbxContent>
@@ -11379,12 +11509,15 @@
                           <w:p>
                             <w:pPr>
                               <w:pStyle w:val="FrameContents"/>
-                              <w:overflowPunct w:val="false"/>
-                              <w:rPr/>
+                              <w:overflowPunct w:val="true"/>
+                              <w:rPr>
+                                <w:color w:val="000000"/>
+                              </w:rPr>
                             </w:pPr>
                             <w:r>
                               <w:rPr>
                                 <w:rFonts w:ascii="Monospace" w:hAnsi="Monospace"/>
+                                <w:color w:val="000000"/>
                                 <w:sz w:val="20"/>
                                 <w:szCs w:val="20"/>
                               </w:rPr>
@@ -11394,11 +11527,15 @@
                           <w:p>
                             <w:pPr>
                               <w:pStyle w:val="FrameContents"/>
-                              <w:overflowPunct w:val="false"/>
-                              <w:rPr/>
+                              <w:overflowPunct w:val="true"/>
+                              <w:rPr>
+                                <w:color w:val="000000"/>
+                              </w:rPr>
                             </w:pPr>
                             <w:r>
-                              <w:rPr/>
+                              <w:rPr>
+                                <w:color w:val="000000"/>
+                              </w:rPr>
                             </w:r>
                           </w:p>
                         </w:txbxContent>
@@ -11422,12 +11559,15 @@
                     <w:p>
                       <w:pPr>
                         <w:pStyle w:val="FrameContents"/>
-                        <w:overflowPunct w:val="false"/>
-                        <w:rPr/>
+                        <w:overflowPunct w:val="true"/>
+                        <w:rPr>
+                          <w:color w:val="000000"/>
+                        </w:rPr>
                       </w:pPr>
                       <w:r>
                         <w:rPr>
                           <w:rFonts w:ascii="Monospace" w:hAnsi="Monospace"/>
+                          <w:color w:val="000000"/>
                           <w:sz w:val="20"/>
                           <w:szCs w:val="20"/>
                         </w:rPr>
@@ -11437,11 +11577,15 @@
                     <w:p>
                       <w:pPr>
                         <w:pStyle w:val="FrameContents"/>
-                        <w:overflowPunct w:val="false"/>
-                        <w:rPr/>
+                        <w:overflowPunct w:val="true"/>
+                        <w:rPr>
+                          <w:color w:val="000000"/>
+                        </w:rPr>
                       </w:pPr>
                       <w:r>
-                        <w:rPr/>
+                        <w:rPr>
+                          <w:color w:val="000000"/>
+                        </w:rPr>
                       </w:r>
                     </w:p>
                   </w:txbxContent>
@@ -11550,12 +11694,15 @@
                           <w:p>
                             <w:pPr>
                               <w:pStyle w:val="FrameContents"/>
-                              <w:overflowPunct w:val="false"/>
-                              <w:rPr/>
+                              <w:overflowPunct w:val="true"/>
+                              <w:rPr>
+                                <w:color w:val="000000"/>
+                              </w:rPr>
                             </w:pPr>
                             <w:r>
                               <w:rPr>
                                 <w:rFonts w:ascii="Monospace" w:hAnsi="Monospace"/>
+                                <w:color w:val="000000"/>
                                 <w:sz w:val="20"/>
                                 <w:szCs w:val="20"/>
                               </w:rPr>
@@ -11565,11 +11712,15 @@
                           <w:p>
                             <w:pPr>
                               <w:pStyle w:val="FrameContents"/>
-                              <w:overflowPunct w:val="false"/>
-                              <w:rPr/>
+                              <w:overflowPunct w:val="true"/>
+                              <w:rPr>
+                                <w:color w:val="000000"/>
+                              </w:rPr>
                             </w:pPr>
                             <w:r>
-                              <w:rPr/>
+                              <w:rPr>
+                                <w:color w:val="000000"/>
+                              </w:rPr>
                             </w:r>
                           </w:p>
                         </w:txbxContent>
@@ -11593,12 +11744,15 @@
                     <w:p>
                       <w:pPr>
                         <w:pStyle w:val="FrameContents"/>
-                        <w:overflowPunct w:val="false"/>
-                        <w:rPr/>
+                        <w:overflowPunct w:val="true"/>
+                        <w:rPr>
+                          <w:color w:val="000000"/>
+                        </w:rPr>
                       </w:pPr>
                       <w:r>
                         <w:rPr>
                           <w:rFonts w:ascii="Monospace" w:hAnsi="Monospace"/>
+                          <w:color w:val="000000"/>
                           <w:sz w:val="20"/>
                           <w:szCs w:val="20"/>
                         </w:rPr>
@@ -11608,11 +11762,15 @@
                     <w:p>
                       <w:pPr>
                         <w:pStyle w:val="FrameContents"/>
-                        <w:overflowPunct w:val="false"/>
-                        <w:rPr/>
+                        <w:overflowPunct w:val="true"/>
+                        <w:rPr>
+                          <w:color w:val="000000"/>
+                        </w:rPr>
                       </w:pPr>
                       <w:r>
-                        <w:rPr/>
+                        <w:rPr>
+                          <w:color w:val="000000"/>
+                        </w:rPr>
                       </w:r>
                     </w:p>
                   </w:txbxContent>
@@ -11721,12 +11879,15 @@
                           <w:p>
                             <w:pPr>
                               <w:pStyle w:val="FrameContents"/>
-                              <w:overflowPunct w:val="false"/>
-                              <w:rPr/>
+                              <w:overflowPunct w:val="true"/>
+                              <w:rPr>
+                                <w:color w:val="000000"/>
+                              </w:rPr>
                             </w:pPr>
                             <w:r>
                               <w:rPr>
                                 <w:rFonts w:ascii="Monospace" w:hAnsi="Monospace"/>
+                                <w:color w:val="000000"/>
                                 <w:sz w:val="20"/>
                                 <w:szCs w:val="20"/>
                               </w:rPr>
@@ -11736,12 +11897,15 @@
                           <w:p>
                             <w:pPr>
                               <w:pStyle w:val="FrameContents"/>
-                              <w:overflowPunct w:val="false"/>
-                              <w:rPr/>
+                              <w:overflowPunct w:val="true"/>
+                              <w:rPr>
+                                <w:color w:val="000000"/>
+                              </w:rPr>
                             </w:pPr>
                             <w:r>
                               <w:rPr>
                                 <w:rFonts w:ascii="Monospace" w:hAnsi="Monospace"/>
+                                <w:color w:val="000000"/>
                                 <w:sz w:val="20"/>
                                 <w:szCs w:val="20"/>
                               </w:rPr>
@@ -11750,6 +11914,7 @@
                             <w:r>
                               <w:rPr>
                                 <w:rFonts w:ascii="Monospace" w:hAnsi="Monospace"/>
+                                <w:color w:val="000000"/>
                                 <w:sz w:val="20"/>
                                 <w:szCs w:val="20"/>
                               </w:rPr>
@@ -11759,11 +11924,15 @@
                           <w:p>
                             <w:pPr>
                               <w:pStyle w:val="FrameContents"/>
-                              <w:overflowPunct w:val="false"/>
-                              <w:rPr/>
+                              <w:overflowPunct w:val="true"/>
+                              <w:rPr>
+                                <w:color w:val="000000"/>
+                              </w:rPr>
                             </w:pPr>
                             <w:r>
-                              <w:rPr/>
+                              <w:rPr>
+                                <w:color w:val="000000"/>
+                              </w:rPr>
                             </w:r>
                           </w:p>
                         </w:txbxContent>
@@ -11787,12 +11956,15 @@
                     <w:p>
                       <w:pPr>
                         <w:pStyle w:val="FrameContents"/>
-                        <w:overflowPunct w:val="false"/>
-                        <w:rPr/>
+                        <w:overflowPunct w:val="true"/>
+                        <w:rPr>
+                          <w:color w:val="000000"/>
+                        </w:rPr>
                       </w:pPr>
                       <w:r>
                         <w:rPr>
                           <w:rFonts w:ascii="Monospace" w:hAnsi="Monospace"/>
+                          <w:color w:val="000000"/>
                           <w:sz w:val="20"/>
                           <w:szCs w:val="20"/>
                         </w:rPr>
@@ -11802,12 +11974,15 @@
                     <w:p>
                       <w:pPr>
                         <w:pStyle w:val="FrameContents"/>
-                        <w:overflowPunct w:val="false"/>
-                        <w:rPr/>
+                        <w:overflowPunct w:val="true"/>
+                        <w:rPr>
+                          <w:color w:val="000000"/>
+                        </w:rPr>
                       </w:pPr>
                       <w:r>
                         <w:rPr>
                           <w:rFonts w:ascii="Monospace" w:hAnsi="Monospace"/>
+                          <w:color w:val="000000"/>
                           <w:sz w:val="20"/>
                           <w:szCs w:val="20"/>
                         </w:rPr>
@@ -11816,6 +11991,7 @@
                       <w:r>
                         <w:rPr>
                           <w:rFonts w:ascii="Monospace" w:hAnsi="Monospace"/>
+                          <w:color w:val="000000"/>
                           <w:sz w:val="20"/>
                           <w:szCs w:val="20"/>
                         </w:rPr>
@@ -11825,11 +12001,15 @@
                     <w:p>
                       <w:pPr>
                         <w:pStyle w:val="FrameContents"/>
-                        <w:overflowPunct w:val="false"/>
-                        <w:rPr/>
+                        <w:overflowPunct w:val="true"/>
+                        <w:rPr>
+                          <w:color w:val="000000"/>
+                        </w:rPr>
                       </w:pPr>
                       <w:r>
-                        <w:rPr/>
+                        <w:rPr>
+                          <w:color w:val="000000"/>
+                        </w:rPr>
                       </w:r>
                     </w:p>
                   </w:txbxContent>
@@ -11938,12 +12118,15 @@
                           <w:p>
                             <w:pPr>
                               <w:pStyle w:val="FrameContents"/>
-                              <w:overflowPunct w:val="false"/>
-                              <w:rPr/>
+                              <w:overflowPunct w:val="true"/>
+                              <w:rPr>
+                                <w:color w:val="000000"/>
+                              </w:rPr>
                             </w:pPr>
                             <w:r>
                               <w:rPr>
                                 <w:rFonts w:ascii="Monospace" w:hAnsi="Monospace"/>
+                                <w:color w:val="000000"/>
                                 <w:sz w:val="20"/>
                                 <w:szCs w:val="20"/>
                               </w:rPr>
@@ -11953,12 +12136,15 @@
                           <w:p>
                             <w:pPr>
                               <w:pStyle w:val="FrameContents"/>
-                              <w:overflowPunct w:val="false"/>
-                              <w:rPr/>
+                              <w:overflowPunct w:val="true"/>
+                              <w:rPr>
+                                <w:color w:val="000000"/>
+                              </w:rPr>
                             </w:pPr>
                             <w:r>
                               <w:rPr>
                                 <w:rFonts w:ascii="Monospace" w:hAnsi="Monospace"/>
+                                <w:color w:val="000000"/>
                                 <w:sz w:val="20"/>
                                 <w:szCs w:val="20"/>
                               </w:rPr>
@@ -11967,6 +12153,7 @@
                             <w:r>
                               <w:rPr>
                                 <w:rFonts w:ascii="Monospace" w:hAnsi="Monospace"/>
+                                <w:color w:val="000000"/>
                                 <w:sz w:val="20"/>
                                 <w:szCs w:val="20"/>
                               </w:rPr>
@@ -11976,11 +12163,15 @@
                           <w:p>
                             <w:pPr>
                               <w:pStyle w:val="FrameContents"/>
-                              <w:overflowPunct w:val="false"/>
-                              <w:rPr/>
+                              <w:overflowPunct w:val="true"/>
+                              <w:rPr>
+                                <w:color w:val="000000"/>
+                              </w:rPr>
                             </w:pPr>
                             <w:r>
-                              <w:rPr/>
+                              <w:rPr>
+                                <w:color w:val="000000"/>
+                              </w:rPr>
                             </w:r>
                           </w:p>
                         </w:txbxContent>
@@ -12004,12 +12195,15 @@
                     <w:p>
                       <w:pPr>
                         <w:pStyle w:val="FrameContents"/>
-                        <w:overflowPunct w:val="false"/>
-                        <w:rPr/>
+                        <w:overflowPunct w:val="true"/>
+                        <w:rPr>
+                          <w:color w:val="000000"/>
+                        </w:rPr>
                       </w:pPr>
                       <w:r>
                         <w:rPr>
                           <w:rFonts w:ascii="Monospace" w:hAnsi="Monospace"/>
+                          <w:color w:val="000000"/>
                           <w:sz w:val="20"/>
                           <w:szCs w:val="20"/>
                         </w:rPr>
@@ -12019,12 +12213,15 @@
                     <w:p>
                       <w:pPr>
                         <w:pStyle w:val="FrameContents"/>
-                        <w:overflowPunct w:val="false"/>
-                        <w:rPr/>
+                        <w:overflowPunct w:val="true"/>
+                        <w:rPr>
+                          <w:color w:val="000000"/>
+                        </w:rPr>
                       </w:pPr>
                       <w:r>
                         <w:rPr>
                           <w:rFonts w:ascii="Monospace" w:hAnsi="Monospace"/>
+                          <w:color w:val="000000"/>
                           <w:sz w:val="20"/>
                           <w:szCs w:val="20"/>
                         </w:rPr>
@@ -12033,6 +12230,7 @@
                       <w:r>
                         <w:rPr>
                           <w:rFonts w:ascii="Monospace" w:hAnsi="Monospace"/>
+                          <w:color w:val="000000"/>
                           <w:sz w:val="20"/>
                           <w:szCs w:val="20"/>
                         </w:rPr>
@@ -12042,11 +12240,15 @@
                     <w:p>
                       <w:pPr>
                         <w:pStyle w:val="FrameContents"/>
-                        <w:overflowPunct w:val="false"/>
-                        <w:rPr/>
+                        <w:overflowPunct w:val="true"/>
+                        <w:rPr>
+                          <w:color w:val="000000"/>
+                        </w:rPr>
                       </w:pPr>
                       <w:r>
-                        <w:rPr/>
+                        <w:rPr>
+                          <w:color w:val="000000"/>
+                        </w:rPr>
                       </w:r>
                     </w:p>
                   </w:txbxContent>
@@ -12170,12 +12372,15 @@
                           <w:p>
                             <w:pPr>
                               <w:pStyle w:val="FrameContents"/>
-                              <w:overflowPunct w:val="false"/>
-                              <w:rPr/>
+                              <w:overflowPunct w:val="true"/>
+                              <w:rPr>
+                                <w:color w:val="000000"/>
+                              </w:rPr>
                             </w:pPr>
                             <w:r>
                               <w:rPr>
                                 <w:rFonts w:ascii="Monospace" w:hAnsi="Monospace"/>
+                                <w:color w:val="000000"/>
                                 <w:sz w:val="20"/>
                                 <w:szCs w:val="20"/>
                               </w:rPr>
@@ -12185,11 +12390,15 @@
                           <w:p>
                             <w:pPr>
                               <w:pStyle w:val="FrameContents"/>
-                              <w:overflowPunct w:val="false"/>
-                              <w:rPr/>
+                              <w:overflowPunct w:val="true"/>
+                              <w:rPr>
+                                <w:color w:val="000000"/>
+                              </w:rPr>
                             </w:pPr>
                             <w:r>
-                              <w:rPr/>
+                              <w:rPr>
+                                <w:color w:val="000000"/>
+                              </w:rPr>
                             </w:r>
                           </w:p>
                         </w:txbxContent>
@@ -12213,12 +12422,15 @@
                     <w:p>
                       <w:pPr>
                         <w:pStyle w:val="FrameContents"/>
-                        <w:overflowPunct w:val="false"/>
-                        <w:rPr/>
+                        <w:overflowPunct w:val="true"/>
+                        <w:rPr>
+                          <w:color w:val="000000"/>
+                        </w:rPr>
                       </w:pPr>
                       <w:r>
                         <w:rPr>
                           <w:rFonts w:ascii="Monospace" w:hAnsi="Monospace"/>
+                          <w:color w:val="000000"/>
                           <w:sz w:val="20"/>
                           <w:szCs w:val="20"/>
                         </w:rPr>
@@ -12228,11 +12440,15 @@
                     <w:p>
                       <w:pPr>
                         <w:pStyle w:val="FrameContents"/>
-                        <w:overflowPunct w:val="false"/>
-                        <w:rPr/>
+                        <w:overflowPunct w:val="true"/>
+                        <w:rPr>
+                          <w:color w:val="000000"/>
+                        </w:rPr>
                       </w:pPr>
                       <w:r>
-                        <w:rPr/>
+                        <w:rPr>
+                          <w:color w:val="000000"/>
+                        </w:rPr>
                       </w:r>
                     </w:p>
                   </w:txbxContent>
@@ -12341,12 +12557,15 @@
                           <w:p>
                             <w:pPr>
                               <w:pStyle w:val="FrameContents"/>
-                              <w:overflowPunct w:val="false"/>
-                              <w:rPr/>
+                              <w:overflowPunct w:val="true"/>
+                              <w:rPr>
+                                <w:color w:val="000000"/>
+                              </w:rPr>
                             </w:pPr>
                             <w:r>
                               <w:rPr>
                                 <w:rFonts w:ascii="Monospace" w:hAnsi="Monospace"/>
+                                <w:color w:val="000000"/>
                                 <w:sz w:val="20"/>
                                 <w:szCs w:val="20"/>
                               </w:rPr>
@@ -12356,12 +12575,15 @@
                           <w:p>
                             <w:pPr>
                               <w:pStyle w:val="FrameContents"/>
-                              <w:overflowPunct w:val="false"/>
-                              <w:rPr/>
+                              <w:overflowPunct w:val="true"/>
+                              <w:rPr>
+                                <w:color w:val="000000"/>
+                              </w:rPr>
                             </w:pPr>
                             <w:r>
                               <w:rPr>
                                 <w:rFonts w:ascii="Monospace" w:hAnsi="Monospace"/>
+                                <w:color w:val="000000"/>
                                 <w:sz w:val="20"/>
                                 <w:szCs w:val="20"/>
                               </w:rPr>
@@ -12370,6 +12592,7 @@
                             <w:r>
                               <w:rPr>
                                 <w:rFonts w:ascii="Monospace" w:hAnsi="Monospace"/>
+                                <w:color w:val="000000"/>
                                 <w:sz w:val="20"/>
                                 <w:szCs w:val="20"/>
                               </w:rPr>
@@ -12379,12 +12602,15 @@
                           <w:p>
                             <w:pPr>
                               <w:pStyle w:val="FrameContents"/>
-                              <w:overflowPunct w:val="false"/>
-                              <w:rPr/>
+                              <w:overflowPunct w:val="true"/>
+                              <w:rPr>
+                                <w:color w:val="000000"/>
+                              </w:rPr>
                             </w:pPr>
                             <w:r>
                               <w:rPr>
                                 <w:rFonts w:ascii="Monospace" w:hAnsi="Monospace"/>
+                                <w:color w:val="000000"/>
                                 <w:sz w:val="20"/>
                                 <w:szCs w:val="20"/>
                               </w:rPr>
@@ -12393,6 +12619,7 @@
                             <w:r>
                               <w:rPr>
                                 <w:rFonts w:ascii="Monospace" w:hAnsi="Monospace"/>
+                                <w:color w:val="000000"/>
                                 <w:sz w:val="20"/>
                                 <w:szCs w:val="20"/>
                               </w:rPr>
@@ -12402,12 +12629,15 @@
                           <w:p>
                             <w:pPr>
                               <w:pStyle w:val="FrameContents"/>
-                              <w:overflowPunct w:val="false"/>
-                              <w:rPr/>
+                              <w:overflowPunct w:val="true"/>
+                              <w:rPr>
+                                <w:color w:val="000000"/>
+                              </w:rPr>
                             </w:pPr>
                             <w:r>
                               <w:rPr>
                                 <w:rFonts w:ascii="Monospace" w:hAnsi="Monospace"/>
+                                <w:color w:val="000000"/>
                                 <w:sz w:val="20"/>
                                 <w:szCs w:val="20"/>
                               </w:rPr>
@@ -12416,6 +12646,7 @@
                             <w:r>
                               <w:rPr>
                                 <w:rFonts w:ascii="Monospace" w:hAnsi="Monospace"/>
+                                <w:color w:val="000000"/>
                                 <w:sz w:val="20"/>
                                 <w:szCs w:val="20"/>
                               </w:rPr>
@@ -12425,12 +12656,15 @@
                           <w:p>
                             <w:pPr>
                               <w:pStyle w:val="FrameContents"/>
-                              <w:overflowPunct w:val="false"/>
-                              <w:rPr/>
+                              <w:overflowPunct w:val="true"/>
+                              <w:rPr>
+                                <w:color w:val="000000"/>
+                              </w:rPr>
                             </w:pPr>
                             <w:r>
                               <w:rPr>
                                 <w:rFonts w:ascii="Monospace" w:hAnsi="Monospace"/>
+                                <w:color w:val="000000"/>
                                 <w:sz w:val="20"/>
                                 <w:szCs w:val="20"/>
                               </w:rPr>
@@ -12439,6 +12673,7 @@
                             <w:r>
                               <w:rPr>
                                 <w:rFonts w:ascii="Monospace" w:hAnsi="Monospace"/>
+                                <w:color w:val="000000"/>
                                 <w:sz w:val="20"/>
                                 <w:szCs w:val="20"/>
                               </w:rPr>
@@ -12448,12 +12683,15 @@
                           <w:p>
                             <w:pPr>
                               <w:pStyle w:val="FrameContents"/>
-                              <w:overflowPunct w:val="false"/>
-                              <w:rPr/>
+                              <w:overflowPunct w:val="true"/>
+                              <w:rPr>
+                                <w:color w:val="000000"/>
+                              </w:rPr>
                             </w:pPr>
                             <w:r>
                               <w:rPr>
                                 <w:rFonts w:ascii="Monospace" w:hAnsi="Monospace"/>
+                                <w:color w:val="000000"/>
                                 <w:sz w:val="20"/>
                                 <w:szCs w:val="20"/>
                               </w:rPr>
@@ -12462,6 +12700,7 @@
                             <w:r>
                               <w:rPr>
                                 <w:rFonts w:ascii="Monospace" w:hAnsi="Monospace"/>
+                                <w:color w:val="000000"/>
                                 <w:sz w:val="20"/>
                                 <w:szCs w:val="20"/>
                               </w:rPr>
@@ -12471,12 +12710,15 @@
                           <w:p>
                             <w:pPr>
                               <w:pStyle w:val="FrameContents"/>
-                              <w:overflowPunct w:val="false"/>
-                              <w:rPr/>
+                              <w:overflowPunct w:val="true"/>
+                              <w:rPr>
+                                <w:color w:val="000000"/>
+                              </w:rPr>
                             </w:pPr>
                             <w:r>
                               <w:rPr>
                                 <w:rFonts w:ascii="Monospace" w:hAnsi="Monospace"/>
+                                <w:color w:val="000000"/>
                                 <w:sz w:val="20"/>
                                 <w:szCs w:val="20"/>
                               </w:rPr>
@@ -12485,6 +12727,7 @@
                             <w:r>
                               <w:rPr>
                                 <w:rFonts w:ascii="Monospace" w:hAnsi="Monospace"/>
+                                <w:color w:val="000000"/>
                                 <w:sz w:val="20"/>
                                 <w:szCs w:val="20"/>
                               </w:rPr>
@@ -12494,12 +12737,15 @@
                           <w:p>
                             <w:pPr>
                               <w:pStyle w:val="FrameContents"/>
-                              <w:overflowPunct w:val="false"/>
-                              <w:rPr/>
+                              <w:overflowPunct w:val="true"/>
+                              <w:rPr>
+                                <w:color w:val="000000"/>
+                              </w:rPr>
                             </w:pPr>
                             <w:r>
                               <w:rPr>
                                 <w:rFonts w:ascii="Monospace" w:hAnsi="Monospace"/>
+                                <w:color w:val="000000"/>
                                 <w:sz w:val="20"/>
                                 <w:szCs w:val="20"/>
                               </w:rPr>
@@ -12508,6 +12754,7 @@
                             <w:r>
                               <w:rPr>
                                 <w:rFonts w:ascii="Monospace" w:hAnsi="Monospace"/>
+                                <w:color w:val="000000"/>
                                 <w:sz w:val="20"/>
                                 <w:szCs w:val="20"/>
                               </w:rPr>
@@ -12517,12 +12764,15 @@
                           <w:p>
                             <w:pPr>
                               <w:pStyle w:val="FrameContents"/>
-                              <w:overflowPunct w:val="false"/>
-                              <w:rPr/>
+                              <w:overflowPunct w:val="true"/>
+                              <w:rPr>
+                                <w:color w:val="000000"/>
+                              </w:rPr>
                             </w:pPr>
                             <w:r>
                               <w:rPr>
                                 <w:rFonts w:ascii="Monospace" w:hAnsi="Monospace"/>
+                                <w:color w:val="000000"/>
                                 <w:sz w:val="20"/>
                                 <w:szCs w:val="20"/>
                               </w:rPr>
@@ -12531,6 +12781,7 @@
                             <w:r>
                               <w:rPr>
                                 <w:rFonts w:ascii="Monospace" w:hAnsi="Monospace"/>
+                                <w:color w:val="000000"/>
                                 <w:sz w:val="20"/>
                                 <w:szCs w:val="20"/>
                               </w:rPr>
@@ -12540,12 +12791,15 @@
                           <w:p>
                             <w:pPr>
                               <w:pStyle w:val="FrameContents"/>
-                              <w:overflowPunct w:val="false"/>
-                              <w:rPr/>
+                              <w:overflowPunct w:val="true"/>
+                              <w:rPr>
+                                <w:color w:val="000000"/>
+                              </w:rPr>
                             </w:pPr>
                             <w:r>
                               <w:rPr>
                                 <w:rFonts w:ascii="Monospace" w:hAnsi="Monospace"/>
+                                <w:color w:val="000000"/>
                                 <w:sz w:val="20"/>
                                 <w:szCs w:val="20"/>
                               </w:rPr>
@@ -12554,6 +12808,7 @@
                             <w:r>
                               <w:rPr>
                                 <w:rFonts w:ascii="Monospace" w:hAnsi="Monospace"/>
+                                <w:color w:val="000000"/>
                                 <w:sz w:val="20"/>
                                 <w:szCs w:val="20"/>
                               </w:rPr>
@@ -12563,11 +12818,15 @@
                           <w:p>
                             <w:pPr>
                               <w:pStyle w:val="FrameContents"/>
-                              <w:overflowPunct w:val="false"/>
-                              <w:rPr/>
+                              <w:overflowPunct w:val="true"/>
+                              <w:rPr>
+                                <w:color w:val="000000"/>
+                              </w:rPr>
                             </w:pPr>
                             <w:r>
-                              <w:rPr/>
+                              <w:rPr>
+                                <w:color w:val="000000"/>
+                              </w:rPr>
                             </w:r>
                           </w:p>
                         </w:txbxContent>
@@ -12591,12 +12850,15 @@
                     <w:p>
                       <w:pPr>
                         <w:pStyle w:val="FrameContents"/>
-                        <w:overflowPunct w:val="false"/>
-                        <w:rPr/>
+                        <w:overflowPunct w:val="true"/>
+                        <w:rPr>
+                          <w:color w:val="000000"/>
+                        </w:rPr>
                       </w:pPr>
                       <w:r>
                         <w:rPr>
                           <w:rFonts w:ascii="Monospace" w:hAnsi="Monospace"/>
+                          <w:color w:val="000000"/>
                           <w:sz w:val="20"/>
                           <w:szCs w:val="20"/>
                         </w:rPr>
@@ -12606,12 +12868,15 @@
                     <w:p>
                       <w:pPr>
                         <w:pStyle w:val="FrameContents"/>
-                        <w:overflowPunct w:val="false"/>
-                        <w:rPr/>
+                        <w:overflowPunct w:val="true"/>
+                        <w:rPr>
+                          <w:color w:val="000000"/>
+                        </w:rPr>
                       </w:pPr>
                       <w:r>
                         <w:rPr>
                           <w:rFonts w:ascii="Monospace" w:hAnsi="Monospace"/>
+                          <w:color w:val="000000"/>
                           <w:sz w:val="20"/>
                           <w:szCs w:val="20"/>
                         </w:rPr>
@@ -12620,6 +12885,7 @@
                       <w:r>
                         <w:rPr>
                           <w:rFonts w:ascii="Monospace" w:hAnsi="Monospace"/>
+                          <w:color w:val="000000"/>
                           <w:sz w:val="20"/>
                           <w:szCs w:val="20"/>
                         </w:rPr>
@@ -12629,12 +12895,15 @@
                     <w:p>
                       <w:pPr>
                         <w:pStyle w:val="FrameContents"/>
-                        <w:overflowPunct w:val="false"/>
-                        <w:rPr/>
+                        <w:overflowPunct w:val="true"/>
+                        <w:rPr>
+                          <w:color w:val="000000"/>
+                        </w:rPr>
                       </w:pPr>
                       <w:r>
                         <w:rPr>
                           <w:rFonts w:ascii="Monospace" w:hAnsi="Monospace"/>
+                          <w:color w:val="000000"/>
                           <w:sz w:val="20"/>
                           <w:szCs w:val="20"/>
                         </w:rPr>
@@ -12643,6 +12912,7 @@
                       <w:r>
                         <w:rPr>
                           <w:rFonts w:ascii="Monospace" w:hAnsi="Monospace"/>
+                          <w:color w:val="000000"/>
                           <w:sz w:val="20"/>
                           <w:szCs w:val="20"/>
                         </w:rPr>
@@ -12652,12 +12922,15 @@
                     <w:p>
                       <w:pPr>
                         <w:pStyle w:val="FrameContents"/>
-                        <w:overflowPunct w:val="false"/>
-                        <w:rPr/>
+                        <w:overflowPunct w:val="true"/>
+                        <w:rPr>
+                          <w:color w:val="000000"/>
+                        </w:rPr>
                       </w:pPr>
                       <w:r>
                         <w:rPr>
                           <w:rFonts w:ascii="Monospace" w:hAnsi="Monospace"/>
+                          <w:color w:val="000000"/>
                           <w:sz w:val="20"/>
                           <w:szCs w:val="20"/>
                         </w:rPr>
@@ -12666,6 +12939,7 @@
                       <w:r>
                         <w:rPr>
                           <w:rFonts w:ascii="Monospace" w:hAnsi="Monospace"/>
+                          <w:color w:val="000000"/>
                           <w:sz w:val="20"/>
                           <w:szCs w:val="20"/>
                         </w:rPr>
@@ -12675,12 +12949,15 @@
                     <w:p>
                       <w:pPr>
                         <w:pStyle w:val="FrameContents"/>
-                        <w:overflowPunct w:val="false"/>
-                        <w:rPr/>
+                        <w:overflowPunct w:val="true"/>
+                        <w:rPr>
+                          <w:color w:val="000000"/>
+                        </w:rPr>
                       </w:pPr>
                       <w:r>
                         <w:rPr>
                           <w:rFonts w:ascii="Monospace" w:hAnsi="Monospace"/>
+                          <w:color w:val="000000"/>
                           <w:sz w:val="20"/>
                           <w:szCs w:val="20"/>
                         </w:rPr>
@@ -12689,6 +12966,7 @@
                       <w:r>
                         <w:rPr>
                           <w:rFonts w:ascii="Monospace" w:hAnsi="Monospace"/>
+                          <w:color w:val="000000"/>
                           <w:sz w:val="20"/>
                           <w:szCs w:val="20"/>
                         </w:rPr>
@@ -12698,12 +12976,15 @@
                     <w:p>
                       <w:pPr>
                         <w:pStyle w:val="FrameContents"/>
-                        <w:overflowPunct w:val="false"/>
-                        <w:rPr/>
+                        <w:overflowPunct w:val="true"/>
+                        <w:rPr>
+                          <w:color w:val="000000"/>
+                        </w:rPr>
                       </w:pPr>
                       <w:r>
                         <w:rPr>
                           <w:rFonts w:ascii="Monospace" w:hAnsi="Monospace"/>
+                          <w:color w:val="000000"/>
                           <w:sz w:val="20"/>
                           <w:szCs w:val="20"/>
                         </w:rPr>
@@ -12712,6 +12993,7 @@
                       <w:r>
                         <w:rPr>
                           <w:rFonts w:ascii="Monospace" w:hAnsi="Monospace"/>
+                          <w:color w:val="000000"/>
                           <w:sz w:val="20"/>
                           <w:szCs w:val="20"/>
                         </w:rPr>
@@ -12721,12 +13003,15 @@
                     <w:p>
                       <w:pPr>
                         <w:pStyle w:val="FrameContents"/>
-                        <w:overflowPunct w:val="false"/>
-                        <w:rPr/>
+                        <w:overflowPunct w:val="true"/>
+                        <w:rPr>
+                          <w:color w:val="000000"/>
+                        </w:rPr>
                       </w:pPr>
                       <w:r>
                         <w:rPr>
                           <w:rFonts w:ascii="Monospace" w:hAnsi="Monospace"/>
+                          <w:color w:val="000000"/>
                           <w:sz w:val="20"/>
                           <w:szCs w:val="20"/>
                         </w:rPr>
@@ -12735,6 +13020,7 @@
                       <w:r>
                         <w:rPr>
                           <w:rFonts w:ascii="Monospace" w:hAnsi="Monospace"/>
+                          <w:color w:val="000000"/>
                           <w:sz w:val="20"/>
                           <w:szCs w:val="20"/>
                         </w:rPr>
@@ -12744,12 +13030,15 @@
                     <w:p>
                       <w:pPr>
                         <w:pStyle w:val="FrameContents"/>
-                        <w:overflowPunct w:val="false"/>
-                        <w:rPr/>
+                        <w:overflowPunct w:val="true"/>
+                        <w:rPr>
+                          <w:color w:val="000000"/>
+                        </w:rPr>
                       </w:pPr>
                       <w:r>
                         <w:rPr>
                           <w:rFonts w:ascii="Monospace" w:hAnsi="Monospace"/>
+                          <w:color w:val="000000"/>
                           <w:sz w:val="20"/>
                           <w:szCs w:val="20"/>
                         </w:rPr>
@@ -12758,6 +13047,7 @@
                       <w:r>
                         <w:rPr>
                           <w:rFonts w:ascii="Monospace" w:hAnsi="Monospace"/>
+                          <w:color w:val="000000"/>
                           <w:sz w:val="20"/>
                           <w:szCs w:val="20"/>
                         </w:rPr>
@@ -12767,12 +13057,15 @@
                     <w:p>
                       <w:pPr>
                         <w:pStyle w:val="FrameContents"/>
-                        <w:overflowPunct w:val="false"/>
-                        <w:rPr/>
+                        <w:overflowPunct w:val="true"/>
+                        <w:rPr>
+                          <w:color w:val="000000"/>
+                        </w:rPr>
                       </w:pPr>
                       <w:r>
                         <w:rPr>
                           <w:rFonts w:ascii="Monospace" w:hAnsi="Monospace"/>
+                          <w:color w:val="000000"/>
                           <w:sz w:val="20"/>
                           <w:szCs w:val="20"/>
                         </w:rPr>
@@ -12781,6 +13074,7 @@
                       <w:r>
                         <w:rPr>
                           <w:rFonts w:ascii="Monospace" w:hAnsi="Monospace"/>
+                          <w:color w:val="000000"/>
                           <w:sz w:val="20"/>
                           <w:szCs w:val="20"/>
                         </w:rPr>
@@ -12790,12 +13084,15 @@
                     <w:p>
                       <w:pPr>
                         <w:pStyle w:val="FrameContents"/>
-                        <w:overflowPunct w:val="false"/>
-                        <w:rPr/>
+                        <w:overflowPunct w:val="true"/>
+                        <w:rPr>
+                          <w:color w:val="000000"/>
+                        </w:rPr>
                       </w:pPr>
                       <w:r>
                         <w:rPr>
                           <w:rFonts w:ascii="Monospace" w:hAnsi="Monospace"/>
+                          <w:color w:val="000000"/>
                           <w:sz w:val="20"/>
                           <w:szCs w:val="20"/>
                         </w:rPr>
@@ -12804,6 +13101,7 @@
                       <w:r>
                         <w:rPr>
                           <w:rFonts w:ascii="Monospace" w:hAnsi="Monospace"/>
+                          <w:color w:val="000000"/>
                           <w:sz w:val="20"/>
                           <w:szCs w:val="20"/>
                         </w:rPr>
@@ -12813,11 +13111,15 @@
                     <w:p>
                       <w:pPr>
                         <w:pStyle w:val="FrameContents"/>
-                        <w:overflowPunct w:val="false"/>
-                        <w:rPr/>
+                        <w:overflowPunct w:val="true"/>
+                        <w:rPr>
+                          <w:color w:val="000000"/>
+                        </w:rPr>
                       </w:pPr>
                       <w:r>
-                        <w:rPr/>
+                        <w:rPr>
+                          <w:color w:val="000000"/>
+                        </w:rPr>
                       </w:r>
                     </w:p>
                   </w:txbxContent>
@@ -12991,12 +13293,15 @@
                           <w:p>
                             <w:pPr>
                               <w:pStyle w:val="FrameContents"/>
-                              <w:overflowPunct w:val="false"/>
-                              <w:rPr/>
+                              <w:overflowPunct w:val="true"/>
+                              <w:rPr>
+                                <w:color w:val="000000"/>
+                              </w:rPr>
                             </w:pPr>
                             <w:r>
                               <w:rPr>
                                 <w:rFonts w:ascii="Monospace" w:hAnsi="Monospace"/>
+                                <w:color w:val="000000"/>
                                 <w:sz w:val="20"/>
                                 <w:szCs w:val="20"/>
                               </w:rPr>
@@ -13006,12 +13311,15 @@
                           <w:p>
                             <w:pPr>
                               <w:pStyle w:val="FrameContents"/>
-                              <w:overflowPunct w:val="false"/>
-                              <w:rPr/>
+                              <w:overflowPunct w:val="true"/>
+                              <w:rPr>
+                                <w:color w:val="000000"/>
+                              </w:rPr>
                             </w:pPr>
                             <w:r>
                               <w:rPr>
                                 <w:rFonts w:ascii="Monospace" w:hAnsi="Monospace"/>
+                                <w:color w:val="000000"/>
                                 <w:sz w:val="20"/>
                                 <w:szCs w:val="20"/>
                               </w:rPr>
@@ -13020,6 +13328,7 @@
                             <w:r>
                               <w:rPr>
                                 <w:rFonts w:ascii="Monospace" w:hAnsi="Monospace"/>
+                                <w:color w:val="000000"/>
                                 <w:sz w:val="20"/>
                                 <w:szCs w:val="20"/>
                               </w:rPr>
@@ -13029,11 +13338,15 @@
                           <w:p>
                             <w:pPr>
                               <w:pStyle w:val="FrameContents"/>
-                              <w:overflowPunct w:val="false"/>
-                              <w:rPr/>
+                              <w:overflowPunct w:val="true"/>
+                              <w:rPr>
+                                <w:color w:val="000000"/>
+                              </w:rPr>
                             </w:pPr>
                             <w:r>
-                              <w:rPr/>
+                              <w:rPr>
+                                <w:color w:val="000000"/>
+                              </w:rPr>
                             </w:r>
                           </w:p>
                         </w:txbxContent>
@@ -13057,12 +13370,15 @@
                     <w:p>
                       <w:pPr>
                         <w:pStyle w:val="FrameContents"/>
-                        <w:overflowPunct w:val="false"/>
-                        <w:rPr/>
+                        <w:overflowPunct w:val="true"/>
+                        <w:rPr>
+                          <w:color w:val="000000"/>
+                        </w:rPr>
                       </w:pPr>
                       <w:r>
                         <w:rPr>
                           <w:rFonts w:ascii="Monospace" w:hAnsi="Monospace"/>
+                          <w:color w:val="000000"/>
                           <w:sz w:val="20"/>
                           <w:szCs w:val="20"/>
                         </w:rPr>
@@ -13072,12 +13388,15 @@
                     <w:p>
                       <w:pPr>
                         <w:pStyle w:val="FrameContents"/>
-                        <w:overflowPunct w:val="false"/>
-                        <w:rPr/>
+                        <w:overflowPunct w:val="true"/>
+                        <w:rPr>
+                          <w:color w:val="000000"/>
+                        </w:rPr>
                       </w:pPr>
                       <w:r>
                         <w:rPr>
                           <w:rFonts w:ascii="Monospace" w:hAnsi="Monospace"/>
+                          <w:color w:val="000000"/>
                           <w:sz w:val="20"/>
                           <w:szCs w:val="20"/>
                         </w:rPr>
@@ -13086,6 +13405,7 @@
                       <w:r>
                         <w:rPr>
                           <w:rFonts w:ascii="Monospace" w:hAnsi="Monospace"/>
+                          <w:color w:val="000000"/>
                           <w:sz w:val="20"/>
                           <w:szCs w:val="20"/>
                         </w:rPr>
@@ -13095,11 +13415,15 @@
                     <w:p>
                       <w:pPr>
                         <w:pStyle w:val="FrameContents"/>
-                        <w:overflowPunct w:val="false"/>
-                        <w:rPr/>
+                        <w:overflowPunct w:val="true"/>
+                        <w:rPr>
+                          <w:color w:val="000000"/>
+                        </w:rPr>
                       </w:pPr>
                       <w:r>
-                        <w:rPr/>
+                        <w:rPr>
+                          <w:color w:val="000000"/>
+                        </w:rPr>
                       </w:r>
                     </w:p>
                   </w:txbxContent>
@@ -13221,12 +13545,15 @@
                           <w:p>
                             <w:pPr>
                               <w:pStyle w:val="FrameContents"/>
-                              <w:overflowPunct w:val="false"/>
-                              <w:rPr/>
+                              <w:overflowPunct w:val="true"/>
+                              <w:rPr>
+                                <w:color w:val="000000"/>
+                              </w:rPr>
                             </w:pPr>
                             <w:r>
                               <w:rPr>
                                 <w:rFonts w:ascii="Monospace" w:hAnsi="Monospace"/>
+                                <w:color w:val="000000"/>
                                 <w:sz w:val="20"/>
                                 <w:szCs w:val="20"/>
                               </w:rPr>
@@ -13236,11 +13563,15 @@
                           <w:p>
                             <w:pPr>
                               <w:pStyle w:val="FrameContents"/>
-                              <w:overflowPunct w:val="false"/>
-                              <w:rPr/>
+                              <w:overflowPunct w:val="true"/>
+                              <w:rPr>
+                                <w:color w:val="000000"/>
+                              </w:rPr>
                             </w:pPr>
                             <w:r>
-                              <w:rPr/>
+                              <w:rPr>
+                                <w:color w:val="000000"/>
+                              </w:rPr>
                             </w:r>
                           </w:p>
                         </w:txbxContent>
@@ -13264,12 +13595,15 @@
                     <w:p>
                       <w:pPr>
                         <w:pStyle w:val="FrameContents"/>
-                        <w:overflowPunct w:val="false"/>
-                        <w:rPr/>
+                        <w:overflowPunct w:val="true"/>
+                        <w:rPr>
+                          <w:color w:val="000000"/>
+                        </w:rPr>
                       </w:pPr>
                       <w:r>
                         <w:rPr>
                           <w:rFonts w:ascii="Monospace" w:hAnsi="Monospace"/>
+                          <w:color w:val="000000"/>
                           <w:sz w:val="20"/>
                           <w:szCs w:val="20"/>
                         </w:rPr>
@@ -13279,11 +13613,15 @@
                     <w:p>
                       <w:pPr>
                         <w:pStyle w:val="FrameContents"/>
-                        <w:overflowPunct w:val="false"/>
-                        <w:rPr/>
+                        <w:overflowPunct w:val="true"/>
+                        <w:rPr>
+                          <w:color w:val="000000"/>
+                        </w:rPr>
                       </w:pPr>
                       <w:r>
-                        <w:rPr/>
+                        <w:rPr>
+                          <w:color w:val="000000"/>
+                        </w:rPr>
                       </w:r>
                     </w:p>
                   </w:txbxContent>
@@ -13392,12 +13730,15 @@
                           <w:p>
                             <w:pPr>
                               <w:pStyle w:val="FrameContents"/>
-                              <w:overflowPunct w:val="false"/>
-                              <w:rPr/>
+                              <w:overflowPunct w:val="true"/>
+                              <w:rPr>
+                                <w:color w:val="000000"/>
+                              </w:rPr>
                             </w:pPr>
                             <w:r>
                               <w:rPr>
                                 <w:rFonts w:ascii="Monospace" w:hAnsi="Monospace"/>
+                                <w:color w:val="000000"/>
                                 <w:sz w:val="20"/>
                                 <w:szCs w:val="20"/>
                               </w:rPr>
@@ -13407,12 +13748,15 @@
                           <w:p>
                             <w:pPr>
                               <w:pStyle w:val="FrameContents"/>
-                              <w:overflowPunct w:val="false"/>
-                              <w:rPr/>
+                              <w:overflowPunct w:val="true"/>
+                              <w:rPr>
+                                <w:color w:val="000000"/>
+                              </w:rPr>
                             </w:pPr>
                             <w:r>
                               <w:rPr>
                                 <w:rFonts w:ascii="Monospace" w:hAnsi="Monospace"/>
+                                <w:color w:val="000000"/>
                                 <w:sz w:val="20"/>
                                 <w:szCs w:val="20"/>
                               </w:rPr>
@@ -13421,6 +13765,7 @@
                             <w:r>
                               <w:rPr>
                                 <w:rFonts w:ascii="Monospace" w:hAnsi="Monospace"/>
+                                <w:color w:val="000000"/>
                                 <w:sz w:val="20"/>
                                 <w:szCs w:val="20"/>
                               </w:rPr>
@@ -13430,11 +13775,15 @@
                           <w:p>
                             <w:pPr>
                               <w:pStyle w:val="FrameContents"/>
-                              <w:overflowPunct w:val="false"/>
-                              <w:rPr/>
+                              <w:overflowPunct w:val="true"/>
+                              <w:rPr>
+                                <w:color w:val="000000"/>
+                              </w:rPr>
                             </w:pPr>
                             <w:r>
-                              <w:rPr/>
+                              <w:rPr>
+                                <w:color w:val="000000"/>
+                              </w:rPr>
                             </w:r>
                           </w:p>
                         </w:txbxContent>
@@ -13458,12 +13807,15 @@
                     <w:p>
                       <w:pPr>
                         <w:pStyle w:val="FrameContents"/>
-                        <w:overflowPunct w:val="false"/>
-                        <w:rPr/>
+                        <w:overflowPunct w:val="true"/>
+                        <w:rPr>
+                          <w:color w:val="000000"/>
+                        </w:rPr>
                       </w:pPr>
                       <w:r>
                         <w:rPr>
                           <w:rFonts w:ascii="Monospace" w:hAnsi="Monospace"/>
+                          <w:color w:val="000000"/>
                           <w:sz w:val="20"/>
                           <w:szCs w:val="20"/>
                         </w:rPr>
@@ -13473,12 +13825,15 @@
                     <w:p>
                       <w:pPr>
                         <w:pStyle w:val="FrameContents"/>
-                        <w:overflowPunct w:val="false"/>
-                        <w:rPr/>
+                        <w:overflowPunct w:val="true"/>
+                        <w:rPr>
+                          <w:color w:val="000000"/>
+                        </w:rPr>
                       </w:pPr>
                       <w:r>
                         <w:rPr>
                           <w:rFonts w:ascii="Monospace" w:hAnsi="Monospace"/>
+                          <w:color w:val="000000"/>
                           <w:sz w:val="20"/>
                           <w:szCs w:val="20"/>
                         </w:rPr>
@@ -13487,6 +13842,7 @@
                       <w:r>
                         <w:rPr>
                           <w:rFonts w:ascii="Monospace" w:hAnsi="Monospace"/>
+                          <w:color w:val="000000"/>
                           <w:sz w:val="20"/>
                           <w:szCs w:val="20"/>
                         </w:rPr>
@@ -13496,11 +13852,15 @@
                     <w:p>
                       <w:pPr>
                         <w:pStyle w:val="FrameContents"/>
-                        <w:overflowPunct w:val="false"/>
-                        <w:rPr/>
+                        <w:overflowPunct w:val="true"/>
+                        <w:rPr>
+                          <w:color w:val="000000"/>
+                        </w:rPr>
                       </w:pPr>
                       <w:r>
-                        <w:rPr/>
+                        <w:rPr>
+                          <w:color w:val="000000"/>
+                        </w:rPr>
                       </w:r>
                     </w:p>
                   </w:txbxContent>
@@ -13547,7 +13907,9 @@
         </w:rPr>
       </w:pPr>
       <w:r>
-        <w:rPr/>
+        <w:rPr>
+          <w:rFonts w:ascii="SF Pro Text" w:hAnsi="SF Pro Text"/>
+        </w:rPr>
       </w:r>
     </w:p>
     <w:p>
@@ -13570,13 +13932,16 @@
     <w:p>
       <w:pPr>
         <w:pStyle w:val="Heading3"/>
+        <w:spacing w:before="0" w:after="120"/>
         <w:ind w:hanging="0" w:start="0"/>
         <w:rPr>
           <w:rFonts w:ascii="SF Pro Text" w:hAnsi="SF Pro Text"/>
         </w:rPr>
       </w:pPr>
       <w:r>
-        <w:rPr/>
+        <w:rPr>
+          <w:rFonts w:ascii="SF Pro Text" w:hAnsi="SF Pro Text"/>
+        </w:rPr>
         <w:t>6. Cancel Incomplete Upload</w:t>
       </w:r>
     </w:p>
@@ -13637,12 +14002,15 @@
                           <w:p>
                             <w:pPr>
                               <w:pStyle w:val="FrameContents"/>
-                              <w:overflowPunct w:val="false"/>
-                              <w:rPr/>
+                              <w:overflowPunct w:val="true"/>
+                              <w:rPr>
+                                <w:color w:val="000000"/>
+                              </w:rPr>
                             </w:pPr>
                             <w:r>
                               <w:rPr>
                                 <w:rFonts w:ascii="Monospace" w:hAnsi="Monospace"/>
+                                <w:color w:val="000000"/>
                                 <w:sz w:val="20"/>
                                 <w:szCs w:val="20"/>
                               </w:rPr>
@@ -13652,12 +14020,15 @@
                           <w:p>
                             <w:pPr>
                               <w:pStyle w:val="FrameContents"/>
-                              <w:overflowPunct w:val="false"/>
-                              <w:rPr/>
+                              <w:overflowPunct w:val="true"/>
+                              <w:rPr>
+                                <w:color w:val="000000"/>
+                              </w:rPr>
                             </w:pPr>
                             <w:r>
                               <w:rPr>
                                 <w:rFonts w:ascii="Monospace" w:hAnsi="Monospace"/>
+                                <w:color w:val="000000"/>
                                 <w:sz w:val="20"/>
                                 <w:szCs w:val="20"/>
                               </w:rPr>
@@ -13666,6 +14037,7 @@
                             <w:r>
                               <w:rPr>
                                 <w:rFonts w:ascii="Monospace" w:hAnsi="Monospace"/>
+                                <w:color w:val="000000"/>
                                 <w:sz w:val="20"/>
                                 <w:szCs w:val="20"/>
                               </w:rPr>
@@ -13675,11 +14047,15 @@
                           <w:p>
                             <w:pPr>
                               <w:pStyle w:val="FrameContents"/>
-                              <w:overflowPunct w:val="false"/>
-                              <w:rPr/>
+                              <w:overflowPunct w:val="true"/>
+                              <w:rPr>
+                                <w:color w:val="000000"/>
+                              </w:rPr>
                             </w:pPr>
                             <w:r>
-                              <w:rPr/>
+                              <w:rPr>
+                                <w:color w:val="000000"/>
+                              </w:rPr>
                             </w:r>
                           </w:p>
                         </w:txbxContent>
@@ -13703,12 +14079,15 @@
                     <w:p>
                       <w:pPr>
                         <w:pStyle w:val="FrameContents"/>
-                        <w:overflowPunct w:val="false"/>
-                        <w:rPr/>
+                        <w:overflowPunct w:val="true"/>
+                        <w:rPr>
+                          <w:color w:val="000000"/>
+                        </w:rPr>
                       </w:pPr>
                       <w:r>
                         <w:rPr>
                           <w:rFonts w:ascii="Monospace" w:hAnsi="Monospace"/>
+                          <w:color w:val="000000"/>
                           <w:sz w:val="20"/>
                           <w:szCs w:val="20"/>
                         </w:rPr>
@@ -13718,12 +14097,15 @@
                     <w:p>
                       <w:pPr>
                         <w:pStyle w:val="FrameContents"/>
-                        <w:overflowPunct w:val="false"/>
-                        <w:rPr/>
+                        <w:overflowPunct w:val="true"/>
+                        <w:rPr>
+                          <w:color w:val="000000"/>
+                        </w:rPr>
                       </w:pPr>
                       <w:r>
                         <w:rPr>
                           <w:rFonts w:ascii="Monospace" w:hAnsi="Monospace"/>
+                          <w:color w:val="000000"/>
                           <w:sz w:val="20"/>
                           <w:szCs w:val="20"/>
                         </w:rPr>
@@ -13732,6 +14114,7 @@
                       <w:r>
                         <w:rPr>
                           <w:rFonts w:ascii="Monospace" w:hAnsi="Monospace"/>
+                          <w:color w:val="000000"/>
                           <w:sz w:val="20"/>
                           <w:szCs w:val="20"/>
                         </w:rPr>
@@ -13741,11 +14124,15 @@
                     <w:p>
                       <w:pPr>
                         <w:pStyle w:val="FrameContents"/>
-                        <w:overflowPunct w:val="false"/>
-                        <w:rPr/>
+                        <w:overflowPunct w:val="true"/>
+                        <w:rPr>
+                          <w:color w:val="000000"/>
+                        </w:rPr>
                       </w:pPr>
                       <w:r>
-                        <w:rPr/>
+                        <w:rPr>
+                          <w:color w:val="000000"/>
+                        </w:rPr>
                       </w:r>
                     </w:p>
                   </w:txbxContent>
@@ -13797,6 +14184,1365 @@
         <w:rPr>
           <w:rFonts w:ascii="SF Pro Text" w:hAnsi="SF Pro Text"/>
         </w:rPr>
+      </w:r>
+    </w:p>
+    <w:p>
+      <w:pPr>
+        <w:pStyle w:val="Heading2"/>
+        <w:rPr>
+          <w:rFonts w:ascii="SF Pro Text" w:hAnsi="SF Pro Text"/>
+        </w:rPr>
+      </w:pPr>
+      <w:r>
+        <w:rPr>
+          <w:rFonts w:ascii="SF Pro Text" w:hAnsi="SF Pro Text"/>
+        </w:rPr>
+        <w:t>File Sharing Implementation With UI</w:t>
+      </w:r>
+    </w:p>
+    <w:p>
+      <w:pPr>
+        <w:pStyle w:val="BodyText"/>
+        <w:rPr>
+          <w:rFonts w:ascii="SF Pro Text" w:hAnsi="SF Pro Text"/>
+        </w:rPr>
+      </w:pPr>
+      <w:r>
+        <w:rPr>
+          <w:rFonts w:ascii="SF Pro Text" w:hAnsi="SF Pro Text"/>
+        </w:rPr>
+        <w:t>3-Phase Upload Process: Initiate → Upload to R2 → Complete</w:t>
+      </w:r>
+    </w:p>
+    <w:p>
+      <w:pPr>
+        <w:pStyle w:val="BodyText"/>
+        <w:rPr>
+          <w:rFonts w:ascii="SF Pro Text" w:hAnsi="SF Pro Text"/>
+        </w:rPr>
+      </w:pPr>
+      <w:r>
+        <w:rPr>
+          <w:rFonts w:ascii="SF Pro Text" w:hAnsi="SF Pro Text"/>
+        </w:rPr>
+        <w:t>Real-time Progress Tracking: Visual upload progress indicators</w:t>
+      </w:r>
+    </w:p>
+    <w:p>
+      <w:pPr>
+        <w:pStyle w:val="BodyText"/>
+        <w:rPr>
+          <w:rFonts w:ascii="SF Pro Text" w:hAnsi="SF Pro Text"/>
+        </w:rPr>
+      </w:pPr>
+      <w:r>
+        <w:rPr>
+          <w:rFonts w:ascii="SF Pro Text" w:hAnsi="SF Pro Text"/>
+        </w:rPr>
+        <w:t>Permission management: Creator only upload restrictions</w:t>
+      </w:r>
+    </w:p>
+    <w:p>
+      <w:pPr>
+        <w:pStyle w:val="BodyText"/>
+        <w:rPr>
+          <w:rFonts w:ascii="SF Pro Text" w:hAnsi="SF Pro Text"/>
+        </w:rPr>
+      </w:pPr>
+      <w:r>
+        <w:rPr>
+          <w:rFonts w:ascii="SF Pro Text" w:hAnsi="SF Pro Text"/>
+        </w:rPr>
+        <w:t>File management: Download, Delete, and File preview</w:t>
+      </w:r>
+    </w:p>
+    <w:p>
+      <w:pPr>
+        <w:pStyle w:val="BodyText"/>
+        <w:rPr>
+          <w:rFonts w:ascii="SF Pro Text" w:hAnsi="SF Pro Text"/>
+        </w:rPr>
+      </w:pPr>
+      <w:r>
+        <w:rPr>
+          <w:rFonts w:ascii="SF Pro Text" w:hAnsi="SF Pro Text"/>
+        </w:rPr>
+        <w:t>Better UI: Drag-and-drop, modal based interface</w:t>
+      </w:r>
+    </w:p>
+    <w:p>
+      <w:pPr>
+        <w:pStyle w:val="BodyText"/>
+        <w:rPr>
+          <w:rFonts w:ascii="SF Pro Text" w:hAnsi="SF Pro Text"/>
+        </w:rPr>
+      </w:pPr>
+      <w:r>
+        <w:rPr>
+          <w:rFonts w:ascii="SF Pro Text" w:hAnsi="SF Pro Text"/>
+        </w:rPr>
+      </w:r>
+    </w:p>
+    <w:p>
+      <w:pPr>
+        <w:pStyle w:val="Heading3"/>
+        <w:rPr/>
+      </w:pPr>
+      <w:r>
+        <w:rPr/>
+        <w:t>File Upload Flow</w:t>
+      </w:r>
+    </w:p>
+    <w:p>
+      <w:pPr>
+        <w:pStyle w:val="BodyText"/>
+        <w:ind w:hanging="0" w:start="0" w:end="0"/>
+        <w:rPr/>
+      </w:pPr>
+      <w:r>
+        <w:rPr/>
+        <mc:AlternateContent>
+          <mc:Choice Requires="wps">
+            <w:drawing>
+              <wp:anchor behindDoc="0" distT="0" distB="0" distL="0" distR="0" simplePos="0" locked="0" layoutInCell="1" allowOverlap="1" relativeHeight="32">
+                <wp:simplePos x="0" y="0"/>
+                <wp:positionH relativeFrom="column">
+                  <wp:posOffset>4445</wp:posOffset>
+                </wp:positionH>
+                <wp:positionV relativeFrom="paragraph">
+                  <wp:posOffset>111125</wp:posOffset>
+                </wp:positionV>
+                <wp:extent cx="4630420" cy="2832735"/>
+                <wp:effectExtent l="0" t="0" r="0" b="0"/>
+                <wp:wrapNone/>
+                <wp:docPr id="18" name="Text Frame 14"/>
+                <a:graphic xmlns:a="http://schemas.openxmlformats.org/drawingml/2006/main">
+                  <a:graphicData uri="http://schemas.microsoft.com/office/word/2010/wordprocessingShape">
+                    <wps:wsp>
+                      <wps:cNvSpPr txBox="1"/>
+                      <wps:spPr>
+                        <a:xfrm>
+                          <a:off x="0" y="0"/>
+                          <a:ext cx="4630320" cy="2832840"/>
+                        </a:xfrm>
+                        <a:prstGeom prst="rect">
+                          <a:avLst/>
+                        </a:prstGeom>
+                        <a:solidFill>
+                          <a:srgbClr val="eeeeee"/>
+                        </a:solidFill>
+                        <a:ln w="0">
+                          <a:noFill/>
+                        </a:ln>
+                      </wps:spPr>
+                      <wps:txbx>
+                        <w:txbxContent>
+                          <w:p>
+                            <w:pPr>
+                              <w:ind w:start="0" w:end="0" w:hanging="0"/>
+                              <w:rPr/>
+                            </w:pPr>
+                            <w:r>
+                              <w:rPr>
+                                <w:sz w:val="24"/>
+                              </w:rPr>
+                              <w:t xml:space="preserve"> User</w:t>
+                            </w:r>
+                            <w:r>
+                              <w:rPr>
+                                <w:sz w:val="24"/>
+                                <w:color w:val="61AFEF"/>
+                              </w:rPr>
+                              <w:t xml:space="preserve"> → </w:t>
+                            </w:r>
+                            <w:r>
+                              <w:rPr>
+                                <w:sz w:val="24"/>
+                              </w:rPr>
+                              <w:t>Frontend</w:t>
+                            </w:r>
+                            <w:r>
+                              <w:rPr>
+                                <w:sz w:val="24"/>
+                                <w:color w:val="61AFEF"/>
+                              </w:rPr>
+                              <w:t>:</w:t>
+                            </w:r>
+                            <w:r>
+                              <w:rPr>
+                                <w:sz w:val="24"/>
+                              </w:rPr>
+                              <w:t xml:space="preserve"> Select File</w:t>
+                            </w:r>
+                          </w:p>
+                          <w:p>
+                            <w:pPr>
+                              <w:ind w:start="0" w:end="0" w:hanging="0"/>
+                              <w:rPr/>
+                            </w:pPr>
+                            <w:r>
+                              <w:rPr>
+                                <w:sz w:val="24"/>
+                              </w:rPr>
+                              <w:t xml:space="preserve"> Frontend</w:t>
+                            </w:r>
+                            <w:r>
+                              <w:rPr>
+                                <w:sz w:val="24"/>
+                                <w:color w:val="61AFEF"/>
+                              </w:rPr>
+                              <w:t xml:space="preserve"> → </w:t>
+                            </w:r>
+                            <w:r>
+                              <w:rPr>
+                                <w:sz w:val="24"/>
+                              </w:rPr>
+                              <w:t>Frontend</w:t>
+                            </w:r>
+                            <w:r>
+                              <w:rPr>
+                                <w:sz w:val="24"/>
+                                <w:color w:val="61AFEF"/>
+                              </w:rPr>
+                              <w:t>:</w:t>
+                            </w:r>
+                            <w:r>
+                              <w:rPr>
+                                <w:sz w:val="24"/>
+                              </w:rPr>
+                              <w:t xml:space="preserve"> Calculate SHA-256 Checksum </w:t>
+                            </w:r>
+                          </w:p>
+                          <w:p>
+                            <w:pPr>
+                              <w:ind w:start="0" w:end="0" w:hanging="0"/>
+                              <w:rPr/>
+                            </w:pPr>
+                            <w:r>
+                              <w:rPr>
+                                <w:sz w:val="24"/>
+                              </w:rPr>
+                              <w:t xml:space="preserve"> Frontend</w:t>
+                            </w:r>
+                            <w:r>
+                              <w:rPr>
+                                <w:sz w:val="24"/>
+                                <w:color w:val="61AFEF"/>
+                              </w:rPr>
+                              <w:t xml:space="preserve"> → </w:t>
+                            </w:r>
+                            <w:r>
+                              <w:rPr>
+                                <w:sz w:val="24"/>
+                              </w:rPr>
+                              <w:t>Backend</w:t>
+                            </w:r>
+                            <w:r>
+                              <w:rPr>
+                                <w:sz w:val="24"/>
+                                <w:color w:val="61AFEF"/>
+                              </w:rPr>
+                              <w:t>:</w:t>
+                            </w:r>
+                            <w:r>
+                              <w:rPr>
+                                <w:sz w:val="24"/>
+                              </w:rPr>
+                              <w:t xml:space="preserve"> POST /initiate </w:t>
+                            </w:r>
+                            <w:r>
+                              <w:rPr>
+                                <w:sz w:val="24"/>
+                                <w:color w:val="98C379"/>
+                              </w:rPr>
+                              <w:t>(fileName, size, checksum)</w:t>
+                            </w:r>
+                            <w:r>
+                              <w:rPr>
+                                <w:sz w:val="24"/>
+                              </w:rPr>
+                              <w:t xml:space="preserve"> </w:t>
+                            </w:r>
+                          </w:p>
+                          <w:p>
+                            <w:pPr>
+                              <w:ind w:start="0" w:end="0" w:hanging="0"/>
+                              <w:rPr/>
+                            </w:pPr>
+                            <w:r>
+                              <w:rPr>
+                                <w:sz w:val="24"/>
+                              </w:rPr>
+                              <w:t xml:space="preserve"> Backend</w:t>
+                            </w:r>
+                            <w:r>
+                              <w:rPr>
+                                <w:sz w:val="24"/>
+                                <w:color w:val="61AFEF"/>
+                              </w:rPr>
+                              <w:t xml:space="preserve"> → </w:t>
+                            </w:r>
+                            <w:r>
+                              <w:rPr>
+                                <w:sz w:val="24"/>
+                              </w:rPr>
+                              <w:t>Backend</w:t>
+                            </w:r>
+                            <w:r>
+                              <w:rPr>
+                                <w:sz w:val="24"/>
+                                <w:color w:val="61AFEF"/>
+                              </w:rPr>
+                              <w:t>:</w:t>
+                            </w:r>
+                            <w:r>
+                              <w:rPr>
+                                <w:sz w:val="24"/>
+                              </w:rPr>
+                              <w:t xml:space="preserve"> Validate permissions </w:t>
+                            </w:r>
+                            <w:r>
+                              <w:rPr>
+                                <w:sz w:val="24"/>
+                                <w:color w:val="61AFEF"/>
+                              </w:rPr>
+                              <w:t>&amp;</w:t>
+                            </w:r>
+                            <w:r>
+                              <w:rPr>
+                                <w:sz w:val="24"/>
+                              </w:rPr>
+                              <w:t xml:space="preserve"> limits </w:t>
+                            </w:r>
+                          </w:p>
+                          <w:p>
+                            <w:pPr>
+                              <w:ind w:start="0" w:end="0" w:hanging="0"/>
+                              <w:rPr/>
+                            </w:pPr>
+                            <w:r>
+                              <w:rPr>
+                                <w:sz w:val="24"/>
+                              </w:rPr>
+                              <w:t xml:space="preserve"> Backend</w:t>
+                            </w:r>
+                            <w:r>
+                              <w:rPr>
+                                <w:sz w:val="24"/>
+                                <w:color w:val="61AFEF"/>
+                              </w:rPr>
+                              <w:t xml:space="preserve"> → </w:t>
+                            </w:r>
+                            <w:r>
+                              <w:rPr>
+                                <w:sz w:val="24"/>
+                              </w:rPr>
+                              <w:t>CloudflareR2</w:t>
+                            </w:r>
+                            <w:r>
+                              <w:rPr>
+                                <w:sz w:val="24"/>
+                                <w:color w:val="61AFEF"/>
+                              </w:rPr>
+                              <w:t>:</w:t>
+                            </w:r>
+                            <w:r>
+                              <w:rPr>
+                                <w:sz w:val="24"/>
+                              </w:rPr>
+                              <w:t xml:space="preserve"> Generate presigned URL </w:t>
+                            </w:r>
+                          </w:p>
+                          <w:p>
+                            <w:pPr>
+                              <w:ind w:start="0" w:end="0" w:hanging="0"/>
+                              <w:rPr/>
+                            </w:pPr>
+                            <w:r>
+                              <w:rPr>
+                                <w:sz w:val="24"/>
+                              </w:rPr>
+                              <w:t xml:space="preserve"> Backend</w:t>
+                            </w:r>
+                            <w:r>
+                              <w:rPr>
+                                <w:sz w:val="24"/>
+                                <w:color w:val="61AFEF"/>
+                              </w:rPr>
+                              <w:t xml:space="preserve"> → </w:t>
+                            </w:r>
+                            <w:r>
+                              <w:rPr>
+                                <w:sz w:val="24"/>
+                              </w:rPr>
+                              <w:t>Frontend</w:t>
+                            </w:r>
+                            <w:r>
+                              <w:rPr>
+                                <w:sz w:val="24"/>
+                                <w:color w:val="61AFEF"/>
+                              </w:rPr>
+                              <w:t>:</w:t>
+                            </w:r>
+                            <w:r>
+                              <w:rPr>
+                                <w:sz w:val="24"/>
+                              </w:rPr>
+                              <w:t xml:space="preserve"> Return uploadUrl + fileId </w:t>
+                            </w:r>
+                          </w:p>
+                          <w:p>
+                            <w:pPr>
+                              <w:ind w:start="0" w:end="0" w:hanging="0"/>
+                              <w:rPr/>
+                            </w:pPr>
+                            <w:r>
+                              <w:rPr>
+                                <w:sz w:val="24"/>
+                              </w:rPr>
+                              <w:t xml:space="preserve"> Frontend</w:t>
+                            </w:r>
+                            <w:r>
+                              <w:rPr>
+                                <w:sz w:val="24"/>
+                                <w:color w:val="61AFEF"/>
+                              </w:rPr>
+                              <w:t xml:space="preserve"> → </w:t>
+                            </w:r>
+                            <w:r>
+                              <w:rPr>
+                                <w:sz w:val="24"/>
+                              </w:rPr>
+                              <w:t>CloudflareR2</w:t>
+                            </w:r>
+                            <w:r>
+                              <w:rPr>
+                                <w:sz w:val="24"/>
+                                <w:color w:val="61AFEF"/>
+                              </w:rPr>
+                              <w:t>:</w:t>
+                            </w:r>
+                            <w:r>
+                              <w:rPr>
+                                <w:sz w:val="24"/>
+                              </w:rPr>
+                              <w:t xml:space="preserve"> PUT file to presigned URL </w:t>
+                            </w:r>
+                          </w:p>
+                          <w:p>
+                            <w:pPr>
+                              <w:ind w:start="0" w:end="0" w:hanging="0"/>
+                              <w:rPr/>
+                            </w:pPr>
+                            <w:r>
+                              <w:rPr>
+                                <w:sz w:val="24"/>
+                              </w:rPr>
+                              <w:t xml:space="preserve"> CloudflareR2</w:t>
+                            </w:r>
+                            <w:r>
+                              <w:rPr>
+                                <w:sz w:val="24"/>
+                                <w:color w:val="61AFEF"/>
+                              </w:rPr>
+                              <w:t xml:space="preserve"> → </w:t>
+                            </w:r>
+                            <w:r>
+                              <w:rPr>
+                                <w:sz w:val="24"/>
+                              </w:rPr>
+                              <w:t>Frontend</w:t>
+                            </w:r>
+                            <w:r>
+                              <w:rPr>
+                                <w:sz w:val="24"/>
+                                <w:color w:val="61AFEF"/>
+                              </w:rPr>
+                              <w:t>:</w:t>
+                            </w:r>
+                            <w:r>
+                              <w:rPr>
+                                <w:sz w:val="24"/>
+                              </w:rPr>
+                              <w:t xml:space="preserve"> 200 OK </w:t>
+                            </w:r>
+                          </w:p>
+                          <w:p>
+                            <w:pPr>
+                              <w:ind w:start="0" w:end="0" w:hanging="0"/>
+                              <w:rPr/>
+                            </w:pPr>
+                            <w:r>
+                              <w:rPr>
+                                <w:sz w:val="24"/>
+                              </w:rPr>
+                              <w:t xml:space="preserve"> Frontend</w:t>
+                            </w:r>
+                            <w:r>
+                              <w:rPr>
+                                <w:sz w:val="24"/>
+                                <w:color w:val="61AFEF"/>
+                              </w:rPr>
+                              <w:t xml:space="preserve"> → </w:t>
+                            </w:r>
+                            <w:r>
+                              <w:rPr>
+                                <w:sz w:val="24"/>
+                              </w:rPr>
+                              <w:t>Backend</w:t>
+                            </w:r>
+                            <w:r>
+                              <w:rPr>
+                                <w:sz w:val="24"/>
+                                <w:color w:val="61AFEF"/>
+                              </w:rPr>
+                              <w:t>:</w:t>
+                            </w:r>
+                            <w:r>
+                              <w:rPr>
+                                <w:sz w:val="24"/>
+                              </w:rPr>
+                              <w:t xml:space="preserve"> POST /complete </w:t>
+                            </w:r>
+                            <w:r>
+                              <w:rPr>
+                                <w:sz w:val="24"/>
+                                <w:color w:val="98C379"/>
+                              </w:rPr>
+                              <w:t>(fileId)</w:t>
+                            </w:r>
+                            <w:r>
+                              <w:rPr>
+                                <w:sz w:val="24"/>
+                              </w:rPr>
+                              <w:t xml:space="preserve"> </w:t>
+                            </w:r>
+                          </w:p>
+                          <w:p>
+                            <w:pPr>
+                              <w:ind w:start="0" w:end="0" w:hanging="0"/>
+                              <w:rPr/>
+                            </w:pPr>
+                            <w:r>
+                              <w:rPr>
+                                <w:sz w:val="24"/>
+                              </w:rPr>
+                              <w:t xml:space="preserve"> Backend</w:t>
+                            </w:r>
+                            <w:r>
+                              <w:rPr>
+                                <w:sz w:val="24"/>
+                                <w:color w:val="61AFEF"/>
+                              </w:rPr>
+                              <w:t xml:space="preserve"> → </w:t>
+                            </w:r>
+                            <w:r>
+                              <w:rPr>
+                                <w:sz w:val="24"/>
+                              </w:rPr>
+                              <w:t>CloudflareR2</w:t>
+                            </w:r>
+                            <w:r>
+                              <w:rPr>
+                                <w:sz w:val="24"/>
+                                <w:color w:val="61AFEF"/>
+                              </w:rPr>
+                              <w:t>:</w:t>
+                            </w:r>
+                            <w:r>
+                              <w:rPr>
+                                <w:sz w:val="24"/>
+                              </w:rPr>
+                              <w:t xml:space="preserve"> Verify file exists </w:t>
+                            </w:r>
+                          </w:p>
+                          <w:p>
+                            <w:pPr>
+                              <w:ind w:start="0" w:end="0" w:hanging="0"/>
+                              <w:rPr/>
+                            </w:pPr>
+                            <w:r>
+                              <w:rPr>
+                                <w:sz w:val="24"/>
+                              </w:rPr>
+                              <w:t xml:space="preserve"> Backend</w:t>
+                            </w:r>
+                            <w:r>
+                              <w:rPr>
+                                <w:sz w:val="24"/>
+                                <w:color w:val="61AFEF"/>
+                              </w:rPr>
+                              <w:t xml:space="preserve"> → </w:t>
+                            </w:r>
+                            <w:r>
+                              <w:rPr>
+                                <w:sz w:val="24"/>
+                              </w:rPr>
+                              <w:t>Backend</w:t>
+                            </w:r>
+                            <w:r>
+                              <w:rPr>
+                                <w:sz w:val="24"/>
+                                <w:color w:val="61AFEF"/>
+                              </w:rPr>
+                              <w:t>:</w:t>
+                            </w:r>
+                            <w:r>
+                              <w:rPr>
+                                <w:sz w:val="24"/>
+                              </w:rPr>
+                              <w:t xml:space="preserve"> Mark file available </w:t>
+                            </w:r>
+                          </w:p>
+                          <w:p>
+                            <w:pPr>
+                              <w:ind w:start="0" w:end="0" w:hanging="0"/>
+                              <w:rPr/>
+                            </w:pPr>
+                            <w:r>
+                              <w:rPr>
+                                <w:sz w:val="24"/>
+                              </w:rPr>
+                              <w:t xml:space="preserve"> Backend</w:t>
+                            </w:r>
+                            <w:r>
+                              <w:rPr>
+                                <w:sz w:val="24"/>
+                                <w:color w:val="61AFEF"/>
+                              </w:rPr>
+                              <w:t xml:space="preserve"> → </w:t>
+                            </w:r>
+                            <w:r>
+                              <w:rPr>
+                                <w:sz w:val="24"/>
+                              </w:rPr>
+                              <w:t>Frontend</w:t>
+                            </w:r>
+                            <w:r>
+                              <w:rPr>
+                                <w:sz w:val="24"/>
+                                <w:color w:val="61AFEF"/>
+                              </w:rPr>
+                              <w:t>:</w:t>
+                            </w:r>
+                            <w:r>
+                              <w:rPr>
+                                <w:sz w:val="24"/>
+                              </w:rPr>
+                              <w:t xml:space="preserve"> Return FileInfo </w:t>
+                            </w:r>
+                          </w:p>
+                          <w:p>
+                            <w:pPr>
+                              <w:ind w:start="0" w:end="0" w:hanging="0"/>
+                              <w:rPr/>
+                            </w:pPr>
+                            <w:r>
+                              <w:rPr>
+                                <w:sz w:val="24"/>
+                              </w:rPr>
+                              <w:t xml:space="preserve"> Frontend</w:t>
+                            </w:r>
+                            <w:r>
+                              <w:rPr>
+                                <w:sz w:val="24"/>
+                                <w:color w:val="61AFEF"/>
+                              </w:rPr>
+                              <w:t xml:space="preserve"> → </w:t>
+                            </w:r>
+                            <w:r>
+                              <w:rPr>
+                                <w:sz w:val="24"/>
+                              </w:rPr>
+                              <w:t>User</w:t>
+                            </w:r>
+                            <w:r>
+                              <w:rPr>
+                                <w:sz w:val="24"/>
+                                <w:color w:val="61AFEF"/>
+                              </w:rPr>
+                              <w:t>:</w:t>
+                            </w:r>
+                            <w:r>
+                              <w:rPr>
+                                <w:sz w:val="24"/>
+                              </w:rPr>
+                              <w:t xml:space="preserve"> Success!</w:t>
+                            </w:r>
+                          </w:p>
+                        </w:txbxContent>
+                      </wps:txbx>
+                      <wps:bodyPr wrap="square" lIns="0" rIns="0" tIns="0" bIns="0" anchor="t">
+                        <a:noAutofit/>
+                      </wps:bodyPr>
+                    </wps:wsp>
+                  </a:graphicData>
+                </a:graphic>
+              </wp:anchor>
+            </w:drawing>
+          </mc:Choice>
+          <mc:Fallback>
+            <w:pict>
+              <v:shapetype id="_x0000_t202" coordsize="21600,21600" o:spt="202" path="m,l,21600l21600,21600l21600,xe">
+                <v:stroke joinstyle="miter"/>
+                <v:path gradientshapeok="t" o:connecttype="rect"/>
+              </v:shapetype>
+              <v:shape id="shape_0" ID="Text Frame 14" fillcolor="#eeeeee" stroked="f" o:allowincell="f" style="position:absolute;margin-left:0.35pt;margin-top:8.75pt;width:364.55pt;height:223pt;mso-wrap-style:square;v-text-anchor:top" type="_x0000_t202">
+                <v:textbox>
+                  <w:txbxContent>
+                    <w:p>
+                      <w:pPr>
+                        <w:ind w:start="0" w:end="0" w:hanging="0"/>
+                        <w:rPr/>
+                      </w:pPr>
+                      <w:r>
+                        <w:rPr>
+                          <w:sz w:val="24"/>
+                        </w:rPr>
+                        <w:t xml:space="preserve"> User</w:t>
+                      </w:r>
+                      <w:r>
+                        <w:rPr>
+                          <w:sz w:val="24"/>
+                          <w:color w:val="61AFEF"/>
+                        </w:rPr>
+                        <w:t xml:space="preserve"> → </w:t>
+                      </w:r>
+                      <w:r>
+                        <w:rPr>
+                          <w:sz w:val="24"/>
+                        </w:rPr>
+                        <w:t>Frontend</w:t>
+                      </w:r>
+                      <w:r>
+                        <w:rPr>
+                          <w:sz w:val="24"/>
+                          <w:color w:val="61AFEF"/>
+                        </w:rPr>
+                        <w:t>:</w:t>
+                      </w:r>
+                      <w:r>
+                        <w:rPr>
+                          <w:sz w:val="24"/>
+                        </w:rPr>
+                        <w:t xml:space="preserve"> Select File</w:t>
+                      </w:r>
+                    </w:p>
+                    <w:p>
+                      <w:pPr>
+                        <w:ind w:start="0" w:end="0" w:hanging="0"/>
+                        <w:rPr/>
+                      </w:pPr>
+                      <w:r>
+                        <w:rPr>
+                          <w:sz w:val="24"/>
+                        </w:rPr>
+                        <w:t xml:space="preserve"> Frontend</w:t>
+                      </w:r>
+                      <w:r>
+                        <w:rPr>
+                          <w:sz w:val="24"/>
+                          <w:color w:val="61AFEF"/>
+                        </w:rPr>
+                        <w:t xml:space="preserve"> → </w:t>
+                      </w:r>
+                      <w:r>
+                        <w:rPr>
+                          <w:sz w:val="24"/>
+                        </w:rPr>
+                        <w:t>Frontend</w:t>
+                      </w:r>
+                      <w:r>
+                        <w:rPr>
+                          <w:sz w:val="24"/>
+                          <w:color w:val="61AFEF"/>
+                        </w:rPr>
+                        <w:t>:</w:t>
+                      </w:r>
+                      <w:r>
+                        <w:rPr>
+                          <w:sz w:val="24"/>
+                        </w:rPr>
+                        <w:t xml:space="preserve"> Calculate SHA-256 Checksum </w:t>
+                      </w:r>
+                    </w:p>
+                    <w:p>
+                      <w:pPr>
+                        <w:ind w:start="0" w:end="0" w:hanging="0"/>
+                        <w:rPr/>
+                      </w:pPr>
+                      <w:r>
+                        <w:rPr>
+                          <w:sz w:val="24"/>
+                        </w:rPr>
+                        <w:t xml:space="preserve"> Frontend</w:t>
+                      </w:r>
+                      <w:r>
+                        <w:rPr>
+                          <w:sz w:val="24"/>
+                          <w:color w:val="61AFEF"/>
+                        </w:rPr>
+                        <w:t xml:space="preserve"> → </w:t>
+                      </w:r>
+                      <w:r>
+                        <w:rPr>
+                          <w:sz w:val="24"/>
+                        </w:rPr>
+                        <w:t>Backend</w:t>
+                      </w:r>
+                      <w:r>
+                        <w:rPr>
+                          <w:sz w:val="24"/>
+                          <w:color w:val="61AFEF"/>
+                        </w:rPr>
+                        <w:t>:</w:t>
+                      </w:r>
+                      <w:r>
+                        <w:rPr>
+                          <w:sz w:val="24"/>
+                        </w:rPr>
+                        <w:t xml:space="preserve"> POST /initiate </w:t>
+                      </w:r>
+                      <w:r>
+                        <w:rPr>
+                          <w:sz w:val="24"/>
+                          <w:color w:val="98C379"/>
+                        </w:rPr>
+                        <w:t>(fileName, size, checksum)</w:t>
+                      </w:r>
+                      <w:r>
+                        <w:rPr>
+                          <w:sz w:val="24"/>
+                        </w:rPr>
+                        <w:t xml:space="preserve"> </w:t>
+                      </w:r>
+                    </w:p>
+                    <w:p>
+                      <w:pPr>
+                        <w:ind w:start="0" w:end="0" w:hanging="0"/>
+                        <w:rPr/>
+                      </w:pPr>
+                      <w:r>
+                        <w:rPr>
+                          <w:sz w:val="24"/>
+                        </w:rPr>
+                        <w:t xml:space="preserve"> Backend</w:t>
+                      </w:r>
+                      <w:r>
+                        <w:rPr>
+                          <w:sz w:val="24"/>
+                          <w:color w:val="61AFEF"/>
+                        </w:rPr>
+                        <w:t xml:space="preserve"> → </w:t>
+                      </w:r>
+                      <w:r>
+                        <w:rPr>
+                          <w:sz w:val="24"/>
+                        </w:rPr>
+                        <w:t>Backend</w:t>
+                      </w:r>
+                      <w:r>
+                        <w:rPr>
+                          <w:sz w:val="24"/>
+                          <w:color w:val="61AFEF"/>
+                        </w:rPr>
+                        <w:t>:</w:t>
+                      </w:r>
+                      <w:r>
+                        <w:rPr>
+                          <w:sz w:val="24"/>
+                        </w:rPr>
+                        <w:t xml:space="preserve"> Validate permissions </w:t>
+                      </w:r>
+                      <w:r>
+                        <w:rPr>
+                          <w:sz w:val="24"/>
+                          <w:color w:val="61AFEF"/>
+                        </w:rPr>
+                        <w:t>&amp;</w:t>
+                      </w:r>
+                      <w:r>
+                        <w:rPr>
+                          <w:sz w:val="24"/>
+                        </w:rPr>
+                        <w:t xml:space="preserve"> limits </w:t>
+                      </w:r>
+                    </w:p>
+                    <w:p>
+                      <w:pPr>
+                        <w:ind w:start="0" w:end="0" w:hanging="0"/>
+                        <w:rPr/>
+                      </w:pPr>
+                      <w:r>
+                        <w:rPr>
+                          <w:sz w:val="24"/>
+                        </w:rPr>
+                        <w:t xml:space="preserve"> Backend</w:t>
+                      </w:r>
+                      <w:r>
+                        <w:rPr>
+                          <w:sz w:val="24"/>
+                          <w:color w:val="61AFEF"/>
+                        </w:rPr>
+                        <w:t xml:space="preserve"> → </w:t>
+                      </w:r>
+                      <w:r>
+                        <w:rPr>
+                          <w:sz w:val="24"/>
+                        </w:rPr>
+                        <w:t>CloudflareR2</w:t>
+                      </w:r>
+                      <w:r>
+                        <w:rPr>
+                          <w:sz w:val="24"/>
+                          <w:color w:val="61AFEF"/>
+                        </w:rPr>
+                        <w:t>:</w:t>
+                      </w:r>
+                      <w:r>
+                        <w:rPr>
+                          <w:sz w:val="24"/>
+                        </w:rPr>
+                        <w:t xml:space="preserve"> Generate presigned URL </w:t>
+                      </w:r>
+                    </w:p>
+                    <w:p>
+                      <w:pPr>
+                        <w:ind w:start="0" w:end="0" w:hanging="0"/>
+                        <w:rPr/>
+                      </w:pPr>
+                      <w:r>
+                        <w:rPr>
+                          <w:sz w:val="24"/>
+                        </w:rPr>
+                        <w:t xml:space="preserve"> Backend</w:t>
+                      </w:r>
+                      <w:r>
+                        <w:rPr>
+                          <w:sz w:val="24"/>
+                          <w:color w:val="61AFEF"/>
+                        </w:rPr>
+                        <w:t xml:space="preserve"> → </w:t>
+                      </w:r>
+                      <w:r>
+                        <w:rPr>
+                          <w:sz w:val="24"/>
+                        </w:rPr>
+                        <w:t>Frontend</w:t>
+                      </w:r>
+                      <w:r>
+                        <w:rPr>
+                          <w:sz w:val="24"/>
+                          <w:color w:val="61AFEF"/>
+                        </w:rPr>
+                        <w:t>:</w:t>
+                      </w:r>
+                      <w:r>
+                        <w:rPr>
+                          <w:sz w:val="24"/>
+                        </w:rPr>
+                        <w:t xml:space="preserve"> Return uploadUrl + fileId </w:t>
+                      </w:r>
+                    </w:p>
+                    <w:p>
+                      <w:pPr>
+                        <w:ind w:start="0" w:end="0" w:hanging="0"/>
+                        <w:rPr/>
+                      </w:pPr>
+                      <w:r>
+                        <w:rPr>
+                          <w:sz w:val="24"/>
+                        </w:rPr>
+                        <w:t xml:space="preserve"> Frontend</w:t>
+                      </w:r>
+                      <w:r>
+                        <w:rPr>
+                          <w:sz w:val="24"/>
+                          <w:color w:val="61AFEF"/>
+                        </w:rPr>
+                        <w:t xml:space="preserve"> → </w:t>
+                      </w:r>
+                      <w:r>
+                        <w:rPr>
+                          <w:sz w:val="24"/>
+                        </w:rPr>
+                        <w:t>CloudflareR2</w:t>
+                      </w:r>
+                      <w:r>
+                        <w:rPr>
+                          <w:sz w:val="24"/>
+                          <w:color w:val="61AFEF"/>
+                        </w:rPr>
+                        <w:t>:</w:t>
+                      </w:r>
+                      <w:r>
+                        <w:rPr>
+                          <w:sz w:val="24"/>
+                        </w:rPr>
+                        <w:t xml:space="preserve"> PUT file to presigned URL </w:t>
+                      </w:r>
+                    </w:p>
+                    <w:p>
+                      <w:pPr>
+                        <w:ind w:start="0" w:end="0" w:hanging="0"/>
+                        <w:rPr/>
+                      </w:pPr>
+                      <w:r>
+                        <w:rPr>
+                          <w:sz w:val="24"/>
+                        </w:rPr>
+                        <w:t xml:space="preserve"> CloudflareR2</w:t>
+                      </w:r>
+                      <w:r>
+                        <w:rPr>
+                          <w:sz w:val="24"/>
+                          <w:color w:val="61AFEF"/>
+                        </w:rPr>
+                        <w:t xml:space="preserve"> → </w:t>
+                      </w:r>
+                      <w:r>
+                        <w:rPr>
+                          <w:sz w:val="24"/>
+                        </w:rPr>
+                        <w:t>Frontend</w:t>
+                      </w:r>
+                      <w:r>
+                        <w:rPr>
+                          <w:sz w:val="24"/>
+                          <w:color w:val="61AFEF"/>
+                        </w:rPr>
+                        <w:t>:</w:t>
+                      </w:r>
+                      <w:r>
+                        <w:rPr>
+                          <w:sz w:val="24"/>
+                        </w:rPr>
+                        <w:t xml:space="preserve"> 200 OK </w:t>
+                      </w:r>
+                    </w:p>
+                    <w:p>
+                      <w:pPr>
+                        <w:ind w:start="0" w:end="0" w:hanging="0"/>
+                        <w:rPr/>
+                      </w:pPr>
+                      <w:r>
+                        <w:rPr>
+                          <w:sz w:val="24"/>
+                        </w:rPr>
+                        <w:t xml:space="preserve"> Frontend</w:t>
+                      </w:r>
+                      <w:r>
+                        <w:rPr>
+                          <w:sz w:val="24"/>
+                          <w:color w:val="61AFEF"/>
+                        </w:rPr>
+                        <w:t xml:space="preserve"> → </w:t>
+                      </w:r>
+                      <w:r>
+                        <w:rPr>
+                          <w:sz w:val="24"/>
+                        </w:rPr>
+                        <w:t>Backend</w:t>
+                      </w:r>
+                      <w:r>
+                        <w:rPr>
+                          <w:sz w:val="24"/>
+                          <w:color w:val="61AFEF"/>
+                        </w:rPr>
+                        <w:t>:</w:t>
+                      </w:r>
+                      <w:r>
+                        <w:rPr>
+                          <w:sz w:val="24"/>
+                        </w:rPr>
+                        <w:t xml:space="preserve"> POST /complete </w:t>
+                      </w:r>
+                      <w:r>
+                        <w:rPr>
+                          <w:sz w:val="24"/>
+                          <w:color w:val="98C379"/>
+                        </w:rPr>
+                        <w:t>(fileId)</w:t>
+                      </w:r>
+                      <w:r>
+                        <w:rPr>
+                          <w:sz w:val="24"/>
+                        </w:rPr>
+                        <w:t xml:space="preserve"> </w:t>
+                      </w:r>
+                    </w:p>
+                    <w:p>
+                      <w:pPr>
+                        <w:ind w:start="0" w:end="0" w:hanging="0"/>
+                        <w:rPr/>
+                      </w:pPr>
+                      <w:r>
+                        <w:rPr>
+                          <w:sz w:val="24"/>
+                        </w:rPr>
+                        <w:t xml:space="preserve"> Backend</w:t>
+                      </w:r>
+                      <w:r>
+                        <w:rPr>
+                          <w:sz w:val="24"/>
+                          <w:color w:val="61AFEF"/>
+                        </w:rPr>
+                        <w:t xml:space="preserve"> → </w:t>
+                      </w:r>
+                      <w:r>
+                        <w:rPr>
+                          <w:sz w:val="24"/>
+                        </w:rPr>
+                        <w:t>CloudflareR2</w:t>
+                      </w:r>
+                      <w:r>
+                        <w:rPr>
+                          <w:sz w:val="24"/>
+                          <w:color w:val="61AFEF"/>
+                        </w:rPr>
+                        <w:t>:</w:t>
+                      </w:r>
+                      <w:r>
+                        <w:rPr>
+                          <w:sz w:val="24"/>
+                        </w:rPr>
+                        <w:t xml:space="preserve"> Verify file exists </w:t>
+                      </w:r>
+                    </w:p>
+                    <w:p>
+                      <w:pPr>
+                        <w:ind w:start="0" w:end="0" w:hanging="0"/>
+                        <w:rPr/>
+                      </w:pPr>
+                      <w:r>
+                        <w:rPr>
+                          <w:sz w:val="24"/>
+                        </w:rPr>
+                        <w:t xml:space="preserve"> Backend</w:t>
+                      </w:r>
+                      <w:r>
+                        <w:rPr>
+                          <w:sz w:val="24"/>
+                          <w:color w:val="61AFEF"/>
+                        </w:rPr>
+                        <w:t xml:space="preserve"> → </w:t>
+                      </w:r>
+                      <w:r>
+                        <w:rPr>
+                          <w:sz w:val="24"/>
+                        </w:rPr>
+                        <w:t>Backend</w:t>
+                      </w:r>
+                      <w:r>
+                        <w:rPr>
+                          <w:sz w:val="24"/>
+                          <w:color w:val="61AFEF"/>
+                        </w:rPr>
+                        <w:t>:</w:t>
+                      </w:r>
+                      <w:r>
+                        <w:rPr>
+                          <w:sz w:val="24"/>
+                        </w:rPr>
+                        <w:t xml:space="preserve"> Mark file available </w:t>
+                      </w:r>
+                    </w:p>
+                    <w:p>
+                      <w:pPr>
+                        <w:ind w:start="0" w:end="0" w:hanging="0"/>
+                        <w:rPr/>
+                      </w:pPr>
+                      <w:r>
+                        <w:rPr>
+                          <w:sz w:val="24"/>
+                        </w:rPr>
+                        <w:t xml:space="preserve"> Backend</w:t>
+                      </w:r>
+                      <w:r>
+                        <w:rPr>
+                          <w:sz w:val="24"/>
+                          <w:color w:val="61AFEF"/>
+                        </w:rPr>
+                        <w:t xml:space="preserve"> → </w:t>
+                      </w:r>
+                      <w:r>
+                        <w:rPr>
+                          <w:sz w:val="24"/>
+                        </w:rPr>
+                        <w:t>Frontend</w:t>
+                      </w:r>
+                      <w:r>
+                        <w:rPr>
+                          <w:sz w:val="24"/>
+                          <w:color w:val="61AFEF"/>
+                        </w:rPr>
+                        <w:t>:</w:t>
+                      </w:r>
+                      <w:r>
+                        <w:rPr>
+                          <w:sz w:val="24"/>
+                        </w:rPr>
+                        <w:t xml:space="preserve"> Return FileInfo </w:t>
+                      </w:r>
+                    </w:p>
+                    <w:p>
+                      <w:pPr>
+                        <w:ind w:start="0" w:end="0" w:hanging="0"/>
+                        <w:rPr/>
+                      </w:pPr>
+                      <w:r>
+                        <w:rPr>
+                          <w:sz w:val="24"/>
+                        </w:rPr>
+                        <w:t xml:space="preserve"> Frontend</w:t>
+                      </w:r>
+                      <w:r>
+                        <w:rPr>
+                          <w:sz w:val="24"/>
+                          <w:color w:val="61AFEF"/>
+                        </w:rPr>
+                        <w:t xml:space="preserve"> → </w:t>
+                      </w:r>
+                      <w:r>
+                        <w:rPr>
+                          <w:sz w:val="24"/>
+                        </w:rPr>
+                        <w:t>User</w:t>
+                      </w:r>
+                      <w:r>
+                        <w:rPr>
+                          <w:sz w:val="24"/>
+                          <w:color w:val="61AFEF"/>
+                        </w:rPr>
+                        <w:t>:</w:t>
+                      </w:r>
+                      <w:r>
+                        <w:rPr>
+                          <w:sz w:val="24"/>
+                        </w:rPr>
+                        <w:t xml:space="preserve"> Success!</w:t>
+                      </w:r>
+                    </w:p>
+                  </w:txbxContent>
+                </v:textbox>
+                <v:fill o:detectmouseclick="t" type="solid" color2="#111111"/>
+                <v:stroke color="black" joinstyle="round" endcap="flat"/>
+                <w10:wrap type="none"/>
+              </v:shape>
+            </w:pict>
+          </mc:Fallback>
+        </mc:AlternateContent>
+      </w:r>
+    </w:p>
+    <w:p>
+      <w:pPr>
+        <w:pStyle w:val="BodyText"/>
+        <w:ind w:hanging="0" w:start="0" w:end="0"/>
+        <w:rPr/>
+      </w:pPr>
+      <w:r>
+        <w:rPr/>
+      </w:r>
+    </w:p>
+    <w:p>
+      <w:pPr>
+        <w:pStyle w:val="BodyText"/>
+        <w:ind w:hanging="0" w:start="0" w:end="0"/>
+        <w:rPr/>
+      </w:pPr>
+      <w:r>
+        <w:rPr/>
+      </w:r>
+    </w:p>
+    <w:p>
+      <w:pPr>
+        <w:pStyle w:val="BodyText"/>
+        <w:ind w:hanging="0" w:start="0" w:end="0"/>
+        <w:rPr/>
+      </w:pPr>
+      <w:r>
+        <w:rPr/>
+      </w:r>
+    </w:p>
+    <w:p>
+      <w:pPr>
+        <w:pStyle w:val="BodyText"/>
+        <w:ind w:hanging="0" w:start="0" w:end="0"/>
+        <w:rPr/>
+      </w:pPr>
+      <w:r>
+        <w:rPr/>
+      </w:r>
+    </w:p>
+    <w:p>
+      <w:pPr>
+        <w:pStyle w:val="BodyText"/>
+        <w:ind w:hanging="0" w:start="0" w:end="0"/>
+        <w:rPr/>
+      </w:pPr>
+      <w:r>
+        <w:rPr/>
+      </w:r>
+    </w:p>
+    <w:p>
+      <w:pPr>
+        <w:pStyle w:val="BodyText"/>
+        <w:ind w:hanging="0" w:start="0" w:end="0"/>
+        <w:rPr/>
+      </w:pPr>
+      <w:r>
+        <w:rPr/>
+      </w:r>
+    </w:p>
+    <w:p>
+      <w:pPr>
+        <w:pStyle w:val="BodyText"/>
+        <w:ind w:hanging="0" w:start="0" w:end="0"/>
+        <w:rPr/>
+      </w:pPr>
+      <w:r>
+        <w:rPr/>
+      </w:r>
+    </w:p>
+    <w:p>
+      <w:pPr>
+        <w:pStyle w:val="BodyText"/>
+        <w:ind w:hanging="0" w:start="0" w:end="0"/>
+        <w:rPr/>
+      </w:pPr>
+      <w:r>
+        <w:rPr/>
+      </w:r>
+    </w:p>
+    <w:p>
+      <w:pPr>
+        <w:pStyle w:val="BodyText"/>
+        <w:ind w:hanging="0" w:start="0" w:end="0"/>
+        <w:rPr/>
+      </w:pPr>
+      <w:r>
+        <w:rPr/>
+      </w:r>
+    </w:p>
+    <w:p>
+      <w:pPr>
+        <w:pStyle w:val="BodyText"/>
+        <w:ind w:hanging="0" w:start="0" w:end="0"/>
+        <w:rPr/>
+      </w:pPr>
+      <w:r>
+        <w:rPr/>
+      </w:r>
+    </w:p>
+    <w:p>
+      <w:pPr>
+        <w:pStyle w:val="BodyText"/>
+        <w:spacing w:before="0" w:after="140"/>
+        <w:ind w:hanging="0" w:start="0" w:end="0"/>
+        <w:rPr/>
+      </w:pPr>
+      <w:r>
+        <w:rPr/>
       </w:r>
     </w:p>
     <w:sectPr>
@@ -19988,7 +21734,7 @@
     <w:pPr>
       <w:widowControl/>
       <w:suppressAutoHyphens w:val="true"/>
-      <w:overflowPunct w:val="true"/>
+      <w:overflowPunct w:val="false"/>
       <w:bidi w:val="0"/>
       <w:spacing w:before="0" w:after="0"/>
       <w:jc w:val="start"/>

</xml_diff>